<commit_message>
Export ROS and Week 5 ranks as separate current-season views
</commit_message>
<xml_diff>
--- a/exports/fantasy-2026-current.docx
+++ b/exports/fantasy-2026-current.docx
@@ -44,6 +44,22 @@
     </w:p>
     <w:p>
       <w:pPr>
+        <w:pStyle w:val="Heading2"/>
+      </w:pPr>
+      <w:r>
+        <w:t xml:space="preserve">Week 5 outlook</w:t>
+      </w:r>
+    </w:p>
+    <w:p>
+      <w:pPr>
+        <w:pStyle w:val="Normal"/>
+      </w:pPr>
+      <w:r>
+        <w:t xml:space="preserve">Weekly overall model rank 5 (RB2). ROS overall rank 1 (RB1). Availability: UNKNOWN. Weekly ranks are preliminary when playing status is unconfirmed; they are separate from season ranks.</w:t>
+      </w:r>
+    </w:p>
+    <w:p>
+      <w:pPr>
         <w:pStyle w:val="Normal"/>
       </w:pPr>
       <w:r>
@@ -148,6 +164,22 @@
     </w:p>
     <w:p>
       <w:pPr>
+        <w:pStyle w:val="Heading2"/>
+      </w:pPr>
+      <w:r>
+        <w:t xml:space="preserve">Week 5 outlook</w:t>
+      </w:r>
+    </w:p>
+    <w:p>
+      <w:pPr>
+        <w:pStyle w:val="Normal"/>
+      </w:pPr>
+      <w:r>
+        <w:t xml:space="preserve">Weekly overall model rank 1 (RB1). ROS overall rank 2 (RB2). Availability: UNKNOWN. Weekly ranks are preliminary when playing status is unconfirmed; they are separate from season ranks.</w:t>
+      </w:r>
+    </w:p>
+    <w:p>
+      <w:pPr>
         <w:pStyle w:val="Normal"/>
       </w:pPr>
       <w:r>
@@ -252,6 +284,22 @@
     </w:p>
     <w:p>
       <w:pPr>
+        <w:pStyle w:val="Heading2"/>
+      </w:pPr>
+      <w:r>
+        <w:t xml:space="preserve">Week 5 outlook</w:t>
+      </w:r>
+    </w:p>
+    <w:p>
+      <w:pPr>
+        <w:pStyle w:val="Normal"/>
+      </w:pPr>
+      <w:r>
+        <w:t xml:space="preserve">Weekly overall model rank 4 (WR1). ROS overall rank 3 (WR1). Availability: UNKNOWN. Weekly ranks are preliminary when playing status is unconfirmed; they are separate from season ranks.</w:t>
+      </w:r>
+    </w:p>
+    <w:p>
+      <w:pPr>
         <w:pStyle w:val="Normal"/>
       </w:pPr>
       <w:r>
@@ -356,6 +404,22 @@
     </w:p>
     <w:p>
       <w:pPr>
+        <w:pStyle w:val="Heading2"/>
+      </w:pPr>
+      <w:r>
+        <w:t xml:space="preserve">Week 5 outlook</w:t>
+      </w:r>
+    </w:p>
+    <w:p>
+      <w:pPr>
+        <w:pStyle w:val="Normal"/>
+      </w:pPr>
+      <w:r>
+        <w:t xml:space="preserve">Weekly overall model rank 21 (WR7). ROS overall rank 4 (WR2). Availability: UNKNOWN. Weekly ranks are preliminary when playing status is unconfirmed; they are separate from season ranks.</w:t>
+      </w:r>
+    </w:p>
+    <w:p>
+      <w:pPr>
         <w:pStyle w:val="Normal"/>
       </w:pPr>
       <w:r>
@@ -460,6 +524,22 @@
     </w:p>
     <w:p>
       <w:pPr>
+        <w:pStyle w:val="Heading2"/>
+      </w:pPr>
+      <w:r>
+        <w:t xml:space="preserve">Week 5 outlook</w:t>
+      </w:r>
+    </w:p>
+    <w:p>
+      <w:pPr>
+        <w:pStyle w:val="Normal"/>
+      </w:pPr>
+      <w:r>
+        <w:t xml:space="preserve">Weekly overall model rank 14 (WR4). ROS overall rank 5 (WR3). Availability: UNKNOWN. Weekly ranks are preliminary when playing status is unconfirmed; they are separate from season ranks.</w:t>
+      </w:r>
+    </w:p>
+    <w:p>
+      <w:pPr>
         <w:pStyle w:val="Normal"/>
       </w:pPr>
       <w:r>
@@ -564,6 +644,22 @@
     </w:p>
     <w:p>
       <w:pPr>
+        <w:pStyle w:val="Heading2"/>
+      </w:pPr>
+      <w:r>
+        <w:t xml:space="preserve">Week 5 outlook</w:t>
+      </w:r>
+    </w:p>
+    <w:p>
+      <w:pPr>
+        <w:pStyle w:val="Normal"/>
+      </w:pPr>
+      <w:r>
+        <w:t xml:space="preserve">Weekly overall model rank 6 (WR2). ROS overall rank 6 (WR4). Availability: UNKNOWN. Weekly ranks are preliminary when playing status is unconfirmed; they are separate from season ranks.</w:t>
+      </w:r>
+    </w:p>
+    <w:p>
+      <w:pPr>
         <w:pStyle w:val="Normal"/>
       </w:pPr>
       <w:r>
@@ -636,6 +732,22 @@
     </w:p>
     <w:p>
       <w:pPr>
+        <w:pStyle w:val="Heading2"/>
+      </w:pPr>
+      <w:r>
+        <w:t xml:space="preserve">Week 5 outlook</w:t>
+      </w:r>
+    </w:p>
+    <w:p>
+      <w:pPr>
+        <w:pStyle w:val="Normal"/>
+      </w:pPr>
+      <w:r>
+        <w:t xml:space="preserve">Weekly overall model rank 13 (RB4). ROS overall rank 7 (RB3). Availability: UNKNOWN. Weekly ranks are preliminary when playing status is unconfirmed; they are separate from season ranks.</w:t>
+      </w:r>
+    </w:p>
+    <w:p>
+      <w:pPr>
         <w:pStyle w:val="Normal"/>
       </w:pPr>
       <w:r>
@@ -740,6 +852,22 @@
     </w:p>
     <w:p>
       <w:pPr>
+        <w:pStyle w:val="Heading2"/>
+      </w:pPr>
+      <w:r>
+        <w:t xml:space="preserve">Week 5 outlook</w:t>
+      </w:r>
+    </w:p>
+    <w:p>
+      <w:pPr>
+        <w:pStyle w:val="Normal"/>
+      </w:pPr>
+      <w:r>
+        <w:t xml:space="preserve">Weekly overall model rank 17 (RB5). ROS overall rank 8 (RB4). Availability: UNKNOWN. Weekly ranks are preliminary when playing status is unconfirmed; they are separate from season ranks.</w:t>
+      </w:r>
+    </w:p>
+    <w:p>
+      <w:pPr>
         <w:pStyle w:val="Normal"/>
       </w:pPr>
       <w:r>
@@ -844,6 +972,22 @@
     </w:p>
     <w:p>
       <w:pPr>
+        <w:pStyle w:val="Heading2"/>
+      </w:pPr>
+      <w:r>
+        <w:t xml:space="preserve">Week 5 outlook</w:t>
+      </w:r>
+    </w:p>
+    <w:p>
+      <w:pPr>
+        <w:pStyle w:val="Normal"/>
+      </w:pPr>
+      <w:r>
+        <w:t xml:space="preserve">Weekly overall model rank 15 (WR5). ROS overall rank 9 (WR5). Availability: UNKNOWN. Weekly ranks are preliminary when playing status is unconfirmed; they are separate from season ranks.</w:t>
+      </w:r>
+    </w:p>
+    <w:p>
+      <w:pPr>
         <w:pStyle w:val="Normal"/>
       </w:pPr>
       <w:r>
@@ -948,6 +1092,22 @@
     </w:p>
     <w:p>
       <w:pPr>
+        <w:pStyle w:val="Heading2"/>
+      </w:pPr>
+      <w:r>
+        <w:t xml:space="preserve">Week 5 outlook</w:t>
+      </w:r>
+    </w:p>
+    <w:p>
+      <w:pPr>
+        <w:pStyle w:val="Normal"/>
+      </w:pPr>
+      <w:r>
+        <w:t xml:space="preserve">Weekly overall model rank 12 (RB3). ROS overall rank 10 (RB5). Availability: UNKNOWN. Weekly ranks are preliminary when playing status is unconfirmed; they are separate from season ranks.</w:t>
+      </w:r>
+    </w:p>
+    <w:p>
+      <w:pPr>
         <w:pStyle w:val="Normal"/>
       </w:pPr>
       <w:r>
@@ -1052,6 +1212,22 @@
     </w:p>
     <w:p>
       <w:pPr>
+        <w:pStyle w:val="Heading2"/>
+      </w:pPr>
+      <w:r>
+        <w:t xml:space="preserve">Week 5 outlook</w:t>
+      </w:r>
+    </w:p>
+    <w:p>
+      <w:pPr>
+        <w:pStyle w:val="Normal"/>
+      </w:pPr>
+      <w:r>
+        <w:t xml:space="preserve">Weekly overall model rank 9 (TE1). ROS overall rank 11 (TE1). Availability: UNKNOWN. Weekly ranks are preliminary when playing status is unconfirmed; they are separate from season ranks.</w:t>
+      </w:r>
+    </w:p>
+    <w:p>
+      <w:pPr>
         <w:pStyle w:val="Normal"/>
       </w:pPr>
       <w:r>
@@ -1156,6 +1332,22 @@
     </w:p>
     <w:p>
       <w:pPr>
+        <w:pStyle w:val="Heading2"/>
+      </w:pPr>
+      <w:r>
+        <w:t xml:space="preserve">Week 5 outlook</w:t>
+      </w:r>
+    </w:p>
+    <w:p>
+      <w:pPr>
+        <w:pStyle w:val="Normal"/>
+      </w:pPr>
+      <w:r>
+        <w:t xml:space="preserve">Weekly overall model rank 18 (RB6). ROS overall rank 12 (RB6). Availability: UNKNOWN. Weekly ranks are preliminary when playing status is unconfirmed; they are separate from season ranks.</w:t>
+      </w:r>
+    </w:p>
+    <w:p>
+      <w:pPr>
         <w:pStyle w:val="Normal"/>
       </w:pPr>
       <w:r>
@@ -1260,6 +1452,22 @@
     </w:p>
     <w:p>
       <w:pPr>
+        <w:pStyle w:val="Heading2"/>
+      </w:pPr>
+      <w:r>
+        <w:t xml:space="preserve">Week 5 outlook</w:t>
+      </w:r>
+    </w:p>
+    <w:p>
+      <w:pPr>
+        <w:pStyle w:val="Normal"/>
+      </w:pPr>
+      <w:r>
+        <w:t xml:space="preserve">Weekly overall model rank 11 (WR3). ROS overall rank 13 (WR6). Availability: UNKNOWN. Weekly ranks are preliminary when playing status is unconfirmed; they are separate from season ranks.</w:t>
+      </w:r>
+    </w:p>
+    <w:p>
+      <w:pPr>
         <w:pStyle w:val="Normal"/>
       </w:pPr>
       <w:r>
@@ -1364,6 +1572,22 @@
     </w:p>
     <w:p>
       <w:pPr>
+        <w:pStyle w:val="Heading2"/>
+      </w:pPr>
+      <w:r>
+        <w:t xml:space="preserve">Week 5 outlook</w:t>
+      </w:r>
+    </w:p>
+    <w:p>
+      <w:pPr>
+        <w:pStyle w:val="Normal"/>
+      </w:pPr>
+      <w:r>
+        <w:t xml:space="preserve">Weekly overall model rank 48 (RB14). ROS overall rank 14 (RB7). Availability: UNKNOWN. Weekly ranks are preliminary when playing status is unconfirmed; they are separate from season ranks.</w:t>
+      </w:r>
+    </w:p>
+    <w:p>
+      <w:pPr>
         <w:pStyle w:val="Normal"/>
       </w:pPr>
       <w:r>
@@ -1468,6 +1692,22 @@
     </w:p>
     <w:p>
       <w:pPr>
+        <w:pStyle w:val="Heading2"/>
+      </w:pPr>
+      <w:r>
+        <w:t xml:space="preserve">Week 5 outlook</w:t>
+      </w:r>
+    </w:p>
+    <w:p>
+      <w:pPr>
+        <w:pStyle w:val="Normal"/>
+      </w:pPr>
+      <w:r>
+        <w:t xml:space="preserve">Weekly overall model rank 43 (RB12). ROS overall rank 15 (RB8). Availability: UNKNOWN. Weekly ranks are preliminary when playing status is unconfirmed; they are separate from season ranks.</w:t>
+      </w:r>
+    </w:p>
+    <w:p>
+      <w:pPr>
         <w:pStyle w:val="Normal"/>
       </w:pPr>
       <w:r>
@@ -1572,6 +1812,22 @@
     </w:p>
     <w:p>
       <w:pPr>
+        <w:pStyle w:val="Heading2"/>
+      </w:pPr>
+      <w:r>
+        <w:t xml:space="preserve">Week 5 outlook</w:t>
+      </w:r>
+    </w:p>
+    <w:p>
+      <w:pPr>
+        <w:pStyle w:val="Normal"/>
+      </w:pPr>
+      <w:r>
+        <w:t xml:space="preserve">Weekly overall model rank 27 (WR9). ROS overall rank 16 (WR7). Availability: UNKNOWN. Weekly ranks are preliminary when playing status is unconfirmed; they are separate from season ranks.</w:t>
+      </w:r>
+    </w:p>
+    <w:p>
+      <w:pPr>
         <w:pStyle w:val="Normal"/>
       </w:pPr>
       <w:r>
@@ -1644,6 +1900,22 @@
     </w:p>
     <w:p>
       <w:pPr>
+        <w:pStyle w:val="Heading2"/>
+      </w:pPr>
+      <w:r>
+        <w:t xml:space="preserve">Week 5 outlook</w:t>
+      </w:r>
+    </w:p>
+    <w:p>
+      <w:pPr>
+        <w:pStyle w:val="Normal"/>
+      </w:pPr>
+      <w:r>
+        <w:t xml:space="preserve">Weekly overall model rank 38 (RB11). ROS overall rank 17 (RB9). Availability: UNKNOWN. Weekly ranks are preliminary when playing status is unconfirmed; they are separate from season ranks.</w:t>
+      </w:r>
+    </w:p>
+    <w:p>
+      <w:pPr>
         <w:pStyle w:val="Normal"/>
       </w:pPr>
       <w:r>
@@ -1716,6 +1988,22 @@
     </w:p>
     <w:p>
       <w:pPr>
+        <w:pStyle w:val="Heading2"/>
+      </w:pPr>
+      <w:r>
+        <w:t xml:space="preserve">Week 5 outlook</w:t>
+      </w:r>
+    </w:p>
+    <w:p>
+      <w:pPr>
+        <w:pStyle w:val="Normal"/>
+      </w:pPr>
+      <w:r>
+        <w:t xml:space="preserve">Weekly overall model rank 19 (WR6). ROS overall rank 18 (WR8). Availability: UNKNOWN. Weekly ranks are preliminary when playing status is unconfirmed; they are separate from season ranks.</w:t>
+      </w:r>
+    </w:p>
+    <w:p>
+      <w:pPr>
         <w:pStyle w:val="Normal"/>
       </w:pPr>
       <w:r>
@@ -1820,6 +2108,22 @@
     </w:p>
     <w:p>
       <w:pPr>
+        <w:pStyle w:val="Heading2"/>
+      </w:pPr>
+      <w:r>
+        <w:t xml:space="preserve">Week 5 outlook</w:t>
+      </w:r>
+    </w:p>
+    <w:p>
+      <w:pPr>
+        <w:pStyle w:val="Normal"/>
+      </w:pPr>
+      <w:r>
+        <w:t xml:space="preserve">Weekly overall model rank 37 (RB10). ROS overall rank 19 (RB10). Availability: UNKNOWN. Weekly ranks are preliminary when playing status is unconfirmed; they are separate from season ranks.</w:t>
+      </w:r>
+    </w:p>
+    <w:p>
+      <w:pPr>
         <w:pStyle w:val="Normal"/>
       </w:pPr>
       <w:r>
@@ -1924,6 +2228,22 @@
     </w:p>
     <w:p>
       <w:pPr>
+        <w:pStyle w:val="Heading2"/>
+      </w:pPr>
+      <w:r>
+        <w:t xml:space="preserve">Week 5 outlook</w:t>
+      </w:r>
+    </w:p>
+    <w:p>
+      <w:pPr>
+        <w:pStyle w:val="Normal"/>
+      </w:pPr>
+      <w:r>
+        <w:t xml:space="preserve">Weekly overall model rank 20 (TE2). ROS overall rank 20 (TE2). Availability: UNKNOWN. Weekly ranks are preliminary when playing status is unconfirmed; they are separate from season ranks.</w:t>
+      </w:r>
+    </w:p>
+    <w:p>
+      <w:pPr>
         <w:pStyle w:val="Normal"/>
       </w:pPr>
       <w:r>
@@ -2028,6 +2348,22 @@
     </w:p>
     <w:p>
       <w:pPr>
+        <w:pStyle w:val="Heading2"/>
+      </w:pPr>
+      <w:r>
+        <w:t xml:space="preserve">Week 5 outlook</w:t>
+      </w:r>
+    </w:p>
+    <w:p>
+      <w:pPr>
+        <w:pStyle w:val="Normal"/>
+      </w:pPr>
+      <w:r>
+        <w:t xml:space="preserve">Weekly overall model rank 35 (RB9). ROS overall rank 21 (RB11). Availability: UNKNOWN. Weekly ranks are preliminary when playing status is unconfirmed; they are separate from season ranks.</w:t>
+      </w:r>
+    </w:p>
+    <w:p>
+      <w:pPr>
         <w:pStyle w:val="Normal"/>
       </w:pPr>
       <w:r>
@@ -2132,6 +2468,22 @@
     </w:p>
     <w:p>
       <w:pPr>
+        <w:pStyle w:val="Heading2"/>
+      </w:pPr>
+      <w:r>
+        <w:t xml:space="preserve">Week 5 outlook</w:t>
+      </w:r>
+    </w:p>
+    <w:p>
+      <w:pPr>
+        <w:pStyle w:val="Normal"/>
+      </w:pPr>
+      <w:r>
+        <w:t xml:space="preserve">Weekly overall model rank 26 (RB7). ROS overall rank 22 (RB12). Availability: UNKNOWN. Weekly ranks are preliminary when playing status is unconfirmed; they are separate from season ranks.</w:t>
+      </w:r>
+    </w:p>
+    <w:p>
+      <w:pPr>
         <w:pStyle w:val="Normal"/>
       </w:pPr>
       <w:r>
@@ -2236,6 +2588,22 @@
     </w:p>
     <w:p>
       <w:pPr>
+        <w:pStyle w:val="Heading2"/>
+      </w:pPr>
+      <w:r>
+        <w:t xml:space="preserve">Week 5 outlook</w:t>
+      </w:r>
+    </w:p>
+    <w:p>
+      <w:pPr>
+        <w:pStyle w:val="Normal"/>
+      </w:pPr>
+      <w:r>
+        <w:t xml:space="preserve">Weekly overall model rank 50 (WR13). ROS overall rank 23 (WR9). Availability: UNKNOWN. Weekly ranks are preliminary when playing status is unconfirmed; they are separate from season ranks.</w:t>
+      </w:r>
+    </w:p>
+    <w:p>
+      <w:pPr>
         <w:pStyle w:val="Normal"/>
       </w:pPr>
       <w:r>
@@ -2340,6 +2708,22 @@
     </w:p>
     <w:p>
       <w:pPr>
+        <w:pStyle w:val="Heading2"/>
+      </w:pPr>
+      <w:r>
+        <w:t xml:space="preserve">Week 5 outlook</w:t>
+      </w:r>
+    </w:p>
+    <w:p>
+      <w:pPr>
+        <w:pStyle w:val="Normal"/>
+      </w:pPr>
+      <w:r>
+        <w:t xml:space="preserve">Weekly overall model rank 44 (RB13). ROS overall rank 24 (RB13). Availability: UNKNOWN. Weekly ranks are preliminary when playing status is unconfirmed; they are separate from season ranks.</w:t>
+      </w:r>
+    </w:p>
+    <w:p>
+      <w:pPr>
         <w:pStyle w:val="Normal"/>
       </w:pPr>
       <w:r>
@@ -2444,6 +2828,22 @@
     </w:p>
     <w:p>
       <w:pPr>
+        <w:pStyle w:val="Heading2"/>
+      </w:pPr>
+      <w:r>
+        <w:t xml:space="preserve">Week 5 outlook</w:t>
+      </w:r>
+    </w:p>
+    <w:p>
+      <w:pPr>
+        <w:pStyle w:val="Normal"/>
+      </w:pPr>
+      <w:r>
+        <w:t xml:space="preserve">Weekly overall model rank 172 (WR65). ROS overall rank 25 (WR10). Availability: EXPECTED_INACTIVE. Weekly ranks are preliminary when playing status is unconfirmed; they are separate from season ranks.</w:t>
+      </w:r>
+    </w:p>
+    <w:p>
+      <w:pPr>
         <w:pStyle w:val="Normal"/>
       </w:pPr>
       <w:r>
@@ -2548,6 +2948,22 @@
     </w:p>
     <w:p>
       <w:pPr>
+        <w:pStyle w:val="Heading2"/>
+      </w:pPr>
+      <w:r>
+        <w:t xml:space="preserve">Week 5 outlook</w:t>
+      </w:r>
+    </w:p>
+    <w:p>
+      <w:pPr>
+        <w:pStyle w:val="Normal"/>
+      </w:pPr>
+      <w:r>
+        <w:t xml:space="preserve">Weekly overall model rank 33 (RB8). ROS overall rank 26 (RB14). Availability: UNKNOWN. Weekly ranks are preliminary when playing status is unconfirmed; they are separate from season ranks.</w:t>
+      </w:r>
+    </w:p>
+    <w:p>
+      <w:pPr>
         <w:pStyle w:val="Normal"/>
       </w:pPr>
       <w:r>
@@ -2652,6 +3068,22 @@
     </w:p>
     <w:p>
       <w:pPr>
+        <w:pStyle w:val="Heading2"/>
+      </w:pPr>
+      <w:r>
+        <w:t xml:space="preserve">Week 5 outlook</w:t>
+      </w:r>
+    </w:p>
+    <w:p>
+      <w:pPr>
+        <w:pStyle w:val="Normal"/>
+      </w:pPr>
+      <w:r>
+        <w:t xml:space="preserve">Weekly overall model rank 46 (WR12). ROS overall rank 27 (WR11). Availability: UNKNOWN. Weekly ranks are preliminary when playing status is unconfirmed; they are separate from season ranks.</w:t>
+      </w:r>
+    </w:p>
+    <w:p>
+      <w:pPr>
         <w:pStyle w:val="Normal"/>
       </w:pPr>
       <w:r>
@@ -2756,6 +3188,22 @@
     </w:p>
     <w:p>
       <w:pPr>
+        <w:pStyle w:val="Heading2"/>
+      </w:pPr>
+      <w:r>
+        <w:t xml:space="preserve">Week 5 outlook</w:t>
+      </w:r>
+    </w:p>
+    <w:p>
+      <w:pPr>
+        <w:pStyle w:val="Normal"/>
+      </w:pPr>
+      <w:r>
+        <w:t xml:space="preserve">Weekly overall model rank 40 (WR11). ROS overall rank 28 (WR12). Availability: UNKNOWN. Weekly ranks are preliminary when playing status is unconfirmed; they are separate from season ranks.</w:t>
+      </w:r>
+    </w:p>
+    <w:p>
+      <w:pPr>
         <w:pStyle w:val="Normal"/>
       </w:pPr>
       <w:r>
@@ -2860,6 +3308,22 @@
     </w:p>
     <w:p>
       <w:pPr>
+        <w:pStyle w:val="Heading2"/>
+      </w:pPr>
+      <w:r>
+        <w:t xml:space="preserve">Week 5 outlook</w:t>
+      </w:r>
+    </w:p>
+    <w:p>
+      <w:pPr>
+        <w:pStyle w:val="Normal"/>
+      </w:pPr>
+      <w:r>
+        <w:t xml:space="preserve">Weekly overall model rank 32 (WR10). ROS overall rank 29 (WR13). Availability: UNKNOWN. Weekly ranks are preliminary when playing status is unconfirmed; they are separate from season ranks.</w:t>
+      </w:r>
+    </w:p>
+    <w:p>
+      <w:pPr>
         <w:pStyle w:val="Normal"/>
       </w:pPr>
       <w:r>
@@ -2964,6 +3428,22 @@
     </w:p>
     <w:p>
       <w:pPr>
+        <w:pStyle w:val="Heading2"/>
+      </w:pPr>
+      <w:r>
+        <w:t xml:space="preserve">Week 5 outlook</w:t>
+      </w:r>
+    </w:p>
+    <w:p>
+      <w:pPr>
+        <w:pStyle w:val="Normal"/>
+      </w:pPr>
+      <w:r>
+        <w:t xml:space="preserve">Weekly overall model rank 56 (WR16). ROS overall rank 30 (WR14). Availability: UNKNOWN. Weekly ranks are preliminary when playing status is unconfirmed; they are separate from season ranks.</w:t>
+      </w:r>
+    </w:p>
+    <w:p>
+      <w:pPr>
         <w:pStyle w:val="Normal"/>
       </w:pPr>
       <w:r>
@@ -3068,6 +3548,22 @@
     </w:p>
     <w:p>
       <w:pPr>
+        <w:pStyle w:val="Heading2"/>
+      </w:pPr>
+      <w:r>
+        <w:t xml:space="preserve">Week 5 outlook</w:t>
+      </w:r>
+    </w:p>
+    <w:p>
+      <w:pPr>
+        <w:pStyle w:val="Normal"/>
+      </w:pPr>
+      <w:r>
+        <w:t xml:space="preserve">Weekly overall model rank 2 (QB1). ROS overall rank 31 (QB1). Availability: UNKNOWN. Weekly ranks are preliminary when playing status is unconfirmed; they are separate from season ranks.</w:t>
+      </w:r>
+    </w:p>
+    <w:p>
+      <w:pPr>
         <w:pStyle w:val="Normal"/>
       </w:pPr>
       <w:r>
@@ -3172,6 +3668,22 @@
     </w:p>
     <w:p>
       <w:pPr>
+        <w:pStyle w:val="Heading2"/>
+      </w:pPr>
+      <w:r>
+        <w:t xml:space="preserve">Week 5 outlook</w:t>
+      </w:r>
+    </w:p>
+    <w:p>
+      <w:pPr>
+        <w:pStyle w:val="Normal"/>
+      </w:pPr>
+      <w:r>
+        <w:t xml:space="preserve">Weekly overall model rank 53 (WR14). ROS overall rank 32 (WR15). Availability: UNKNOWN. Weekly ranks are preliminary when playing status is unconfirmed; they are separate from season ranks.</w:t>
+      </w:r>
+    </w:p>
+    <w:p>
+      <w:pPr>
         <w:pStyle w:val="Normal"/>
       </w:pPr>
       <w:r>
@@ -3276,6 +3788,22 @@
     </w:p>
     <w:p>
       <w:pPr>
+        <w:pStyle w:val="Heading2"/>
+      </w:pPr>
+      <w:r>
+        <w:t xml:space="preserve">Week 5 outlook</w:t>
+      </w:r>
+    </w:p>
+    <w:p>
+      <w:pPr>
+        <w:pStyle w:val="Normal"/>
+      </w:pPr>
+      <w:r>
+        <w:t xml:space="preserve">Weekly overall model rank 64 (WR20). ROS overall rank 33 (WR16). Availability: UNKNOWN. Weekly ranks are preliminary when playing status is unconfirmed; they are separate from season ranks.</w:t>
+      </w:r>
+    </w:p>
+    <w:p>
+      <w:pPr>
         <w:pStyle w:val="Normal"/>
       </w:pPr>
       <w:r>
@@ -3380,6 +3908,22 @@
     </w:p>
     <w:p>
       <w:pPr>
+        <w:pStyle w:val="Heading2"/>
+      </w:pPr>
+      <w:r>
+        <w:t xml:space="preserve">Week 5 outlook</w:t>
+      </w:r>
+    </w:p>
+    <w:p>
+      <w:pPr>
+        <w:pStyle w:val="Normal"/>
+      </w:pPr>
+      <w:r>
+        <w:t xml:space="preserve">Weekly overall model rank 55 (WR15). ROS overall rank 34 (WR17). Availability: UNKNOWN. Weekly ranks are preliminary when playing status is unconfirmed; they are separate from season ranks.</w:t>
+      </w:r>
+    </w:p>
+    <w:p>
+      <w:pPr>
         <w:pStyle w:val="Normal"/>
       </w:pPr>
       <w:r>
@@ -3484,6 +4028,22 @@
     </w:p>
     <w:p>
       <w:pPr>
+        <w:pStyle w:val="Heading2"/>
+      </w:pPr>
+      <w:r>
+        <w:t xml:space="preserve">Week 5 outlook</w:t>
+      </w:r>
+    </w:p>
+    <w:p>
+      <w:pPr>
+        <w:pStyle w:val="Normal"/>
+      </w:pPr>
+      <w:r>
+        <w:t xml:space="preserve">Weekly overall model rank 25 (WR8). ROS overall rank 35 (WR18). Availability: UNKNOWN. Weekly ranks are preliminary when playing status is unconfirmed; they are separate from season ranks.</w:t>
+      </w:r>
+    </w:p>
+    <w:p>
+      <w:pPr>
         <w:pStyle w:val="Normal"/>
       </w:pPr>
       <w:r>
@@ -3588,6 +4148,22 @@
     </w:p>
     <w:p>
       <w:pPr>
+        <w:pStyle w:val="Heading2"/>
+      </w:pPr>
+      <w:r>
+        <w:t xml:space="preserve">Week 5 outlook</w:t>
+      </w:r>
+    </w:p>
+    <w:p>
+      <w:pPr>
+        <w:pStyle w:val="Normal"/>
+      </w:pPr>
+      <w:r>
+        <w:t xml:space="preserve">Weekly overall model rank 66 (WR21). ROS overall rank 36 (WR19). Availability: UNKNOWN. Weekly ranks are preliminary when playing status is unconfirmed; they are separate from season ranks.</w:t>
+      </w:r>
+    </w:p>
+    <w:p>
+      <w:pPr>
         <w:pStyle w:val="Normal"/>
       </w:pPr>
       <w:r>
@@ -3692,6 +4268,22 @@
     </w:p>
     <w:p>
       <w:pPr>
+        <w:pStyle w:val="Heading2"/>
+      </w:pPr>
+      <w:r>
+        <w:t xml:space="preserve">Week 5 outlook</w:t>
+      </w:r>
+    </w:p>
+    <w:p>
+      <w:pPr>
+        <w:pStyle w:val="Normal"/>
+      </w:pPr>
+      <w:r>
+        <w:t xml:space="preserve">Weekly overall model rank 67 (WR22). ROS overall rank 37 (WR20). Availability: UNKNOWN. Weekly ranks are preliminary when playing status is unconfirmed; they are separate from season ranks.</w:t>
+      </w:r>
+    </w:p>
+    <w:p>
+      <w:pPr>
         <w:pStyle w:val="Normal"/>
       </w:pPr>
       <w:r>
@@ -3796,6 +4388,22 @@
     </w:p>
     <w:p>
       <w:pPr>
+        <w:pStyle w:val="Heading2"/>
+      </w:pPr>
+      <w:r>
+        <w:t xml:space="preserve">Week 5 outlook</w:t>
+      </w:r>
+    </w:p>
+    <w:p>
+      <w:pPr>
+        <w:pStyle w:val="Normal"/>
+      </w:pPr>
+      <w:r>
+        <w:t xml:space="preserve">Weekly overall model rank 74 (WR25). ROS overall rank 38 (WR21). Availability: UNKNOWN. Weekly ranks are preliminary when playing status is unconfirmed; they are separate from season ranks.</w:t>
+      </w:r>
+    </w:p>
+    <w:p>
+      <w:pPr>
         <w:pStyle w:val="Normal"/>
       </w:pPr>
       <w:r>
@@ -3900,6 +4508,22 @@
     </w:p>
     <w:p>
       <w:pPr>
+        <w:pStyle w:val="Heading2"/>
+      </w:pPr>
+      <w:r>
+        <w:t xml:space="preserve">Week 5 outlook</w:t>
+      </w:r>
+    </w:p>
+    <w:p>
+      <w:pPr>
+        <w:pStyle w:val="Normal"/>
+      </w:pPr>
+      <w:r>
+        <w:t xml:space="preserve">Weekly overall model rank 7 (QB3). ROS overall rank 39 (QB2). Availability: UNKNOWN. Weekly ranks are preliminary when playing status is unconfirmed; they are separate from season ranks.</w:t>
+      </w:r>
+    </w:p>
+    <w:p>
+      <w:pPr>
         <w:pStyle w:val="Normal"/>
       </w:pPr>
       <w:r>
@@ -4004,6 +4628,22 @@
     </w:p>
     <w:p>
       <w:pPr>
+        <w:pStyle w:val="Heading2"/>
+      </w:pPr>
+      <w:r>
+        <w:t xml:space="preserve">Week 5 outlook</w:t>
+      </w:r>
+    </w:p>
+    <w:p>
+      <w:pPr>
+        <w:pStyle w:val="Normal"/>
+      </w:pPr>
+      <w:r>
+        <w:t xml:space="preserve">Weekly overall model rank 8 (QB4). ROS overall rank 40 (QB3). Availability: UNKNOWN. Weekly ranks are preliminary when playing status is unconfirmed; they are separate from season ranks.</w:t>
+      </w:r>
+    </w:p>
+    <w:p>
+      <w:pPr>
         <w:pStyle w:val="Normal"/>
       </w:pPr>
       <w:r>
@@ -4108,6 +4748,22 @@
     </w:p>
     <w:p>
       <w:pPr>
+        <w:pStyle w:val="Heading2"/>
+      </w:pPr>
+      <w:r>
+        <w:t xml:space="preserve">Week 5 outlook</w:t>
+      </w:r>
+    </w:p>
+    <w:p>
+      <w:pPr>
+        <w:pStyle w:val="Normal"/>
+      </w:pPr>
+      <w:r>
+        <w:t xml:space="preserve">Weekly overall model rank 52 (TE3). ROS overall rank 41 (TE3). Availability: UNKNOWN. Weekly ranks are preliminary when playing status is unconfirmed; they are separate from season ranks.</w:t>
+      </w:r>
+    </w:p>
+    <w:p>
+      <w:pPr>
         <w:pStyle w:val="Normal"/>
       </w:pPr>
       <w:r>
@@ -4212,6 +4868,22 @@
     </w:p>
     <w:p>
       <w:pPr>
+        <w:pStyle w:val="Heading2"/>
+      </w:pPr>
+      <w:r>
+        <w:t xml:space="preserve">Week 5 outlook</w:t>
+      </w:r>
+    </w:p>
+    <w:p>
+      <w:pPr>
+        <w:pStyle w:val="Normal"/>
+      </w:pPr>
+      <w:r>
+        <w:t xml:space="preserve">Weekly overall model rank 63 (WR19). ROS overall rank 42 (WR22). Availability: UNKNOWN. Weekly ranks are preliminary when playing status is unconfirmed; they are separate from season ranks.</w:t>
+      </w:r>
+    </w:p>
+    <w:p>
+      <w:pPr>
         <w:pStyle w:val="Normal"/>
       </w:pPr>
       <w:r>
@@ -4316,6 +4988,22 @@
     </w:p>
     <w:p>
       <w:pPr>
+        <w:pStyle w:val="Heading2"/>
+      </w:pPr>
+      <w:r>
+        <w:t xml:space="preserve">Week 5 outlook</w:t>
+      </w:r>
+    </w:p>
+    <w:p>
+      <w:pPr>
+        <w:pStyle w:val="Normal"/>
+      </w:pPr>
+      <w:r>
+        <w:t xml:space="preserve">Weekly overall model rank 70 (WR24). ROS overall rank 43 (WR23). Availability: UNKNOWN. Weekly ranks are preliminary when playing status is unconfirmed; they are separate from season ranks.</w:t>
+      </w:r>
+    </w:p>
+    <w:p>
+      <w:pPr>
         <w:pStyle w:val="Normal"/>
       </w:pPr>
       <w:r>
@@ -4420,6 +5108,22 @@
     </w:p>
     <w:p>
       <w:pPr>
+        <w:pStyle w:val="Heading2"/>
+      </w:pPr>
+      <w:r>
+        <w:t xml:space="preserve">Week 5 outlook</w:t>
+      </w:r>
+    </w:p>
+    <w:p>
+      <w:pPr>
+        <w:pStyle w:val="Normal"/>
+      </w:pPr>
+      <w:r>
+        <w:t xml:space="preserve">Weekly overall model rank 60 (WR18). ROS overall rank 44 (WR24). Availability: UNKNOWN. Weekly ranks are preliminary when playing status is unconfirmed; they are separate from season ranks.</w:t>
+      </w:r>
+    </w:p>
+    <w:p>
+      <w:pPr>
         <w:pStyle w:val="Normal"/>
       </w:pPr>
       <w:r>
@@ -4524,6 +5228,22 @@
     </w:p>
     <w:p>
       <w:pPr>
+        <w:pStyle w:val="Heading2"/>
+      </w:pPr>
+      <w:r>
+        <w:t xml:space="preserve">Week 5 outlook</w:t>
+      </w:r>
+    </w:p>
+    <w:p>
+      <w:pPr>
+        <w:pStyle w:val="Normal"/>
+      </w:pPr>
+      <w:r>
+        <w:t xml:space="preserve">Weekly overall model rank 82 (WR29). ROS overall rank 45 (WR25). Availability: UNKNOWN. Weekly ranks are preliminary when playing status is unconfirmed; they are separate from season ranks.</w:t>
+      </w:r>
+    </w:p>
+    <w:p>
+      <w:pPr>
         <w:pStyle w:val="Normal"/>
       </w:pPr>
       <w:r>
@@ -4628,6 +5348,22 @@
     </w:p>
     <w:p>
       <w:pPr>
+        <w:pStyle w:val="Heading2"/>
+      </w:pPr>
+      <w:r>
+        <w:t xml:space="preserve">Week 5 outlook</w:t>
+      </w:r>
+    </w:p>
+    <w:p>
+      <w:pPr>
+        <w:pStyle w:val="Normal"/>
+      </w:pPr>
+      <w:r>
+        <w:t xml:space="preserve">Weekly overall model rank 73 (TE5). ROS overall rank 46 (TE4). Availability: UNKNOWN. Weekly ranks are preliminary when playing status is unconfirmed; they are separate from season ranks.</w:t>
+      </w:r>
+    </w:p>
+    <w:p>
+      <w:pPr>
         <w:pStyle w:val="Normal"/>
       </w:pPr>
       <w:r>
@@ -4732,6 +5468,22 @@
     </w:p>
     <w:p>
       <w:pPr>
+        <w:pStyle w:val="Heading2"/>
+      </w:pPr>
+      <w:r>
+        <w:t xml:space="preserve">Week 5 outlook</w:t>
+      </w:r>
+    </w:p>
+    <w:p>
+      <w:pPr>
+        <w:pStyle w:val="Normal"/>
+      </w:pPr>
+      <w:r>
+        <w:t xml:space="preserve">Weekly overall model rank 61 (RB15). ROS overall rank 47 (RB15). Availability: UNKNOWN. Weekly ranks are preliminary when playing status is unconfirmed; they are separate from season ranks.</w:t>
+      </w:r>
+    </w:p>
+    <w:p>
+      <w:pPr>
         <w:pStyle w:val="Normal"/>
       </w:pPr>
       <w:r>
@@ -4836,6 +5588,22 @@
     </w:p>
     <w:p>
       <w:pPr>
+        <w:pStyle w:val="Heading2"/>
+      </w:pPr>
+      <w:r>
+        <w:t xml:space="preserve">Week 5 outlook</w:t>
+      </w:r>
+    </w:p>
+    <w:p>
+      <w:pPr>
+        <w:pStyle w:val="Normal"/>
+      </w:pPr>
+      <w:r>
+        <w:t xml:space="preserve">Weekly overall model rank 79 (RB20). ROS overall rank 48 (RB16). Availability: UNKNOWN. Weekly ranks are preliminary when playing status is unconfirmed; they are separate from season ranks.</w:t>
+      </w:r>
+    </w:p>
+    <w:p>
+      <w:pPr>
         <w:pStyle w:val="Normal"/>
       </w:pPr>
       <w:r>
@@ -4940,6 +5708,22 @@
     </w:p>
     <w:p>
       <w:pPr>
+        <w:pStyle w:val="Heading2"/>
+      </w:pPr>
+      <w:r>
+        <w:t xml:space="preserve">Week 5 outlook</w:t>
+      </w:r>
+    </w:p>
+    <w:p>
+      <w:pPr>
+        <w:pStyle w:val="Normal"/>
+      </w:pPr>
+      <w:r>
+        <w:t xml:space="preserve">Weekly overall model rank 65 (RB16). ROS overall rank 49 (RB17). Availability: UNKNOWN. Weekly ranks are preliminary when playing status is unconfirmed; they are separate from season ranks.</w:t>
+      </w:r>
+    </w:p>
+    <w:p>
+      <w:pPr>
         <w:pStyle w:val="Normal"/>
       </w:pPr>
       <w:r>
@@ -5044,6 +5828,22 @@
     </w:p>
     <w:p>
       <w:pPr>
+        <w:pStyle w:val="Heading2"/>
+      </w:pPr>
+      <w:r>
+        <w:t xml:space="preserve">Week 5 outlook</w:t>
+      </w:r>
+    </w:p>
+    <w:p>
+      <w:pPr>
+        <w:pStyle w:val="Normal"/>
+      </w:pPr>
+      <w:r>
+        <w:t xml:space="preserve">Weekly overall model rank 85 (WR31). ROS overall rank 50 (WR26). Availability: UNKNOWN. Weekly ranks are preliminary when playing status is unconfirmed; they are separate from season ranks.</w:t>
+      </w:r>
+    </w:p>
+    <w:p>
+      <w:pPr>
         <w:pStyle w:val="Normal"/>
       </w:pPr>
       <w:r>
@@ -5148,6 +5948,22 @@
     </w:p>
     <w:p>
       <w:pPr>
+        <w:pStyle w:val="Heading2"/>
+      </w:pPr>
+      <w:r>
+        <w:t xml:space="preserve">Week 5 outlook</w:t>
+      </w:r>
+    </w:p>
+    <w:p>
+      <w:pPr>
+        <w:pStyle w:val="Normal"/>
+      </w:pPr>
+      <w:r>
+        <w:t xml:space="preserve">Weekly overall model rank 109 (WR42). ROS overall rank 51 (WR27). Availability: UNKNOWN. Weekly ranks are preliminary when playing status is unconfirmed; they are separate from season ranks.</w:t>
+      </w:r>
+    </w:p>
+    <w:p>
+      <w:pPr>
         <w:pStyle w:val="Normal"/>
       </w:pPr>
       <w:r>
@@ -5252,6 +6068,22 @@
     </w:p>
     <w:p>
       <w:pPr>
+        <w:pStyle w:val="Heading2"/>
+      </w:pPr>
+      <w:r>
+        <w:t xml:space="preserve">Week 5 outlook</w:t>
+      </w:r>
+    </w:p>
+    <w:p>
+      <w:pPr>
+        <w:pStyle w:val="Normal"/>
+      </w:pPr>
+      <w:r>
+        <w:t xml:space="preserve">Weekly overall model rank 34 (QB14). ROS overall rank 52 (QB4). Availability: UNKNOWN. Weekly ranks are preliminary when playing status is unconfirmed; they are separate from season ranks.</w:t>
+      </w:r>
+    </w:p>
+    <w:p>
+      <w:pPr>
         <w:pStyle w:val="Normal"/>
       </w:pPr>
       <w:r>
@@ -5356,6 +6188,22 @@
     </w:p>
     <w:p>
       <w:pPr>
+        <w:pStyle w:val="Heading2"/>
+      </w:pPr>
+      <w:r>
+        <w:t xml:space="preserve">Week 5 outlook</w:t>
+      </w:r>
+    </w:p>
+    <w:p>
+      <w:pPr>
+        <w:pStyle w:val="Normal"/>
+      </w:pPr>
+      <w:r>
+        <w:t xml:space="preserve">Weekly overall model rank 10 (QB5). ROS overall rank 53 (QB5). Availability: UNKNOWN. Weekly ranks are preliminary when playing status is unconfirmed; they are separate from season ranks.</w:t>
+      </w:r>
+    </w:p>
+    <w:p>
+      <w:pPr>
         <w:pStyle w:val="Normal"/>
       </w:pPr>
       <w:r>
@@ -5460,6 +6308,22 @@
     </w:p>
     <w:p>
       <w:pPr>
+        <w:pStyle w:val="Heading2"/>
+      </w:pPr>
+      <w:r>
+        <w:t xml:space="preserve">Week 5 outlook</w:t>
+      </w:r>
+    </w:p>
+    <w:p>
+      <w:pPr>
+        <w:pStyle w:val="Normal"/>
+      </w:pPr>
+      <w:r>
+        <w:t xml:space="preserve">Weekly overall model rank 75 (RB18). ROS overall rank 54 (RB18). Availability: UNKNOWN. Weekly ranks are preliminary when playing status is unconfirmed; they are separate from season ranks.</w:t>
+      </w:r>
+    </w:p>
+    <w:p>
+      <w:pPr>
         <w:pStyle w:val="Normal"/>
       </w:pPr>
       <w:r>
@@ -5564,6 +6428,22 @@
     </w:p>
     <w:p>
       <w:pPr>
+        <w:pStyle w:val="Heading2"/>
+      </w:pPr>
+      <w:r>
+        <w:t xml:space="preserve">Week 5 outlook</w:t>
+      </w:r>
+    </w:p>
+    <w:p>
+      <w:pPr>
+        <w:pStyle w:val="Normal"/>
+      </w:pPr>
+      <w:r>
+        <w:t xml:space="preserve">Weekly overall model rank 78 (RB19). ROS overall rank 55 (RB19). Availability: UNKNOWN. Weekly ranks are preliminary when playing status is unconfirmed; they are separate from season ranks.</w:t>
+      </w:r>
+    </w:p>
+    <w:p>
+      <w:pPr>
         <w:pStyle w:val="Normal"/>
       </w:pPr>
       <w:r>
@@ -5668,6 +6548,22 @@
     </w:p>
     <w:p>
       <w:pPr>
+        <w:pStyle w:val="Heading2"/>
+      </w:pPr>
+      <w:r>
+        <w:t xml:space="preserve">Week 5 outlook</w:t>
+      </w:r>
+    </w:p>
+    <w:p>
+      <w:pPr>
+        <w:pStyle w:val="Normal"/>
+      </w:pPr>
+      <w:r>
+        <w:t xml:space="preserve">Weekly overall model rank 69 (WR23). ROS overall rank 56 (WR28). Availability: UNKNOWN. Weekly ranks are preliminary when playing status is unconfirmed; they are separate from season ranks.</w:t>
+      </w:r>
+    </w:p>
+    <w:p>
+      <w:pPr>
         <w:pStyle w:val="Normal"/>
       </w:pPr>
       <w:r>
@@ -5772,6 +6668,22 @@
     </w:p>
     <w:p>
       <w:pPr>
+        <w:pStyle w:val="Heading2"/>
+      </w:pPr>
+      <w:r>
+        <w:t xml:space="preserve">Week 5 outlook</w:t>
+      </w:r>
+    </w:p>
+    <w:p>
+      <w:pPr>
+        <w:pStyle w:val="Normal"/>
+      </w:pPr>
+      <w:r>
+        <w:t xml:space="preserve">Weekly overall model rank 39 (QB16). ROS overall rank 57 (QB6). Availability: UNKNOWN. Weekly ranks are preliminary when playing status is unconfirmed; they are separate from season ranks.</w:t>
+      </w:r>
+    </w:p>
+    <w:p>
+      <w:pPr>
         <w:pStyle w:val="Normal"/>
       </w:pPr>
       <w:r>
@@ -5876,6 +6788,22 @@
     </w:p>
     <w:p>
       <w:pPr>
+        <w:pStyle w:val="Heading2"/>
+      </w:pPr>
+      <w:r>
+        <w:t xml:space="preserve">Week 5 outlook</w:t>
+      </w:r>
+    </w:p>
+    <w:p>
+      <w:pPr>
+        <w:pStyle w:val="Normal"/>
+      </w:pPr>
+      <w:r>
+        <w:t xml:space="preserve">Weekly overall model rank 42 (QB18). ROS overall rank 58 (QB7). Availability: UNKNOWN. Weekly ranks are preliminary when playing status is unconfirmed; they are separate from season ranks.</w:t>
+      </w:r>
+    </w:p>
+    <w:p>
+      <w:pPr>
         <w:pStyle w:val="Normal"/>
       </w:pPr>
       <w:r>
@@ -5980,6 +6908,22 @@
     </w:p>
     <w:p>
       <w:pPr>
+        <w:pStyle w:val="Heading2"/>
+      </w:pPr>
+      <w:r>
+        <w:t xml:space="preserve">Week 5 outlook</w:t>
+      </w:r>
+    </w:p>
+    <w:p>
+      <w:pPr>
+        <w:pStyle w:val="Normal"/>
+      </w:pPr>
+      <w:r>
+        <w:t xml:space="preserve">Weekly overall model rank 41 (QB17). ROS overall rank 59 (QB8). Availability: UNKNOWN. Weekly ranks are preliminary when playing status is unconfirmed; they are separate from season ranks.</w:t>
+      </w:r>
+    </w:p>
+    <w:p>
+      <w:pPr>
         <w:pStyle w:val="Normal"/>
       </w:pPr>
       <w:r>
@@ -6084,6 +7028,22 @@
     </w:p>
     <w:p>
       <w:pPr>
+        <w:pStyle w:val="Heading2"/>
+      </w:pPr>
+      <w:r>
+        <w:t xml:space="preserve">Week 5 outlook</w:t>
+      </w:r>
+    </w:p>
+    <w:p>
+      <w:pPr>
+        <w:pStyle w:val="Normal"/>
+      </w:pPr>
+      <w:r>
+        <w:t xml:space="preserve">Weekly overall model rank 105 (WR39). ROS overall rank 60 (WR29). Availability: UNKNOWN. Weekly ranks are preliminary when playing status is unconfirmed; they are separate from season ranks.</w:t>
+      </w:r>
+    </w:p>
+    <w:p>
+      <w:pPr>
         <w:pStyle w:val="Normal"/>
       </w:pPr>
       <w:r>
@@ -6188,6 +7148,22 @@
     </w:p>
     <w:p>
       <w:pPr>
+        <w:pStyle w:val="Heading2"/>
+      </w:pPr>
+      <w:r>
+        <w:t xml:space="preserve">Week 5 outlook</w:t>
+      </w:r>
+    </w:p>
+    <w:p>
+      <w:pPr>
+        <w:pStyle w:val="Normal"/>
+      </w:pPr>
+      <w:r>
+        <w:t xml:space="preserve">Weekly overall model rank 71 (RB17). ROS overall rank 61 (RB20). Availability: UNKNOWN. Weekly ranks are preliminary when playing status is unconfirmed; they are separate from season ranks.</w:t>
+      </w:r>
+    </w:p>
+    <w:p>
+      <w:pPr>
         <w:pStyle w:val="Normal"/>
       </w:pPr>
       <w:r>
@@ -6292,6 +7268,22 @@
     </w:p>
     <w:p>
       <w:pPr>
+        <w:pStyle w:val="Heading2"/>
+      </w:pPr>
+      <w:r>
+        <w:t xml:space="preserve">Week 5 outlook</w:t>
+      </w:r>
+    </w:p>
+    <w:p>
+      <w:pPr>
+        <w:pStyle w:val="Normal"/>
+      </w:pPr>
+      <w:r>
+        <w:t xml:space="preserve">Weekly overall model rank 86 (TE7). ROS overall rank 62 (TE5). Availability: UNKNOWN. Weekly ranks are preliminary when playing status is unconfirmed; they are separate from season ranks.</w:t>
+      </w:r>
+    </w:p>
+    <w:p>
+      <w:pPr>
         <w:pStyle w:val="Normal"/>
       </w:pPr>
       <w:r>
@@ -6364,6 +7356,22 @@
     </w:p>
     <w:p>
       <w:pPr>
+        <w:pStyle w:val="Heading2"/>
+      </w:pPr>
+      <w:r>
+        <w:t xml:space="preserve">Week 5 outlook</w:t>
+      </w:r>
+    </w:p>
+    <w:p>
+      <w:pPr>
+        <w:pStyle w:val="Normal"/>
+      </w:pPr>
+      <w:r>
+        <w:t xml:space="preserve">Weekly overall model rank 112 (RB23). ROS overall rank 63 (RB21). Availability: UNKNOWN. Weekly ranks are preliminary when playing status is unconfirmed; they are separate from season ranks.</w:t>
+      </w:r>
+    </w:p>
+    <w:p>
+      <w:pPr>
         <w:pStyle w:val="Normal"/>
       </w:pPr>
       <w:r>
@@ -6468,6 +7476,22 @@
     </w:p>
     <w:p>
       <w:pPr>
+        <w:pStyle w:val="Heading2"/>
+      </w:pPr>
+      <w:r>
+        <w:t xml:space="preserve">Week 5 outlook</w:t>
+      </w:r>
+    </w:p>
+    <w:p>
+      <w:pPr>
+        <w:pStyle w:val="Normal"/>
+      </w:pPr>
+      <w:r>
+        <w:t xml:space="preserve">Weekly overall model rank 133 (RB31). ROS overall rank 64 (RB22). Availability: UNKNOWN. Weekly ranks are preliminary when playing status is unconfirmed; they are separate from season ranks.</w:t>
+      </w:r>
+    </w:p>
+    <w:p>
+      <w:pPr>
         <w:pStyle w:val="Normal"/>
       </w:pPr>
       <w:r>
@@ -6572,6 +7596,22 @@
     </w:p>
     <w:p>
       <w:pPr>
+        <w:pStyle w:val="Heading2"/>
+      </w:pPr>
+      <w:r>
+        <w:t xml:space="preserve">Week 5 outlook</w:t>
+      </w:r>
+    </w:p>
+    <w:p>
+      <w:pPr>
+        <w:pStyle w:val="Normal"/>
+      </w:pPr>
+      <w:r>
+        <w:t xml:space="preserve">Weekly overall model rank 49 (QB21). ROS overall rank 65 (QB9). Availability: UNKNOWN. Weekly ranks are preliminary when playing status is unconfirmed; they are separate from season ranks.</w:t>
+      </w:r>
+    </w:p>
+    <w:p>
+      <w:pPr>
         <w:pStyle w:val="Normal"/>
       </w:pPr>
       <w:r>
@@ -6676,6 +7716,22 @@
     </w:p>
     <w:p>
       <w:pPr>
+        <w:pStyle w:val="Heading2"/>
+      </w:pPr>
+      <w:r>
+        <w:t xml:space="preserve">Week 5 outlook</w:t>
+      </w:r>
+    </w:p>
+    <w:p>
+      <w:pPr>
+        <w:pStyle w:val="Normal"/>
+      </w:pPr>
+      <w:r>
+        <w:t xml:space="preserve">Weekly overall model rank 106 (WR40). ROS overall rank 66 (WR30). Availability: UNKNOWN. Weekly ranks are preliminary when playing status is unconfirmed; they are separate from season ranks.</w:t>
+      </w:r>
+    </w:p>
+    <w:p>
+      <w:pPr>
         <w:pStyle w:val="Normal"/>
       </w:pPr>
       <w:r>
@@ -6780,6 +7836,22 @@
     </w:p>
     <w:p>
       <w:pPr>
+        <w:pStyle w:val="Heading2"/>
+      </w:pPr>
+      <w:r>
+        <w:t xml:space="preserve">Week 5 outlook</w:t>
+      </w:r>
+    </w:p>
+    <w:p>
+      <w:pPr>
+        <w:pStyle w:val="Normal"/>
+      </w:pPr>
+      <w:r>
+        <w:t xml:space="preserve">Weekly overall model rank 98 (WR36). ROS overall rank 67 (WR31). Availability: UNKNOWN. Weekly ranks are preliminary when playing status is unconfirmed; they are separate from season ranks.</w:t>
+      </w:r>
+    </w:p>
+    <w:p>
+      <w:pPr>
         <w:pStyle w:val="Normal"/>
       </w:pPr>
       <w:r>
@@ -6884,6 +7956,22 @@
     </w:p>
     <w:p>
       <w:pPr>
+        <w:pStyle w:val="Heading2"/>
+      </w:pPr>
+      <w:r>
+        <w:t xml:space="preserve">Week 5 outlook</w:t>
+      </w:r>
+    </w:p>
+    <w:p>
+      <w:pPr>
+        <w:pStyle w:val="Normal"/>
+      </w:pPr>
+      <w:r>
+        <w:t xml:space="preserve">Weekly overall model rank 101 (TE14). ROS overall rank 68 (TE6). Availability: UNKNOWN. Weekly ranks are preliminary when playing status is unconfirmed; they are separate from season ranks.</w:t>
+      </w:r>
+    </w:p>
+    <w:p>
+      <w:pPr>
         <w:pStyle w:val="Normal"/>
       </w:pPr>
       <w:r>
@@ -6988,6 +8076,22 @@
     </w:p>
     <w:p>
       <w:pPr>
+        <w:pStyle w:val="Heading2"/>
+      </w:pPr>
+      <w:r>
+        <w:t xml:space="preserve">Week 5 outlook</w:t>
+      </w:r>
+    </w:p>
+    <w:p>
+      <w:pPr>
+        <w:pStyle w:val="Normal"/>
+      </w:pPr>
+      <w:r>
+        <w:t xml:space="preserve">Weekly overall model rank 23 (QB8). ROS overall rank 69 (QB10). Availability: UNKNOWN. Weekly ranks are preliminary when playing status is unconfirmed; they are separate from season ranks.</w:t>
+      </w:r>
+    </w:p>
+    <w:p>
+      <w:pPr>
         <w:pStyle w:val="Normal"/>
       </w:pPr>
       <w:r>
@@ -7092,6 +8196,22 @@
     </w:p>
     <w:p>
       <w:pPr>
+        <w:pStyle w:val="Heading2"/>
+      </w:pPr>
+      <w:r>
+        <w:t xml:space="preserve">Week 5 outlook</w:t>
+      </w:r>
+    </w:p>
+    <w:p>
+      <w:pPr>
+        <w:pStyle w:val="Normal"/>
+      </w:pPr>
+      <w:r>
+        <w:t xml:space="preserve">Weekly overall model rank 24 (QB9). ROS overall rank 70 (QB11). Availability: UNKNOWN. Weekly ranks are preliminary when playing status is unconfirmed; they are separate from season ranks.</w:t>
+      </w:r>
+    </w:p>
+    <w:p>
+      <w:pPr>
         <w:pStyle w:val="Normal"/>
       </w:pPr>
       <w:r>
@@ -7196,6 +8316,22 @@
     </w:p>
     <w:p>
       <w:pPr>
+        <w:pStyle w:val="Heading2"/>
+      </w:pPr>
+      <w:r>
+        <w:t xml:space="preserve">Week 5 outlook</w:t>
+      </w:r>
+    </w:p>
+    <w:p>
+      <w:pPr>
+        <w:pStyle w:val="Normal"/>
+      </w:pPr>
+      <w:r>
+        <w:t xml:space="preserve">Weekly overall model rank 16 (QB6). ROS overall rank 71 (QB12). Availability: UNKNOWN. Weekly ranks are preliminary when playing status is unconfirmed; they are separate from season ranks.</w:t>
+      </w:r>
+    </w:p>
+    <w:p>
+      <w:pPr>
         <w:pStyle w:val="Normal"/>
       </w:pPr>
       <w:r>
@@ -7300,6 +8436,22 @@
     </w:p>
     <w:p>
       <w:pPr>
+        <w:pStyle w:val="Heading2"/>
+      </w:pPr>
+      <w:r>
+        <w:t xml:space="preserve">Week 5 outlook</w:t>
+      </w:r>
+    </w:p>
+    <w:p>
+      <w:pPr>
+        <w:pStyle w:val="Normal"/>
+      </w:pPr>
+      <w:r>
+        <w:t xml:space="preserve">Weekly overall model rank 80 (WR27). ROS overall rank 72 (WR32). Availability: UNKNOWN. Weekly ranks are preliminary when playing status is unconfirmed; they are separate from season ranks.</w:t>
+      </w:r>
+    </w:p>
+    <w:p>
+      <w:pPr>
         <w:pStyle w:val="Normal"/>
       </w:pPr>
       <w:r>
@@ -7404,6 +8556,22 @@
     </w:p>
     <w:p>
       <w:pPr>
+        <w:pStyle w:val="Heading2"/>
+      </w:pPr>
+      <w:r>
+        <w:t xml:space="preserve">Week 5 outlook</w:t>
+      </w:r>
+    </w:p>
+    <w:p>
+      <w:pPr>
+        <w:pStyle w:val="Normal"/>
+      </w:pPr>
+      <w:r>
+        <w:t xml:space="preserve">Weekly overall model rank 76 (WR26). ROS overall rank 73 (WR33). Availability: UNKNOWN. Weekly ranks are preliminary when playing status is unconfirmed; they are separate from season ranks.</w:t>
+      </w:r>
+    </w:p>
+    <w:p>
+      <w:pPr>
         <w:pStyle w:val="Normal"/>
       </w:pPr>
       <w:r>
@@ -7508,6 +8676,22 @@
     </w:p>
     <w:p>
       <w:pPr>
+        <w:pStyle w:val="Heading2"/>
+      </w:pPr>
+      <w:r>
+        <w:t xml:space="preserve">Week 5 outlook</w:t>
+      </w:r>
+    </w:p>
+    <w:p>
+      <w:pPr>
+        <w:pStyle w:val="Normal"/>
+      </w:pPr>
+      <w:r>
+        <w:t xml:space="preserve">Weekly overall model rank 186 (WR70). ROS overall rank 74 (WR34). Availability: EXPECTED_INACTIVE. Weekly ranks are preliminary when playing status is unconfirmed; they are separate from season ranks.</w:t>
+      </w:r>
+    </w:p>
+    <w:p>
+      <w:pPr>
         <w:pStyle w:val="Normal"/>
       </w:pPr>
       <w:r>
@@ -7612,6 +8796,22 @@
     </w:p>
     <w:p>
       <w:pPr>
+        <w:pStyle w:val="Heading2"/>
+      </w:pPr>
+      <w:r>
+        <w:t xml:space="preserve">Week 5 outlook</w:t>
+      </w:r>
+    </w:p>
+    <w:p>
+      <w:pPr>
+        <w:pStyle w:val="Normal"/>
+      </w:pPr>
+      <w:r>
+        <w:t xml:space="preserve">Weekly overall model rank 57 (WR17). ROS overall rank 75 (WR35). Availability: EXPECTED_ACTIVE. Weekly ranks are preliminary when playing status is unconfirmed; they are separate from season ranks.</w:t>
+      </w:r>
+    </w:p>
+    <w:p>
+      <w:pPr>
         <w:pStyle w:val="Normal"/>
       </w:pPr>
       <w:r>
@@ -7716,6 +8916,22 @@
     </w:p>
     <w:p>
       <w:pPr>
+        <w:pStyle w:val="Heading2"/>
+      </w:pPr>
+      <w:r>
+        <w:t xml:space="preserve">Week 5 outlook</w:t>
+      </w:r>
+    </w:p>
+    <w:p>
+      <w:pPr>
+        <w:pStyle w:val="Normal"/>
+      </w:pPr>
+      <w:r>
+        <w:t xml:space="preserve">Weekly overall model rank 122 (WR48). ROS overall rank 76 (WR36). Availability: UNKNOWN. Weekly ranks are preliminary when playing status is unconfirmed; they are separate from season ranks.</w:t>
+      </w:r>
+    </w:p>
+    <w:p>
+      <w:pPr>
         <w:pStyle w:val="Normal"/>
       </w:pPr>
       <w:r>
@@ -7820,6 +9036,22 @@
     </w:p>
     <w:p>
       <w:pPr>
+        <w:pStyle w:val="Heading2"/>
+      </w:pPr>
+      <w:r>
+        <w:t xml:space="preserve">Week 5 outlook</w:t>
+      </w:r>
+    </w:p>
+    <w:p>
+      <w:pPr>
+        <w:pStyle w:val="Normal"/>
+      </w:pPr>
+      <w:r>
+        <w:t xml:space="preserve">Weekly overall model rank 62 (TE4). ROS overall rank 77 (TE7). Availability: UNKNOWN. Weekly ranks are preliminary when playing status is unconfirmed; they are separate from season ranks.</w:t>
+      </w:r>
+    </w:p>
+    <w:p>
+      <w:pPr>
         <w:pStyle w:val="Normal"/>
       </w:pPr>
       <w:r>
@@ -7924,6 +9156,22 @@
     </w:p>
     <w:p>
       <w:pPr>
+        <w:pStyle w:val="Heading2"/>
+      </w:pPr>
+      <w:r>
+        <w:t xml:space="preserve">Week 5 outlook</w:t>
+      </w:r>
+    </w:p>
+    <w:p>
+      <w:pPr>
+        <w:pStyle w:val="Normal"/>
+      </w:pPr>
+      <w:r>
+        <w:t xml:space="preserve">Weekly overall model rank 117 (RB27). ROS overall rank 78 (RB23). Availability: UNKNOWN. Weekly ranks are preliminary when playing status is unconfirmed; they are separate from season ranks.</w:t>
+      </w:r>
+    </w:p>
+    <w:p>
+      <w:pPr>
         <w:pStyle w:val="Normal"/>
       </w:pPr>
       <w:r>
@@ -8028,6 +9276,22 @@
     </w:p>
     <w:p>
       <w:pPr>
+        <w:pStyle w:val="Heading2"/>
+      </w:pPr>
+      <w:r>
+        <w:t xml:space="preserve">Week 5 outlook</w:t>
+      </w:r>
+    </w:p>
+    <w:p>
+      <w:pPr>
+        <w:pStyle w:val="Normal"/>
+      </w:pPr>
+      <w:r>
+        <w:t xml:space="preserve">Weekly overall model rank 141 (RB35). ROS overall rank 79 (RB24). Availability: UNKNOWN. Weekly ranks are preliminary when playing status is unconfirmed; they are separate from season ranks.</w:t>
+      </w:r>
+    </w:p>
+    <w:p>
+      <w:pPr>
         <w:pStyle w:val="Normal"/>
       </w:pPr>
       <w:r>
@@ -8132,6 +9396,22 @@
     </w:p>
     <w:p>
       <w:pPr>
+        <w:pStyle w:val="Heading2"/>
+      </w:pPr>
+      <w:r>
+        <w:t xml:space="preserve">Week 5 outlook</w:t>
+      </w:r>
+    </w:p>
+    <w:p>
+      <w:pPr>
+        <w:pStyle w:val="Normal"/>
+      </w:pPr>
+      <w:r>
+        <w:t xml:space="preserve">Weekly overall model rank 140 (RB34). ROS overall rank 80 (RB25). Availability: UNKNOWN. Weekly ranks are preliminary when playing status is unconfirmed; they are separate from season ranks.</w:t>
+      </w:r>
+    </w:p>
+    <w:p>
+      <w:pPr>
         <w:pStyle w:val="Normal"/>
       </w:pPr>
       <w:r>
@@ -8236,6 +9516,22 @@
     </w:p>
     <w:p>
       <w:pPr>
+        <w:pStyle w:val="Heading2"/>
+      </w:pPr>
+      <w:r>
+        <w:t xml:space="preserve">Week 5 outlook</w:t>
+      </w:r>
+    </w:p>
+    <w:p>
+      <w:pPr>
+        <w:pStyle w:val="Normal"/>
+      </w:pPr>
+      <w:r>
+        <w:t xml:space="preserve">Weekly overall model rank 97 (TE13). ROS overall rank 81 (TE8). Availability: UNKNOWN. Weekly ranks are preliminary when playing status is unconfirmed; they are separate from season ranks.</w:t>
+      </w:r>
+    </w:p>
+    <w:p>
+      <w:pPr>
         <w:pStyle w:val="Normal"/>
       </w:pPr>
       <w:r>
@@ -8340,6 +9636,22 @@
     </w:p>
     <w:p>
       <w:pPr>
+        <w:pStyle w:val="Heading2"/>
+      </w:pPr>
+      <w:r>
+        <w:t xml:space="preserve">Week 5 outlook</w:t>
+      </w:r>
+    </w:p>
+    <w:p>
+      <w:pPr>
+        <w:pStyle w:val="Normal"/>
+      </w:pPr>
+      <w:r>
+        <w:t xml:space="preserve">Weekly overall model rank 114 (RB25). ROS overall rank 82 (RB26). Availability: UNKNOWN. Weekly ranks are preliminary when playing status is unconfirmed; they are separate from season ranks.</w:t>
+      </w:r>
+    </w:p>
+    <w:p>
+      <w:pPr>
         <w:pStyle w:val="Normal"/>
       </w:pPr>
       <w:r>
@@ -8444,6 +9756,22 @@
     </w:p>
     <w:p>
       <w:pPr>
+        <w:pStyle w:val="Heading2"/>
+      </w:pPr>
+      <w:r>
+        <w:t xml:space="preserve">Week 5 outlook</w:t>
+      </w:r>
+    </w:p>
+    <w:p>
+      <w:pPr>
+        <w:pStyle w:val="Normal"/>
+      </w:pPr>
+      <w:r>
+        <w:t xml:space="preserve">Weekly overall model rank 91 (WR33). ROS overall rank 83 (WR37). Availability: UNKNOWN. Weekly ranks are preliminary when playing status is unconfirmed; they are separate from season ranks.</w:t>
+      </w:r>
+    </w:p>
+    <w:p>
+      <w:pPr>
         <w:pStyle w:val="Normal"/>
       </w:pPr>
       <w:r>
@@ -8548,6 +9876,22 @@
     </w:p>
     <w:p>
       <w:pPr>
+        <w:pStyle w:val="Heading2"/>
+      </w:pPr>
+      <w:r>
+        <w:t xml:space="preserve">Week 5 outlook</w:t>
+      </w:r>
+    </w:p>
+    <w:p>
+      <w:pPr>
+        <w:pStyle w:val="Normal"/>
+      </w:pPr>
+      <w:r>
+        <w:t xml:space="preserve">Weekly overall model rank 3 (QB2). ROS overall rank 84 (QB13). Availability: UNKNOWN. Weekly ranks are preliminary when playing status is unconfirmed; they are separate from season ranks.</w:t>
+      </w:r>
+    </w:p>
+    <w:p>
+      <w:pPr>
         <w:pStyle w:val="Normal"/>
       </w:pPr>
       <w:r>
@@ -8652,6 +9996,22 @@
     </w:p>
     <w:p>
       <w:pPr>
+        <w:pStyle w:val="Heading2"/>
+      </w:pPr>
+      <w:r>
+        <w:t xml:space="preserve">Week 5 outlook</w:t>
+      </w:r>
+    </w:p>
+    <w:p>
+      <w:pPr>
+        <w:pStyle w:val="Normal"/>
+      </w:pPr>
+      <w:r>
+        <w:t xml:space="preserve">Weekly overall model rank 99 (WR37). ROS overall rank 85 (WR38). Availability: UNKNOWN. Weekly ranks are preliminary when playing status is unconfirmed; they are separate from season ranks.</w:t>
+      </w:r>
+    </w:p>
+    <w:p>
+      <w:pPr>
         <w:pStyle w:val="Normal"/>
       </w:pPr>
       <w:r>
@@ -8756,6 +10116,22 @@
     </w:p>
     <w:p>
       <w:pPr>
+        <w:pStyle w:val="Heading2"/>
+      </w:pPr>
+      <w:r>
+        <w:t xml:space="preserve">Week 5 outlook</w:t>
+      </w:r>
+    </w:p>
+    <w:p>
+      <w:pPr>
+        <w:pStyle w:val="Normal"/>
+      </w:pPr>
+      <w:r>
+        <w:t xml:space="preserve">Weekly overall model rank 93 (TE11). ROS overall rank 86 (TE9). Availability: UNKNOWN. Weekly ranks are preliminary when playing status is unconfirmed; they are separate from season ranks.</w:t>
+      </w:r>
+    </w:p>
+    <w:p>
+      <w:pPr>
         <w:pStyle w:val="Normal"/>
       </w:pPr>
       <w:r>
@@ -8860,6 +10236,22 @@
     </w:p>
     <w:p>
       <w:pPr>
+        <w:pStyle w:val="Heading2"/>
+      </w:pPr>
+      <w:r>
+        <w:t xml:space="preserve">Week 5 outlook</w:t>
+      </w:r>
+    </w:p>
+    <w:p>
+      <w:pPr>
+        <w:pStyle w:val="Normal"/>
+      </w:pPr>
+      <w:r>
+        <w:t xml:space="preserve">Weekly overall model rank 83 (WR30). ROS overall rank 87 (WR39). Availability: UNKNOWN. Weekly ranks are preliminary when playing status is unconfirmed; they are separate from season ranks.</w:t>
+      </w:r>
+    </w:p>
+    <w:p>
+      <w:pPr>
         <w:pStyle w:val="Normal"/>
       </w:pPr>
       <w:r>
@@ -8964,6 +10356,22 @@
     </w:p>
     <w:p>
       <w:pPr>
+        <w:pStyle w:val="Heading2"/>
+      </w:pPr>
+      <w:r>
+        <w:t xml:space="preserve">Week 5 outlook</w:t>
+      </w:r>
+    </w:p>
+    <w:p>
+      <w:pPr>
+        <w:pStyle w:val="Normal"/>
+      </w:pPr>
+      <w:r>
+        <w:t xml:space="preserve">Weekly overall model rank 92 (TE10). ROS overall rank 88 (TE10). Availability: UNKNOWN. Weekly ranks are preliminary when playing status is unconfirmed; they are separate from season ranks.</w:t>
+      </w:r>
+    </w:p>
+    <w:p>
+      <w:pPr>
         <w:pStyle w:val="Normal"/>
       </w:pPr>
       <w:r>
@@ -9068,6 +10476,22 @@
     </w:p>
     <w:p>
       <w:pPr>
+        <w:pStyle w:val="Heading2"/>
+      </w:pPr>
+      <w:r>
+        <w:t xml:space="preserve">Week 5 outlook</w:t>
+      </w:r>
+    </w:p>
+    <w:p>
+      <w:pPr>
+        <w:pStyle w:val="Normal"/>
+      </w:pPr>
+      <w:r>
+        <w:t xml:space="preserve">Weekly overall model rank 94 (WR34). ROS overall rank 89 (WR40). Availability: UNKNOWN. Weekly ranks are preliminary when playing status is unconfirmed; they are separate from season ranks.</w:t>
+      </w:r>
+    </w:p>
+    <w:p>
+      <w:pPr>
         <w:pStyle w:val="Normal"/>
       </w:pPr>
       <w:r>
@@ -9172,6 +10596,22 @@
     </w:p>
     <w:p>
       <w:pPr>
+        <w:pStyle w:val="Heading2"/>
+      </w:pPr>
+      <w:r>
+        <w:t xml:space="preserve">Week 5 outlook</w:t>
+      </w:r>
+    </w:p>
+    <w:p>
+      <w:pPr>
+        <w:pStyle w:val="Normal"/>
+      </w:pPr>
+      <w:r>
+        <w:t xml:space="preserve">Weekly overall model rank 22 (QB7). ROS overall rank 90 (QB14). Availability: UNKNOWN. Weekly ranks are preliminary when playing status is unconfirmed; they are separate from season ranks.</w:t>
+      </w:r>
+    </w:p>
+    <w:p>
+      <w:pPr>
         <w:pStyle w:val="Normal"/>
       </w:pPr>
       <w:r>
@@ -9276,6 +10716,22 @@
     </w:p>
     <w:p>
       <w:pPr>
+        <w:pStyle w:val="Heading2"/>
+      </w:pPr>
+      <w:r>
+        <w:t xml:space="preserve">Week 5 outlook</w:t>
+      </w:r>
+    </w:p>
+    <w:p>
+      <w:pPr>
+        <w:pStyle w:val="Normal"/>
+      </w:pPr>
+      <w:r>
+        <w:t xml:space="preserve">Weekly overall model rank 89 (TE9). ROS overall rank 91 (TE11). Availability: UNKNOWN. Weekly ranks are preliminary when playing status is unconfirmed; they are separate from season ranks.</w:t>
+      </w:r>
+    </w:p>
+    <w:p>
+      <w:pPr>
         <w:pStyle w:val="Normal"/>
       </w:pPr>
       <w:r>
@@ -9380,6 +10836,22 @@
     </w:p>
     <w:p>
       <w:pPr>
+        <w:pStyle w:val="Heading2"/>
+      </w:pPr>
+      <w:r>
+        <w:t xml:space="preserve">Week 5 outlook</w:t>
+      </w:r>
+    </w:p>
+    <w:p>
+      <w:pPr>
+        <w:pStyle w:val="Normal"/>
+      </w:pPr>
+      <w:r>
+        <w:t xml:space="preserve">Weekly overall model rank 126 (RB29). ROS overall rank 92 (RB27). Availability: UNKNOWN. Weekly ranks are preliminary when playing status is unconfirmed; they are separate from season ranks.</w:t>
+      </w:r>
+    </w:p>
+    <w:p>
+      <w:pPr>
         <w:pStyle w:val="Normal"/>
       </w:pPr>
       <w:r>
@@ -9452,6 +10924,22 @@
     </w:p>
     <w:p>
       <w:pPr>
+        <w:pStyle w:val="Heading2"/>
+      </w:pPr>
+      <w:r>
+        <w:t xml:space="preserve">Week 5 outlook</w:t>
+      </w:r>
+    </w:p>
+    <w:p>
+      <w:pPr>
+        <w:pStyle w:val="Normal"/>
+      </w:pPr>
+      <w:r>
+        <w:t xml:space="preserve">Weekly overall model rank 88 (WR32). ROS overall rank 93 (WR41). Availability: UNKNOWN. Weekly ranks are preliminary when playing status is unconfirmed; they are separate from season ranks.</w:t>
+      </w:r>
+    </w:p>
+    <w:p>
+      <w:pPr>
         <w:pStyle w:val="Normal"/>
       </w:pPr>
       <w:r>
@@ -9556,6 +11044,22 @@
     </w:p>
     <w:p>
       <w:pPr>
+        <w:pStyle w:val="Heading2"/>
+      </w:pPr>
+      <w:r>
+        <w:t xml:space="preserve">Week 5 outlook</w:t>
+      </w:r>
+    </w:p>
+    <w:p>
+      <w:pPr>
+        <w:pStyle w:val="Normal"/>
+      </w:pPr>
+      <w:r>
+        <w:t xml:space="preserve">Weekly overall model rank 100 (WR38). ROS overall rank 94 (WR42). Availability: UNKNOWN. Weekly ranks are preliminary when playing status is unconfirmed; they are separate from season ranks.</w:t>
+      </w:r>
+    </w:p>
+    <w:p>
+      <w:pPr>
         <w:pStyle w:val="Normal"/>
       </w:pPr>
       <w:r>
@@ -9660,6 +11164,22 @@
     </w:p>
     <w:p>
       <w:pPr>
+        <w:pStyle w:val="Heading2"/>
+      </w:pPr>
+      <w:r>
+        <w:t xml:space="preserve">Week 5 outlook</w:t>
+      </w:r>
+    </w:p>
+    <w:p>
+      <w:pPr>
+        <w:pStyle w:val="Normal"/>
+      </w:pPr>
+      <w:r>
+        <w:t xml:space="preserve">Weekly overall model rank 118 (WR46). ROS overall rank 95 (WR43). Availability: UNKNOWN. Weekly ranks are preliminary when playing status is unconfirmed; they are separate from season ranks.</w:t>
+      </w:r>
+    </w:p>
+    <w:p>
+      <w:pPr>
         <w:pStyle w:val="Normal"/>
       </w:pPr>
       <w:r>
@@ -9764,6 +11284,22 @@
     </w:p>
     <w:p>
       <w:pPr>
+        <w:pStyle w:val="Heading2"/>
+      </w:pPr>
+      <w:r>
+        <w:t xml:space="preserve">Week 5 outlook</w:t>
+      </w:r>
+    </w:p>
+    <w:p>
+      <w:pPr>
+        <w:pStyle w:val="Normal"/>
+      </w:pPr>
+      <w:r>
+        <w:t xml:space="preserve">Weekly overall model rank 147 (WR57). ROS overall rank 96 (WR44). Availability: UNKNOWN. Weekly ranks are preliminary when playing status is unconfirmed; they are separate from season ranks.</w:t>
+      </w:r>
+    </w:p>
+    <w:p>
+      <w:pPr>
         <w:pStyle w:val="Normal"/>
       </w:pPr>
       <w:r>
@@ -9868,6 +11404,22 @@
     </w:p>
     <w:p>
       <w:pPr>
+        <w:pStyle w:val="Heading2"/>
+      </w:pPr>
+      <w:r>
+        <w:t xml:space="preserve">Week 5 outlook</w:t>
+      </w:r>
+    </w:p>
+    <w:p>
+      <w:pPr>
+        <w:pStyle w:val="Normal"/>
+      </w:pPr>
+      <w:r>
+        <w:t xml:space="preserve">Weekly overall model rank 131 (TE21). ROS overall rank 97 (TE12). Availability: UNKNOWN. Weekly ranks are preliminary when playing status is unconfirmed; they are separate from season ranks.</w:t>
+      </w:r>
+    </w:p>
+    <w:p>
+      <w:pPr>
         <w:pStyle w:val="Normal"/>
       </w:pPr>
       <w:r>
@@ -9972,6 +11524,22 @@
     </w:p>
     <w:p>
       <w:pPr>
+        <w:pStyle w:val="Heading2"/>
+      </w:pPr>
+      <w:r>
+        <w:t xml:space="preserve">Week 5 outlook</w:t>
+      </w:r>
+    </w:p>
+    <w:p>
+      <w:pPr>
+        <w:pStyle w:val="Normal"/>
+      </w:pPr>
+      <w:r>
+        <w:t xml:space="preserve">Weekly overall model rank 95 (WR35). ROS overall rank 98 (WR45). Availability: UNKNOWN. Weekly ranks are preliminary when playing status is unconfirmed; they are separate from season ranks.</w:t>
+      </w:r>
+    </w:p>
+    <w:p>
+      <w:pPr>
         <w:pStyle w:val="Normal"/>
       </w:pPr>
       <w:r>
@@ -10076,6 +11644,22 @@
     </w:p>
     <w:p>
       <w:pPr>
+        <w:pStyle w:val="Heading2"/>
+      </w:pPr>
+      <w:r>
+        <w:t xml:space="preserve">Week 5 outlook</w:t>
+      </w:r>
+    </w:p>
+    <w:p>
+      <w:pPr>
+        <w:pStyle w:val="Normal"/>
+      </w:pPr>
+      <w:r>
+        <w:t xml:space="preserve">Weekly overall model rank 128 (WR50). ROS overall rank 99 (WR46). Availability: UNKNOWN. Weekly ranks are preliminary when playing status is unconfirmed; they are separate from season ranks.</w:t>
+      </w:r>
+    </w:p>
+    <w:p>
+      <w:pPr>
         <w:pStyle w:val="Normal"/>
       </w:pPr>
       <w:r>
@@ -10180,6 +11764,22 @@
     </w:p>
     <w:p>
       <w:pPr>
+        <w:pStyle w:val="Heading2"/>
+      </w:pPr>
+      <w:r>
+        <w:t xml:space="preserve">Week 5 outlook</w:t>
+      </w:r>
+    </w:p>
+    <w:p>
+      <w:pPr>
+        <w:pStyle w:val="Normal"/>
+      </w:pPr>
+      <w:r>
+        <w:t xml:space="preserve">Weekly overall model rank 171 (RB54). ROS overall rank 100 (RB28). Availability: UNKNOWN. Weekly ranks are preliminary when playing status is unconfirmed; they are separate from season ranks.</w:t>
+      </w:r>
+    </w:p>
+    <w:p>
+      <w:pPr>
         <w:pStyle w:val="Normal"/>
       </w:pPr>
       <w:r>
@@ -10284,6 +11884,22 @@
     </w:p>
     <w:p>
       <w:pPr>
+        <w:pStyle w:val="Heading2"/>
+      </w:pPr>
+      <w:r>
+        <w:t xml:space="preserve">Week 5 outlook</w:t>
+      </w:r>
+    </w:p>
+    <w:p>
+      <w:pPr>
+        <w:pStyle w:val="Normal"/>
+      </w:pPr>
+      <w:r>
+        <w:t xml:space="preserve">Weekly overall model rank 116 (WR45). ROS overall rank 101 (WR47). Availability: UNKNOWN. Weekly ranks are preliminary when playing status is unconfirmed; they are separate from season ranks.</w:t>
+      </w:r>
+    </w:p>
+    <w:p>
+      <w:pPr>
         <w:pStyle w:val="Normal"/>
       </w:pPr>
       <w:r>
@@ -10388,6 +12004,22 @@
     </w:p>
     <w:p>
       <w:pPr>
+        <w:pStyle w:val="Heading2"/>
+      </w:pPr>
+      <w:r>
+        <w:t xml:space="preserve">Week 5 outlook</w:t>
+      </w:r>
+    </w:p>
+    <w:p>
+      <w:pPr>
+        <w:pStyle w:val="Normal"/>
+      </w:pPr>
+      <w:r>
+        <w:t xml:space="preserve">Weekly overall model rank 111 (WR44). ROS overall rank 102 (WR48). Availability: UNKNOWN. Weekly ranks are preliminary when playing status is unconfirmed; they are separate from season ranks.</w:t>
+      </w:r>
+    </w:p>
+    <w:p>
+      <w:pPr>
         <w:pStyle w:val="Normal"/>
       </w:pPr>
       <w:r>
@@ -10492,6 +12124,22 @@
     </w:p>
     <w:p>
       <w:pPr>
+        <w:pStyle w:val="Heading2"/>
+      </w:pPr>
+      <w:r>
+        <w:t xml:space="preserve">Week 5 outlook</w:t>
+      </w:r>
+    </w:p>
+    <w:p>
+      <w:pPr>
+        <w:pStyle w:val="Normal"/>
+      </w:pPr>
+      <w:r>
+        <w:t xml:space="preserve">Weekly overall model rank 36 (QB15). ROS overall rank 103 (QB15). Availability: UNKNOWN. Weekly ranks are preliminary when playing status is unconfirmed; they are separate from season ranks.</w:t>
+      </w:r>
+    </w:p>
+    <w:p>
+      <w:pPr>
         <w:pStyle w:val="Normal"/>
       </w:pPr>
       <w:r>
@@ -10596,6 +12244,22 @@
     </w:p>
     <w:p>
       <w:pPr>
+        <w:pStyle w:val="Heading2"/>
+      </w:pPr>
+      <w:r>
+        <w:t xml:space="preserve">Week 5 outlook</w:t>
+      </w:r>
+    </w:p>
+    <w:p>
+      <w:pPr>
+        <w:pStyle w:val="Normal"/>
+      </w:pPr>
+      <w:r>
+        <w:t xml:space="preserve">Weekly overall model rank 31 (QB13). ROS overall rank 104 (QB16). Availability: UNKNOWN. Weekly ranks are preliminary when playing status is unconfirmed; they are separate from season ranks.</w:t>
+      </w:r>
+    </w:p>
+    <w:p>
+      <w:pPr>
         <w:pStyle w:val="Normal"/>
       </w:pPr>
       <w:r>
@@ -10700,6 +12364,22 @@
     </w:p>
     <w:p>
       <w:pPr>
+        <w:pStyle w:val="Heading2"/>
+      </w:pPr>
+      <w:r>
+        <w:t xml:space="preserve">Week 5 outlook</w:t>
+      </w:r>
+    </w:p>
+    <w:p>
+      <w:pPr>
+        <w:pStyle w:val="Normal"/>
+      </w:pPr>
+      <w:r>
+        <w:t xml:space="preserve">Weekly overall model rank 125 (TE20). ROS overall rank 105 (TE13). Availability: UNKNOWN. Weekly ranks are preliminary when playing status is unconfirmed; they are separate from season ranks.</w:t>
+      </w:r>
+    </w:p>
+    <w:p>
+      <w:pPr>
         <w:pStyle w:val="Normal"/>
       </w:pPr>
       <w:r>
@@ -10804,6 +12484,22 @@
     </w:p>
     <w:p>
       <w:pPr>
+        <w:pStyle w:val="Heading2"/>
+      </w:pPr>
+      <w:r>
+        <w:t xml:space="preserve">Week 5 outlook</w:t>
+      </w:r>
+    </w:p>
+    <w:p>
+      <w:pPr>
+        <w:pStyle w:val="Normal"/>
+      </w:pPr>
+      <w:r>
+        <w:t xml:space="preserve">Weekly overall model rank 107 (TE17). ROS overall rank 106 (TE14). Availability: UNKNOWN. Weekly ranks are preliminary when playing status is unconfirmed; they are separate from season ranks.</w:t>
+      </w:r>
+    </w:p>
+    <w:p>
+      <w:pPr>
         <w:pStyle w:val="Normal"/>
       </w:pPr>
       <w:r>
@@ -10908,6 +12604,22 @@
     </w:p>
     <w:p>
       <w:pPr>
+        <w:pStyle w:val="Heading2"/>
+      </w:pPr>
+      <w:r>
+        <w:t xml:space="preserve">Week 5 outlook</w:t>
+      </w:r>
+    </w:p>
+    <w:p>
+      <w:pPr>
+        <w:pStyle w:val="Normal"/>
+      </w:pPr>
+      <w:r>
+        <w:t xml:space="preserve">Weekly overall model rank 138 (RB32). ROS overall rank 107 (RB29). Availability: UNKNOWN. Weekly ranks are preliminary when playing status is unconfirmed; they are separate from season ranks.</w:t>
+      </w:r>
+    </w:p>
+    <w:p>
+      <w:pPr>
         <w:pStyle w:val="Normal"/>
       </w:pPr>
       <w:r>
@@ -11012,6 +12724,22 @@
     </w:p>
     <w:p>
       <w:pPr>
+        <w:pStyle w:val="Heading2"/>
+      </w:pPr>
+      <w:r>
+        <w:t xml:space="preserve">Week 5 outlook</w:t>
+      </w:r>
+    </w:p>
+    <w:p>
+      <w:pPr>
+        <w:pStyle w:val="Normal"/>
+      </w:pPr>
+      <w:r>
+        <w:t xml:space="preserve">Weekly overall model rank 124 (WR49). ROS overall rank 108 (WR49). Availability: UNKNOWN. Weekly ranks are preliminary when playing status is unconfirmed; they are separate from season ranks.</w:t>
+      </w:r>
+    </w:p>
+    <w:p>
+      <w:pPr>
         <w:pStyle w:val="Normal"/>
       </w:pPr>
       <w:r>
@@ -11116,6 +12844,22 @@
     </w:p>
     <w:p>
       <w:pPr>
+        <w:pStyle w:val="Heading2"/>
+      </w:pPr>
+      <w:r>
+        <w:t xml:space="preserve">Week 5 outlook</w:t>
+      </w:r>
+    </w:p>
+    <w:p>
+      <w:pPr>
+        <w:pStyle w:val="Normal"/>
+      </w:pPr>
+      <w:r>
+        <w:t xml:space="preserve">Weekly overall model rank 134 (WR53). ROS overall rank 109 (WR50). Availability: UNKNOWN. Weekly ranks are preliminary when playing status is unconfirmed; they are separate from season ranks.</w:t>
+      </w:r>
+    </w:p>
+    <w:p>
+      <w:pPr>
         <w:pStyle w:val="Normal"/>
       </w:pPr>
       <w:r>
@@ -11220,6 +12964,22 @@
     </w:p>
     <w:p>
       <w:pPr>
+        <w:pStyle w:val="Heading2"/>
+      </w:pPr>
+      <w:r>
+        <w:t xml:space="preserve">Week 5 outlook</w:t>
+      </w:r>
+    </w:p>
+    <w:p>
+      <w:pPr>
+        <w:pStyle w:val="Normal"/>
+      </w:pPr>
+      <w:r>
+        <w:t xml:space="preserve">Weekly overall model rank 139 (RB33). ROS overall rank 110 (RB30). Availability: UNKNOWN. Weekly ranks are preliminary when playing status is unconfirmed; they are separate from season ranks.</w:t>
+      </w:r>
+    </w:p>
+    <w:p>
+      <w:pPr>
         <w:pStyle w:val="Normal"/>
       </w:pPr>
       <w:r>
@@ -11324,6 +13084,22 @@
     </w:p>
     <w:p>
       <w:pPr>
+        <w:pStyle w:val="Heading2"/>
+      </w:pPr>
+      <w:r>
+        <w:t xml:space="preserve">Week 5 outlook</w:t>
+      </w:r>
+    </w:p>
+    <w:p>
+      <w:pPr>
+        <w:pStyle w:val="Normal"/>
+      </w:pPr>
+      <w:r>
+        <w:t xml:space="preserve">Weekly overall model rank 81 (WR28). ROS overall rank 111 (WR51). Availability: UNKNOWN. Weekly ranks are preliminary when playing status is unconfirmed; they are separate from season ranks.</w:t>
+      </w:r>
+    </w:p>
+    <w:p>
+      <w:pPr>
         <w:pStyle w:val="Normal"/>
       </w:pPr>
       <w:r>
@@ -11428,6 +13204,22 @@
     </w:p>
     <w:p>
       <w:pPr>
+        <w:pStyle w:val="Heading2"/>
+      </w:pPr>
+      <w:r>
+        <w:t xml:space="preserve">Week 5 outlook</w:t>
+      </w:r>
+    </w:p>
+    <w:p>
+      <w:pPr>
+        <w:pStyle w:val="Normal"/>
+      </w:pPr>
+      <w:r>
+        <w:t xml:space="preserve">Weekly overall model rank 108 (WR41). ROS overall rank 112 (WR52). Availability: UNKNOWN. Weekly ranks are preliminary when playing status is unconfirmed; they are separate from season ranks.</w:t>
+      </w:r>
+    </w:p>
+    <w:p>
+      <w:pPr>
         <w:pStyle w:val="Normal"/>
       </w:pPr>
       <w:r>
@@ -11532,6 +13324,22 @@
     </w:p>
     <w:p>
       <w:pPr>
+        <w:pStyle w:val="Heading2"/>
+      </w:pPr>
+      <w:r>
+        <w:t xml:space="preserve">Week 5 outlook</w:t>
+      </w:r>
+    </w:p>
+    <w:p>
+      <w:pPr>
+        <w:pStyle w:val="Normal"/>
+      </w:pPr>
+      <w:r>
+        <w:t xml:space="preserve">Weekly overall model rank 96 (TE12). ROS overall rank 113 (TE15). Availability: UNKNOWN. Weekly ranks are preliminary when playing status is unconfirmed; they are separate from season ranks.</w:t>
+      </w:r>
+    </w:p>
+    <w:p>
+      <w:pPr>
         <w:pStyle w:val="Normal"/>
       </w:pPr>
       <w:r>
@@ -11636,6 +13444,22 @@
     </w:p>
     <w:p>
       <w:pPr>
+        <w:pStyle w:val="Heading2"/>
+      </w:pPr>
+      <w:r>
+        <w:t xml:space="preserve">Week 5 outlook</w:t>
+      </w:r>
+    </w:p>
+    <w:p>
+      <w:pPr>
+        <w:pStyle w:val="Normal"/>
+      </w:pPr>
+      <w:r>
+        <w:t xml:space="preserve">Weekly overall model rank 119 (TE18). ROS overall rank 114 (TE16). Availability: UNKNOWN. Weekly ranks are preliminary when playing status is unconfirmed; they are separate from season ranks.</w:t>
+      </w:r>
+    </w:p>
+    <w:p>
+      <w:pPr>
         <w:pStyle w:val="Normal"/>
       </w:pPr>
       <w:r>
@@ -11740,6 +13564,22 @@
     </w:p>
     <w:p>
       <w:pPr>
+        <w:pStyle w:val="Heading2"/>
+      </w:pPr>
+      <w:r>
+        <w:t xml:space="preserve">Week 5 outlook</w:t>
+      </w:r>
+    </w:p>
+    <w:p>
+      <w:pPr>
+        <w:pStyle w:val="Normal"/>
+      </w:pPr>
+      <w:r>
+        <w:t xml:space="preserve">Weekly overall model rank 123 (RB28). ROS overall rank 115 (RB31). Availability: UNKNOWN. Weekly ranks are preliminary when playing status is unconfirmed; they are separate from season ranks.</w:t>
+      </w:r>
+    </w:p>
+    <w:p>
+      <w:pPr>
         <w:pStyle w:val="Normal"/>
       </w:pPr>
       <w:r>
@@ -11844,6 +13684,22 @@
     </w:p>
     <w:p>
       <w:pPr>
+        <w:pStyle w:val="Heading2"/>
+      </w:pPr>
+      <w:r>
+        <w:t xml:space="preserve">Week 5 outlook</w:t>
+      </w:r>
+    </w:p>
+    <w:p>
+      <w:pPr>
+        <w:pStyle w:val="Normal"/>
+      </w:pPr>
+      <w:r>
+        <w:t xml:space="preserve">Weekly overall model rank 142 (RB36). ROS overall rank 116 (RB32). Availability: UNKNOWN. Weekly ranks are preliminary when playing status is unconfirmed; they are separate from season ranks.</w:t>
+      </w:r>
+    </w:p>
+    <w:p>
+      <w:pPr>
         <w:pStyle w:val="Normal"/>
       </w:pPr>
       <w:r>
@@ -11948,6 +13804,22 @@
     </w:p>
     <w:p>
       <w:pPr>
+        <w:pStyle w:val="Heading2"/>
+      </w:pPr>
+      <w:r>
+        <w:t xml:space="preserve">Week 5 outlook</w:t>
+      </w:r>
+    </w:p>
+    <w:p>
+      <w:pPr>
+        <w:pStyle w:val="Normal"/>
+      </w:pPr>
+      <w:r>
+        <w:t xml:space="preserve">Weekly overall model rank 148 (WR58). ROS overall rank 117 (WR53). Availability: UNKNOWN. Weekly ranks are preliminary when playing status is unconfirmed; they are separate from season ranks.</w:t>
+      </w:r>
+    </w:p>
+    <w:p>
+      <w:pPr>
         <w:pStyle w:val="Normal"/>
       </w:pPr>
       <w:r>
@@ -12020,6 +13892,22 @@
     </w:p>
     <w:p>
       <w:pPr>
+        <w:pStyle w:val="Heading2"/>
+      </w:pPr>
+      <w:r>
+        <w:t xml:space="preserve">Week 5 outlook</w:t>
+      </w:r>
+    </w:p>
+    <w:p>
+      <w:pPr>
+        <w:pStyle w:val="Normal"/>
+      </w:pPr>
+      <w:r>
+        <w:t xml:space="preserve">Weekly overall model rank 102 (TE15). ROS overall rank 118 (TE17). Availability: UNKNOWN. Weekly ranks are preliminary when playing status is unconfirmed; they are separate from season ranks.</w:t>
+      </w:r>
+    </w:p>
+    <w:p>
+      <w:pPr>
         <w:pStyle w:val="Normal"/>
       </w:pPr>
       <w:r>
@@ -12092,6 +13980,22 @@
     </w:p>
     <w:p>
       <w:pPr>
+        <w:pStyle w:val="Heading2"/>
+      </w:pPr>
+      <w:r>
+        <w:t xml:space="preserve">Week 5 outlook</w:t>
+      </w:r>
+    </w:p>
+    <w:p>
+      <w:pPr>
+        <w:pStyle w:val="Normal"/>
+      </w:pPr>
+      <w:r>
+        <w:t xml:space="preserve">Weekly overall model rank 144 (TE24). ROS overall rank 119 (TE18). Availability: UNKNOWN. Weekly ranks are preliminary when playing status is unconfirmed; they are separate from season ranks.</w:t>
+      </w:r>
+    </w:p>
+    <w:p>
+      <w:pPr>
         <w:pStyle w:val="Normal"/>
       </w:pPr>
       <w:r>
@@ -12164,6 +14068,22 @@
     </w:p>
     <w:p>
       <w:pPr>
+        <w:pStyle w:val="Heading2"/>
+      </w:pPr>
+      <w:r>
+        <w:t xml:space="preserve">Week 5 outlook</w:t>
+      </w:r>
+    </w:p>
+    <w:p>
+      <w:pPr>
+        <w:pStyle w:val="Normal"/>
+      </w:pPr>
+      <w:r>
+        <w:t xml:space="preserve">Weekly overall model rank 149 (RB38). ROS overall rank 120 (RB33). Availability: UNKNOWN. Weekly ranks are preliminary when playing status is unconfirmed; they are separate from season ranks.</w:t>
+      </w:r>
+    </w:p>
+    <w:p>
+      <w:pPr>
         <w:pStyle w:val="Normal"/>
       </w:pPr>
       <w:r>
@@ -12268,6 +14188,22 @@
     </w:p>
     <w:p>
       <w:pPr>
+        <w:pStyle w:val="Heading2"/>
+      </w:pPr>
+      <w:r>
+        <w:t xml:space="preserve">Week 5 outlook</w:t>
+      </w:r>
+    </w:p>
+    <w:p>
+      <w:pPr>
+        <w:pStyle w:val="Normal"/>
+      </w:pPr>
+      <w:r>
+        <w:t xml:space="preserve">Weekly overall model rank 103 (RB22). ROS overall rank 121 (RB34). Availability: UNKNOWN. Weekly ranks are preliminary when playing status is unconfirmed; they are separate from season ranks.</w:t>
+      </w:r>
+    </w:p>
+    <w:p>
+      <w:pPr>
         <w:pStyle w:val="Normal"/>
       </w:pPr>
       <w:r>
@@ -12372,6 +14308,22 @@
     </w:p>
     <w:p>
       <w:pPr>
+        <w:pStyle w:val="Heading2"/>
+      </w:pPr>
+      <w:r>
+        <w:t xml:space="preserve">Week 5 outlook</w:t>
+      </w:r>
+    </w:p>
+    <w:p>
+      <w:pPr>
+        <w:pStyle w:val="Normal"/>
+      </w:pPr>
+      <w:r>
+        <w:t xml:space="preserve">Weekly overall model rank 151 (WR60). ROS overall rank 122 (WR54). Availability: UNKNOWN. Weekly ranks are preliminary when playing status is unconfirmed; they are separate from season ranks.</w:t>
+      </w:r>
+    </w:p>
+    <w:p>
+      <w:pPr>
         <w:pStyle w:val="Normal"/>
       </w:pPr>
       <w:r>
@@ -12476,6 +14428,22 @@
     </w:p>
     <w:p>
       <w:pPr>
+        <w:pStyle w:val="Heading2"/>
+      </w:pPr>
+      <w:r>
+        <w:t xml:space="preserve">Week 5 outlook</w:t>
+      </w:r>
+    </w:p>
+    <w:p>
+      <w:pPr>
+        <w:pStyle w:val="Normal"/>
+      </w:pPr>
+      <w:r>
+        <w:t xml:space="preserve">Weekly overall model rank 84 (TE6). ROS overall rank 123 (TE19). Availability: UNKNOWN. Weekly ranks are preliminary when playing status is unconfirmed; they are separate from season ranks.</w:t>
+      </w:r>
+    </w:p>
+    <w:p>
+      <w:pPr>
         <w:pStyle w:val="Normal"/>
       </w:pPr>
       <w:r>
@@ -12564,6 +14532,22 @@
     </w:p>
     <w:p>
       <w:pPr>
+        <w:pStyle w:val="Heading2"/>
+      </w:pPr>
+      <w:r>
+        <w:t xml:space="preserve">Week 5 outlook</w:t>
+      </w:r>
+    </w:p>
+    <w:p>
+      <w:pPr>
+        <w:pStyle w:val="Normal"/>
+      </w:pPr>
+      <w:r>
+        <w:t xml:space="preserve">Weekly overall model rank 115 (RB26). ROS overall rank 124 (RB35). Availability: UNKNOWN. Weekly ranks are preliminary when playing status is unconfirmed; they are separate from season ranks.</w:t>
+      </w:r>
+    </w:p>
+    <w:p>
+      <w:pPr>
         <w:pStyle w:val="Normal"/>
       </w:pPr>
       <w:r>
@@ -12668,6 +14652,22 @@
     </w:p>
     <w:p>
       <w:pPr>
+        <w:pStyle w:val="Heading2"/>
+      </w:pPr>
+      <w:r>
+        <w:t xml:space="preserve">Week 5 outlook</w:t>
+      </w:r>
+    </w:p>
+    <w:p>
+      <w:pPr>
+        <w:pStyle w:val="Normal"/>
+      </w:pPr>
+      <w:r>
+        <w:t xml:space="preserve">Weekly overall model rank 104 (TE16). ROS overall rank 125 (TE20). Availability: UNKNOWN. Weekly ranks are preliminary when playing status is unconfirmed; they are separate from season ranks.</w:t>
+      </w:r>
+    </w:p>
+    <w:p>
+      <w:pPr>
         <w:pStyle w:val="Normal"/>
       </w:pPr>
       <w:r>
@@ -12772,6 +14772,22 @@
     </w:p>
     <w:p>
       <w:pPr>
+        <w:pStyle w:val="Heading2"/>
+      </w:pPr>
+      <w:r>
+        <w:t xml:space="preserve">Week 5 outlook</w:t>
+      </w:r>
+    </w:p>
+    <w:p>
+      <w:pPr>
+        <w:pStyle w:val="Normal"/>
+      </w:pPr>
+      <w:r>
+        <w:t xml:space="preserve">Weekly overall model rank 192 (WR73). ROS overall rank 126 (WR55). Availability: EXPECTED_INACTIVE. Weekly ranks are preliminary when playing status is unconfirmed; they are separate from season ranks.</w:t>
+      </w:r>
+    </w:p>
+    <w:p>
+      <w:pPr>
         <w:pStyle w:val="Normal"/>
       </w:pPr>
       <w:r>
@@ -12876,6 +14892,22 @@
     </w:p>
     <w:p>
       <w:pPr>
+        <w:pStyle w:val="Heading2"/>
+      </w:pPr>
+      <w:r>
+        <w:t xml:space="preserve">Week 5 outlook</w:t>
+      </w:r>
+    </w:p>
+    <w:p>
+      <w:pPr>
+        <w:pStyle w:val="Normal"/>
+      </w:pPr>
+      <w:r>
+        <w:t xml:space="preserve">Weekly overall model rank 121 (WR47). ROS overall rank 127 (WR56). Availability: UNKNOWN. Weekly ranks are preliminary when playing status is unconfirmed; they are separate from season ranks.</w:t>
+      </w:r>
+    </w:p>
+    <w:p>
+      <w:pPr>
         <w:pStyle w:val="Normal"/>
       </w:pPr>
       <w:r>
@@ -12980,6 +15012,22 @@
     </w:p>
     <w:p>
       <w:pPr>
+        <w:pStyle w:val="Heading2"/>
+      </w:pPr>
+      <w:r>
+        <w:t xml:space="preserve">Week 5 outlook</w:t>
+      </w:r>
+    </w:p>
+    <w:p>
+      <w:pPr>
+        <w:pStyle w:val="Normal"/>
+      </w:pPr>
+      <w:r>
+        <w:t xml:space="preserve">Weekly overall model rank 146 (RB37). ROS overall rank 128 (RB36). Availability: UNKNOWN. Weekly ranks are preliminary when playing status is unconfirmed; they are separate from season ranks.</w:t>
+      </w:r>
+    </w:p>
+    <w:p>
+      <w:pPr>
         <w:pStyle w:val="Normal"/>
       </w:pPr>
       <w:r>
@@ -13084,6 +15132,22 @@
     </w:p>
     <w:p>
       <w:pPr>
+        <w:pStyle w:val="Heading2"/>
+      </w:pPr>
+      <w:r>
+        <w:t xml:space="preserve">Week 5 outlook</w:t>
+      </w:r>
+    </w:p>
+    <w:p>
+      <w:pPr>
+        <w:pStyle w:val="Normal"/>
+      </w:pPr>
+      <w:r>
+        <w:t xml:space="preserve">Weekly overall model rank 129 (WR51). ROS overall rank 129 (WR57). Availability: UNKNOWN. Weekly ranks are preliminary when playing status is unconfirmed; they are separate from season ranks.</w:t>
+      </w:r>
+    </w:p>
+    <w:p>
+      <w:pPr>
         <w:pStyle w:val="Normal"/>
       </w:pPr>
       <w:r>
@@ -13188,6 +15252,22 @@
     </w:p>
     <w:p>
       <w:pPr>
+        <w:pStyle w:val="Heading2"/>
+      </w:pPr>
+      <w:r>
+        <w:t xml:space="preserve">Week 5 outlook</w:t>
+      </w:r>
+    </w:p>
+    <w:p>
+      <w:pPr>
+        <w:pStyle w:val="Normal"/>
+      </w:pPr>
+      <w:r>
+        <w:t xml:space="preserve">Weekly overall model rank 162 (RB47). ROS overall rank 130 (RB37). Availability: UNKNOWN. Weekly ranks are preliminary when playing status is unconfirmed; they are separate from season ranks.</w:t>
+      </w:r>
+    </w:p>
+    <w:p>
+      <w:pPr>
         <w:pStyle w:val="Normal"/>
       </w:pPr>
       <w:r>
@@ -13292,6 +15372,22 @@
     </w:p>
     <w:p>
       <w:pPr>
+        <w:pStyle w:val="Heading2"/>
+      </w:pPr>
+      <w:r>
+        <w:t xml:space="preserve">Week 5 outlook</w:t>
+      </w:r>
+    </w:p>
+    <w:p>
+      <w:pPr>
+        <w:pStyle w:val="Normal"/>
+      </w:pPr>
+      <w:r>
+        <w:t xml:space="preserve">Weekly overall model rank 145 (WR56). ROS overall rank 131 (WR58). Availability: UNKNOWN. Weekly ranks are preliminary when playing status is unconfirmed; they are separate from season ranks.</w:t>
+      </w:r>
+    </w:p>
+    <w:p>
+      <w:pPr>
         <w:pStyle w:val="Normal"/>
       </w:pPr>
       <w:r>
@@ -13396,6 +15492,22 @@
     </w:p>
     <w:p>
       <w:pPr>
+        <w:pStyle w:val="Heading2"/>
+      </w:pPr>
+      <w:r>
+        <w:t xml:space="preserve">Week 5 outlook</w:t>
+      </w:r>
+    </w:p>
+    <w:p>
+      <w:pPr>
+        <w:pStyle w:val="Normal"/>
+      </w:pPr>
+      <w:r>
+        <w:t xml:space="preserve">Weekly overall model rank 87 (TE8). ROS overall rank 132 (TE21). Availability: UNKNOWN. Weekly ranks are preliminary when playing status is unconfirmed; they are separate from season ranks.</w:t>
+      </w:r>
+    </w:p>
+    <w:p>
+      <w:pPr>
         <w:pStyle w:val="Normal"/>
       </w:pPr>
       <w:r>
@@ -13500,6 +15612,22 @@
     </w:p>
     <w:p>
       <w:pPr>
+        <w:pStyle w:val="Heading2"/>
+      </w:pPr>
+      <w:r>
+        <w:t xml:space="preserve">Week 5 outlook</w:t>
+      </w:r>
+    </w:p>
+    <w:p>
+      <w:pPr>
+        <w:pStyle w:val="Normal"/>
+      </w:pPr>
+      <w:r>
+        <w:t xml:space="preserve">Weekly overall model rank 154 (WR62). ROS overall rank 133 (WR59). Availability: UNKNOWN. Weekly ranks are preliminary when playing status is unconfirmed; they are separate from season ranks.</w:t>
+      </w:r>
+    </w:p>
+    <w:p>
+      <w:pPr>
         <w:pStyle w:val="Normal"/>
       </w:pPr>
       <w:r>
@@ -13604,6 +15732,22 @@
     </w:p>
     <w:p>
       <w:pPr>
+        <w:pStyle w:val="Heading2"/>
+      </w:pPr>
+      <w:r>
+        <w:t xml:space="preserve">Week 5 outlook</w:t>
+      </w:r>
+    </w:p>
+    <w:p>
+      <w:pPr>
+        <w:pStyle w:val="Normal"/>
+      </w:pPr>
+      <w:r>
+        <w:t xml:space="preserve">Weekly overall model rank 157 (RB42). ROS overall rank 134 (RB38). Availability: UNKNOWN. Weekly ranks are preliminary when playing status is unconfirmed; they are separate from season ranks.</w:t>
+      </w:r>
+    </w:p>
+    <w:p>
+      <w:pPr>
         <w:pStyle w:val="Normal"/>
       </w:pPr>
       <w:r>
@@ -13708,6 +15852,22 @@
     </w:p>
     <w:p>
       <w:pPr>
+        <w:pStyle w:val="Heading2"/>
+      </w:pPr>
+      <w:r>
+        <w:t xml:space="preserve">Week 5 outlook</w:t>
+      </w:r>
+    </w:p>
+    <w:p>
+      <w:pPr>
+        <w:pStyle w:val="Normal"/>
+      </w:pPr>
+      <w:r>
+        <w:t xml:space="preserve">Weekly overall model rank 168 (RB52). ROS overall rank 135 (RB39). Availability: UNKNOWN. Weekly ranks are preliminary when playing status is unconfirmed; they are separate from season ranks.</w:t>
+      </w:r>
+    </w:p>
+    <w:p>
+      <w:pPr>
         <w:pStyle w:val="Normal"/>
       </w:pPr>
       <w:r>
@@ -13812,6 +15972,22 @@
     </w:p>
     <w:p>
       <w:pPr>
+        <w:pStyle w:val="Heading2"/>
+      </w:pPr>
+      <w:r>
+        <w:t xml:space="preserve">Week 5 outlook</w:t>
+      </w:r>
+    </w:p>
+    <w:p>
+      <w:pPr>
+        <w:pStyle w:val="Normal"/>
+      </w:pPr>
+      <w:r>
+        <w:t xml:space="preserve">Weekly overall model rank 153 (WR61). ROS overall rank 136 (WR60). Availability: UNKNOWN. Weekly ranks are preliminary when playing status is unconfirmed; they are separate from season ranks.</w:t>
+      </w:r>
+    </w:p>
+    <w:p>
+      <w:pPr>
         <w:pStyle w:val="Normal"/>
       </w:pPr>
       <w:r>
@@ -13916,6 +16092,22 @@
     </w:p>
     <w:p>
       <w:pPr>
+        <w:pStyle w:val="Heading2"/>
+      </w:pPr>
+      <w:r>
+        <w:t xml:space="preserve">Week 5 outlook</w:t>
+      </w:r>
+    </w:p>
+    <w:p>
+      <w:pPr>
+        <w:pStyle w:val="Normal"/>
+      </w:pPr>
+      <w:r>
+        <w:t xml:space="preserve">Weekly overall model rank 160 (RB45). ROS overall rank 137 (RB40). Availability: UNKNOWN. Weekly ranks are preliminary when playing status is unconfirmed; they are separate from season ranks.</w:t>
+      </w:r>
+    </w:p>
+    <w:p>
+      <w:pPr>
         <w:pStyle w:val="Normal"/>
       </w:pPr>
       <w:r>
@@ -14020,6 +16212,22 @@
     </w:p>
     <w:p>
       <w:pPr>
+        <w:pStyle w:val="Heading2"/>
+      </w:pPr>
+      <w:r>
+        <w:t xml:space="preserve">Week 5 outlook</w:t>
+      </w:r>
+    </w:p>
+    <w:p>
+      <w:pPr>
+        <w:pStyle w:val="Normal"/>
+      </w:pPr>
+      <w:r>
+        <w:t xml:space="preserve">Weekly overall model rank 135 (WR54). ROS overall rank 138 (WR61). Availability: UNKNOWN. Weekly ranks are preliminary when playing status is unconfirmed; they are separate from season ranks.</w:t>
+      </w:r>
+    </w:p>
+    <w:p>
+      <w:pPr>
         <w:pStyle w:val="Normal"/>
       </w:pPr>
       <w:r>
@@ -14124,6 +16332,22 @@
     </w:p>
     <w:p>
       <w:pPr>
+        <w:pStyle w:val="Heading2"/>
+      </w:pPr>
+      <w:r>
+        <w:t xml:space="preserve">Week 5 outlook</w:t>
+      </w:r>
+    </w:p>
+    <w:p>
+      <w:pPr>
+        <w:pStyle w:val="Normal"/>
+      </w:pPr>
+      <w:r>
+        <w:t xml:space="preserve">Weekly overall model rank 143 (TE23). ROS overall rank 139 (TE22). Availability: UNKNOWN. Weekly ranks are preliminary when playing status is unconfirmed; they are separate from season ranks.</w:t>
+      </w:r>
+    </w:p>
+    <w:p>
+      <w:pPr>
         <w:pStyle w:val="Normal"/>
       </w:pPr>
       <w:r>
@@ -14228,6 +16452,22 @@
     </w:p>
     <w:p>
       <w:pPr>
+        <w:pStyle w:val="Heading2"/>
+      </w:pPr>
+      <w:r>
+        <w:t xml:space="preserve">Week 5 outlook</w:t>
+      </w:r>
+    </w:p>
+    <w:p>
+      <w:pPr>
+        <w:pStyle w:val="Normal"/>
+      </w:pPr>
+      <w:r>
+        <w:t xml:space="preserve">Weekly overall model rank 113 (RB24). ROS overall rank 140 (RB41). Availability: UNKNOWN. Weekly ranks are preliminary when playing status is unconfirmed; they are separate from season ranks.</w:t>
+      </w:r>
+    </w:p>
+    <w:p>
+      <w:pPr>
         <w:pStyle w:val="Normal"/>
       </w:pPr>
       <w:r>
@@ -14332,6 +16572,22 @@
     </w:p>
     <w:p>
       <w:pPr>
+        <w:pStyle w:val="Heading2"/>
+      </w:pPr>
+      <w:r>
+        <w:t xml:space="preserve">Week 5 outlook</w:t>
+      </w:r>
+    </w:p>
+    <w:p>
+      <w:pPr>
+        <w:pStyle w:val="Normal"/>
+      </w:pPr>
+      <w:r>
+        <w:t xml:space="preserve">Weekly overall model rank 163 (RB48). ROS overall rank 141 (RB42). Availability: UNKNOWN. Weekly ranks are preliminary when playing status is unconfirmed; they are separate from season ranks.</w:t>
+      </w:r>
+    </w:p>
+    <w:p>
+      <w:pPr>
         <w:pStyle w:val="Normal"/>
       </w:pPr>
       <w:r>
@@ -14436,6 +16692,22 @@
     </w:p>
     <w:p>
       <w:pPr>
+        <w:pStyle w:val="Heading2"/>
+      </w:pPr>
+      <w:r>
+        <w:t xml:space="preserve">Week 5 outlook</w:t>
+      </w:r>
+    </w:p>
+    <w:p>
+      <w:pPr>
+        <w:pStyle w:val="Normal"/>
+      </w:pPr>
+      <w:r>
+        <w:t xml:space="preserve">Weekly overall model rank 190 (WR72). ROS overall rank 142 (WR62). Availability: EXPECTED_INACTIVE. Weekly ranks are preliminary when playing status is unconfirmed; they are separate from season ranks.</w:t>
+      </w:r>
+    </w:p>
+    <w:p>
+      <w:pPr>
         <w:pStyle w:val="Normal"/>
       </w:pPr>
       <w:r>
@@ -14540,6 +16812,22 @@
     </w:p>
     <w:p>
       <w:pPr>
+        <w:pStyle w:val="Heading2"/>
+      </w:pPr>
+      <w:r>
+        <w:t xml:space="preserve">Week 5 outlook</w:t>
+      </w:r>
+    </w:p>
+    <w:p>
+      <w:pPr>
+        <w:pStyle w:val="Normal"/>
+      </w:pPr>
+      <w:r>
+        <w:t xml:space="preserve">Weekly overall model rank 158 (RB43). ROS overall rank 143 (RB43). Availability: UNKNOWN. Weekly ranks are preliminary when playing status is unconfirmed; they are separate from season ranks.</w:t>
+      </w:r>
+    </w:p>
+    <w:p>
+      <w:pPr>
         <w:pStyle w:val="Normal"/>
       </w:pPr>
       <w:r>
@@ -14644,6 +16932,22 @@
     </w:p>
     <w:p>
       <w:pPr>
+        <w:pStyle w:val="Heading2"/>
+      </w:pPr>
+      <w:r>
+        <w:t xml:space="preserve">Week 5 outlook</w:t>
+      </w:r>
+    </w:p>
+    <w:p>
+      <w:pPr>
+        <w:pStyle w:val="Normal"/>
+      </w:pPr>
+      <w:r>
+        <w:t xml:space="preserve">Weekly overall model rank 137 (TE22). ROS overall rank 144 (TE23). Availability: UNKNOWN. Weekly ranks are preliminary when playing status is unconfirmed; they are separate from season ranks.</w:t>
+      </w:r>
+    </w:p>
+    <w:p>
+      <w:pPr>
         <w:pStyle w:val="Normal"/>
       </w:pPr>
       <w:r>
@@ -14748,6 +17052,22 @@
     </w:p>
     <w:p>
       <w:pPr>
+        <w:pStyle w:val="Heading2"/>
+      </w:pPr>
+      <w:r>
+        <w:t xml:space="preserve">Week 5 outlook</w:t>
+      </w:r>
+    </w:p>
+    <w:p>
+      <w:pPr>
+        <w:pStyle w:val="Normal"/>
+      </w:pPr>
+      <w:r>
+        <w:t xml:space="preserve">Weekly overall model rank 150 (WR59). ROS overall rank 145 (WR63). Availability: UNKNOWN. Weekly ranks are preliminary when playing status is unconfirmed; they are separate from season ranks.</w:t>
+      </w:r>
+    </w:p>
+    <w:p>
+      <w:pPr>
         <w:pStyle w:val="Normal"/>
       </w:pPr>
       <w:r>
@@ -14852,6 +17172,22 @@
     </w:p>
     <w:p>
       <w:pPr>
+        <w:pStyle w:val="Heading2"/>
+      </w:pPr>
+      <w:r>
+        <w:t xml:space="preserve">Week 5 outlook</w:t>
+      </w:r>
+    </w:p>
+    <w:p>
+      <w:pPr>
+        <w:pStyle w:val="Normal"/>
+      </w:pPr>
+      <w:r>
+        <w:t xml:space="preserve">Weekly overall model rank 161 (RB46). ROS overall rank 146 (RB44). Availability: UNKNOWN. Weekly ranks are preliminary when playing status is unconfirmed; they are separate from season ranks.</w:t>
+      </w:r>
+    </w:p>
+    <w:p>
+      <w:pPr>
         <w:pStyle w:val="Normal"/>
       </w:pPr>
       <w:r>
@@ -14956,6 +17292,22 @@
     </w:p>
     <w:p>
       <w:pPr>
+        <w:pStyle w:val="Heading2"/>
+      </w:pPr>
+      <w:r>
+        <w:t xml:space="preserve">Week 5 outlook</w:t>
+      </w:r>
+    </w:p>
+    <w:p>
+      <w:pPr>
+        <w:pStyle w:val="Normal"/>
+      </w:pPr>
+      <w:r>
+        <w:t xml:space="preserve">Weekly overall model rank 156 (RB41). ROS overall rank 147 (RB45). Availability: UNKNOWN. Weekly ranks are preliminary when playing status is unconfirmed; they are separate from season ranks.</w:t>
+      </w:r>
+    </w:p>
+    <w:p>
+      <w:pPr>
         <w:pStyle w:val="Normal"/>
       </w:pPr>
       <w:r>
@@ -15060,6 +17412,22 @@
     </w:p>
     <w:p>
       <w:pPr>
+        <w:pStyle w:val="Heading2"/>
+      </w:pPr>
+      <w:r>
+        <w:t xml:space="preserve">Week 5 outlook</w:t>
+      </w:r>
+    </w:p>
+    <w:p>
+      <w:pPr>
+        <w:pStyle w:val="Normal"/>
+      </w:pPr>
+      <w:r>
+        <w:t xml:space="preserve">Weekly overall model rank 59 (QB25). ROS overall rank 148 (QB17). Availability: UNKNOWN. Weekly ranks are preliminary when playing status is unconfirmed; they are separate from season ranks.</w:t>
+      </w:r>
+    </w:p>
+    <w:p>
+      <w:pPr>
         <w:pStyle w:val="Normal"/>
       </w:pPr>
       <w:r>
@@ -15164,6 +17532,22 @@
     </w:p>
     <w:p>
       <w:pPr>
+        <w:pStyle w:val="Heading2"/>
+      </w:pPr>
+      <w:r>
+        <w:t xml:space="preserve">Week 5 outlook</w:t>
+      </w:r>
+    </w:p>
+    <w:p>
+      <w:pPr>
+        <w:pStyle w:val="Normal"/>
+      </w:pPr>
+      <w:r>
+        <w:t xml:space="preserve">Weekly overall model rank 170 (WR64). ROS overall rank 149 (WR64). Availability: UNKNOWN. Weekly ranks are preliminary when playing status is unconfirmed; they are separate from season ranks.</w:t>
+      </w:r>
+    </w:p>
+    <w:p>
+      <w:pPr>
         <w:pStyle w:val="Normal"/>
       </w:pPr>
       <w:r>
@@ -15268,6 +17652,22 @@
     </w:p>
     <w:p>
       <w:pPr>
+        <w:pStyle w:val="Heading2"/>
+      </w:pPr>
+      <w:r>
+        <w:t xml:space="preserve">Week 5 outlook</w:t>
+      </w:r>
+    </w:p>
+    <w:p>
+      <w:pPr>
+        <w:pStyle w:val="Normal"/>
+      </w:pPr>
+      <w:r>
+        <w:t xml:space="preserve">Weekly overall model rank 90 (RB21). ROS overall rank 150 (RB46). Availability: UNKNOWN. Weekly ranks are preliminary when playing status is unconfirmed; they are separate from season ranks.</w:t>
+      </w:r>
+    </w:p>
+    <w:p>
+      <w:pPr>
         <w:pStyle w:val="Normal"/>
       </w:pPr>
       <w:r>
@@ -15372,6 +17772,22 @@
     </w:p>
     <w:p>
       <w:pPr>
+        <w:pStyle w:val="Heading2"/>
+      </w:pPr>
+      <w:r>
+        <w:t xml:space="preserve">Week 5 outlook</w:t>
+      </w:r>
+    </w:p>
+    <w:p>
+      <w:pPr>
+        <w:pStyle w:val="Normal"/>
+      </w:pPr>
+      <w:r>
+        <w:t xml:space="preserve">Weekly overall model rank 130 (WR52). ROS overall rank 151 (WR65). Availability: UNKNOWN. Weekly ranks are preliminary when playing status is unconfirmed; they are separate from season ranks.</w:t>
+      </w:r>
+    </w:p>
+    <w:p>
+      <w:pPr>
         <w:pStyle w:val="Normal"/>
       </w:pPr>
       <w:r>
@@ -15476,6 +17892,22 @@
     </w:p>
     <w:p>
       <w:pPr>
+        <w:pStyle w:val="Heading2"/>
+      </w:pPr>
+      <w:r>
+        <w:t xml:space="preserve">Week 5 outlook</w:t>
+      </w:r>
+    </w:p>
+    <w:p>
+      <w:pPr>
+        <w:pStyle w:val="Normal"/>
+      </w:pPr>
+      <w:r>
+        <w:t xml:space="preserve">Weekly overall model rank 120 (TE19). ROS overall rank 152 (TE24). Availability: UNKNOWN. Weekly ranks are preliminary when playing status is unconfirmed; they are separate from season ranks.</w:t>
+      </w:r>
+    </w:p>
+    <w:p>
+      <w:pPr>
         <w:pStyle w:val="Normal"/>
       </w:pPr>
       <w:r>
@@ -15580,6 +18012,22 @@
     </w:p>
     <w:p>
       <w:pPr>
+        <w:pStyle w:val="Heading2"/>
+      </w:pPr>
+      <w:r>
+        <w:t xml:space="preserve">Week 5 outlook</w:t>
+      </w:r>
+    </w:p>
+    <w:p>
+      <w:pPr>
+        <w:pStyle w:val="Normal"/>
+      </w:pPr>
+      <w:r>
+        <w:t xml:space="preserve">Weekly overall model rank 152 (RB39). ROS overall rank 153 (RB47). Availability: UNKNOWN. Weekly ranks are preliminary when playing status is unconfirmed; they are separate from season ranks.</w:t>
+      </w:r>
+    </w:p>
+    <w:p>
+      <w:pPr>
         <w:pStyle w:val="Normal"/>
       </w:pPr>
       <w:r>
@@ -15684,6 +18132,22 @@
     </w:p>
     <w:p>
       <w:pPr>
+        <w:pStyle w:val="Heading2"/>
+      </w:pPr>
+      <w:r>
+        <w:t xml:space="preserve">Week 5 outlook</w:t>
+      </w:r>
+    </w:p>
+    <w:p>
+      <w:pPr>
+        <w:pStyle w:val="Normal"/>
+      </w:pPr>
+      <w:r>
+        <w:t xml:space="preserve">Weekly overall model rank 194 (RB66). ROS overall rank 154 (RB48). Availability: EXPECTED_INACTIVE. Weekly ranks are preliminary when playing status is unconfirmed; they are separate from season ranks.</w:t>
+      </w:r>
+    </w:p>
+    <w:p>
+      <w:pPr>
         <w:pStyle w:val="Normal"/>
       </w:pPr>
       <w:r>
@@ -15788,6 +18252,22 @@
     </w:p>
     <w:p>
       <w:pPr>
+        <w:pStyle w:val="Heading2"/>
+      </w:pPr>
+      <w:r>
+        <w:t xml:space="preserve">Week 5 outlook</w:t>
+      </w:r>
+    </w:p>
+    <w:p>
+      <w:pPr>
+        <w:pStyle w:val="Normal"/>
+      </w:pPr>
+      <w:r>
+        <w:t xml:space="preserve">Weekly overall model rank 174 (RB56). ROS overall rank 155 (RB49). Availability: UNKNOWN. Weekly ranks are preliminary when playing status is unconfirmed; they are separate from season ranks.</w:t>
+      </w:r>
+    </w:p>
+    <w:p>
+      <w:pPr>
         <w:pStyle w:val="Normal"/>
       </w:pPr>
       <w:r>
@@ -15892,6 +18372,22 @@
     </w:p>
     <w:p>
       <w:pPr>
+        <w:pStyle w:val="Heading2"/>
+      </w:pPr>
+      <w:r>
+        <w:t xml:space="preserve">Week 5 outlook</w:t>
+      </w:r>
+    </w:p>
+    <w:p>
+      <w:pPr>
+        <w:pStyle w:val="Normal"/>
+      </w:pPr>
+      <w:r>
+        <w:t xml:space="preserve">Weekly overall model rank 180 (RB61). ROS overall rank 156 (RB50). Availability: UNKNOWN. Weekly ranks are preliminary when playing status is unconfirmed; they are separate from season ranks.</w:t>
+      </w:r>
+    </w:p>
+    <w:p>
+      <w:pPr>
         <w:pStyle w:val="Normal"/>
       </w:pPr>
       <w:r>
@@ -15996,6 +18492,22 @@
     </w:p>
     <w:p>
       <w:pPr>
+        <w:pStyle w:val="Heading2"/>
+      </w:pPr>
+      <w:r>
+        <w:t xml:space="preserve">Week 5 outlook</w:t>
+      </w:r>
+    </w:p>
+    <w:p>
+      <w:pPr>
+        <w:pStyle w:val="Normal"/>
+      </w:pPr>
+      <w:r>
+        <w:t xml:space="preserve">Weekly overall model rank 127 (RB30). ROS overall rank 157 (RB51). Availability: UNKNOWN. Weekly ranks are preliminary when playing status is unconfirmed; they are separate from season ranks.</w:t>
+      </w:r>
+    </w:p>
+    <w:p>
+      <w:pPr>
         <w:pStyle w:val="Normal"/>
       </w:pPr>
       <w:r>
@@ -16100,6 +18612,22 @@
     </w:p>
     <w:p>
       <w:pPr>
+        <w:pStyle w:val="Heading2"/>
+      </w:pPr>
+      <w:r>
+        <w:t xml:space="preserve">Week 5 outlook</w:t>
+      </w:r>
+    </w:p>
+    <w:p>
+      <w:pPr>
+        <w:pStyle w:val="Normal"/>
+      </w:pPr>
+      <w:r>
+        <w:t xml:space="preserve">Weekly overall model rank 110 (WR43). ROS overall rank 158 (WR66). Availability: UNKNOWN. Weekly ranks are preliminary when playing status is unconfirmed; they are separate from season ranks.</w:t>
+      </w:r>
+    </w:p>
+    <w:p>
+      <w:pPr>
         <w:pStyle w:val="Normal"/>
       </w:pPr>
       <w:r>
@@ -16204,6 +18732,22 @@
     </w:p>
     <w:p>
       <w:pPr>
+        <w:pStyle w:val="Heading2"/>
+      </w:pPr>
+      <w:r>
+        <w:t xml:space="preserve">Week 5 outlook</w:t>
+      </w:r>
+    </w:p>
+    <w:p>
+      <w:pPr>
+        <w:pStyle w:val="Normal"/>
+      </w:pPr>
+      <w:r>
+        <w:t xml:space="preserve">Weekly overall model rank 175 (WR66). ROS overall rank 159 (WR67). Availability: UNKNOWN. Weekly ranks are preliminary when playing status is unconfirmed; they are separate from season ranks.</w:t>
+      </w:r>
+    </w:p>
+    <w:p>
+      <w:pPr>
         <w:pStyle w:val="Normal"/>
       </w:pPr>
       <w:r>
@@ -16308,6 +18852,22 @@
     </w:p>
     <w:p>
       <w:pPr>
+        <w:pStyle w:val="Heading2"/>
+      </w:pPr>
+      <w:r>
+        <w:t xml:space="preserve">Week 5 outlook</w:t>
+      </w:r>
+    </w:p>
+    <w:p>
+      <w:pPr>
+        <w:pStyle w:val="Normal"/>
+      </w:pPr>
+      <w:r>
+        <w:t xml:space="preserve">Weekly overall model rank 165 (RB49). ROS overall rank 160 (RB52). Availability: UNKNOWN. Weekly ranks are preliminary when playing status is unconfirmed; they are separate from season ranks.</w:t>
+      </w:r>
+    </w:p>
+    <w:p>
+      <w:pPr>
         <w:pStyle w:val="Normal"/>
       </w:pPr>
       <w:r>
@@ -16412,6 +18972,22 @@
     </w:p>
     <w:p>
       <w:pPr>
+        <w:pStyle w:val="Heading2"/>
+      </w:pPr>
+      <w:r>
+        <w:t xml:space="preserve">Week 5 outlook</w:t>
+      </w:r>
+    </w:p>
+    <w:p>
+      <w:pPr>
+        <w:pStyle w:val="Normal"/>
+      </w:pPr>
+      <w:r>
+        <w:t xml:space="preserve">Weekly overall model rank 159 (RB44). ROS overall rank 161 (RB53). Availability: UNKNOWN. Weekly ranks are preliminary when playing status is unconfirmed; they are separate from season ranks.</w:t>
+      </w:r>
+    </w:p>
+    <w:p>
+      <w:pPr>
         <w:pStyle w:val="Normal"/>
       </w:pPr>
       <w:r>
@@ -16516,6 +19092,22 @@
     </w:p>
     <w:p>
       <w:pPr>
+        <w:pStyle w:val="Heading2"/>
+      </w:pPr>
+      <w:r>
+        <w:t xml:space="preserve">Week 5 outlook</w:t>
+      </w:r>
+    </w:p>
+    <w:p>
+      <w:pPr>
+        <w:pStyle w:val="Normal"/>
+      </w:pPr>
+      <w:r>
+        <w:t xml:space="preserve">Weekly overall model rank 167 (RB51). ROS overall rank 162 (RB54). Availability: UNKNOWN. Weekly ranks are preliminary when playing status is unconfirmed; they are separate from season ranks.</w:t>
+      </w:r>
+    </w:p>
+    <w:p>
+      <w:pPr>
         <w:pStyle w:val="Normal"/>
       </w:pPr>
       <w:r>
@@ -16620,6 +19212,22 @@
     </w:p>
     <w:p>
       <w:pPr>
+        <w:pStyle w:val="Heading2"/>
+      </w:pPr>
+      <w:r>
+        <w:t xml:space="preserve">Week 5 outlook</w:t>
+      </w:r>
+    </w:p>
+    <w:p>
+      <w:pPr>
+        <w:pStyle w:val="Normal"/>
+      </w:pPr>
+      <w:r>
+        <w:t xml:space="preserve">Weekly overall model rank 136 (WR55). ROS overall rank 163 (WR68). Availability: UNKNOWN. Weekly ranks are preliminary when playing status is unconfirmed; they are separate from season ranks.</w:t>
+      </w:r>
+    </w:p>
+    <w:p>
+      <w:pPr>
         <w:pStyle w:val="Normal"/>
       </w:pPr>
       <w:r>
@@ -16692,6 +19300,22 @@
     </w:p>
     <w:p>
       <w:pPr>
+        <w:pStyle w:val="Heading2"/>
+      </w:pPr>
+      <w:r>
+        <w:t xml:space="preserve">Week 5 outlook</w:t>
+      </w:r>
+    </w:p>
+    <w:p>
+      <w:pPr>
+        <w:pStyle w:val="Normal"/>
+      </w:pPr>
+      <w:r>
+        <w:t xml:space="preserve">Weekly overall model rank 77 (QB28). ROS overall rank 164 (QB18). Availability: UNKNOWN. Weekly ranks are preliminary when playing status is unconfirmed; they are separate from season ranks.</w:t>
+      </w:r>
+    </w:p>
+    <w:p>
+      <w:pPr>
         <w:pStyle w:val="Normal"/>
       </w:pPr>
       <w:r>
@@ -16796,6 +19420,22 @@
     </w:p>
     <w:p>
       <w:pPr>
+        <w:pStyle w:val="Heading2"/>
+      </w:pPr>
+      <w:r>
+        <w:t xml:space="preserve">Week 5 outlook</w:t>
+      </w:r>
+    </w:p>
+    <w:p>
+      <w:pPr>
+        <w:pStyle w:val="Normal"/>
+      </w:pPr>
+      <w:r>
+        <w:t xml:space="preserve">Weekly overall model rank 28 (QB10). ROS overall rank 165 (QB19). Availability: UNKNOWN. Weekly ranks are preliminary when playing status is unconfirmed; they are separate from season ranks.</w:t>
+      </w:r>
+    </w:p>
+    <w:p>
+      <w:pPr>
         <w:pStyle w:val="Normal"/>
       </w:pPr>
       <w:r>
@@ -16900,6 +19540,22 @@
     </w:p>
     <w:p>
       <w:pPr>
+        <w:pStyle w:val="Heading2"/>
+      </w:pPr>
+      <w:r>
+        <w:t xml:space="preserve">Week 5 outlook</w:t>
+      </w:r>
+    </w:p>
+    <w:p>
+      <w:pPr>
+        <w:pStyle w:val="Normal"/>
+      </w:pPr>
+      <w:r>
+        <w:t xml:space="preserve">Weekly overall model rank 155 (RB40). ROS overall rank 166 (RB55). Availability: UNKNOWN. Weekly ranks are preliminary when playing status is unconfirmed; they are separate from season ranks.</w:t>
+      </w:r>
+    </w:p>
+    <w:p>
+      <w:pPr>
         <w:pStyle w:val="Normal"/>
       </w:pPr>
       <w:r>
@@ -16988,6 +19644,22 @@
     </w:p>
     <w:p>
       <w:pPr>
+        <w:pStyle w:val="Heading2"/>
+      </w:pPr>
+      <w:r>
+        <w:t xml:space="preserve">Week 5 outlook</w:t>
+      </w:r>
+    </w:p>
+    <w:p>
+      <w:pPr>
+        <w:pStyle w:val="Normal"/>
+      </w:pPr>
+      <w:r>
+        <w:t xml:space="preserve">Weekly overall model rank 169 (RB53). ROS overall rank 167 (RB56). Availability: UNKNOWN. Weekly ranks are preliminary when playing status is unconfirmed; they are separate from season ranks.</w:t>
+      </w:r>
+    </w:p>
+    <w:p>
+      <w:pPr>
         <w:pStyle w:val="Normal"/>
       </w:pPr>
       <w:r>
@@ -17092,6 +19764,22 @@
     </w:p>
     <w:p>
       <w:pPr>
+        <w:pStyle w:val="Heading2"/>
+      </w:pPr>
+      <w:r>
+        <w:t xml:space="preserve">Week 5 outlook</w:t>
+      </w:r>
+    </w:p>
+    <w:p>
+      <w:pPr>
+        <w:pStyle w:val="Normal"/>
+      </w:pPr>
+      <w:r>
+        <w:t xml:space="preserve">Weekly overall model rank 29 (QB11). ROS overall rank 168 (QB20). Availability: UNKNOWN. Weekly ranks are preliminary when playing status is unconfirmed; they are separate from season ranks.</w:t>
+      </w:r>
+    </w:p>
+    <w:p>
+      <w:pPr>
         <w:pStyle w:val="Normal"/>
       </w:pPr>
       <w:r>
@@ -17196,6 +19884,22 @@
     </w:p>
     <w:p>
       <w:pPr>
+        <w:pStyle w:val="Heading2"/>
+      </w:pPr>
+      <w:r>
+        <w:t xml:space="preserve">Week 5 outlook</w:t>
+      </w:r>
+    </w:p>
+    <w:p>
+      <w:pPr>
+        <w:pStyle w:val="Normal"/>
+      </w:pPr>
+      <w:r>
+        <w:t xml:space="preserve">Weekly overall model rank 178 (RB59). ROS overall rank 169 (RB57). Availability: UNKNOWN. Weekly ranks are preliminary when playing status is unconfirmed; they are separate from season ranks.</w:t>
+      </w:r>
+    </w:p>
+    <w:p>
+      <w:pPr>
         <w:pStyle w:val="Normal"/>
       </w:pPr>
       <w:r>
@@ -17268,6 +19972,22 @@
     </w:p>
     <w:p>
       <w:pPr>
+        <w:pStyle w:val="Heading2"/>
+      </w:pPr>
+      <w:r>
+        <w:t xml:space="preserve">Week 5 outlook</w:t>
+      </w:r>
+    </w:p>
+    <w:p>
+      <w:pPr>
+        <w:pStyle w:val="Normal"/>
+      </w:pPr>
+      <w:r>
+        <w:t xml:space="preserve">Weekly overall model rank 30 (QB12). ROS overall rank 170 (QB21). Availability: UNKNOWN. Weekly ranks are preliminary when playing status is unconfirmed; they are separate from season ranks.</w:t>
+      </w:r>
+    </w:p>
+    <w:p>
+      <w:pPr>
         <w:pStyle w:val="Normal"/>
       </w:pPr>
       <w:r>
@@ -17372,6 +20092,22 @@
     </w:p>
     <w:p>
       <w:pPr>
+        <w:pStyle w:val="Heading2"/>
+      </w:pPr>
+      <w:r>
+        <w:t xml:space="preserve">Week 5 outlook</w:t>
+      </w:r>
+    </w:p>
+    <w:p>
+      <w:pPr>
+        <w:pStyle w:val="Normal"/>
+      </w:pPr>
+      <w:r>
+        <w:t xml:space="preserve">Weekly overall model rank 179 (RB60). ROS overall rank 171 (RB58). Availability: UNKNOWN. Weekly ranks are preliminary when playing status is unconfirmed; they are separate from season ranks.</w:t>
+      </w:r>
+    </w:p>
+    <w:p>
+      <w:pPr>
         <w:pStyle w:val="Normal"/>
       </w:pPr>
       <w:r>
@@ -17444,6 +20180,22 @@
     </w:p>
     <w:p>
       <w:pPr>
+        <w:pStyle w:val="Heading2"/>
+      </w:pPr>
+      <w:r>
+        <w:t xml:space="preserve">Week 5 outlook</w:t>
+      </w:r>
+    </w:p>
+    <w:p>
+      <w:pPr>
+        <w:pStyle w:val="Normal"/>
+      </w:pPr>
+      <w:r>
+        <w:t xml:space="preserve">Weekly overall model rank 177 (RB58). ROS overall rank 172 (RB59). Availability: UNKNOWN. Weekly ranks are preliminary when playing status is unconfirmed; they are separate from season ranks.</w:t>
+      </w:r>
+    </w:p>
+    <w:p>
+      <w:pPr>
         <w:pStyle w:val="Normal"/>
       </w:pPr>
       <w:r>
@@ -17548,6 +20300,22 @@
     </w:p>
     <w:p>
       <w:pPr>
+        <w:pStyle w:val="Heading2"/>
+      </w:pPr>
+      <w:r>
+        <w:t xml:space="preserve">Week 5 outlook</w:t>
+      </w:r>
+    </w:p>
+    <w:p>
+      <w:pPr>
+        <w:pStyle w:val="Normal"/>
+      </w:pPr>
+      <w:r>
+        <w:t xml:space="preserve">Weekly overall model rank 173 (RB55). ROS overall rank 173 (RB60). Availability: UNKNOWN. Weekly ranks are preliminary when playing status is unconfirmed; they are separate from season ranks.</w:t>
+      </w:r>
+    </w:p>
+    <w:p>
+      <w:pPr>
         <w:pStyle w:val="Normal"/>
       </w:pPr>
       <w:r>
@@ -17652,6 +20420,22 @@
     </w:p>
     <w:p>
       <w:pPr>
+        <w:pStyle w:val="Heading2"/>
+      </w:pPr>
+      <w:r>
+        <w:t xml:space="preserve">Week 5 outlook</w:t>
+      </w:r>
+    </w:p>
+    <w:p>
+      <w:pPr>
+        <w:pStyle w:val="Normal"/>
+      </w:pPr>
+      <w:r>
+        <w:t xml:space="preserve">Weekly overall model rank 185 (WR69). ROS overall rank 174 (WR69). Availability: UNKNOWN. Weekly ranks are preliminary when playing status is unconfirmed; they are separate from season ranks.</w:t>
+      </w:r>
+    </w:p>
+    <w:p>
+      <w:pPr>
         <w:pStyle w:val="Normal"/>
       </w:pPr>
       <w:r>
@@ -17756,6 +20540,22 @@
     </w:p>
     <w:p>
       <w:pPr>
+        <w:pStyle w:val="Heading2"/>
+      </w:pPr>
+      <w:r>
+        <w:t xml:space="preserve">Week 5 outlook</w:t>
+      </w:r>
+    </w:p>
+    <w:p>
+      <w:pPr>
+        <w:pStyle w:val="Normal"/>
+      </w:pPr>
+      <w:r>
+        <w:t xml:space="preserve">Weekly overall model rank 47 (QB20). ROS overall rank 175 (QB22). Availability: UNKNOWN. Weekly ranks are preliminary when playing status is unconfirmed; they are separate from season ranks.</w:t>
+      </w:r>
+    </w:p>
+    <w:p>
+      <w:pPr>
         <w:pStyle w:val="Normal"/>
       </w:pPr>
       <w:r>
@@ -17860,6 +20660,22 @@
     </w:p>
     <w:p>
       <w:pPr>
+        <w:pStyle w:val="Heading2"/>
+      </w:pPr>
+      <w:r>
+        <w:t xml:space="preserve">Week 5 outlook</w:t>
+      </w:r>
+    </w:p>
+    <w:p>
+      <w:pPr>
+        <w:pStyle w:val="Normal"/>
+      </w:pPr>
+      <w:r>
+        <w:t xml:space="preserve">Weekly overall model rank 164 (WR63). ROS overall rank 176 (WR70). Availability: UNKNOWN. Weekly ranks are preliminary when playing status is unconfirmed; they are separate from season ranks.</w:t>
+      </w:r>
+    </w:p>
+    <w:p>
+      <w:pPr>
         <w:pStyle w:val="Normal"/>
       </w:pPr>
       <w:r>
@@ -17932,6 +20748,22 @@
     </w:p>
     <w:p>
       <w:pPr>
+        <w:pStyle w:val="Heading2"/>
+      </w:pPr>
+      <w:r>
+        <w:t xml:space="preserve">Week 5 outlook</w:t>
+      </w:r>
+    </w:p>
+    <w:p>
+      <w:pPr>
+        <w:pStyle w:val="Normal"/>
+      </w:pPr>
+      <w:r>
+        <w:t xml:space="preserve">Weekly overall model rank 184 (WR68). ROS overall rank 177 (WR71). Availability: UNKNOWN. Weekly ranks are preliminary when playing status is unconfirmed; they are separate from season ranks.</w:t>
+      </w:r>
+    </w:p>
+    <w:p>
+      <w:pPr>
         <w:pStyle w:val="Normal"/>
       </w:pPr>
       <w:r>
@@ -18036,6 +20868,22 @@
     </w:p>
     <w:p>
       <w:pPr>
+        <w:pStyle w:val="Heading2"/>
+      </w:pPr>
+      <w:r>
+        <w:t xml:space="preserve">Week 5 outlook</w:t>
+      </w:r>
+    </w:p>
+    <w:p>
+      <w:pPr>
+        <w:pStyle w:val="Normal"/>
+      </w:pPr>
+      <w:r>
+        <w:t xml:space="preserve">Weekly overall model rank 182 (WR67). ROS overall rank 178 (WR72). Availability: UNKNOWN. Weekly ranks are preliminary when playing status is unconfirmed; they are separate from season ranks.</w:t>
+      </w:r>
+    </w:p>
+    <w:p>
+      <w:pPr>
         <w:pStyle w:val="Normal"/>
       </w:pPr>
       <w:r>
@@ -18108,6 +20956,22 @@
     </w:p>
     <w:p>
       <w:pPr>
+        <w:pStyle w:val="Heading2"/>
+      </w:pPr>
+      <w:r>
+        <w:t xml:space="preserve">Week 5 outlook</w:t>
+      </w:r>
+    </w:p>
+    <w:p>
+      <w:pPr>
+        <w:pStyle w:val="Normal"/>
+      </w:pPr>
+      <w:r>
+        <w:t xml:space="preserve">Weekly overall model rank 188 (TE26). ROS overall rank 179 (TE25). Availability: UNKNOWN. Weekly ranks are preliminary when playing status is unconfirmed; they are separate from season ranks.</w:t>
+      </w:r>
+    </w:p>
+    <w:p>
+      <w:pPr>
         <w:pStyle w:val="Normal"/>
       </w:pPr>
       <w:r>
@@ -18212,6 +21076,22 @@
     </w:p>
     <w:p>
       <w:pPr>
+        <w:pStyle w:val="Heading2"/>
+      </w:pPr>
+      <w:r>
+        <w:t xml:space="preserve">Week 5 outlook</w:t>
+      </w:r>
+    </w:p>
+    <w:p>
+      <w:pPr>
+        <w:pStyle w:val="Normal"/>
+      </w:pPr>
+      <w:r>
+        <w:t xml:space="preserve">Weekly overall model rank 176 (RB57). ROS overall rank 180 (RB61). Availability: UNKNOWN. Weekly ranks are preliminary when playing status is unconfirmed; they are separate from season ranks.</w:t>
+      </w:r>
+    </w:p>
+    <w:p>
+      <w:pPr>
         <w:pStyle w:val="Normal"/>
       </w:pPr>
       <w:r>
@@ -18284,6 +21164,22 @@
     </w:p>
     <w:p>
       <w:pPr>
+        <w:pStyle w:val="Heading2"/>
+      </w:pPr>
+      <w:r>
+        <w:t xml:space="preserve">Week 5 outlook</w:t>
+      </w:r>
+    </w:p>
+    <w:p>
+      <w:pPr>
+        <w:pStyle w:val="Normal"/>
+      </w:pPr>
+      <w:r>
+        <w:t xml:space="preserve">Weekly overall model rank 196 (RB67). ROS overall rank 181 (RB62). Availability: EXPECTED_INACTIVE. Weekly ranks are preliminary when playing status is unconfirmed; they are separate from season ranks.</w:t>
+      </w:r>
+    </w:p>
+    <w:p>
+      <w:pPr>
         <w:pStyle w:val="Normal"/>
       </w:pPr>
       <w:r>
@@ -18388,6 +21284,22 @@
     </w:p>
     <w:p>
       <w:pPr>
+        <w:pStyle w:val="Heading2"/>
+      </w:pPr>
+      <w:r>
+        <w:t xml:space="preserve">Week 5 outlook</w:t>
+      </w:r>
+    </w:p>
+    <w:p>
+      <w:pPr>
+        <w:pStyle w:val="Normal"/>
+      </w:pPr>
+      <w:r>
+        <w:t xml:space="preserve">Weekly overall model rank 51 (QB22). ROS overall rank 182 (QB23). Availability: UNKNOWN. Weekly ranks are preliminary when playing status is unconfirmed; they are separate from season ranks.</w:t>
+      </w:r>
+    </w:p>
+    <w:p>
+      <w:pPr>
         <w:pStyle w:val="Normal"/>
       </w:pPr>
       <w:r>
@@ -18492,6 +21404,22 @@
     </w:p>
     <w:p>
       <w:pPr>
+        <w:pStyle w:val="Heading2"/>
+      </w:pPr>
+      <w:r>
+        <w:t xml:space="preserve">Week 5 outlook</w:t>
+      </w:r>
+    </w:p>
+    <w:p>
+      <w:pPr>
+        <w:pStyle w:val="Normal"/>
+      </w:pPr>
+      <w:r>
+        <w:t xml:space="preserve">Weekly overall model rank 181 (RB62). ROS overall rank 183 (RB63). Availability: UNKNOWN. Weekly ranks are preliminary when playing status is unconfirmed; they are separate from season ranks.</w:t>
+      </w:r>
+    </w:p>
+    <w:p>
+      <w:pPr>
         <w:pStyle w:val="Normal"/>
       </w:pPr>
       <w:r>
@@ -18596,6 +21524,22 @@
     </w:p>
     <w:p>
       <w:pPr>
+        <w:pStyle w:val="Heading2"/>
+      </w:pPr>
+      <w:r>
+        <w:t xml:space="preserve">Week 5 outlook</w:t>
+      </w:r>
+    </w:p>
+    <w:p>
+      <w:pPr>
+        <w:pStyle w:val="Normal"/>
+      </w:pPr>
+      <w:r>
+        <w:t xml:space="preserve">Weekly overall model rank 187 (RB63). ROS overall rank 184 (RB64). Availability: UNKNOWN. Weekly ranks are preliminary when playing status is unconfirmed; they are separate from season ranks.</w:t>
+      </w:r>
+    </w:p>
+    <w:p>
+      <w:pPr>
         <w:pStyle w:val="Normal"/>
       </w:pPr>
       <w:r>
@@ -18700,6 +21644,22 @@
     </w:p>
     <w:p>
       <w:pPr>
+        <w:pStyle w:val="Heading2"/>
+      </w:pPr>
+      <w:r>
+        <w:t xml:space="preserve">Week 5 outlook</w:t>
+      </w:r>
+    </w:p>
+    <w:p>
+      <w:pPr>
+        <w:pStyle w:val="Normal"/>
+      </w:pPr>
+      <w:r>
+        <w:t xml:space="preserve">Weekly overall model rank 58 (QB24). ROS overall rank 185 (QB24). Availability: UNKNOWN. Weekly ranks are preliminary when playing status is unconfirmed; they are separate from season ranks.</w:t>
+      </w:r>
+    </w:p>
+    <w:p>
+      <w:pPr>
         <w:pStyle w:val="Normal"/>
       </w:pPr>
       <w:r>
@@ -18804,6 +21764,22 @@
     </w:p>
     <w:p>
       <w:pPr>
+        <w:pStyle w:val="Heading2"/>
+      </w:pPr>
+      <w:r>
+        <w:t xml:space="preserve">Week 5 outlook</w:t>
+      </w:r>
+    </w:p>
+    <w:p>
+      <w:pPr>
+        <w:pStyle w:val="Normal"/>
+      </w:pPr>
+      <w:r>
+        <w:t xml:space="preserve">Weekly overall model rank 45 (QB19). ROS overall rank 186 (QB25). Availability: UNKNOWN. Weekly ranks are preliminary when playing status is unconfirmed; they are separate from season ranks.</w:t>
+      </w:r>
+    </w:p>
+    <w:p>
+      <w:pPr>
         <w:pStyle w:val="Normal"/>
       </w:pPr>
       <w:r>
@@ -18908,6 +21884,22 @@
     </w:p>
     <w:p>
       <w:pPr>
+        <w:pStyle w:val="Heading2"/>
+      </w:pPr>
+      <w:r>
+        <w:t xml:space="preserve">Week 5 outlook</w:t>
+      </w:r>
+    </w:p>
+    <w:p>
+      <w:pPr>
+        <w:pStyle w:val="Normal"/>
+      </w:pPr>
+      <w:r>
+        <w:t xml:space="preserve">Weekly overall model rank 183 (TE25). ROS overall rank 187 (TE26). Availability: UNKNOWN. Weekly ranks are preliminary when playing status is unconfirmed; they are separate from season ranks.</w:t>
+      </w:r>
+    </w:p>
+    <w:p>
+      <w:pPr>
         <w:pStyle w:val="Normal"/>
       </w:pPr>
       <w:r>
@@ -19012,6 +22004,22 @@
     </w:p>
     <w:p>
       <w:pPr>
+        <w:pStyle w:val="Heading2"/>
+      </w:pPr>
+      <w:r>
+        <w:t xml:space="preserve">Week 5 outlook</w:t>
+      </w:r>
+    </w:p>
+    <w:p>
+      <w:pPr>
+        <w:pStyle w:val="Normal"/>
+      </w:pPr>
+      <w:r>
+        <w:t xml:space="preserve">Weekly overall model rank 54 (QB23). ROS overall rank 188 (QB26). Availability: UNKNOWN. Weekly ranks are preliminary when playing status is unconfirmed; they are separate from season ranks.</w:t>
+      </w:r>
+    </w:p>
+    <w:p>
+      <w:pPr>
         <w:pStyle w:val="Normal"/>
       </w:pPr>
       <w:r>
@@ -19116,6 +22124,22 @@
     </w:p>
     <w:p>
       <w:pPr>
+        <w:pStyle w:val="Heading2"/>
+      </w:pPr>
+      <w:r>
+        <w:t xml:space="preserve">Week 5 outlook</w:t>
+      </w:r>
+    </w:p>
+    <w:p>
+      <w:pPr>
+        <w:pStyle w:val="Normal"/>
+      </w:pPr>
+      <w:r>
+        <w:t xml:space="preserve">Weekly overall model rank 193 (RB65). ROS overall rank 189 (RB65). Availability: UNKNOWN. Weekly ranks are preliminary when playing status is unconfirmed; they are separate from season ranks.</w:t>
+      </w:r>
+    </w:p>
+    <w:p>
+      <w:pPr>
         <w:pStyle w:val="Normal"/>
       </w:pPr>
       <w:r>
@@ -19220,6 +22244,22 @@
     </w:p>
     <w:p>
       <w:pPr>
+        <w:pStyle w:val="Heading2"/>
+      </w:pPr>
+      <w:r>
+        <w:t xml:space="preserve">Week 5 outlook</w:t>
+      </w:r>
+    </w:p>
+    <w:p>
+      <w:pPr>
+        <w:pStyle w:val="Normal"/>
+      </w:pPr>
+      <w:r>
+        <w:t xml:space="preserve">Weekly overall model rank 132 (QB29). ROS overall rank 190 (QB27). Availability: UNKNOWN. Weekly ranks are preliminary when playing status is unconfirmed; they are separate from season ranks.</w:t>
+      </w:r>
+    </w:p>
+    <w:p>
+      <w:pPr>
         <w:pStyle w:val="Normal"/>
       </w:pPr>
       <w:r>
@@ -19292,6 +22332,22 @@
     </w:p>
     <w:p>
       <w:pPr>
+        <w:pStyle w:val="Heading2"/>
+      </w:pPr>
+      <w:r>
+        <w:t xml:space="preserve">Week 5 outlook</w:t>
+      </w:r>
+    </w:p>
+    <w:p>
+      <w:pPr>
+        <w:pStyle w:val="Normal"/>
+      </w:pPr>
+      <w:r>
+        <w:t xml:space="preserve">Weekly overall model rank 191 (RB64). ROS overall rank 191 (RB66). Availability: UNKNOWN. Weekly ranks are preliminary when playing status is unconfirmed; they are separate from season ranks.</w:t>
+      </w:r>
+    </w:p>
+    <w:p>
+      <w:pPr>
         <w:pStyle w:val="Normal"/>
       </w:pPr>
       <w:r>
@@ -19396,6 +22452,22 @@
     </w:p>
     <w:p>
       <w:pPr>
+        <w:pStyle w:val="Heading2"/>
+      </w:pPr>
+      <w:r>
+        <w:t xml:space="preserve">Week 5 outlook</w:t>
+      </w:r>
+    </w:p>
+    <w:p>
+      <w:pPr>
+        <w:pStyle w:val="Normal"/>
+      </w:pPr>
+      <w:r>
+        <w:t xml:space="preserve">Weekly overall model rank 68 (QB26). ROS overall rank 192 (QB28). Availability: UNKNOWN. Weekly ranks are preliminary when playing status is unconfirmed; they are separate from season ranks.</w:t>
+      </w:r>
+    </w:p>
+    <w:p>
+      <w:pPr>
         <w:pStyle w:val="Normal"/>
       </w:pPr>
       <w:r>
@@ -19500,6 +22572,22 @@
     </w:p>
     <w:p>
       <w:pPr>
+        <w:pStyle w:val="Heading2"/>
+      </w:pPr>
+      <w:r>
+        <w:t xml:space="preserve">Week 5 outlook</w:t>
+      </w:r>
+    </w:p>
+    <w:p>
+      <w:pPr>
+        <w:pStyle w:val="Normal"/>
+      </w:pPr>
+      <w:r>
+        <w:t xml:space="preserve">Weekly overall model rank 189 (WR71). ROS overall rank 193 (WR73). Availability: UNKNOWN. Weekly ranks are preliminary when playing status is unconfirmed; they are separate from season ranks.</w:t>
+      </w:r>
+    </w:p>
+    <w:p>
+      <w:pPr>
         <w:pStyle w:val="Normal"/>
       </w:pPr>
       <w:r>
@@ -19604,6 +22692,22 @@
     </w:p>
     <w:p>
       <w:pPr>
+        <w:pStyle w:val="Heading2"/>
+      </w:pPr>
+      <w:r>
+        <w:t xml:space="preserve">Week 5 outlook</w:t>
+      </w:r>
+    </w:p>
+    <w:p>
+      <w:pPr>
+        <w:pStyle w:val="Normal"/>
+      </w:pPr>
+      <w:r>
+        <w:t xml:space="preserve">Weekly overall model rank 72 (QB27). ROS overall rank 194 (QB29). Availability: UNKNOWN. Weekly ranks are preliminary when playing status is unconfirmed; they are separate from season ranks.</w:t>
+      </w:r>
+    </w:p>
+    <w:p>
+      <w:pPr>
         <w:pStyle w:val="Normal"/>
       </w:pPr>
       <w:r>
@@ -19708,6 +22812,22 @@
     </w:p>
     <w:p>
       <w:pPr>
+        <w:pStyle w:val="Heading2"/>
+      </w:pPr>
+      <w:r>
+        <w:t xml:space="preserve">Week 5 outlook</w:t>
+      </w:r>
+    </w:p>
+    <w:p>
+      <w:pPr>
+        <w:pStyle w:val="Normal"/>
+      </w:pPr>
+      <w:r>
+        <w:t xml:space="preserve">Weekly overall model rank 195 (WR74). ROS overall rank 195 (WR74). Availability: EXPECTED_INACTIVE. Weekly ranks are preliminary when playing status is unconfirmed; they are separate from season ranks.</w:t>
+      </w:r>
+    </w:p>
+    <w:p>
+      <w:pPr>
         <w:pStyle w:val="Normal"/>
       </w:pPr>
       <w:r>
@@ -19812,6 +22932,22 @@
     </w:p>
     <w:p>
       <w:pPr>
+        <w:pStyle w:val="Heading2"/>
+      </w:pPr>
+      <w:r>
+        <w:t xml:space="preserve">Week 5 outlook</w:t>
+      </w:r>
+    </w:p>
+    <w:p>
+      <w:pPr>
+        <w:pStyle w:val="Normal"/>
+      </w:pPr>
+      <w:r>
+        <w:t xml:space="preserve">Weekly overall model rank 197 (WR75). ROS overall rank 196 (WR75). Availability: UNKNOWN. Weekly ranks are preliminary when playing status is unconfirmed; they are separate from season ranks.</w:t>
+      </w:r>
+    </w:p>
+    <w:p>
+      <w:pPr>
         <w:pStyle w:val="Normal"/>
       </w:pPr>
       <w:r>
@@ -19912,6 +23048,22 @@
       </w:pPr>
       <w:r>
         <w:t xml:space="preserve">San Francisco 49ers RB. Overall rank 197 (RB67). True Value rank 197 (RB67). True Value score 7.27. Season PPR projection 104.</w:t>
+      </w:r>
+    </w:p>
+    <w:p>
+      <w:pPr>
+        <w:pStyle w:val="Heading2"/>
+      </w:pPr>
+      <w:r>
+        <w:t xml:space="preserve">Week 5 outlook</w:t>
+      </w:r>
+    </w:p>
+    <w:p>
+      <w:pPr>
+        <w:pStyle w:val="Normal"/>
+      </w:pPr>
+      <w:r>
+        <w:t xml:space="preserve">Weekly overall model rank 166 (RB50). ROS overall rank 197 (RB67). Availability: UNKNOWN. Weekly ranks are preliminary when playing status is unconfirmed; they are separate from season ranks.</w:t>
       </w:r>
     </w:p>
     <w:p>

</xml_diff>

<commit_message>
Keep current weekly ranks separate and withhold games outside the forecast window
</commit_message>
<xml_diff>
--- a/exports/fantasy-2026-current.docx
+++ b/exports/fantasy-2026-current.docx
@@ -55,7 +55,7 @@
         <w:pStyle w:val="Normal"/>
       </w:pPr>
       <w:r>
-        <w:t xml:space="preserve">Weekly overall model rank 5 (RB2). ROS overall rank 1 (RB1). Availability: UNKNOWN. Weekly ranks are preliminary when playing status is unconfirmed; they are separate from season ranks.</w:t>
+        <w:t xml:space="preserve">Weekly overall model rank 4 (RB2). ROS overall rank 1 (RB1). Availability: UNKNOWN. Weekly ranks are preliminary when playing status is unconfirmed; they are separate from season ranks.</w:t>
       </w:r>
     </w:p>
     <w:p>
@@ -295,7 +295,7 @@
         <w:pStyle w:val="Normal"/>
       </w:pPr>
       <w:r>
-        <w:t xml:space="preserve">Weekly overall model rank 4 (WR1). ROS overall rank 3 (WR1). Availability: UNKNOWN. Weekly ranks are preliminary when playing status is unconfirmed; they are separate from season ranks.</w:t>
+        <w:t xml:space="preserve">Weekly overall model rank 3 (WR1). ROS overall rank 3 (WR1). Availability: UNKNOWN. Weekly ranks are preliminary when playing status is unconfirmed; they are separate from season ranks.</w:t>
       </w:r>
     </w:p>
     <w:p>
@@ -415,7 +415,7 @@
         <w:pStyle w:val="Normal"/>
       </w:pPr>
       <w:r>
-        <w:t xml:space="preserve">Weekly overall model rank 21 (WR7). ROS overall rank 4 (WR2). Availability: UNKNOWN. Weekly ranks are preliminary when playing status is unconfirmed; they are separate from season ranks.</w:t>
+        <w:t xml:space="preserve">Weekly overall model rank 19 (WR6). ROS overall rank 4 (WR2). Availability: UNKNOWN. Weekly ranks are preliminary when playing status is unconfirmed; they are separate from season ranks.</w:t>
       </w:r>
     </w:p>
     <w:p>
@@ -535,7 +535,7 @@
         <w:pStyle w:val="Normal"/>
       </w:pPr>
       <w:r>
-        <w:t xml:space="preserve">Weekly overall model rank 14 (WR4). ROS overall rank 5 (WR3). Availability: UNKNOWN. Weekly ranks are preliminary when playing status is unconfirmed; they are separate from season ranks.</w:t>
+        <w:t xml:space="preserve">Weekly overall model rank 13 (WR4). ROS overall rank 5 (WR3). Availability: UNKNOWN. Weekly ranks are preliminary when playing status is unconfirmed; they are separate from season ranks.</w:t>
       </w:r>
     </w:p>
     <w:p>
@@ -655,7 +655,7 @@
         <w:pStyle w:val="Normal"/>
       </w:pPr>
       <w:r>
-        <w:t xml:space="preserve">Weekly overall model rank 6 (WR2). ROS overall rank 6 (WR4). Availability: UNKNOWN. Weekly ranks are preliminary when playing status is unconfirmed; they are separate from season ranks.</w:t>
+        <w:t xml:space="preserve">Weekly overall model rank 5 (WR2). ROS overall rank 6 (WR4). Availability: UNKNOWN. Weekly ranks are preliminary when playing status is unconfirmed; they are separate from season ranks.</w:t>
       </w:r>
     </w:p>
     <w:p>
@@ -743,7 +743,7 @@
         <w:pStyle w:val="Normal"/>
       </w:pPr>
       <w:r>
-        <w:t xml:space="preserve">Weekly overall model rank 13 (RB4). ROS overall rank 7 (RB3). Availability: UNKNOWN. Weekly ranks are preliminary when playing status is unconfirmed; they are separate from season ranks.</w:t>
+        <w:t xml:space="preserve">Weekly overall model rank 12 (RB4). ROS overall rank 7 (RB3). Availability: UNKNOWN. Weekly ranks are preliminary when playing status is unconfirmed; they are separate from season ranks.</w:t>
       </w:r>
     </w:p>
     <w:p>
@@ -863,7 +863,7 @@
         <w:pStyle w:val="Normal"/>
       </w:pPr>
       <w:r>
-        <w:t xml:space="preserve">Weekly overall model rank 17 (RB5). ROS overall rank 8 (RB4). Availability: UNKNOWN. Weekly ranks are preliminary when playing status is unconfirmed; they are separate from season ranks.</w:t>
+        <w:t xml:space="preserve">Weekly overall model rank 15 (RB5). ROS overall rank 8 (RB4). Availability: UNKNOWN. Weekly ranks are preliminary when playing status is unconfirmed; they are separate from season ranks.</w:t>
       </w:r>
     </w:p>
     <w:p>
@@ -983,7 +983,7 @@
         <w:pStyle w:val="Normal"/>
       </w:pPr>
       <w:r>
-        <w:t xml:space="preserve">Weekly overall model rank 15 (WR5). ROS overall rank 9 (WR5). Availability: UNKNOWN. Weekly ranks are preliminary when playing status is unconfirmed; they are separate from season ranks.</w:t>
+        <w:t xml:space="preserve">Weekly overall model rank Not published (GAME_STARTED_NO_ORIGINAL_WEEKLY_RANK). ROS overall rank 9 (WR5). Availability: UNKNOWN. Weekly ranks are preliminary when playing status is unconfirmed; they are separate from season ranks.</w:t>
       </w:r>
     </w:p>
     <w:p>
@@ -1103,7 +1103,7 @@
         <w:pStyle w:val="Normal"/>
       </w:pPr>
       <w:r>
-        <w:t xml:space="preserve">Weekly overall model rank 12 (RB3). ROS overall rank 10 (RB5). Availability: UNKNOWN. Weekly ranks are preliminary when playing status is unconfirmed; they are separate from season ranks.</w:t>
+        <w:t xml:space="preserve">Weekly overall model rank 11 (RB3). ROS overall rank 10 (RB5). Availability: UNKNOWN. Weekly ranks are preliminary when playing status is unconfirmed; they are separate from season ranks.</w:t>
       </w:r>
     </w:p>
     <w:p>
@@ -1223,7 +1223,7 @@
         <w:pStyle w:val="Normal"/>
       </w:pPr>
       <w:r>
-        <w:t xml:space="preserve">Weekly overall model rank 9 (TE1). ROS overall rank 11 (TE1). Availability: UNKNOWN. Weekly ranks are preliminary when playing status is unconfirmed; they are separate from season ranks.</w:t>
+        <w:t xml:space="preserve">Weekly overall model rank 8 (TE1). ROS overall rank 11 (TE1). Availability: UNKNOWN. Weekly ranks are preliminary when playing status is unconfirmed; they are separate from season ranks.</w:t>
       </w:r>
     </w:p>
     <w:p>
@@ -1343,7 +1343,7 @@
         <w:pStyle w:val="Normal"/>
       </w:pPr>
       <w:r>
-        <w:t xml:space="preserve">Weekly overall model rank 18 (RB6). ROS overall rank 12 (RB6). Availability: UNKNOWN. Weekly ranks are preliminary when playing status is unconfirmed; they are separate from season ranks.</w:t>
+        <w:t xml:space="preserve">Weekly overall model rank 16 (RB6). ROS overall rank 12 (RB6). Availability: UNKNOWN. Weekly ranks are preliminary when playing status is unconfirmed; they are separate from season ranks.</w:t>
       </w:r>
     </w:p>
     <w:p>
@@ -1463,7 +1463,7 @@
         <w:pStyle w:val="Normal"/>
       </w:pPr>
       <w:r>
-        <w:t xml:space="preserve">Weekly overall model rank 11 (WR3). ROS overall rank 13 (WR6). Availability: UNKNOWN. Weekly ranks are preliminary when playing status is unconfirmed; they are separate from season ranks.</w:t>
+        <w:t xml:space="preserve">Weekly overall model rank 10 (WR3). ROS overall rank 13 (WR6). Availability: UNKNOWN. Weekly ranks are preliminary when playing status is unconfirmed; they are separate from season ranks.</w:t>
       </w:r>
     </w:p>
     <w:p>
@@ -1583,7 +1583,7 @@
         <w:pStyle w:val="Normal"/>
       </w:pPr>
       <w:r>
-        <w:t xml:space="preserve">Weekly overall model rank 48 (RB14). ROS overall rank 14 (RB7). Availability: UNKNOWN. Weekly ranks are preliminary when playing status is unconfirmed; they are separate from season ranks.</w:t>
+        <w:t xml:space="preserve">Weekly overall model rank 39 (RB13). ROS overall rank 14 (RB7). Availability: UNKNOWN. Weekly ranks are preliminary when playing status is unconfirmed; they are separate from season ranks.</w:t>
       </w:r>
     </w:p>
     <w:p>
@@ -1703,7 +1703,7 @@
         <w:pStyle w:val="Normal"/>
       </w:pPr>
       <w:r>
-        <w:t xml:space="preserve">Weekly overall model rank 43 (RB12). ROS overall rank 15 (RB8). Availability: UNKNOWN. Weekly ranks are preliminary when playing status is unconfirmed; they are separate from season ranks.</w:t>
+        <w:t xml:space="preserve">Weekly overall model rank 35 (RB11). ROS overall rank 15 (RB8). Availability: UNKNOWN. Weekly ranks are preliminary when playing status is unconfirmed; they are separate from season ranks.</w:t>
       </w:r>
     </w:p>
     <w:p>
@@ -1823,7 +1823,7 @@
         <w:pStyle w:val="Normal"/>
       </w:pPr>
       <w:r>
-        <w:t xml:space="preserve">Weekly overall model rank 27 (WR9). ROS overall rank 16 (WR7). Availability: UNKNOWN. Weekly ranks are preliminary when playing status is unconfirmed; they are separate from season ranks.</w:t>
+        <w:t xml:space="preserve">Weekly overall model rank 24 (WR7). ROS overall rank 16 (WR7). Availability: UNKNOWN. Weekly ranks are preliminary when playing status is unconfirmed; they are separate from season ranks.</w:t>
       </w:r>
     </w:p>
     <w:p>
@@ -1911,7 +1911,7 @@
         <w:pStyle w:val="Normal"/>
       </w:pPr>
       <w:r>
-        <w:t xml:space="preserve">Weekly overall model rank 38 (RB11). ROS overall rank 17 (RB9). Availability: UNKNOWN. Weekly ranks are preliminary when playing status is unconfirmed; they are separate from season ranks.</w:t>
+        <w:t xml:space="preserve">Weekly overall model rank 32 (RB10). ROS overall rank 17 (RB9). Availability: UNKNOWN. Weekly ranks are preliminary when playing status is unconfirmed; they are separate from season ranks.</w:t>
       </w:r>
     </w:p>
     <w:p>
@@ -1999,7 +1999,7 @@
         <w:pStyle w:val="Normal"/>
       </w:pPr>
       <w:r>
-        <w:t xml:space="preserve">Weekly overall model rank 19 (WR6). ROS overall rank 18 (WR8). Availability: UNKNOWN. Weekly ranks are preliminary when playing status is unconfirmed; they are separate from season ranks.</w:t>
+        <w:t xml:space="preserve">Weekly overall model rank 17 (WR5). ROS overall rank 18 (WR8). Availability: UNKNOWN. Weekly ranks are preliminary when playing status is unconfirmed; they are separate from season ranks.</w:t>
       </w:r>
     </w:p>
     <w:p>
@@ -2119,7 +2119,7 @@
         <w:pStyle w:val="Normal"/>
       </w:pPr>
       <w:r>
-        <w:t xml:space="preserve">Weekly overall model rank 37 (RB10). ROS overall rank 19 (RB10). Availability: UNKNOWN. Weekly ranks are preliminary when playing status is unconfirmed; they are separate from season ranks.</w:t>
+        <w:t xml:space="preserve">Weekly overall model rank 31 (RB9). ROS overall rank 19 (RB10). Availability: UNKNOWN. Weekly ranks are preliminary when playing status is unconfirmed; they are separate from season ranks.</w:t>
       </w:r>
     </w:p>
     <w:p>
@@ -2239,7 +2239,7 @@
         <w:pStyle w:val="Normal"/>
       </w:pPr>
       <w:r>
-        <w:t xml:space="preserve">Weekly overall model rank 20 (TE2). ROS overall rank 20 (TE2). Availability: UNKNOWN. Weekly ranks are preliminary when playing status is unconfirmed; they are separate from season ranks.</w:t>
+        <w:t xml:space="preserve">Weekly overall model rank 18 (TE2). ROS overall rank 20 (TE2). Availability: UNKNOWN. Weekly ranks are preliminary when playing status is unconfirmed; they are separate from season ranks.</w:t>
       </w:r>
     </w:p>
     <w:p>
@@ -2359,7 +2359,7 @@
         <w:pStyle w:val="Normal"/>
       </w:pPr>
       <w:r>
-        <w:t xml:space="preserve">Weekly overall model rank 35 (RB9). ROS overall rank 21 (RB11). Availability: UNKNOWN. Weekly ranks are preliminary when playing status is unconfirmed; they are separate from season ranks.</w:t>
+        <w:t xml:space="preserve">Weekly overall model rank Not published (NO_CURRENT_WEEK_GAME). ROS overall rank 21 (RB11). Availability: UNKNOWN. Weekly ranks are preliminary when playing status is unconfirmed; they are separate from season ranks.</w:t>
       </w:r>
     </w:p>
     <w:p>
@@ -2479,7 +2479,7 @@
         <w:pStyle w:val="Normal"/>
       </w:pPr>
       <w:r>
-        <w:t xml:space="preserve">Weekly overall model rank 26 (RB7). ROS overall rank 22 (RB12). Availability: UNKNOWN. Weekly ranks are preliminary when playing status is unconfirmed; they are separate from season ranks.</w:t>
+        <w:t xml:space="preserve">Weekly overall model rank 23 (RB7). ROS overall rank 22 (RB12). Availability: UNKNOWN. Weekly ranks are preliminary when playing status is unconfirmed; they are separate from season ranks.</w:t>
       </w:r>
     </w:p>
     <w:p>
@@ -2599,7 +2599,7 @@
         <w:pStyle w:val="Normal"/>
       </w:pPr>
       <w:r>
-        <w:t xml:space="preserve">Weekly overall model rank 50 (WR13). ROS overall rank 23 (WR9). Availability: UNKNOWN. Weekly ranks are preliminary when playing status is unconfirmed; they are separate from season ranks.</w:t>
+        <w:t xml:space="preserve">Weekly overall model rank 41 (WR9). ROS overall rank 23 (WR9). Availability: UNKNOWN. Weekly ranks are preliminary when playing status is unconfirmed; they are separate from season ranks.</w:t>
       </w:r>
     </w:p>
     <w:p>
@@ -2719,7 +2719,7 @@
         <w:pStyle w:val="Normal"/>
       </w:pPr>
       <w:r>
-        <w:t xml:space="preserve">Weekly overall model rank 44 (RB13). ROS overall rank 24 (RB13). Availability: UNKNOWN. Weekly ranks are preliminary when playing status is unconfirmed; they are separate from season ranks.</w:t>
+        <w:t xml:space="preserve">Weekly overall model rank 36 (RB12). ROS overall rank 24 (RB13). Availability: UNKNOWN. Weekly ranks are preliminary when playing status is unconfirmed; they are separate from season ranks.</w:t>
       </w:r>
     </w:p>
     <w:p>
@@ -2839,7 +2839,7 @@
         <w:pStyle w:val="Normal"/>
       </w:pPr>
       <w:r>
-        <w:t xml:space="preserve">Weekly overall model rank 172 (WR65). ROS overall rank 25 (WR10). Availability: EXPECTED_INACTIVE. Weekly ranks are preliminary when playing status is unconfirmed; they are separate from season ranks.</w:t>
+        <w:t xml:space="preserve">Weekly overall model rank Not published (NOT_EXPECTED_TO_PLAY). ROS overall rank 25 (WR10). Availability: EXPECTED_INACTIVE. Weekly ranks are preliminary when playing status is unconfirmed; they are separate from season ranks.</w:t>
       </w:r>
     </w:p>
     <w:p>
@@ -2959,7 +2959,7 @@
         <w:pStyle w:val="Normal"/>
       </w:pPr>
       <w:r>
-        <w:t xml:space="preserve">Weekly overall model rank 33 (RB8). ROS overall rank 26 (RB14). Availability: UNKNOWN. Weekly ranks are preliminary when playing status is unconfirmed; they are separate from season ranks.</w:t>
+        <w:t xml:space="preserve">Weekly overall model rank 29 (RB8). ROS overall rank 26 (RB14). Availability: UNKNOWN. Weekly ranks are preliminary when playing status is unconfirmed; they are separate from season ranks.</w:t>
       </w:r>
     </w:p>
     <w:p>
@@ -3079,7 +3079,7 @@
         <w:pStyle w:val="Normal"/>
       </w:pPr>
       <w:r>
-        <w:t xml:space="preserve">Weekly overall model rank 46 (WR12). ROS overall rank 27 (WR11). Availability: UNKNOWN. Weekly ranks are preliminary when playing status is unconfirmed; they are separate from season ranks.</w:t>
+        <w:t xml:space="preserve">Weekly overall model rank 37 (WR8). ROS overall rank 27 (WR11). Availability: UNKNOWN. Weekly ranks are preliminary when playing status is unconfirmed; they are separate from season ranks.</w:t>
       </w:r>
     </w:p>
     <w:p>
@@ -3199,7 +3199,7 @@
         <w:pStyle w:val="Normal"/>
       </w:pPr>
       <w:r>
-        <w:t xml:space="preserve">Weekly overall model rank 40 (WR11). ROS overall rank 28 (WR12). Availability: UNKNOWN. Weekly ranks are preliminary when playing status is unconfirmed; they are separate from season ranks.</w:t>
+        <w:t xml:space="preserve">Weekly overall model rank Not published (NO_CURRENT_WEEK_GAME). ROS overall rank 28 (WR12). Availability: UNKNOWN. Weekly ranks are preliminary when playing status is unconfirmed; they are separate from season ranks.</w:t>
       </w:r>
     </w:p>
     <w:p>
@@ -3319,7 +3319,7 @@
         <w:pStyle w:val="Normal"/>
       </w:pPr>
       <w:r>
-        <w:t xml:space="preserve">Weekly overall model rank 32 (WR10). ROS overall rank 29 (WR13). Availability: UNKNOWN. Weekly ranks are preliminary when playing status is unconfirmed; they are separate from season ranks.</w:t>
+        <w:t xml:space="preserve">Weekly overall model rank Not published (GAME_STARTED_NO_ORIGINAL_WEEKLY_RANK). ROS overall rank 29 (WR13). Availability: UNKNOWN. Weekly ranks are preliminary when playing status is unconfirmed; they are separate from season ranks.</w:t>
       </w:r>
     </w:p>
     <w:p>
@@ -3439,7 +3439,7 @@
         <w:pStyle w:val="Normal"/>
       </w:pPr>
       <w:r>
-        <w:t xml:space="preserve">Weekly overall model rank 56 (WR16). ROS overall rank 30 (WR14). Availability: UNKNOWN. Weekly ranks are preliminary when playing status is unconfirmed; they are separate from season ranks.</w:t>
+        <w:t xml:space="preserve">Weekly overall model rank 47 (WR12). ROS overall rank 30 (WR14). Availability: UNKNOWN. Weekly ranks are preliminary when playing status is unconfirmed; they are separate from season ranks.</w:t>
       </w:r>
     </w:p>
     <w:p>
@@ -3679,7 +3679,7 @@
         <w:pStyle w:val="Normal"/>
       </w:pPr>
       <w:r>
-        <w:t xml:space="preserve">Weekly overall model rank 53 (WR14). ROS overall rank 32 (WR15). Availability: UNKNOWN. Weekly ranks are preliminary when playing status is unconfirmed; they are separate from season ranks.</w:t>
+        <w:t xml:space="preserve">Weekly overall model rank 44 (WR10). ROS overall rank 32 (WR15). Availability: UNKNOWN. Weekly ranks are preliminary when playing status is unconfirmed; they are separate from season ranks.</w:t>
       </w:r>
     </w:p>
     <w:p>
@@ -3799,7 +3799,7 @@
         <w:pStyle w:val="Normal"/>
       </w:pPr>
       <w:r>
-        <w:t xml:space="preserve">Weekly overall model rank 64 (WR20). ROS overall rank 33 (WR16). Availability: UNKNOWN. Weekly ranks are preliminary when playing status is unconfirmed; they are separate from season ranks.</w:t>
+        <w:t xml:space="preserve">Weekly overall model rank 53 (WR15). ROS overall rank 33 (WR16). Availability: UNKNOWN. Weekly ranks are preliminary when playing status is unconfirmed; they are separate from season ranks.</w:t>
       </w:r>
     </w:p>
     <w:p>
@@ -3919,7 +3919,7 @@
         <w:pStyle w:val="Normal"/>
       </w:pPr>
       <w:r>
-        <w:t xml:space="preserve">Weekly overall model rank 55 (WR15). ROS overall rank 34 (WR17). Availability: UNKNOWN. Weekly ranks are preliminary when playing status is unconfirmed; they are separate from season ranks.</w:t>
+        <w:t xml:space="preserve">Weekly overall model rank 46 (WR11). ROS overall rank 34 (WR17). Availability: UNKNOWN. Weekly ranks are preliminary when playing status is unconfirmed; they are separate from season ranks.</w:t>
       </w:r>
     </w:p>
     <w:p>
@@ -4039,7 +4039,7 @@
         <w:pStyle w:val="Normal"/>
       </w:pPr>
       <w:r>
-        <w:t xml:space="preserve">Weekly overall model rank 25 (WR8). ROS overall rank 35 (WR18). Availability: UNKNOWN. Weekly ranks are preliminary when playing status is unconfirmed; they are separate from season ranks.</w:t>
+        <w:t xml:space="preserve">Weekly overall model rank Not published (NO_CURRENT_WEEK_GAME). ROS overall rank 35 (WR18). Availability: UNKNOWN. Weekly ranks are preliminary when playing status is unconfirmed; they are separate from season ranks.</w:t>
       </w:r>
     </w:p>
     <w:p>
@@ -4159,7 +4159,7 @@
         <w:pStyle w:val="Normal"/>
       </w:pPr>
       <w:r>
-        <w:t xml:space="preserve">Weekly overall model rank 66 (WR21). ROS overall rank 36 (WR19). Availability: UNKNOWN. Weekly ranks are preliminary when playing status is unconfirmed; they are separate from season ranks.</w:t>
+        <w:t xml:space="preserve">Weekly overall model rank Not published (GAME_STARTED_NO_ORIGINAL_WEEKLY_RANK). ROS overall rank 36 (WR19). Availability: UNKNOWN. Weekly ranks are preliminary when playing status is unconfirmed; they are separate from season ranks.</w:t>
       </w:r>
     </w:p>
     <w:p>
@@ -4279,7 +4279,7 @@
         <w:pStyle w:val="Normal"/>
       </w:pPr>
       <w:r>
-        <w:t xml:space="preserve">Weekly overall model rank 67 (WR22). ROS overall rank 37 (WR20). Availability: UNKNOWN. Weekly ranks are preliminary when playing status is unconfirmed; they are separate from season ranks.</w:t>
+        <w:t xml:space="preserve">Weekly overall model rank 55 (WR16). ROS overall rank 37 (WR20). Availability: UNKNOWN. Weekly ranks are preliminary when playing status is unconfirmed; they are separate from season ranks.</w:t>
       </w:r>
     </w:p>
     <w:p>
@@ -4399,7 +4399,7 @@
         <w:pStyle w:val="Normal"/>
       </w:pPr>
       <w:r>
-        <w:t xml:space="preserve">Weekly overall model rank 74 (WR25). ROS overall rank 38 (WR21). Availability: UNKNOWN. Weekly ranks are preliminary when playing status is unconfirmed; they are separate from season ranks.</w:t>
+        <w:t xml:space="preserve">Weekly overall model rank 62 (WR19). ROS overall rank 38 (WR21). Availability: UNKNOWN. Weekly ranks are preliminary when playing status is unconfirmed; they are separate from season ranks.</w:t>
       </w:r>
     </w:p>
     <w:p>
@@ -4519,7 +4519,7 @@
         <w:pStyle w:val="Normal"/>
       </w:pPr>
       <w:r>
-        <w:t xml:space="preserve">Weekly overall model rank 7 (QB3). ROS overall rank 39 (QB2). Availability: UNKNOWN. Weekly ranks are preliminary when playing status is unconfirmed; they are separate from season ranks.</w:t>
+        <w:t xml:space="preserve">Weekly overall model rank 6 (QB2). ROS overall rank 39 (QB2). Availability: UNKNOWN. Weekly ranks are preliminary when playing status is unconfirmed; they are separate from season ranks.</w:t>
       </w:r>
     </w:p>
     <w:p>
@@ -4639,7 +4639,7 @@
         <w:pStyle w:val="Normal"/>
       </w:pPr>
       <w:r>
-        <w:t xml:space="preserve">Weekly overall model rank 8 (QB4). ROS overall rank 40 (QB3). Availability: UNKNOWN. Weekly ranks are preliminary when playing status is unconfirmed; they are separate from season ranks.</w:t>
+        <w:t xml:space="preserve">Weekly overall model rank 7 (QB3). ROS overall rank 40 (QB3). Availability: UNKNOWN. Weekly ranks are preliminary when playing status is unconfirmed; they are separate from season ranks.</w:t>
       </w:r>
     </w:p>
     <w:p>
@@ -4759,7 +4759,7 @@
         <w:pStyle w:val="Normal"/>
       </w:pPr>
       <w:r>
-        <w:t xml:space="preserve">Weekly overall model rank 52 (TE3). ROS overall rank 41 (TE3). Availability: UNKNOWN. Weekly ranks are preliminary when playing status is unconfirmed; they are separate from season ranks.</w:t>
+        <w:t xml:space="preserve">Weekly overall model rank 43 (TE3). ROS overall rank 41 (TE3). Availability: UNKNOWN. Weekly ranks are preliminary when playing status is unconfirmed; they are separate from season ranks.</w:t>
       </w:r>
     </w:p>
     <w:p>
@@ -4879,7 +4879,7 @@
         <w:pStyle w:val="Normal"/>
       </w:pPr>
       <w:r>
-        <w:t xml:space="preserve">Weekly overall model rank 63 (WR19). ROS overall rank 42 (WR22). Availability: UNKNOWN. Weekly ranks are preliminary when playing status is unconfirmed; they are separate from season ranks.</w:t>
+        <w:t xml:space="preserve">Weekly overall model rank 52 (WR14). ROS overall rank 42 (WR22). Availability: UNKNOWN. Weekly ranks are preliminary when playing status is unconfirmed; they are separate from season ranks.</w:t>
       </w:r>
     </w:p>
     <w:p>
@@ -4999,7 +4999,7 @@
         <w:pStyle w:val="Normal"/>
       </w:pPr>
       <w:r>
-        <w:t xml:space="preserve">Weekly overall model rank 70 (WR24). ROS overall rank 43 (WR23). Availability: UNKNOWN. Weekly ranks are preliminary when playing status is unconfirmed; they are separate from season ranks.</w:t>
+        <w:t xml:space="preserve">Weekly overall model rank 58 (WR18). ROS overall rank 43 (WR23). Availability: UNKNOWN. Weekly ranks are preliminary when playing status is unconfirmed; they are separate from season ranks.</w:t>
       </w:r>
     </w:p>
     <w:p>
@@ -5119,7 +5119,7 @@
         <w:pStyle w:val="Normal"/>
       </w:pPr>
       <w:r>
-        <w:t xml:space="preserve">Weekly overall model rank 60 (WR18). ROS overall rank 44 (WR24). Availability: UNKNOWN. Weekly ranks are preliminary when playing status is unconfirmed; they are separate from season ranks.</w:t>
+        <w:t xml:space="preserve">Weekly overall model rank 50 (WR13). ROS overall rank 44 (WR24). Availability: UNKNOWN. Weekly ranks are preliminary when playing status is unconfirmed; they are separate from season ranks.</w:t>
       </w:r>
     </w:p>
     <w:p>
@@ -5239,7 +5239,7 @@
         <w:pStyle w:val="Normal"/>
       </w:pPr>
       <w:r>
-        <w:t xml:space="preserve">Weekly overall model rank 82 (WR29). ROS overall rank 45 (WR25). Availability: UNKNOWN. Weekly ranks are preliminary when playing status is unconfirmed; they are separate from season ranks.</w:t>
+        <w:t xml:space="preserve">Weekly overall model rank 69 (WR23). ROS overall rank 45 (WR25). Availability: UNKNOWN. Weekly ranks are preliminary when playing status is unconfirmed; they are separate from season ranks.</w:t>
       </w:r>
     </w:p>
     <w:p>
@@ -5359,7 +5359,7 @@
         <w:pStyle w:val="Normal"/>
       </w:pPr>
       <w:r>
-        <w:t xml:space="preserve">Weekly overall model rank 73 (TE5). ROS overall rank 46 (TE4). Availability: UNKNOWN. Weekly ranks are preliminary when playing status is unconfirmed; they are separate from season ranks.</w:t>
+        <w:t xml:space="preserve">Weekly overall model rank 61 (TE5). ROS overall rank 46 (TE4). Availability: UNKNOWN. Weekly ranks are preliminary when playing status is unconfirmed; they are separate from season ranks.</w:t>
       </w:r>
     </w:p>
     <w:p>
@@ -5479,7 +5479,7 @@
         <w:pStyle w:val="Normal"/>
       </w:pPr>
       <w:r>
-        <w:t xml:space="preserve">Weekly overall model rank 61 (RB15). ROS overall rank 47 (RB15). Availability: UNKNOWN. Weekly ranks are preliminary when playing status is unconfirmed; they are separate from season ranks.</w:t>
+        <w:t xml:space="preserve">Weekly overall model rank Not published (GAME_STARTED_NO_ORIGINAL_WEEKLY_RANK). ROS overall rank 47 (RB15). Availability: UNKNOWN. Weekly ranks are preliminary when playing status is unconfirmed; they are separate from season ranks.</w:t>
       </w:r>
     </w:p>
     <w:p>
@@ -5599,7 +5599,7 @@
         <w:pStyle w:val="Normal"/>
       </w:pPr>
       <w:r>
-        <w:t xml:space="preserve">Weekly overall model rank 79 (RB20). ROS overall rank 48 (RB16). Availability: UNKNOWN. Weekly ranks are preliminary when playing status is unconfirmed; they are separate from season ranks.</w:t>
+        <w:t xml:space="preserve">Weekly overall model rank Not published (GAME_STARTED_NO_ORIGINAL_WEEKLY_RANK). ROS overall rank 48 (RB16). Availability: UNKNOWN. Weekly ranks are preliminary when playing status is unconfirmed; they are separate from season ranks.</w:t>
       </w:r>
     </w:p>
     <w:p>
@@ -5719,7 +5719,7 @@
         <w:pStyle w:val="Normal"/>
       </w:pPr>
       <w:r>
-        <w:t xml:space="preserve">Weekly overall model rank 65 (RB16). ROS overall rank 49 (RB17). Availability: UNKNOWN. Weekly ranks are preliminary when playing status is unconfirmed; they are separate from season ranks.</w:t>
+        <w:t xml:space="preserve">Weekly overall model rank 54 (RB14). ROS overall rank 49 (RB17). Availability: UNKNOWN. Weekly ranks are preliminary when playing status is unconfirmed; they are separate from season ranks.</w:t>
       </w:r>
     </w:p>
     <w:p>
@@ -5839,7 +5839,7 @@
         <w:pStyle w:val="Normal"/>
       </w:pPr>
       <w:r>
-        <w:t xml:space="preserve">Weekly overall model rank 85 (WR31). ROS overall rank 50 (WR26). Availability: UNKNOWN. Weekly ranks are preliminary when playing status is unconfirmed; they are separate from season ranks.</w:t>
+        <w:t xml:space="preserve">Weekly overall model rank 72 (WR25). ROS overall rank 50 (WR26). Availability: UNKNOWN. Weekly ranks are preliminary when playing status is unconfirmed; they are separate from season ranks.</w:t>
       </w:r>
     </w:p>
     <w:p>
@@ -5959,7 +5959,7 @@
         <w:pStyle w:val="Normal"/>
       </w:pPr>
       <w:r>
-        <w:t xml:space="preserve">Weekly overall model rank 109 (WR42). ROS overall rank 51 (WR27). Availability: UNKNOWN. Weekly ranks are preliminary when playing status is unconfirmed; they are separate from season ranks.</w:t>
+        <w:t xml:space="preserve">Weekly overall model rank 93 (WR36). ROS overall rank 51 (WR27). Availability: UNKNOWN. Weekly ranks are preliminary when playing status is unconfirmed; they are separate from season ranks.</w:t>
       </w:r>
     </w:p>
     <w:p>
@@ -6079,7 +6079,7 @@
         <w:pStyle w:val="Normal"/>
       </w:pPr>
       <w:r>
-        <w:t xml:space="preserve">Weekly overall model rank 34 (QB14). ROS overall rank 52 (QB4). Availability: UNKNOWN. Weekly ranks are preliminary when playing status is unconfirmed; they are separate from season ranks.</w:t>
+        <w:t xml:space="preserve">Weekly overall model rank 30 (QB13). ROS overall rank 52 (QB4). Availability: UNKNOWN. Weekly ranks are preliminary when playing status is unconfirmed; they are separate from season ranks.</w:t>
       </w:r>
     </w:p>
     <w:p>
@@ -6199,7 +6199,7 @@
         <w:pStyle w:val="Normal"/>
       </w:pPr>
       <w:r>
-        <w:t xml:space="preserve">Weekly overall model rank 10 (QB5). ROS overall rank 53 (QB5). Availability: UNKNOWN. Weekly ranks are preliminary when playing status is unconfirmed; they are separate from season ranks.</w:t>
+        <w:t xml:space="preserve">Weekly overall model rank 9 (QB4). ROS overall rank 53 (QB5). Availability: UNKNOWN. Weekly ranks are preliminary when playing status is unconfirmed; they are separate from season ranks.</w:t>
       </w:r>
     </w:p>
     <w:p>
@@ -6319,7 +6319,7 @@
         <w:pStyle w:val="Normal"/>
       </w:pPr>
       <w:r>
-        <w:t xml:space="preserve">Weekly overall model rank 75 (RB18). ROS overall rank 54 (RB18). Availability: UNKNOWN. Weekly ranks are preliminary when playing status is unconfirmed; they are separate from season ranks.</w:t>
+        <w:t xml:space="preserve">Weekly overall model rank 63 (RB16). ROS overall rank 54 (RB18). Availability: UNKNOWN. Weekly ranks are preliminary when playing status is unconfirmed; they are separate from season ranks.</w:t>
       </w:r>
     </w:p>
     <w:p>
@@ -6439,7 +6439,7 @@
         <w:pStyle w:val="Normal"/>
       </w:pPr>
       <w:r>
-        <w:t xml:space="preserve">Weekly overall model rank 78 (RB19). ROS overall rank 55 (RB19). Availability: UNKNOWN. Weekly ranks are preliminary when playing status is unconfirmed; they are separate from season ranks.</w:t>
+        <w:t xml:space="preserve">Weekly overall model rank 66 (RB17). ROS overall rank 55 (RB19). Availability: UNKNOWN. Weekly ranks are preliminary when playing status is unconfirmed; they are separate from season ranks.</w:t>
       </w:r>
     </w:p>
     <w:p>
@@ -6559,7 +6559,7 @@
         <w:pStyle w:val="Normal"/>
       </w:pPr>
       <w:r>
-        <w:t xml:space="preserve">Weekly overall model rank 69 (WR23). ROS overall rank 56 (WR28). Availability: UNKNOWN. Weekly ranks are preliminary when playing status is unconfirmed; they are separate from season ranks.</w:t>
+        <w:t xml:space="preserve">Weekly overall model rank 57 (WR17). ROS overall rank 56 (WR28). Availability: UNKNOWN. Weekly ranks are preliminary when playing status is unconfirmed; they are separate from season ranks.</w:t>
       </w:r>
     </w:p>
     <w:p>
@@ -6679,7 +6679,7 @@
         <w:pStyle w:val="Normal"/>
       </w:pPr>
       <w:r>
-        <w:t xml:space="preserve">Weekly overall model rank 39 (QB16). ROS overall rank 57 (QB6). Availability: UNKNOWN. Weekly ranks are preliminary when playing status is unconfirmed; they are separate from season ranks.</w:t>
+        <w:t xml:space="preserve">Weekly overall model rank Not published (GAME_STARTED_NO_ORIGINAL_WEEKLY_RANK). ROS overall rank 57 (QB6). Availability: UNKNOWN. Weekly ranks are preliminary when playing status is unconfirmed; they are separate from season ranks.</w:t>
       </w:r>
     </w:p>
     <w:p>
@@ -6799,7 +6799,7 @@
         <w:pStyle w:val="Normal"/>
       </w:pPr>
       <w:r>
-        <w:t xml:space="preserve">Weekly overall model rank 42 (QB18). ROS overall rank 58 (QB7). Availability: UNKNOWN. Weekly ranks are preliminary when playing status is unconfirmed; they are separate from season ranks.</w:t>
+        <w:t xml:space="preserve">Weekly overall model rank 34 (QB15). ROS overall rank 58 (QB7). Availability: UNKNOWN. Weekly ranks are preliminary when playing status is unconfirmed; they are separate from season ranks.</w:t>
       </w:r>
     </w:p>
     <w:p>
@@ -6919,7 +6919,7 @@
         <w:pStyle w:val="Normal"/>
       </w:pPr>
       <w:r>
-        <w:t xml:space="preserve">Weekly overall model rank 41 (QB17). ROS overall rank 59 (QB8). Availability: UNKNOWN. Weekly ranks are preliminary when playing status is unconfirmed; they are separate from season ranks.</w:t>
+        <w:t xml:space="preserve">Weekly overall model rank 33 (QB14). ROS overall rank 59 (QB8). Availability: UNKNOWN. Weekly ranks are preliminary when playing status is unconfirmed; they are separate from season ranks.</w:t>
       </w:r>
     </w:p>
     <w:p>
@@ -7039,7 +7039,7 @@
         <w:pStyle w:val="Normal"/>
       </w:pPr>
       <w:r>
-        <w:t xml:space="preserve">Weekly overall model rank 105 (WR39). ROS overall rank 60 (WR29). Availability: UNKNOWN. Weekly ranks are preliminary when playing status is unconfirmed; they are separate from season ranks.</w:t>
+        <w:t xml:space="preserve">Weekly overall model rank 90 (WR33). ROS overall rank 60 (WR29). Availability: UNKNOWN. Weekly ranks are preliminary when playing status is unconfirmed; they are separate from season ranks.</w:t>
       </w:r>
     </w:p>
     <w:p>
@@ -7159,7 +7159,7 @@
         <w:pStyle w:val="Normal"/>
       </w:pPr>
       <w:r>
-        <w:t xml:space="preserve">Weekly overall model rank 71 (RB17). ROS overall rank 61 (RB20). Availability: UNKNOWN. Weekly ranks are preliminary when playing status is unconfirmed; they are separate from season ranks.</w:t>
+        <w:t xml:space="preserve">Weekly overall model rank 59 (RB15). ROS overall rank 61 (RB20). Availability: UNKNOWN. Weekly ranks are preliminary when playing status is unconfirmed; they are separate from season ranks.</w:t>
       </w:r>
     </w:p>
     <w:p>
@@ -7279,7 +7279,7 @@
         <w:pStyle w:val="Normal"/>
       </w:pPr>
       <w:r>
-        <w:t xml:space="preserve">Weekly overall model rank 86 (TE7). ROS overall rank 62 (TE5). Availability: UNKNOWN. Weekly ranks are preliminary when playing status is unconfirmed; they are separate from season ranks.</w:t>
+        <w:t xml:space="preserve">Weekly overall model rank 73 (TE7). ROS overall rank 62 (TE5). Availability: UNKNOWN. Weekly ranks are preliminary when playing status is unconfirmed; they are separate from season ranks.</w:t>
       </w:r>
     </w:p>
     <w:p>
@@ -7367,7 +7367,7 @@
         <w:pStyle w:val="Normal"/>
       </w:pPr>
       <w:r>
-        <w:t xml:space="preserve">Weekly overall model rank 112 (RB23). ROS overall rank 63 (RB21). Availability: UNKNOWN. Weekly ranks are preliminary when playing status is unconfirmed; they are separate from season ranks.</w:t>
+        <w:t xml:space="preserve">Weekly overall model rank 96 (RB20). ROS overall rank 63 (RB21). Availability: UNKNOWN. Weekly ranks are preliminary when playing status is unconfirmed; they are separate from season ranks.</w:t>
       </w:r>
     </w:p>
     <w:p>
@@ -7487,7 +7487,7 @@
         <w:pStyle w:val="Normal"/>
       </w:pPr>
       <w:r>
-        <w:t xml:space="preserve">Weekly overall model rank 133 (RB31). ROS overall rank 64 (RB22). Availability: UNKNOWN. Weekly ranks are preliminary when playing status is unconfirmed; they are separate from season ranks.</w:t>
+        <w:t xml:space="preserve">Weekly overall model rank 115 (RB27). ROS overall rank 64 (RB22). Availability: UNKNOWN. Weekly ranks are preliminary when playing status is unconfirmed; they are separate from season ranks.</w:t>
       </w:r>
     </w:p>
     <w:p>
@@ -7607,7 +7607,7 @@
         <w:pStyle w:val="Normal"/>
       </w:pPr>
       <w:r>
-        <w:t xml:space="preserve">Weekly overall model rank 49 (QB21). ROS overall rank 65 (QB9). Availability: UNKNOWN. Weekly ranks are preliminary when playing status is unconfirmed; they are separate from season ranks.</w:t>
+        <w:t xml:space="preserve">Weekly overall model rank 40 (QB17). ROS overall rank 65 (QB9). Availability: UNKNOWN. Weekly ranks are preliminary when playing status is unconfirmed; they are separate from season ranks.</w:t>
       </w:r>
     </w:p>
     <w:p>
@@ -7727,7 +7727,7 @@
         <w:pStyle w:val="Normal"/>
       </w:pPr>
       <w:r>
-        <w:t xml:space="preserve">Weekly overall model rank 106 (WR40). ROS overall rank 66 (WR30). Availability: UNKNOWN. Weekly ranks are preliminary when playing status is unconfirmed; they are separate from season ranks.</w:t>
+        <w:t xml:space="preserve">Weekly overall model rank 91 (WR34). ROS overall rank 66 (WR30). Availability: UNKNOWN. Weekly ranks are preliminary when playing status is unconfirmed; they are separate from season ranks.</w:t>
       </w:r>
     </w:p>
     <w:p>
@@ -7847,7 +7847,7 @@
         <w:pStyle w:val="Normal"/>
       </w:pPr>
       <w:r>
-        <w:t xml:space="preserve">Weekly overall model rank 98 (WR36). ROS overall rank 67 (WR31). Availability: UNKNOWN. Weekly ranks are preliminary when playing status is unconfirmed; they are separate from season ranks.</w:t>
+        <w:t xml:space="preserve">Weekly overall model rank 83 (WR30). ROS overall rank 67 (WR31). Availability: UNKNOWN. Weekly ranks are preliminary when playing status is unconfirmed; they are separate from season ranks.</w:t>
       </w:r>
     </w:p>
     <w:p>
@@ -7967,7 +7967,7 @@
         <w:pStyle w:val="Normal"/>
       </w:pPr>
       <w:r>
-        <w:t xml:space="preserve">Weekly overall model rank 101 (TE14). ROS overall rank 68 (TE6). Availability: UNKNOWN. Weekly ranks are preliminary when playing status is unconfirmed; they are separate from season ranks.</w:t>
+        <w:t xml:space="preserve">Weekly overall model rank 86 (TE12). ROS overall rank 68 (TE6). Availability: UNKNOWN. Weekly ranks are preliminary when playing status is unconfirmed; they are separate from season ranks.</w:t>
       </w:r>
     </w:p>
     <w:p>
@@ -8087,7 +8087,7 @@
         <w:pStyle w:val="Normal"/>
       </w:pPr>
       <w:r>
-        <w:t xml:space="preserve">Weekly overall model rank 23 (QB8). ROS overall rank 69 (QB10). Availability: UNKNOWN. Weekly ranks are preliminary when playing status is unconfirmed; they are separate from season ranks.</w:t>
+        <w:t xml:space="preserve">Weekly overall model rank 21 (QB7). ROS overall rank 69 (QB10). Availability: UNKNOWN. Weekly ranks are preliminary when playing status is unconfirmed; they are separate from season ranks.</w:t>
       </w:r>
     </w:p>
     <w:p>
@@ -8207,7 +8207,7 @@
         <w:pStyle w:val="Normal"/>
       </w:pPr>
       <w:r>
-        <w:t xml:space="preserve">Weekly overall model rank 24 (QB9). ROS overall rank 70 (QB11). Availability: UNKNOWN. Weekly ranks are preliminary when playing status is unconfirmed; they are separate from season ranks.</w:t>
+        <w:t xml:space="preserve">Weekly overall model rank 22 (QB8). ROS overall rank 70 (QB11). Availability: UNKNOWN. Weekly ranks are preliminary when playing status is unconfirmed; they are separate from season ranks.</w:t>
       </w:r>
     </w:p>
     <w:p>
@@ -8327,7 +8327,7 @@
         <w:pStyle w:val="Normal"/>
       </w:pPr>
       <w:r>
-        <w:t xml:space="preserve">Weekly overall model rank 16 (QB6). ROS overall rank 71 (QB12). Availability: UNKNOWN. Weekly ranks are preliminary when playing status is unconfirmed; they are separate from season ranks.</w:t>
+        <w:t xml:space="preserve">Weekly overall model rank 14 (QB5). ROS overall rank 71 (QB12). Availability: UNKNOWN. Weekly ranks are preliminary when playing status is unconfirmed; they are separate from season ranks.</w:t>
       </w:r>
     </w:p>
     <w:p>
@@ -8447,7 +8447,7 @@
         <w:pStyle w:val="Normal"/>
       </w:pPr>
       <w:r>
-        <w:t xml:space="preserve">Weekly overall model rank 80 (WR27). ROS overall rank 72 (WR32). Availability: UNKNOWN. Weekly ranks are preliminary when playing status is unconfirmed; they are separate from season ranks.</w:t>
+        <w:t xml:space="preserve">Weekly overall model rank 67 (WR21). ROS overall rank 72 (WR32). Availability: UNKNOWN. Weekly ranks are preliminary when playing status is unconfirmed; they are separate from season ranks.</w:t>
       </w:r>
     </w:p>
     <w:p>
@@ -8567,7 +8567,7 @@
         <w:pStyle w:val="Normal"/>
       </w:pPr>
       <w:r>
-        <w:t xml:space="preserve">Weekly overall model rank 76 (WR26). ROS overall rank 73 (WR33). Availability: UNKNOWN. Weekly ranks are preliminary when playing status is unconfirmed; they are separate from season ranks.</w:t>
+        <w:t xml:space="preserve">Weekly overall model rank 64 (WR20). ROS overall rank 73 (WR33). Availability: UNKNOWN. Weekly ranks are preliminary when playing status is unconfirmed; they are separate from season ranks.</w:t>
       </w:r>
     </w:p>
     <w:p>
@@ -8687,7 +8687,7 @@
         <w:pStyle w:val="Normal"/>
       </w:pPr>
       <w:r>
-        <w:t xml:space="preserve">Weekly overall model rank 186 (WR70). ROS overall rank 74 (WR34). Availability: EXPECTED_INACTIVE. Weekly ranks are preliminary when playing status is unconfirmed; they are separate from season ranks.</w:t>
+        <w:t xml:space="preserve">Weekly overall model rank Not published (NOT_EXPECTED_TO_PLAY). ROS overall rank 74 (WR34). Availability: EXPECTED_INACTIVE. Weekly ranks are preliminary when playing status is unconfirmed; they are separate from season ranks.</w:t>
       </w:r>
     </w:p>
     <w:p>
@@ -8807,7 +8807,7 @@
         <w:pStyle w:val="Normal"/>
       </w:pPr>
       <w:r>
-        <w:t xml:space="preserve">Weekly overall model rank 57 (WR17). ROS overall rank 75 (WR35). Availability: EXPECTED_ACTIVE. Weekly ranks are preliminary when playing status is unconfirmed; they are separate from season ranks.</w:t>
+        <w:t xml:space="preserve">Weekly overall model rank Not published (GAME_STARTED_NO_ORIGINAL_WEEKLY_RANK). ROS overall rank 75 (WR35). Availability: EXPECTED_ACTIVE. Weekly ranks are preliminary when playing status is unconfirmed; they are separate from season ranks.</w:t>
       </w:r>
     </w:p>
     <w:p>
@@ -8927,7 +8927,7 @@
         <w:pStyle w:val="Normal"/>
       </w:pPr>
       <w:r>
-        <w:t xml:space="preserve">Weekly overall model rank 122 (WR48). ROS overall rank 76 (WR36). Availability: UNKNOWN. Weekly ranks are preliminary when playing status is unconfirmed; they are separate from season ranks.</w:t>
+        <w:t xml:space="preserve">Weekly overall model rank 105 (WR42). ROS overall rank 76 (WR36). Availability: UNKNOWN. Weekly ranks are preliminary when playing status is unconfirmed; they are separate from season ranks.</w:t>
       </w:r>
     </w:p>
     <w:p>
@@ -9047,7 +9047,7 @@
         <w:pStyle w:val="Normal"/>
       </w:pPr>
       <w:r>
-        <w:t xml:space="preserve">Weekly overall model rank 62 (TE4). ROS overall rank 77 (TE7). Availability: UNKNOWN. Weekly ranks are preliminary when playing status is unconfirmed; they are separate from season ranks.</w:t>
+        <w:t xml:space="preserve">Weekly overall model rank 51 (TE4). ROS overall rank 77 (TE7). Availability: UNKNOWN. Weekly ranks are preliminary when playing status is unconfirmed; they are separate from season ranks.</w:t>
       </w:r>
     </w:p>
     <w:p>
@@ -9167,7 +9167,7 @@
         <w:pStyle w:val="Normal"/>
       </w:pPr>
       <w:r>
-        <w:t xml:space="preserve">Weekly overall model rank 117 (RB27). ROS overall rank 78 (RB23). Availability: UNKNOWN. Weekly ranks are preliminary when playing status is unconfirmed; they are separate from season ranks.</w:t>
+        <w:t xml:space="preserve">Weekly overall model rank 100 (RB23). ROS overall rank 78 (RB23). Availability: UNKNOWN. Weekly ranks are preliminary when playing status is unconfirmed; they are separate from season ranks.</w:t>
       </w:r>
     </w:p>
     <w:p>
@@ -9287,7 +9287,7 @@
         <w:pStyle w:val="Normal"/>
       </w:pPr>
       <w:r>
-        <w:t xml:space="preserve">Weekly overall model rank 141 (RB35). ROS overall rank 79 (RB24). Availability: UNKNOWN. Weekly ranks are preliminary when playing status is unconfirmed; they are separate from season ranks.</w:t>
+        <w:t xml:space="preserve">Weekly overall model rank 122 (RB31). ROS overall rank 79 (RB24). Availability: UNKNOWN. Weekly ranks are preliminary when playing status is unconfirmed; they are separate from season ranks.</w:t>
       </w:r>
     </w:p>
     <w:p>
@@ -9407,7 +9407,7 @@
         <w:pStyle w:val="Normal"/>
       </w:pPr>
       <w:r>
-        <w:t xml:space="preserve">Weekly overall model rank 140 (RB34). ROS overall rank 80 (RB25). Availability: UNKNOWN. Weekly ranks are preliminary when playing status is unconfirmed; they are separate from season ranks.</w:t>
+        <w:t xml:space="preserve">Weekly overall model rank 121 (RB30). ROS overall rank 80 (RB25). Availability: UNKNOWN. Weekly ranks are preliminary when playing status is unconfirmed; they are separate from season ranks.</w:t>
       </w:r>
     </w:p>
     <w:p>
@@ -9527,7 +9527,7 @@
         <w:pStyle w:val="Normal"/>
       </w:pPr>
       <w:r>
-        <w:t xml:space="preserve">Weekly overall model rank 97 (TE13). ROS overall rank 81 (TE8). Availability: UNKNOWN. Weekly ranks are preliminary when playing status is unconfirmed; they are separate from season ranks.</w:t>
+        <w:t xml:space="preserve">Weekly overall model rank 82 (TE11). ROS overall rank 81 (TE8). Availability: UNKNOWN. Weekly ranks are preliminary when playing status is unconfirmed; they are separate from season ranks.</w:t>
       </w:r>
     </w:p>
     <w:p>
@@ -9647,7 +9647,7 @@
         <w:pStyle w:val="Normal"/>
       </w:pPr>
       <w:r>
-        <w:t xml:space="preserve">Weekly overall model rank 114 (RB25). ROS overall rank 82 (RB26). Availability: UNKNOWN. Weekly ranks are preliminary when playing status is unconfirmed; they are separate from season ranks.</w:t>
+        <w:t xml:space="preserve">Weekly overall model rank 97 (RB21). ROS overall rank 82 (RB26). Availability: UNKNOWN. Weekly ranks are preliminary when playing status is unconfirmed; they are separate from season ranks.</w:t>
       </w:r>
     </w:p>
     <w:p>
@@ -9767,7 +9767,7 @@
         <w:pStyle w:val="Normal"/>
       </w:pPr>
       <w:r>
-        <w:t xml:space="preserve">Weekly overall model rank 91 (WR33). ROS overall rank 83 (WR37). Availability: UNKNOWN. Weekly ranks are preliminary when playing status is unconfirmed; they are separate from season ranks.</w:t>
+        <w:t xml:space="preserve">Weekly overall model rank 77 (WR27). ROS overall rank 83 (WR37). Availability: UNKNOWN. Weekly ranks are preliminary when playing status is unconfirmed; they are separate from season ranks.</w:t>
       </w:r>
     </w:p>
     <w:p>
@@ -9887,7 +9887,7 @@
         <w:pStyle w:val="Normal"/>
       </w:pPr>
       <w:r>
-        <w:t xml:space="preserve">Weekly overall model rank 3 (QB2). ROS overall rank 84 (QB13). Availability: UNKNOWN. Weekly ranks are preliminary when playing status is unconfirmed; they are separate from season ranks.</w:t>
+        <w:t xml:space="preserve">Weekly overall model rank Not published (NO_CURRENT_WEEK_GAME). ROS overall rank 84 (QB13). Availability: UNKNOWN. Weekly ranks are preliminary when playing status is unconfirmed; they are separate from season ranks.</w:t>
       </w:r>
     </w:p>
     <w:p>
@@ -10007,7 +10007,7 @@
         <w:pStyle w:val="Normal"/>
       </w:pPr>
       <w:r>
-        <w:t xml:space="preserve">Weekly overall model rank 99 (WR37). ROS overall rank 85 (WR38). Availability: UNKNOWN. Weekly ranks are preliminary when playing status is unconfirmed; they are separate from season ranks.</w:t>
+        <w:t xml:space="preserve">Weekly overall model rank 84 (WR31). ROS overall rank 85 (WR38). Availability: UNKNOWN. Weekly ranks are preliminary when playing status is unconfirmed; they are separate from season ranks.</w:t>
       </w:r>
     </w:p>
     <w:p>
@@ -10127,7 +10127,7 @@
         <w:pStyle w:val="Normal"/>
       </w:pPr>
       <w:r>
-        <w:t xml:space="preserve">Weekly overall model rank 93 (TE11). ROS overall rank 86 (TE9). Availability: UNKNOWN. Weekly ranks are preliminary when playing status is unconfirmed; they are separate from season ranks.</w:t>
+        <w:t xml:space="preserve">Weekly overall model rank 79 (TE10). ROS overall rank 86 (TE9). Availability: UNKNOWN. Weekly ranks are preliminary when playing status is unconfirmed; they are separate from season ranks.</w:t>
       </w:r>
     </w:p>
     <w:p>
@@ -10247,7 +10247,7 @@
         <w:pStyle w:val="Normal"/>
       </w:pPr>
       <w:r>
-        <w:t xml:space="preserve">Weekly overall model rank 83 (WR30). ROS overall rank 87 (WR39). Availability: UNKNOWN. Weekly ranks are preliminary when playing status is unconfirmed; they are separate from season ranks.</w:t>
+        <w:t xml:space="preserve">Weekly overall model rank 70 (WR24). ROS overall rank 87 (WR39). Availability: UNKNOWN. Weekly ranks are preliminary when playing status is unconfirmed; they are separate from season ranks.</w:t>
       </w:r>
     </w:p>
     <w:p>
@@ -10367,7 +10367,7 @@
         <w:pStyle w:val="Normal"/>
       </w:pPr>
       <w:r>
-        <w:t xml:space="preserve">Weekly overall model rank 92 (TE10). ROS overall rank 88 (TE10). Availability: UNKNOWN. Weekly ranks are preliminary when playing status is unconfirmed; they are separate from season ranks.</w:t>
+        <w:t xml:space="preserve">Weekly overall model rank 78 (TE9). ROS overall rank 88 (TE10). Availability: UNKNOWN. Weekly ranks are preliminary when playing status is unconfirmed; they are separate from season ranks.</w:t>
       </w:r>
     </w:p>
     <w:p>
@@ -10487,7 +10487,7 @@
         <w:pStyle w:val="Normal"/>
       </w:pPr>
       <w:r>
-        <w:t xml:space="preserve">Weekly overall model rank 94 (WR34). ROS overall rank 89 (WR40). Availability: UNKNOWN. Weekly ranks are preliminary when playing status is unconfirmed; they are separate from season ranks.</w:t>
+        <w:t xml:space="preserve">Weekly overall model rank 80 (WR28). ROS overall rank 89 (WR40). Availability: UNKNOWN. Weekly ranks are preliminary when playing status is unconfirmed; they are separate from season ranks.</w:t>
       </w:r>
     </w:p>
     <w:p>
@@ -10607,7 +10607,7 @@
         <w:pStyle w:val="Normal"/>
       </w:pPr>
       <w:r>
-        <w:t xml:space="preserve">Weekly overall model rank 22 (QB7). ROS overall rank 90 (QB14). Availability: UNKNOWN. Weekly ranks are preliminary when playing status is unconfirmed; they are separate from season ranks.</w:t>
+        <w:t xml:space="preserve">Weekly overall model rank 20 (QB6). ROS overall rank 90 (QB14). Availability: UNKNOWN. Weekly ranks are preliminary when playing status is unconfirmed; they are separate from season ranks.</w:t>
       </w:r>
     </w:p>
     <w:p>
@@ -10727,7 +10727,7 @@
         <w:pStyle w:val="Normal"/>
       </w:pPr>
       <w:r>
-        <w:t xml:space="preserve">Weekly overall model rank 89 (TE9). ROS overall rank 91 (TE11). Availability: UNKNOWN. Weekly ranks are preliminary when playing status is unconfirmed; they are separate from season ranks.</w:t>
+        <w:t xml:space="preserve">Weekly overall model rank 75 (TE8). ROS overall rank 91 (TE11). Availability: UNKNOWN. Weekly ranks are preliminary when playing status is unconfirmed; they are separate from season ranks.</w:t>
       </w:r>
     </w:p>
     <w:p>
@@ -10847,7 +10847,7 @@
         <w:pStyle w:val="Normal"/>
       </w:pPr>
       <w:r>
-        <w:t xml:space="preserve">Weekly overall model rank 126 (RB29). ROS overall rank 92 (RB27). Availability: UNKNOWN. Weekly ranks are preliminary when playing status is unconfirmed; they are separate from season ranks.</w:t>
+        <w:t xml:space="preserve">Weekly overall model rank 109 (RB25). ROS overall rank 92 (RB27). Availability: UNKNOWN. Weekly ranks are preliminary when playing status is unconfirmed; they are separate from season ranks.</w:t>
       </w:r>
     </w:p>
     <w:p>
@@ -10935,7 +10935,7 @@
         <w:pStyle w:val="Normal"/>
       </w:pPr>
       <w:r>
-        <w:t xml:space="preserve">Weekly overall model rank 88 (WR32). ROS overall rank 93 (WR41). Availability: UNKNOWN. Weekly ranks are preliminary when playing status is unconfirmed; they are separate from season ranks.</w:t>
+        <w:t xml:space="preserve">Weekly overall model rank 74 (WR26). ROS overall rank 93 (WR41). Availability: UNKNOWN. Weekly ranks are preliminary when playing status is unconfirmed; they are separate from season ranks.</w:t>
       </w:r>
     </w:p>
     <w:p>
@@ -11055,7 +11055,7 @@
         <w:pStyle w:val="Normal"/>
       </w:pPr>
       <w:r>
-        <w:t xml:space="preserve">Weekly overall model rank 100 (WR38). ROS overall rank 94 (WR42). Availability: UNKNOWN. Weekly ranks are preliminary when playing status is unconfirmed; they are separate from season ranks.</w:t>
+        <w:t xml:space="preserve">Weekly overall model rank 85 (WR32). ROS overall rank 94 (WR42). Availability: UNKNOWN. Weekly ranks are preliminary when playing status is unconfirmed; they are separate from season ranks.</w:t>
       </w:r>
     </w:p>
     <w:p>
@@ -11175,7 +11175,7 @@
         <w:pStyle w:val="Normal"/>
       </w:pPr>
       <w:r>
-        <w:t xml:space="preserve">Weekly overall model rank 118 (WR46). ROS overall rank 95 (WR43). Availability: UNKNOWN. Weekly ranks are preliminary when playing status is unconfirmed; they are separate from season ranks.</w:t>
+        <w:t xml:space="preserve">Weekly overall model rank 101 (WR40). ROS overall rank 95 (WR43). Availability: UNKNOWN. Weekly ranks are preliminary when playing status is unconfirmed; they are separate from season ranks.</w:t>
       </w:r>
     </w:p>
     <w:p>
@@ -11295,7 +11295,7 @@
         <w:pStyle w:val="Normal"/>
       </w:pPr>
       <w:r>
-        <w:t xml:space="preserve">Weekly overall model rank 147 (WR57). ROS overall rank 96 (WR44). Availability: UNKNOWN. Weekly ranks are preliminary when playing status is unconfirmed; they are separate from season ranks.</w:t>
+        <w:t xml:space="preserve">Weekly overall model rank 128 (WR49). ROS overall rank 96 (WR44). Availability: UNKNOWN. Weekly ranks are preliminary when playing status is unconfirmed; they are separate from season ranks.</w:t>
       </w:r>
     </w:p>
     <w:p>
@@ -11415,7 +11415,7 @@
         <w:pStyle w:val="Normal"/>
       </w:pPr>
       <w:r>
-        <w:t xml:space="preserve">Weekly overall model rank 131 (TE21). ROS overall rank 97 (TE12). Availability: UNKNOWN. Weekly ranks are preliminary when playing status is unconfirmed; they are separate from season ranks.</w:t>
+        <w:t xml:space="preserve">Weekly overall model rank 113 (TE18). ROS overall rank 97 (TE12). Availability: UNKNOWN. Weekly ranks are preliminary when playing status is unconfirmed; they are separate from season ranks.</w:t>
       </w:r>
     </w:p>
     <w:p>
@@ -11535,7 +11535,7 @@
         <w:pStyle w:val="Normal"/>
       </w:pPr>
       <w:r>
-        <w:t xml:space="preserve">Weekly overall model rank 95 (WR35). ROS overall rank 98 (WR45). Availability: UNKNOWN. Weekly ranks are preliminary when playing status is unconfirmed; they are separate from season ranks.</w:t>
+        <w:t xml:space="preserve">Weekly overall model rank 81 (WR29). ROS overall rank 98 (WR45). Availability: UNKNOWN. Weekly ranks are preliminary when playing status is unconfirmed; they are separate from season ranks.</w:t>
       </w:r>
     </w:p>
     <w:p>
@@ -11655,7 +11655,7 @@
         <w:pStyle w:val="Normal"/>
       </w:pPr>
       <w:r>
-        <w:t xml:space="preserve">Weekly overall model rank 128 (WR50). ROS overall rank 99 (WR46). Availability: UNKNOWN. Weekly ranks are preliminary when playing status is unconfirmed; they are separate from season ranks.</w:t>
+        <w:t xml:space="preserve">Weekly overall model rank 111 (WR44). ROS overall rank 99 (WR46). Availability: UNKNOWN. Weekly ranks are preliminary when playing status is unconfirmed; they are separate from season ranks.</w:t>
       </w:r>
     </w:p>
     <w:p>
@@ -11775,7 +11775,7 @@
         <w:pStyle w:val="Normal"/>
       </w:pPr>
       <w:r>
-        <w:t xml:space="preserve">Weekly overall model rank 171 (RB54). ROS overall rank 100 (RB28). Availability: UNKNOWN. Weekly ranks are preliminary when playing status is unconfirmed; they are separate from season ranks.</w:t>
+        <w:t xml:space="preserve">Weekly overall model rank 148 (RB47). ROS overall rank 100 (RB28). Availability: UNKNOWN. Weekly ranks are preliminary when playing status is unconfirmed; they are separate from season ranks.</w:t>
       </w:r>
     </w:p>
     <w:p>
@@ -11895,7 +11895,7 @@
         <w:pStyle w:val="Normal"/>
       </w:pPr>
       <w:r>
-        <w:t xml:space="preserve">Weekly overall model rank 116 (WR45). ROS overall rank 101 (WR47). Availability: UNKNOWN. Weekly ranks are preliminary when playing status is unconfirmed; they are separate from season ranks.</w:t>
+        <w:t xml:space="preserve">Weekly overall model rank 99 (WR39). ROS overall rank 101 (WR47). Availability: UNKNOWN. Weekly ranks are preliminary when playing status is unconfirmed; they are separate from season ranks.</w:t>
       </w:r>
     </w:p>
     <w:p>
@@ -12015,7 +12015,7 @@
         <w:pStyle w:val="Normal"/>
       </w:pPr>
       <w:r>
-        <w:t xml:space="preserve">Weekly overall model rank 111 (WR44). ROS overall rank 102 (WR48). Availability: UNKNOWN. Weekly ranks are preliminary when playing status is unconfirmed; they are separate from season ranks.</w:t>
+        <w:t xml:space="preserve">Weekly overall model rank 95 (WR38). ROS overall rank 102 (WR48). Availability: UNKNOWN. Weekly ranks are preliminary when playing status is unconfirmed; they are separate from season ranks.</w:t>
       </w:r>
     </w:p>
     <w:p>
@@ -12135,7 +12135,7 @@
         <w:pStyle w:val="Normal"/>
       </w:pPr>
       <w:r>
-        <w:t xml:space="preserve">Weekly overall model rank 36 (QB15). ROS overall rank 103 (QB15). Availability: UNKNOWN. Weekly ranks are preliminary when playing status is unconfirmed; they are separate from season ranks.</w:t>
+        <w:t xml:space="preserve">Weekly overall model rank Not published (GAME_STARTED_NO_ORIGINAL_WEEKLY_RANK). ROS overall rank 103 (QB15). Availability: UNKNOWN. Weekly ranks are preliminary when playing status is unconfirmed; they are separate from season ranks.</w:t>
       </w:r>
     </w:p>
     <w:p>
@@ -12255,7 +12255,7 @@
         <w:pStyle w:val="Normal"/>
       </w:pPr>
       <w:r>
-        <w:t xml:space="preserve">Weekly overall model rank 31 (QB13). ROS overall rank 104 (QB16). Availability: UNKNOWN. Weekly ranks are preliminary when playing status is unconfirmed; they are separate from season ranks.</w:t>
+        <w:t xml:space="preserve">Weekly overall model rank 28 (QB12). ROS overall rank 104 (QB16). Availability: UNKNOWN. Weekly ranks are preliminary when playing status is unconfirmed; they are separate from season ranks.</w:t>
       </w:r>
     </w:p>
     <w:p>
@@ -12375,7 +12375,7 @@
         <w:pStyle w:val="Normal"/>
       </w:pPr>
       <w:r>
-        <w:t xml:space="preserve">Weekly overall model rank 125 (TE20). ROS overall rank 105 (TE13). Availability: UNKNOWN. Weekly ranks are preliminary when playing status is unconfirmed; they are separate from season ranks.</w:t>
+        <w:t xml:space="preserve">Weekly overall model rank 108 (TE17). ROS overall rank 105 (TE13). Availability: UNKNOWN. Weekly ranks are preliminary when playing status is unconfirmed; they are separate from season ranks.</w:t>
       </w:r>
     </w:p>
     <w:p>
@@ -12495,7 +12495,7 @@
         <w:pStyle w:val="Normal"/>
       </w:pPr>
       <w:r>
-        <w:t xml:space="preserve">Weekly overall model rank 107 (TE17). ROS overall rank 106 (TE14). Availability: UNKNOWN. Weekly ranks are preliminary when playing status is unconfirmed; they are separate from season ranks.</w:t>
+        <w:t xml:space="preserve">Weekly overall model rank Not published (NO_CURRENT_WEEK_GAME). ROS overall rank 106 (TE14). Availability: UNKNOWN. Weekly ranks are preliminary when playing status is unconfirmed; they are separate from season ranks.</w:t>
       </w:r>
     </w:p>
     <w:p>
@@ -12615,7 +12615,7 @@
         <w:pStyle w:val="Normal"/>
       </w:pPr>
       <w:r>
-        <w:t xml:space="preserve">Weekly overall model rank 138 (RB32). ROS overall rank 107 (RB29). Availability: UNKNOWN. Weekly ranks are preliminary when playing status is unconfirmed; they are separate from season ranks.</w:t>
+        <w:t xml:space="preserve">Weekly overall model rank 119 (RB28). ROS overall rank 107 (RB29). Availability: UNKNOWN. Weekly ranks are preliminary when playing status is unconfirmed; they are separate from season ranks.</w:t>
       </w:r>
     </w:p>
     <w:p>
@@ -12735,7 +12735,7 @@
         <w:pStyle w:val="Normal"/>
       </w:pPr>
       <w:r>
-        <w:t xml:space="preserve">Weekly overall model rank 124 (WR49). ROS overall rank 108 (WR49). Availability: UNKNOWN. Weekly ranks are preliminary when playing status is unconfirmed; they are separate from season ranks.</w:t>
+        <w:t xml:space="preserve">Weekly overall model rank 107 (WR43). ROS overall rank 108 (WR49). Availability: UNKNOWN. Weekly ranks are preliminary when playing status is unconfirmed; they are separate from season ranks.</w:t>
       </w:r>
     </w:p>
     <w:p>
@@ -12855,7 +12855,7 @@
         <w:pStyle w:val="Normal"/>
       </w:pPr>
       <w:r>
-        <w:t xml:space="preserve">Weekly overall model rank 134 (WR53). ROS overall rank 109 (WR50). Availability: UNKNOWN. Weekly ranks are preliminary when playing status is unconfirmed; they are separate from season ranks.</w:t>
+        <w:t xml:space="preserve">Weekly overall model rank 116 (WR46). ROS overall rank 109 (WR50). Availability: UNKNOWN. Weekly ranks are preliminary when playing status is unconfirmed; they are separate from season ranks.</w:t>
       </w:r>
     </w:p>
     <w:p>
@@ -12975,7 +12975,7 @@
         <w:pStyle w:val="Normal"/>
       </w:pPr>
       <w:r>
-        <w:t xml:space="preserve">Weekly overall model rank 139 (RB33). ROS overall rank 110 (RB30). Availability: UNKNOWN. Weekly ranks are preliminary when playing status is unconfirmed; they are separate from season ranks.</w:t>
+        <w:t xml:space="preserve">Weekly overall model rank 120 (RB29). ROS overall rank 110 (RB30). Availability: UNKNOWN. Weekly ranks are preliminary when playing status is unconfirmed; they are separate from season ranks.</w:t>
       </w:r>
     </w:p>
     <w:p>
@@ -13095,7 +13095,7 @@
         <w:pStyle w:val="Normal"/>
       </w:pPr>
       <w:r>
-        <w:t xml:space="preserve">Weekly overall model rank 81 (WR28). ROS overall rank 111 (WR51). Availability: UNKNOWN. Weekly ranks are preliminary when playing status is unconfirmed; they are separate from season ranks.</w:t>
+        <w:t xml:space="preserve">Weekly overall model rank 68 (WR22). ROS overall rank 111 (WR51). Availability: UNKNOWN. Weekly ranks are preliminary when playing status is unconfirmed; they are separate from season ranks.</w:t>
       </w:r>
     </w:p>
     <w:p>
@@ -13215,7 +13215,7 @@
         <w:pStyle w:val="Normal"/>
       </w:pPr>
       <w:r>
-        <w:t xml:space="preserve">Weekly overall model rank 108 (WR41). ROS overall rank 112 (WR52). Availability: UNKNOWN. Weekly ranks are preliminary when playing status is unconfirmed; they are separate from season ranks.</w:t>
+        <w:t xml:space="preserve">Weekly overall model rank 92 (WR35). ROS overall rank 112 (WR52). Availability: UNKNOWN. Weekly ranks are preliminary when playing status is unconfirmed; they are separate from season ranks.</w:t>
       </w:r>
     </w:p>
     <w:p>
@@ -13335,7 +13335,7 @@
         <w:pStyle w:val="Normal"/>
       </w:pPr>
       <w:r>
-        <w:t xml:space="preserve">Weekly overall model rank 96 (TE12). ROS overall rank 113 (TE15). Availability: UNKNOWN. Weekly ranks are preliminary when playing status is unconfirmed; they are separate from season ranks.</w:t>
+        <w:t xml:space="preserve">Weekly overall model rank Not published (GAME_STARTED_NO_ORIGINAL_WEEKLY_RANK). ROS overall rank 113 (TE15). Availability: UNKNOWN. Weekly ranks are preliminary when playing status is unconfirmed; they are separate from season ranks.</w:t>
       </w:r>
     </w:p>
     <w:p>
@@ -13455,7 +13455,7 @@
         <w:pStyle w:val="Normal"/>
       </w:pPr>
       <w:r>
-        <w:t xml:space="preserve">Weekly overall model rank 119 (TE18). ROS overall rank 114 (TE16). Availability: UNKNOWN. Weekly ranks are preliminary when playing status is unconfirmed; they are separate from season ranks.</w:t>
+        <w:t xml:space="preserve">Weekly overall model rank 102 (TE15). ROS overall rank 114 (TE16). Availability: UNKNOWN. Weekly ranks are preliminary when playing status is unconfirmed; they are separate from season ranks.</w:t>
       </w:r>
     </w:p>
     <w:p>
@@ -13575,7 +13575,7 @@
         <w:pStyle w:val="Normal"/>
       </w:pPr>
       <w:r>
-        <w:t xml:space="preserve">Weekly overall model rank 123 (RB28). ROS overall rank 115 (RB31). Availability: UNKNOWN. Weekly ranks are preliminary when playing status is unconfirmed; they are separate from season ranks.</w:t>
+        <w:t xml:space="preserve">Weekly overall model rank 106 (RB24). ROS overall rank 115 (RB31). Availability: UNKNOWN. Weekly ranks are preliminary when playing status is unconfirmed; they are separate from season ranks.</w:t>
       </w:r>
     </w:p>
     <w:p>
@@ -13695,7 +13695,7 @@
         <w:pStyle w:val="Normal"/>
       </w:pPr>
       <w:r>
-        <w:t xml:space="preserve">Weekly overall model rank 142 (RB36). ROS overall rank 116 (RB32). Availability: UNKNOWN. Weekly ranks are preliminary when playing status is unconfirmed; they are separate from season ranks.</w:t>
+        <w:t xml:space="preserve">Weekly overall model rank 123 (RB32). ROS overall rank 116 (RB32). Availability: UNKNOWN. Weekly ranks are preliminary when playing status is unconfirmed; they are separate from season ranks.</w:t>
       </w:r>
     </w:p>
     <w:p>
@@ -13815,7 +13815,7 @@
         <w:pStyle w:val="Normal"/>
       </w:pPr>
       <w:r>
-        <w:t xml:space="preserve">Weekly overall model rank 148 (WR58). ROS overall rank 117 (WR53). Availability: UNKNOWN. Weekly ranks are preliminary when playing status is unconfirmed; they are separate from season ranks.</w:t>
+        <w:t xml:space="preserve">Weekly overall model rank 129 (WR50). ROS overall rank 117 (WR53). Availability: UNKNOWN. Weekly ranks are preliminary when playing status is unconfirmed; they are separate from season ranks.</w:t>
       </w:r>
     </w:p>
     <w:p>
@@ -13903,7 +13903,7 @@
         <w:pStyle w:val="Normal"/>
       </w:pPr>
       <w:r>
-        <w:t xml:space="preserve">Weekly overall model rank 102 (TE15). ROS overall rank 118 (TE17). Availability: UNKNOWN. Weekly ranks are preliminary when playing status is unconfirmed; they are separate from season ranks.</w:t>
+        <w:t xml:space="preserve">Weekly overall model rank 87 (TE13). ROS overall rank 118 (TE17). Availability: UNKNOWN. Weekly ranks are preliminary when playing status is unconfirmed; they are separate from season ranks.</w:t>
       </w:r>
     </w:p>
     <w:p>
@@ -13991,7 +13991,7 @@
         <w:pStyle w:val="Normal"/>
       </w:pPr>
       <w:r>
-        <w:t xml:space="preserve">Weekly overall model rank 144 (TE24). ROS overall rank 119 (TE18). Availability: UNKNOWN. Weekly ranks are preliminary when playing status is unconfirmed; they are separate from season ranks.</w:t>
+        <w:t xml:space="preserve">Weekly overall model rank 125 (TE21). ROS overall rank 119 (TE18). Availability: UNKNOWN. Weekly ranks are preliminary when playing status is unconfirmed; they are separate from season ranks.</w:t>
       </w:r>
     </w:p>
     <w:p>
@@ -14079,7 +14079,7 @@
         <w:pStyle w:val="Normal"/>
       </w:pPr>
       <w:r>
-        <w:t xml:space="preserve">Weekly overall model rank 149 (RB38). ROS overall rank 120 (RB33). Availability: UNKNOWN. Weekly ranks are preliminary when playing status is unconfirmed; they are separate from season ranks.</w:t>
+        <w:t xml:space="preserve">Weekly overall model rank 130 (RB34). ROS overall rank 120 (RB33). Availability: UNKNOWN. Weekly ranks are preliminary when playing status is unconfirmed; they are separate from season ranks.</w:t>
       </w:r>
     </w:p>
     <w:p>
@@ -14199,7 +14199,7 @@
         <w:pStyle w:val="Normal"/>
       </w:pPr>
       <w:r>
-        <w:t xml:space="preserve">Weekly overall model rank 103 (RB22). ROS overall rank 121 (RB34). Availability: UNKNOWN. Weekly ranks are preliminary when playing status is unconfirmed; they are separate from season ranks.</w:t>
+        <w:t xml:space="preserve">Weekly overall model rank 88 (RB19). ROS overall rank 121 (RB34). Availability: UNKNOWN. Weekly ranks are preliminary when playing status is unconfirmed; they are separate from season ranks.</w:t>
       </w:r>
     </w:p>
     <w:p>
@@ -14319,7 +14319,7 @@
         <w:pStyle w:val="Normal"/>
       </w:pPr>
       <w:r>
-        <w:t xml:space="preserve">Weekly overall model rank 151 (WR60). ROS overall rank 122 (WR54). Availability: UNKNOWN. Weekly ranks are preliminary when playing status is unconfirmed; they are separate from season ranks.</w:t>
+        <w:t xml:space="preserve">Weekly overall model rank 132 (WR52). ROS overall rank 122 (WR54). Availability: UNKNOWN. Weekly ranks are preliminary when playing status is unconfirmed; they are separate from season ranks.</w:t>
       </w:r>
     </w:p>
     <w:p>
@@ -14439,7 +14439,7 @@
         <w:pStyle w:val="Normal"/>
       </w:pPr>
       <w:r>
-        <w:t xml:space="preserve">Weekly overall model rank 84 (TE6). ROS overall rank 123 (TE19). Availability: UNKNOWN. Weekly ranks are preliminary when playing status is unconfirmed; they are separate from season ranks.</w:t>
+        <w:t xml:space="preserve">Weekly overall model rank 71 (TE6). ROS overall rank 123 (TE19). Availability: UNKNOWN. Weekly ranks are preliminary when playing status is unconfirmed; they are separate from season ranks.</w:t>
       </w:r>
     </w:p>
     <w:p>
@@ -14543,7 +14543,7 @@
         <w:pStyle w:val="Normal"/>
       </w:pPr>
       <w:r>
-        <w:t xml:space="preserve">Weekly overall model rank 115 (RB26). ROS overall rank 124 (RB35). Availability: UNKNOWN. Weekly ranks are preliminary when playing status is unconfirmed; they are separate from season ranks.</w:t>
+        <w:t xml:space="preserve">Weekly overall model rank 98 (RB22). ROS overall rank 124 (RB35). Availability: UNKNOWN. Weekly ranks are preliminary when playing status is unconfirmed; they are separate from season ranks.</w:t>
       </w:r>
     </w:p>
     <w:p>
@@ -14663,7 +14663,7 @@
         <w:pStyle w:val="Normal"/>
       </w:pPr>
       <w:r>
-        <w:t xml:space="preserve">Weekly overall model rank 104 (TE16). ROS overall rank 125 (TE20). Availability: UNKNOWN. Weekly ranks are preliminary when playing status is unconfirmed; they are separate from season ranks.</w:t>
+        <w:t xml:space="preserve">Weekly overall model rank 89 (TE14). ROS overall rank 125 (TE20). Availability: UNKNOWN. Weekly ranks are preliminary when playing status is unconfirmed; they are separate from season ranks.</w:t>
       </w:r>
     </w:p>
     <w:p>
@@ -14783,7 +14783,7 @@
         <w:pStyle w:val="Normal"/>
       </w:pPr>
       <w:r>
-        <w:t xml:space="preserve">Weekly overall model rank 192 (WR73). ROS overall rank 126 (WR55). Availability: EXPECTED_INACTIVE. Weekly ranks are preliminary when playing status is unconfirmed; they are separate from season ranks.</w:t>
+        <w:t xml:space="preserve">Weekly overall model rank Not published (NOT_EXPECTED_TO_PLAY). ROS overall rank 126 (WR55). Availability: EXPECTED_INACTIVE. Weekly ranks are preliminary when playing status is unconfirmed; they are separate from season ranks.</w:t>
       </w:r>
     </w:p>
     <w:p>
@@ -14903,7 +14903,7 @@
         <w:pStyle w:val="Normal"/>
       </w:pPr>
       <w:r>
-        <w:t xml:space="preserve">Weekly overall model rank 121 (WR47). ROS overall rank 127 (WR56). Availability: UNKNOWN. Weekly ranks are preliminary when playing status is unconfirmed; they are separate from season ranks.</w:t>
+        <w:t xml:space="preserve">Weekly overall model rank 104 (WR41). ROS overall rank 127 (WR56). Availability: UNKNOWN. Weekly ranks are preliminary when playing status is unconfirmed; they are separate from season ranks.</w:t>
       </w:r>
     </w:p>
     <w:p>
@@ -15023,7 +15023,7 @@
         <w:pStyle w:val="Normal"/>
       </w:pPr>
       <w:r>
-        <w:t xml:space="preserve">Weekly overall model rank 146 (RB37). ROS overall rank 128 (RB36). Availability: UNKNOWN. Weekly ranks are preliminary when playing status is unconfirmed; they are separate from season ranks.</w:t>
+        <w:t xml:space="preserve">Weekly overall model rank 127 (RB33). ROS overall rank 128 (RB36). Availability: UNKNOWN. Weekly ranks are preliminary when playing status is unconfirmed; they are separate from season ranks.</w:t>
       </w:r>
     </w:p>
     <w:p>
@@ -15143,7 +15143,7 @@
         <w:pStyle w:val="Normal"/>
       </w:pPr>
       <w:r>
-        <w:t xml:space="preserve">Weekly overall model rank 129 (WR51). ROS overall rank 129 (WR57). Availability: UNKNOWN. Weekly ranks are preliminary when playing status is unconfirmed; they are separate from season ranks.</w:t>
+        <w:t xml:space="preserve">Weekly overall model rank 112 (WR45). ROS overall rank 129 (WR57). Availability: UNKNOWN. Weekly ranks are preliminary when playing status is unconfirmed; they are separate from season ranks.</w:t>
       </w:r>
     </w:p>
     <w:p>
@@ -15263,7 +15263,7 @@
         <w:pStyle w:val="Normal"/>
       </w:pPr>
       <w:r>
-        <w:t xml:space="preserve">Weekly overall model rank 162 (RB47). ROS overall rank 130 (RB37). Availability: UNKNOWN. Weekly ranks are preliminary when playing status is unconfirmed; they are separate from season ranks.</w:t>
+        <w:t xml:space="preserve">Weekly overall model rank 139 (RB40). ROS overall rank 130 (RB37). Availability: UNKNOWN. Weekly ranks are preliminary when playing status is unconfirmed; they are separate from season ranks.</w:t>
       </w:r>
     </w:p>
     <w:p>
@@ -15383,7 +15383,7 @@
         <w:pStyle w:val="Normal"/>
       </w:pPr>
       <w:r>
-        <w:t xml:space="preserve">Weekly overall model rank 145 (WR56). ROS overall rank 131 (WR58). Availability: UNKNOWN. Weekly ranks are preliminary when playing status is unconfirmed; they are separate from season ranks.</w:t>
+        <w:t xml:space="preserve">Weekly overall model rank 126 (WR48). ROS overall rank 131 (WR58). Availability: UNKNOWN. Weekly ranks are preliminary when playing status is unconfirmed; they are separate from season ranks.</w:t>
       </w:r>
     </w:p>
     <w:p>
@@ -15503,7 +15503,7 @@
         <w:pStyle w:val="Normal"/>
       </w:pPr>
       <w:r>
-        <w:t xml:space="preserve">Weekly overall model rank 87 (TE8). ROS overall rank 132 (TE21). Availability: UNKNOWN. Weekly ranks are preliminary when playing status is unconfirmed; they are separate from season ranks.</w:t>
+        <w:t xml:space="preserve">Weekly overall model rank Not published (NO_CURRENT_WEEK_GAME). ROS overall rank 132 (TE21). Availability: UNKNOWN. Weekly ranks are preliminary when playing status is unconfirmed; they are separate from season ranks.</w:t>
       </w:r>
     </w:p>
     <w:p>
@@ -15623,7 +15623,7 @@
         <w:pStyle w:val="Normal"/>
       </w:pPr>
       <w:r>
-        <w:t xml:space="preserve">Weekly overall model rank 154 (WR62). ROS overall rank 133 (WR59). Availability: UNKNOWN. Weekly ranks are preliminary when playing status is unconfirmed; they are separate from season ranks.</w:t>
+        <w:t xml:space="preserve">Weekly overall model rank Not published (NO_CURRENT_WEEK_GAME). ROS overall rank 133 (WR59). Availability: UNKNOWN. Weekly ranks are preliminary when playing status is unconfirmed; they are separate from season ranks.</w:t>
       </w:r>
     </w:p>
     <w:p>
@@ -15743,7 +15743,7 @@
         <w:pStyle w:val="Normal"/>
       </w:pPr>
       <w:r>
-        <w:t xml:space="preserve">Weekly overall model rank 157 (RB42). ROS overall rank 134 (RB38). Availability: UNKNOWN. Weekly ranks are preliminary when playing status is unconfirmed; they are separate from season ranks.</w:t>
+        <w:t xml:space="preserve">Weekly overall model rank Not published (GAME_STARTED_NO_ORIGINAL_WEEKLY_RANK). ROS overall rank 134 (RB38). Availability: UNKNOWN. Weekly ranks are preliminary when playing status is unconfirmed; they are separate from season ranks.</w:t>
       </w:r>
     </w:p>
     <w:p>
@@ -15863,7 +15863,7 @@
         <w:pStyle w:val="Normal"/>
       </w:pPr>
       <w:r>
-        <w:t xml:space="preserve">Weekly overall model rank 168 (RB52). ROS overall rank 135 (RB39). Availability: UNKNOWN. Weekly ranks are preliminary when playing status is unconfirmed; they are separate from season ranks.</w:t>
+        <w:t xml:space="preserve">Weekly overall model rank 145 (RB45). ROS overall rank 135 (RB39). Availability: UNKNOWN. Weekly ranks are preliminary when playing status is unconfirmed; they are separate from season ranks.</w:t>
       </w:r>
     </w:p>
     <w:p>
@@ -15983,7 +15983,7 @@
         <w:pStyle w:val="Normal"/>
       </w:pPr>
       <w:r>
-        <w:t xml:space="preserve">Weekly overall model rank 153 (WR61). ROS overall rank 136 (WR60). Availability: UNKNOWN. Weekly ranks are preliminary when playing status is unconfirmed; they are separate from season ranks.</w:t>
+        <w:t xml:space="preserve">Weekly overall model rank 134 (WR53). ROS overall rank 136 (WR60). Availability: UNKNOWN. Weekly ranks are preliminary when playing status is unconfirmed; they are separate from season ranks.</w:t>
       </w:r>
     </w:p>
     <w:p>
@@ -16103,7 +16103,7 @@
         <w:pStyle w:val="Normal"/>
       </w:pPr>
       <w:r>
-        <w:t xml:space="preserve">Weekly overall model rank 160 (RB45). ROS overall rank 137 (RB40). Availability: UNKNOWN. Weekly ranks are preliminary when playing status is unconfirmed; they are separate from season ranks.</w:t>
+        <w:t xml:space="preserve">Weekly overall model rank 137 (RB38). ROS overall rank 137 (RB40). Availability: UNKNOWN. Weekly ranks are preliminary when playing status is unconfirmed; they are separate from season ranks.</w:t>
       </w:r>
     </w:p>
     <w:p>
@@ -16223,7 +16223,7 @@
         <w:pStyle w:val="Normal"/>
       </w:pPr>
       <w:r>
-        <w:t xml:space="preserve">Weekly overall model rank 135 (WR54). ROS overall rank 138 (WR61). Availability: UNKNOWN. Weekly ranks are preliminary when playing status is unconfirmed; they are separate from season ranks.</w:t>
+        <w:t xml:space="preserve">Weekly overall model rank Not published (NO_CURRENT_WEEK_GAME). ROS overall rank 138 (WR61). Availability: UNKNOWN. Weekly ranks are preliminary when playing status is unconfirmed; they are separate from season ranks.</w:t>
       </w:r>
     </w:p>
     <w:p>
@@ -16343,7 +16343,7 @@
         <w:pStyle w:val="Normal"/>
       </w:pPr>
       <w:r>
-        <w:t xml:space="preserve">Weekly overall model rank 143 (TE23). ROS overall rank 139 (TE22). Availability: UNKNOWN. Weekly ranks are preliminary when playing status is unconfirmed; they are separate from season ranks.</w:t>
+        <w:t xml:space="preserve">Weekly overall model rank 124 (TE20). ROS overall rank 139 (TE22). Availability: UNKNOWN. Weekly ranks are preliminary when playing status is unconfirmed; they are separate from season ranks.</w:t>
       </w:r>
     </w:p>
     <w:p>
@@ -16463,7 +16463,7 @@
         <w:pStyle w:val="Normal"/>
       </w:pPr>
       <w:r>
-        <w:t xml:space="preserve">Weekly overall model rank 113 (RB24). ROS overall rank 140 (RB41). Availability: UNKNOWN. Weekly ranks are preliminary when playing status is unconfirmed; they are separate from season ranks.</w:t>
+        <w:t xml:space="preserve">Weekly overall model rank Not published (NO_CURRENT_WEEK_GAME). ROS overall rank 140 (RB41). Availability: UNKNOWN. Weekly ranks are preliminary when playing status is unconfirmed; they are separate from season ranks.</w:t>
       </w:r>
     </w:p>
     <w:p>
@@ -16583,7 +16583,7 @@
         <w:pStyle w:val="Normal"/>
       </w:pPr>
       <w:r>
-        <w:t xml:space="preserve">Weekly overall model rank 163 (RB48). ROS overall rank 141 (RB42). Availability: UNKNOWN. Weekly ranks are preliminary when playing status is unconfirmed; they are separate from season ranks.</w:t>
+        <w:t xml:space="preserve">Weekly overall model rank 140 (RB41). ROS overall rank 141 (RB42). Availability: UNKNOWN. Weekly ranks are preliminary when playing status is unconfirmed; they are separate from season ranks.</w:t>
       </w:r>
     </w:p>
     <w:p>
@@ -16703,7 +16703,7 @@
         <w:pStyle w:val="Normal"/>
       </w:pPr>
       <w:r>
-        <w:t xml:space="preserve">Weekly overall model rank 190 (WR72). ROS overall rank 142 (WR62). Availability: EXPECTED_INACTIVE. Weekly ranks are preliminary when playing status is unconfirmed; they are separate from season ranks.</w:t>
+        <w:t xml:space="preserve">Weekly overall model rank Not published (NOT_EXPECTED_TO_PLAY). ROS overall rank 142 (WR62). Availability: EXPECTED_INACTIVE. Weekly ranks are preliminary when playing status is unconfirmed; they are separate from season ranks.</w:t>
       </w:r>
     </w:p>
     <w:p>
@@ -16823,7 +16823,7 @@
         <w:pStyle w:val="Normal"/>
       </w:pPr>
       <w:r>
-        <w:t xml:space="preserve">Weekly overall model rank 158 (RB43). ROS overall rank 143 (RB43). Availability: UNKNOWN. Weekly ranks are preliminary when playing status is unconfirmed; they are separate from season ranks.</w:t>
+        <w:t xml:space="preserve">Weekly overall model rank Not published (NO_CURRENT_WEEK_GAME). ROS overall rank 143 (RB43). Availability: UNKNOWN. Weekly ranks are preliminary when playing status is unconfirmed; they are separate from season ranks.</w:t>
       </w:r>
     </w:p>
     <w:p>
@@ -16943,7 +16943,7 @@
         <w:pStyle w:val="Normal"/>
       </w:pPr>
       <w:r>
-        <w:t xml:space="preserve">Weekly overall model rank 137 (TE22). ROS overall rank 144 (TE23). Availability: UNKNOWN. Weekly ranks are preliminary when playing status is unconfirmed; they are separate from season ranks.</w:t>
+        <w:t xml:space="preserve">Weekly overall model rank 118 (TE19). ROS overall rank 144 (TE23). Availability: UNKNOWN. Weekly ranks are preliminary when playing status is unconfirmed; they are separate from season ranks.</w:t>
       </w:r>
     </w:p>
     <w:p>
@@ -17063,7 +17063,7 @@
         <w:pStyle w:val="Normal"/>
       </w:pPr>
       <w:r>
-        <w:t xml:space="preserve">Weekly overall model rank 150 (WR59). ROS overall rank 145 (WR63). Availability: UNKNOWN. Weekly ranks are preliminary when playing status is unconfirmed; they are separate from season ranks.</w:t>
+        <w:t xml:space="preserve">Weekly overall model rank 131 (WR51). ROS overall rank 145 (WR63). Availability: UNKNOWN. Weekly ranks are preliminary when playing status is unconfirmed; they are separate from season ranks.</w:t>
       </w:r>
     </w:p>
     <w:p>
@@ -17183,7 +17183,7 @@
         <w:pStyle w:val="Normal"/>
       </w:pPr>
       <w:r>
-        <w:t xml:space="preserve">Weekly overall model rank 161 (RB46). ROS overall rank 146 (RB44). Availability: UNKNOWN. Weekly ranks are preliminary when playing status is unconfirmed; they are separate from season ranks.</w:t>
+        <w:t xml:space="preserve">Weekly overall model rank 138 (RB39). ROS overall rank 146 (RB44). Availability: UNKNOWN. Weekly ranks are preliminary when playing status is unconfirmed; they are separate from season ranks.</w:t>
       </w:r>
     </w:p>
     <w:p>
@@ -17303,7 +17303,7 @@
         <w:pStyle w:val="Normal"/>
       </w:pPr>
       <w:r>
-        <w:t xml:space="preserve">Weekly overall model rank 156 (RB41). ROS overall rank 147 (RB45). Availability: UNKNOWN. Weekly ranks are preliminary when playing status is unconfirmed; they are separate from season ranks.</w:t>
+        <w:t xml:space="preserve">Weekly overall model rank Not published (NO_CURRENT_WEEK_GAME). ROS overall rank 147 (RB45). Availability: UNKNOWN. Weekly ranks are preliminary when playing status is unconfirmed; they are separate from season ranks.</w:t>
       </w:r>
     </w:p>
     <w:p>
@@ -17423,7 +17423,7 @@
         <w:pStyle w:val="Normal"/>
       </w:pPr>
       <w:r>
-        <w:t xml:space="preserve">Weekly overall model rank 59 (QB25). ROS overall rank 148 (QB17). Availability: UNKNOWN. Weekly ranks are preliminary when playing status is unconfirmed; they are separate from season ranks.</w:t>
+        <w:t xml:space="preserve">Weekly overall model rank 49 (QB21). ROS overall rank 148 (QB17). Availability: UNKNOWN. Weekly ranks are preliminary when playing status is unconfirmed; they are separate from season ranks.</w:t>
       </w:r>
     </w:p>
     <w:p>
@@ -17543,7 +17543,7 @@
         <w:pStyle w:val="Normal"/>
       </w:pPr>
       <w:r>
-        <w:t xml:space="preserve">Weekly overall model rank 170 (WR64). ROS overall rank 149 (WR64). Availability: UNKNOWN. Weekly ranks are preliminary when playing status is unconfirmed; they are separate from season ranks.</w:t>
+        <w:t xml:space="preserve">Weekly overall model rank 147 (WR55). ROS overall rank 149 (WR64). Availability: UNKNOWN. Weekly ranks are preliminary when playing status is unconfirmed; they are separate from season ranks.</w:t>
       </w:r>
     </w:p>
     <w:p>
@@ -17663,7 +17663,7 @@
         <w:pStyle w:val="Normal"/>
       </w:pPr>
       <w:r>
-        <w:t xml:space="preserve">Weekly overall model rank 90 (RB21). ROS overall rank 150 (RB46). Availability: UNKNOWN. Weekly ranks are preliminary when playing status is unconfirmed; they are separate from season ranks.</w:t>
+        <w:t xml:space="preserve">Weekly overall model rank 76 (RB18). ROS overall rank 150 (RB46). Availability: UNKNOWN. Weekly ranks are preliminary when playing status is unconfirmed; they are separate from season ranks.</w:t>
       </w:r>
     </w:p>
     <w:p>
@@ -17783,7 +17783,7 @@
         <w:pStyle w:val="Normal"/>
       </w:pPr>
       <w:r>
-        <w:t xml:space="preserve">Weekly overall model rank 130 (WR52). ROS overall rank 151 (WR65). Availability: UNKNOWN. Weekly ranks are preliminary when playing status is unconfirmed; they are separate from season ranks.</w:t>
+        <w:t xml:space="preserve">Weekly overall model rank Not published (GAME_STARTED_NO_ORIGINAL_WEEKLY_RANK). ROS overall rank 151 (WR65). Availability: UNKNOWN. Weekly ranks are preliminary when playing status is unconfirmed; they are separate from season ranks.</w:t>
       </w:r>
     </w:p>
     <w:p>
@@ -17903,7 +17903,7 @@
         <w:pStyle w:val="Normal"/>
       </w:pPr>
       <w:r>
-        <w:t xml:space="preserve">Weekly overall model rank 120 (TE19). ROS overall rank 152 (TE24). Availability: UNKNOWN. Weekly ranks are preliminary when playing status is unconfirmed; they are separate from season ranks.</w:t>
+        <w:t xml:space="preserve">Weekly overall model rank 103 (TE16). ROS overall rank 152 (TE24). Availability: UNKNOWN. Weekly ranks are preliminary when playing status is unconfirmed; they are separate from season ranks.</w:t>
       </w:r>
     </w:p>
     <w:p>
@@ -18023,7 +18023,7 @@
         <w:pStyle w:val="Normal"/>
       </w:pPr>
       <w:r>
-        <w:t xml:space="preserve">Weekly overall model rank 152 (RB39). ROS overall rank 153 (RB47). Availability: UNKNOWN. Weekly ranks are preliminary when playing status is unconfirmed; they are separate from season ranks.</w:t>
+        <w:t xml:space="preserve">Weekly overall model rank 133 (RB35). ROS overall rank 153 (RB47). Availability: UNKNOWN. Weekly ranks are preliminary when playing status is unconfirmed; they are separate from season ranks.</w:t>
       </w:r>
     </w:p>
     <w:p>
@@ -18143,7 +18143,7 @@
         <w:pStyle w:val="Normal"/>
       </w:pPr>
       <w:r>
-        <w:t xml:space="preserve">Weekly overall model rank 194 (RB66). ROS overall rank 154 (RB48). Availability: EXPECTED_INACTIVE. Weekly ranks are preliminary when playing status is unconfirmed; they are separate from season ranks.</w:t>
+        <w:t xml:space="preserve">Weekly overall model rank Not published (NOT_EXPECTED_TO_PLAY). ROS overall rank 154 (RB48). Availability: EXPECTED_INACTIVE. Weekly ranks are preliminary when playing status is unconfirmed; they are separate from season ranks.</w:t>
       </w:r>
     </w:p>
     <w:p>
@@ -18263,7 +18263,7 @@
         <w:pStyle w:val="Normal"/>
       </w:pPr>
       <w:r>
-        <w:t xml:space="preserve">Weekly overall model rank 174 (RB56). ROS overall rank 155 (RB49). Availability: UNKNOWN. Weekly ranks are preliminary when playing status is unconfirmed; they are separate from season ranks.</w:t>
+        <w:t xml:space="preserve">Weekly overall model rank 150 (RB49). ROS overall rank 155 (RB49). Availability: UNKNOWN. Weekly ranks are preliminary when playing status is unconfirmed; they are separate from season ranks.</w:t>
       </w:r>
     </w:p>
     <w:p>
@@ -18383,7 +18383,7 @@
         <w:pStyle w:val="Normal"/>
       </w:pPr>
       <w:r>
-        <w:t xml:space="preserve">Weekly overall model rank 180 (RB61). ROS overall rank 156 (RB50). Availability: UNKNOWN. Weekly ranks are preliminary when playing status is unconfirmed; they are separate from season ranks.</w:t>
+        <w:t xml:space="preserve">Weekly overall model rank 156 (RB54). ROS overall rank 156 (RB50). Availability: UNKNOWN. Weekly ranks are preliminary when playing status is unconfirmed; they are separate from season ranks.</w:t>
       </w:r>
     </w:p>
     <w:p>
@@ -18503,7 +18503,7 @@
         <w:pStyle w:val="Normal"/>
       </w:pPr>
       <w:r>
-        <w:t xml:space="preserve">Weekly overall model rank 127 (RB30). ROS overall rank 157 (RB51). Availability: UNKNOWN. Weekly ranks are preliminary when playing status is unconfirmed; they are separate from season ranks.</w:t>
+        <w:t xml:space="preserve">Weekly overall model rank 110 (RB26). ROS overall rank 157 (RB51). Availability: UNKNOWN. Weekly ranks are preliminary when playing status is unconfirmed; they are separate from season ranks.</w:t>
       </w:r>
     </w:p>
     <w:p>
@@ -18623,7 +18623,7 @@
         <w:pStyle w:val="Normal"/>
       </w:pPr>
       <w:r>
-        <w:t xml:space="preserve">Weekly overall model rank 110 (WR43). ROS overall rank 158 (WR66). Availability: UNKNOWN. Weekly ranks are preliminary when playing status is unconfirmed; they are separate from season ranks.</w:t>
+        <w:t xml:space="preserve">Weekly overall model rank 94 (WR37). ROS overall rank 158 (WR66). Availability: UNKNOWN. Weekly ranks are preliminary when playing status is unconfirmed; they are separate from season ranks.</w:t>
       </w:r>
     </w:p>
     <w:p>
@@ -18743,7 +18743,7 @@
         <w:pStyle w:val="Normal"/>
       </w:pPr>
       <w:r>
-        <w:t xml:space="preserve">Weekly overall model rank 175 (WR66). ROS overall rank 159 (WR67). Availability: UNKNOWN. Weekly ranks are preliminary when playing status is unconfirmed; they are separate from season ranks.</w:t>
+        <w:t xml:space="preserve">Weekly overall model rank 151 (WR56). ROS overall rank 159 (WR67). Availability: UNKNOWN. Weekly ranks are preliminary when playing status is unconfirmed; they are separate from season ranks.</w:t>
       </w:r>
     </w:p>
     <w:p>
@@ -18863,7 +18863,7 @@
         <w:pStyle w:val="Normal"/>
       </w:pPr>
       <w:r>
-        <w:t xml:space="preserve">Weekly overall model rank 165 (RB49). ROS overall rank 160 (RB52). Availability: UNKNOWN. Weekly ranks are preliminary when playing status is unconfirmed; they are separate from season ranks.</w:t>
+        <w:t xml:space="preserve">Weekly overall model rank 142 (RB42). ROS overall rank 160 (RB52). Availability: UNKNOWN. Weekly ranks are preliminary when playing status is unconfirmed; they are separate from season ranks.</w:t>
       </w:r>
     </w:p>
     <w:p>
@@ -18983,7 +18983,7 @@
         <w:pStyle w:val="Normal"/>
       </w:pPr>
       <w:r>
-        <w:t xml:space="preserve">Weekly overall model rank 159 (RB44). ROS overall rank 161 (RB53). Availability: UNKNOWN. Weekly ranks are preliminary when playing status is unconfirmed; they are separate from season ranks.</w:t>
+        <w:t xml:space="preserve">Weekly overall model rank 136 (RB37). ROS overall rank 161 (RB53). Availability: UNKNOWN. Weekly ranks are preliminary when playing status is unconfirmed; they are separate from season ranks.</w:t>
       </w:r>
     </w:p>
     <w:p>
@@ -19103,7 +19103,7 @@
         <w:pStyle w:val="Normal"/>
       </w:pPr>
       <w:r>
-        <w:t xml:space="preserve">Weekly overall model rank 167 (RB51). ROS overall rank 162 (RB54). Availability: UNKNOWN. Weekly ranks are preliminary when playing status is unconfirmed; they are separate from season ranks.</w:t>
+        <w:t xml:space="preserve">Weekly overall model rank 144 (RB44). ROS overall rank 162 (RB54). Availability: UNKNOWN. Weekly ranks are preliminary when playing status is unconfirmed; they are separate from season ranks.</w:t>
       </w:r>
     </w:p>
     <w:p>
@@ -19223,7 +19223,7 @@
         <w:pStyle w:val="Normal"/>
       </w:pPr>
       <w:r>
-        <w:t xml:space="preserve">Weekly overall model rank 136 (WR55). ROS overall rank 163 (WR68). Availability: UNKNOWN. Weekly ranks are preliminary when playing status is unconfirmed; they are separate from season ranks.</w:t>
+        <w:t xml:space="preserve">Weekly overall model rank 117 (WR47). ROS overall rank 163 (WR68). Availability: UNKNOWN. Weekly ranks are preliminary when playing status is unconfirmed; they are separate from season ranks.</w:t>
       </w:r>
     </w:p>
     <w:p>
@@ -19311,7 +19311,7 @@
         <w:pStyle w:val="Normal"/>
       </w:pPr>
       <w:r>
-        <w:t xml:space="preserve">Weekly overall model rank 77 (QB28). ROS overall rank 164 (QB18). Availability: UNKNOWN. Weekly ranks are preliminary when playing status is unconfirmed; they are separate from season ranks.</w:t>
+        <w:t xml:space="preserve">Weekly overall model rank 65 (QB24). ROS overall rank 164 (QB18). Availability: UNKNOWN. Weekly ranks are preliminary when playing status is unconfirmed; they are separate from season ranks.</w:t>
       </w:r>
     </w:p>
     <w:p>
@@ -19431,7 +19431,7 @@
         <w:pStyle w:val="Normal"/>
       </w:pPr>
       <w:r>
-        <w:t xml:space="preserve">Weekly overall model rank 28 (QB10). ROS overall rank 165 (QB19). Availability: UNKNOWN. Weekly ranks are preliminary when playing status is unconfirmed; they are separate from season ranks.</w:t>
+        <w:t xml:space="preserve">Weekly overall model rank 25 (QB9). ROS overall rank 165 (QB19). Availability: UNKNOWN. Weekly ranks are preliminary when playing status is unconfirmed; they are separate from season ranks.</w:t>
       </w:r>
     </w:p>
     <w:p>
@@ -19551,7 +19551,7 @@
         <w:pStyle w:val="Normal"/>
       </w:pPr>
       <w:r>
-        <w:t xml:space="preserve">Weekly overall model rank 155 (RB40). ROS overall rank 166 (RB55). Availability: UNKNOWN. Weekly ranks are preliminary when playing status is unconfirmed; they are separate from season ranks.</w:t>
+        <w:t xml:space="preserve">Weekly overall model rank 135 (RB36). ROS overall rank 166 (RB55). Availability: UNKNOWN. Weekly ranks are preliminary when playing status is unconfirmed; they are separate from season ranks.</w:t>
       </w:r>
     </w:p>
     <w:p>
@@ -19655,7 +19655,7 @@
         <w:pStyle w:val="Normal"/>
       </w:pPr>
       <w:r>
-        <w:t xml:space="preserve">Weekly overall model rank 169 (RB53). ROS overall rank 167 (RB56). Availability: UNKNOWN. Weekly ranks are preliminary when playing status is unconfirmed; they are separate from season ranks.</w:t>
+        <w:t xml:space="preserve">Weekly overall model rank 146 (RB46). ROS overall rank 167 (RB56). Availability: UNKNOWN. Weekly ranks are preliminary when playing status is unconfirmed; they are separate from season ranks.</w:t>
       </w:r>
     </w:p>
     <w:p>
@@ -19775,7 +19775,7 @@
         <w:pStyle w:val="Normal"/>
       </w:pPr>
       <w:r>
-        <w:t xml:space="preserve">Weekly overall model rank 29 (QB11). ROS overall rank 168 (QB20). Availability: UNKNOWN. Weekly ranks are preliminary when playing status is unconfirmed; they are separate from season ranks.</w:t>
+        <w:t xml:space="preserve">Weekly overall model rank 26 (QB10). ROS overall rank 168 (QB20). Availability: UNKNOWN. Weekly ranks are preliminary when playing status is unconfirmed; they are separate from season ranks.</w:t>
       </w:r>
     </w:p>
     <w:p>
@@ -19895,7 +19895,7 @@
         <w:pStyle w:val="Normal"/>
       </w:pPr>
       <w:r>
-        <w:t xml:space="preserve">Weekly overall model rank 178 (RB59). ROS overall rank 169 (RB57). Availability: UNKNOWN. Weekly ranks are preliminary when playing status is unconfirmed; they are separate from season ranks.</w:t>
+        <w:t xml:space="preserve">Weekly overall model rank 154 (RB52). ROS overall rank 169 (RB57). Availability: UNKNOWN. Weekly ranks are preliminary when playing status is unconfirmed; they are separate from season ranks.</w:t>
       </w:r>
     </w:p>
     <w:p>
@@ -19983,7 +19983,7 @@
         <w:pStyle w:val="Normal"/>
       </w:pPr>
       <w:r>
-        <w:t xml:space="preserve">Weekly overall model rank 30 (QB12). ROS overall rank 170 (QB21). Availability: UNKNOWN. Weekly ranks are preliminary when playing status is unconfirmed; they are separate from season ranks.</w:t>
+        <w:t xml:space="preserve">Weekly overall model rank 27 (QB11). ROS overall rank 170 (QB21). Availability: UNKNOWN. Weekly ranks are preliminary when playing status is unconfirmed; they are separate from season ranks.</w:t>
       </w:r>
     </w:p>
     <w:p>
@@ -20103,7 +20103,7 @@
         <w:pStyle w:val="Normal"/>
       </w:pPr>
       <w:r>
-        <w:t xml:space="preserve">Weekly overall model rank 179 (RB60). ROS overall rank 171 (RB58). Availability: UNKNOWN. Weekly ranks are preliminary when playing status is unconfirmed; they are separate from season ranks.</w:t>
+        <w:t xml:space="preserve">Weekly overall model rank 155 (RB53). ROS overall rank 171 (RB58). Availability: UNKNOWN. Weekly ranks are preliminary when playing status is unconfirmed; they are separate from season ranks.</w:t>
       </w:r>
     </w:p>
     <w:p>
@@ -20191,7 +20191,7 @@
         <w:pStyle w:val="Normal"/>
       </w:pPr>
       <w:r>
-        <w:t xml:space="preserve">Weekly overall model rank 177 (RB58). ROS overall rank 172 (RB59). Availability: UNKNOWN. Weekly ranks are preliminary when playing status is unconfirmed; they are separate from season ranks.</w:t>
+        <w:t xml:space="preserve">Weekly overall model rank 153 (RB51). ROS overall rank 172 (RB59). Availability: UNKNOWN. Weekly ranks are preliminary when playing status is unconfirmed; they are separate from season ranks.</w:t>
       </w:r>
     </w:p>
     <w:p>
@@ -20311,7 +20311,7 @@
         <w:pStyle w:val="Normal"/>
       </w:pPr>
       <w:r>
-        <w:t xml:space="preserve">Weekly overall model rank 173 (RB55). ROS overall rank 173 (RB60). Availability: UNKNOWN. Weekly ranks are preliminary when playing status is unconfirmed; they are separate from season ranks.</w:t>
+        <w:t xml:space="preserve">Weekly overall model rank 149 (RB48). ROS overall rank 173 (RB60). Availability: UNKNOWN. Weekly ranks are preliminary when playing status is unconfirmed; they are separate from season ranks.</w:t>
       </w:r>
     </w:p>
     <w:p>
@@ -20431,7 +20431,7 @@
         <w:pStyle w:val="Normal"/>
       </w:pPr>
       <w:r>
-        <w:t xml:space="preserve">Weekly overall model rank 185 (WR69). ROS overall rank 174 (WR69). Availability: UNKNOWN. Weekly ranks are preliminary when playing status is unconfirmed; they are separate from season ranks.</w:t>
+        <w:t xml:space="preserve">Weekly overall model rank 161 (WR59). ROS overall rank 174 (WR69). Availability: UNKNOWN. Weekly ranks are preliminary when playing status is unconfirmed; they are separate from season ranks.</w:t>
       </w:r>
     </w:p>
     <w:p>
@@ -20551,7 +20551,7 @@
         <w:pStyle w:val="Normal"/>
       </w:pPr>
       <w:r>
-        <w:t xml:space="preserve">Weekly overall model rank 47 (QB20). ROS overall rank 175 (QB22). Availability: UNKNOWN. Weekly ranks are preliminary when playing status is unconfirmed; they are separate from season ranks.</w:t>
+        <w:t xml:space="preserve">Weekly overall model rank 38 (QB16). ROS overall rank 175 (QB22). Availability: UNKNOWN. Weekly ranks are preliminary when playing status is unconfirmed; they are separate from season ranks.</w:t>
       </w:r>
     </w:p>
     <w:p>
@@ -20671,7 +20671,7 @@
         <w:pStyle w:val="Normal"/>
       </w:pPr>
       <w:r>
-        <w:t xml:space="preserve">Weekly overall model rank 164 (WR63). ROS overall rank 176 (WR70). Availability: UNKNOWN. Weekly ranks are preliminary when playing status is unconfirmed; they are separate from season ranks.</w:t>
+        <w:t xml:space="preserve">Weekly overall model rank 141 (WR54). ROS overall rank 176 (WR70). Availability: UNKNOWN. Weekly ranks are preliminary when playing status is unconfirmed; they are separate from season ranks.</w:t>
       </w:r>
     </w:p>
     <w:p>
@@ -20759,7 +20759,7 @@
         <w:pStyle w:val="Normal"/>
       </w:pPr>
       <w:r>
-        <w:t xml:space="preserve">Weekly overall model rank 184 (WR68). ROS overall rank 177 (WR71). Availability: UNKNOWN. Weekly ranks are preliminary when playing status is unconfirmed; they are separate from season ranks.</w:t>
+        <w:t xml:space="preserve">Weekly overall model rank 160 (WR58). ROS overall rank 177 (WR71). Availability: UNKNOWN. Weekly ranks are preliminary when playing status is unconfirmed; they are separate from season ranks.</w:t>
       </w:r>
     </w:p>
     <w:p>
@@ -20879,7 +20879,7 @@
         <w:pStyle w:val="Normal"/>
       </w:pPr>
       <w:r>
-        <w:t xml:space="preserve">Weekly overall model rank 182 (WR67). ROS overall rank 178 (WR72). Availability: UNKNOWN. Weekly ranks are preliminary when playing status is unconfirmed; they are separate from season ranks.</w:t>
+        <w:t xml:space="preserve">Weekly overall model rank 158 (WR57). ROS overall rank 178 (WR72). Availability: UNKNOWN. Weekly ranks are preliminary when playing status is unconfirmed; they are separate from season ranks.</w:t>
       </w:r>
     </w:p>
     <w:p>
@@ -20967,7 +20967,7 @@
         <w:pStyle w:val="Normal"/>
       </w:pPr>
       <w:r>
-        <w:t xml:space="preserve">Weekly overall model rank 188 (TE26). ROS overall rank 179 (TE25). Availability: UNKNOWN. Weekly ranks are preliminary when playing status is unconfirmed; they are separate from season ranks.</w:t>
+        <w:t xml:space="preserve">Weekly overall model rank 163 (TE23). ROS overall rank 179 (TE25). Availability: UNKNOWN. Weekly ranks are preliminary when playing status is unconfirmed; they are separate from season ranks.</w:t>
       </w:r>
     </w:p>
     <w:p>
@@ -21087,7 +21087,7 @@
         <w:pStyle w:val="Normal"/>
       </w:pPr>
       <w:r>
-        <w:t xml:space="preserve">Weekly overall model rank 176 (RB57). ROS overall rank 180 (RB61). Availability: UNKNOWN. Weekly ranks are preliminary when playing status is unconfirmed; they are separate from season ranks.</w:t>
+        <w:t xml:space="preserve">Weekly overall model rank 152 (RB50). ROS overall rank 180 (RB61). Availability: UNKNOWN. Weekly ranks are preliminary when playing status is unconfirmed; they are separate from season ranks.</w:t>
       </w:r>
     </w:p>
     <w:p>
@@ -21175,7 +21175,7 @@
         <w:pStyle w:val="Normal"/>
       </w:pPr>
       <w:r>
-        <w:t xml:space="preserve">Weekly overall model rank 196 (RB67). ROS overall rank 181 (RB62). Availability: EXPECTED_INACTIVE. Weekly ranks are preliminary when playing status is unconfirmed; they are separate from season ranks.</w:t>
+        <w:t xml:space="preserve">Weekly overall model rank Not published (NOT_EXPECTED_TO_PLAY). ROS overall rank 181 (RB62). Availability: EXPECTED_INACTIVE. Weekly ranks are preliminary when playing status is unconfirmed; they are separate from season ranks.</w:t>
       </w:r>
     </w:p>
     <w:p>
@@ -21295,7 +21295,7 @@
         <w:pStyle w:val="Normal"/>
       </w:pPr>
       <w:r>
-        <w:t xml:space="preserve">Weekly overall model rank 51 (QB22). ROS overall rank 182 (QB23). Availability: UNKNOWN. Weekly ranks are preliminary when playing status is unconfirmed; they are separate from season ranks.</w:t>
+        <w:t xml:space="preserve">Weekly overall model rank 42 (QB18). ROS overall rank 182 (QB23). Availability: UNKNOWN. Weekly ranks are preliminary when playing status is unconfirmed; they are separate from season ranks.</w:t>
       </w:r>
     </w:p>
     <w:p>
@@ -21415,7 +21415,7 @@
         <w:pStyle w:val="Normal"/>
       </w:pPr>
       <w:r>
-        <w:t xml:space="preserve">Weekly overall model rank 181 (RB62). ROS overall rank 183 (RB63). Availability: UNKNOWN. Weekly ranks are preliminary when playing status is unconfirmed; they are separate from season ranks.</w:t>
+        <w:t xml:space="preserve">Weekly overall model rank 157 (RB55). ROS overall rank 183 (RB63). Availability: UNKNOWN. Weekly ranks are preliminary when playing status is unconfirmed; they are separate from season ranks.</w:t>
       </w:r>
     </w:p>
     <w:p>
@@ -21535,7 +21535,7 @@
         <w:pStyle w:val="Normal"/>
       </w:pPr>
       <w:r>
-        <w:t xml:space="preserve">Weekly overall model rank 187 (RB63). ROS overall rank 184 (RB64). Availability: UNKNOWN. Weekly ranks are preliminary when playing status is unconfirmed; they are separate from season ranks.</w:t>
+        <w:t xml:space="preserve">Weekly overall model rank 162 (RB56). ROS overall rank 184 (RB64). Availability: UNKNOWN. Weekly ranks are preliminary when playing status is unconfirmed; they are separate from season ranks.</w:t>
       </w:r>
     </w:p>
     <w:p>
@@ -21655,7 +21655,7 @@
         <w:pStyle w:val="Normal"/>
       </w:pPr>
       <w:r>
-        <w:t xml:space="preserve">Weekly overall model rank 58 (QB24). ROS overall rank 185 (QB24). Availability: UNKNOWN. Weekly ranks are preliminary when playing status is unconfirmed; they are separate from season ranks.</w:t>
+        <w:t xml:space="preserve">Weekly overall model rank 48 (QB20). ROS overall rank 185 (QB24). Availability: UNKNOWN. Weekly ranks are preliminary when playing status is unconfirmed; they are separate from season ranks.</w:t>
       </w:r>
     </w:p>
     <w:p>
@@ -21775,7 +21775,7 @@
         <w:pStyle w:val="Normal"/>
       </w:pPr>
       <w:r>
-        <w:t xml:space="preserve">Weekly overall model rank 45 (QB19). ROS overall rank 186 (QB25). Availability: UNKNOWN. Weekly ranks are preliminary when playing status is unconfirmed; they are separate from season ranks.</w:t>
+        <w:t xml:space="preserve">Weekly overall model rank Not published (GAME_STARTED_NO_ORIGINAL_WEEKLY_RANK). ROS overall rank 186 (QB25). Availability: UNKNOWN. Weekly ranks are preliminary when playing status is unconfirmed; they are separate from season ranks.</w:t>
       </w:r>
     </w:p>
     <w:p>
@@ -21895,7 +21895,7 @@
         <w:pStyle w:val="Normal"/>
       </w:pPr>
       <w:r>
-        <w:t xml:space="preserve">Weekly overall model rank 183 (TE25). ROS overall rank 187 (TE26). Availability: UNKNOWN. Weekly ranks are preliminary when playing status is unconfirmed; they are separate from season ranks.</w:t>
+        <w:t xml:space="preserve">Weekly overall model rank 159 (TE22). ROS overall rank 187 (TE26). Availability: UNKNOWN. Weekly ranks are preliminary when playing status is unconfirmed; they are separate from season ranks.</w:t>
       </w:r>
     </w:p>
     <w:p>
@@ -22015,7 +22015,7 @@
         <w:pStyle w:val="Normal"/>
       </w:pPr>
       <w:r>
-        <w:t xml:space="preserve">Weekly overall model rank 54 (QB23). ROS overall rank 188 (QB26). Availability: UNKNOWN. Weekly ranks are preliminary when playing status is unconfirmed; they are separate from season ranks.</w:t>
+        <w:t xml:space="preserve">Weekly overall model rank 45 (QB19). ROS overall rank 188 (QB26). Availability: UNKNOWN. Weekly ranks are preliminary when playing status is unconfirmed; they are separate from season ranks.</w:t>
       </w:r>
     </w:p>
     <w:p>
@@ -22135,7 +22135,7 @@
         <w:pStyle w:val="Normal"/>
       </w:pPr>
       <w:r>
-        <w:t xml:space="preserve">Weekly overall model rank 193 (RB65). ROS overall rank 189 (RB65). Availability: UNKNOWN. Weekly ranks are preliminary when playing status is unconfirmed; they are separate from season ranks.</w:t>
+        <w:t xml:space="preserve">Weekly overall model rank 166 (RB58). ROS overall rank 189 (RB65). Availability: UNKNOWN. Weekly ranks are preliminary when playing status is unconfirmed; they are separate from season ranks.</w:t>
       </w:r>
     </w:p>
     <w:p>
@@ -22255,7 +22255,7 @@
         <w:pStyle w:val="Normal"/>
       </w:pPr>
       <w:r>
-        <w:t xml:space="preserve">Weekly overall model rank 132 (QB29). ROS overall rank 190 (QB27). Availability: UNKNOWN. Weekly ranks are preliminary when playing status is unconfirmed; they are separate from season ranks.</w:t>
+        <w:t xml:space="preserve">Weekly overall model rank 114 (QB25). ROS overall rank 190 (QB27). Availability: UNKNOWN. Weekly ranks are preliminary when playing status is unconfirmed; they are separate from season ranks.</w:t>
       </w:r>
     </w:p>
     <w:p>
@@ -22343,7 +22343,7 @@
         <w:pStyle w:val="Normal"/>
       </w:pPr>
       <w:r>
-        <w:t xml:space="preserve">Weekly overall model rank 191 (RB64). ROS overall rank 191 (RB66). Availability: UNKNOWN. Weekly ranks are preliminary when playing status is unconfirmed; they are separate from season ranks.</w:t>
+        <w:t xml:space="preserve">Weekly overall model rank 165 (RB57). ROS overall rank 191 (RB66). Availability: UNKNOWN. Weekly ranks are preliminary when playing status is unconfirmed; they are separate from season ranks.</w:t>
       </w:r>
     </w:p>
     <w:p>
@@ -22463,7 +22463,7 @@
         <w:pStyle w:val="Normal"/>
       </w:pPr>
       <w:r>
-        <w:t xml:space="preserve">Weekly overall model rank 68 (QB26). ROS overall rank 192 (QB28). Availability: UNKNOWN. Weekly ranks are preliminary when playing status is unconfirmed; they are separate from season ranks.</w:t>
+        <w:t xml:space="preserve">Weekly overall model rank 56 (QB22). ROS overall rank 192 (QB28). Availability: UNKNOWN. Weekly ranks are preliminary when playing status is unconfirmed; they are separate from season ranks.</w:t>
       </w:r>
     </w:p>
     <w:p>
@@ -22583,7 +22583,7 @@
         <w:pStyle w:val="Normal"/>
       </w:pPr>
       <w:r>
-        <w:t xml:space="preserve">Weekly overall model rank 189 (WR71). ROS overall rank 193 (WR73). Availability: UNKNOWN. Weekly ranks are preliminary when playing status is unconfirmed; they are separate from season ranks.</w:t>
+        <w:t xml:space="preserve">Weekly overall model rank 164 (WR60). ROS overall rank 193 (WR73). Availability: UNKNOWN. Weekly ranks are preliminary when playing status is unconfirmed; they are separate from season ranks.</w:t>
       </w:r>
     </w:p>
     <w:p>
@@ -22703,7 +22703,7 @@
         <w:pStyle w:val="Normal"/>
       </w:pPr>
       <w:r>
-        <w:t xml:space="preserve">Weekly overall model rank 72 (QB27). ROS overall rank 194 (QB29). Availability: UNKNOWN. Weekly ranks are preliminary when playing status is unconfirmed; they are separate from season ranks.</w:t>
+        <w:t xml:space="preserve">Weekly overall model rank 60 (QB23). ROS overall rank 194 (QB29). Availability: UNKNOWN. Weekly ranks are preliminary when playing status is unconfirmed; they are separate from season ranks.</w:t>
       </w:r>
     </w:p>
     <w:p>
@@ -22823,7 +22823,7 @@
         <w:pStyle w:val="Normal"/>
       </w:pPr>
       <w:r>
-        <w:t xml:space="preserve">Weekly overall model rank 195 (WR74). ROS overall rank 195 (WR74). Availability: EXPECTED_INACTIVE. Weekly ranks are preliminary when playing status is unconfirmed; they are separate from season ranks.</w:t>
+        <w:t xml:space="preserve">Weekly overall model rank Not published (NOT_EXPECTED_TO_PLAY). ROS overall rank 195 (WR74). Availability: EXPECTED_INACTIVE. Weekly ranks are preliminary when playing status is unconfirmed; they are separate from season ranks.</w:t>
       </w:r>
     </w:p>
     <w:p>
@@ -22943,7 +22943,7 @@
         <w:pStyle w:val="Normal"/>
       </w:pPr>
       <w:r>
-        <w:t xml:space="preserve">Weekly overall model rank 197 (WR75). ROS overall rank 196 (WR75). Availability: UNKNOWN. Weekly ranks are preliminary when playing status is unconfirmed; they are separate from season ranks.</w:t>
+        <w:t xml:space="preserve">Weekly overall model rank 167 (WR61). ROS overall rank 196 (WR75). Availability: UNKNOWN. Weekly ranks are preliminary when playing status is unconfirmed; they are separate from season ranks.</w:t>
       </w:r>
     </w:p>
     <w:p>
@@ -23063,7 +23063,7 @@
         <w:pStyle w:val="Normal"/>
       </w:pPr>
       <w:r>
-        <w:t xml:space="preserve">Weekly overall model rank 166 (RB50). ROS overall rank 197 (RB67). Availability: UNKNOWN. Weekly ranks are preliminary when playing status is unconfirmed; they are separate from season ranks.</w:t>
+        <w:t xml:space="preserve">Weekly overall model rank 143 (RB43). ROS overall rank 197 (RB67). Availability: UNKNOWN. Weekly ranks are preliminary when playing status is unconfirmed; they are separate from season ranks.</w:t>
       </w:r>
     </w:p>
     <w:p>

</xml_diff>

<commit_message>
Publish universal injury/news profiles and keep Questionable numerical effects zero
</commit_message>
<xml_diff>
--- a/exports/fantasy-2026-current.docx
+++ b/exports/fantasy-2026-current.docx
@@ -55,7 +55,7 @@
         <w:pStyle w:val="Normal"/>
       </w:pPr>
       <w:r>
-        <w:t xml:space="preserve">Weekly overall model rank 4 (RB2). ROS overall rank 1 (RB1). Availability: UNKNOWN. Weekly ranks are preliminary when playing status is unconfirmed; they are separate from season ranks.</w:t>
+        <w:t xml:space="preserve">Weekly overall model rank 4 (RB2). ROS overall rank 1 (RB1). Availability: NO_ADVERSE_STATUS_REPORTED. Weekly ranks are preliminary when playing status is unconfirmed; they are separate from season ranks.</w:t>
       </w:r>
     </w:p>
     <w:p>
@@ -175,7 +175,7 @@
         <w:pStyle w:val="Normal"/>
       </w:pPr>
       <w:r>
-        <w:t xml:space="preserve">Weekly overall model rank 1 (RB1). ROS overall rank 2 (RB2). Availability: UNKNOWN. Weekly ranks are preliminary when playing status is unconfirmed; they are separate from season ranks.</w:t>
+        <w:t xml:space="preserve">Weekly overall model rank 1 (RB1). ROS overall rank 2 (RB2). Availability: NO_ADVERSE_STATUS_REPORTED. Weekly ranks are preliminary when playing status is unconfirmed; they are separate from season ranks.</w:t>
       </w:r>
     </w:p>
     <w:p>
@@ -295,7 +295,7 @@
         <w:pStyle w:val="Normal"/>
       </w:pPr>
       <w:r>
-        <w:t xml:space="preserve">Weekly overall model rank 3 (WR1). ROS overall rank 3 (WR1). Availability: UNKNOWN. Weekly ranks are preliminary when playing status is unconfirmed; they are separate from season ranks.</w:t>
+        <w:t xml:space="preserve">Weekly overall model rank 3 (WR1). ROS overall rank 3 (WR1). Availability: QUESTIONABLE. Weekly ranks are preliminary when playing status is unconfirmed; they are separate from season ranks.</w:t>
       </w:r>
     </w:p>
     <w:p>
@@ -415,7 +415,7 @@
         <w:pStyle w:val="Normal"/>
       </w:pPr>
       <w:r>
-        <w:t xml:space="preserve">Weekly overall model rank 19 (WR6). ROS overall rank 4 (WR2). Availability: UNKNOWN. Weekly ranks are preliminary when playing status is unconfirmed; they are separate from season ranks.</w:t>
+        <w:t xml:space="preserve">Weekly overall model rank 17 (WR6). ROS overall rank 4 (WR2). Availability: NO_ADVERSE_STATUS_REPORTED. Weekly ranks are preliminary when playing status is unconfirmed; they are separate from season ranks.</w:t>
       </w:r>
     </w:p>
     <w:p>
@@ -535,7 +535,7 @@
         <w:pStyle w:val="Normal"/>
       </w:pPr>
       <w:r>
-        <w:t xml:space="preserve">Weekly overall model rank 13 (WR4). ROS overall rank 5 (WR3). Availability: UNKNOWN. Weekly ranks are preliminary when playing status is unconfirmed; they are separate from season ranks.</w:t>
+        <w:t xml:space="preserve">Weekly overall model rank 12 (WR4). ROS overall rank 5 (WR3). Availability: NO_ADVERSE_STATUS_REPORTED. Weekly ranks are preliminary when playing status is unconfirmed; they are separate from season ranks.</w:t>
       </w:r>
     </w:p>
     <w:p>
@@ -655,7 +655,7 @@
         <w:pStyle w:val="Normal"/>
       </w:pPr>
       <w:r>
-        <w:t xml:space="preserve">Weekly overall model rank 5 (WR2). ROS overall rank 6 (WR4). Availability: UNKNOWN. Weekly ranks are preliminary when playing status is unconfirmed; they are separate from season ranks.</w:t>
+        <w:t xml:space="preserve">Weekly overall model rank 5 (WR2). ROS overall rank 6 (WR4). Availability: NO_ADVERSE_STATUS_REPORTED. Weekly ranks are preliminary when playing status is unconfirmed; they are separate from season ranks.</w:t>
       </w:r>
     </w:p>
     <w:p>
@@ -743,7 +743,7 @@
         <w:pStyle w:val="Normal"/>
       </w:pPr>
       <w:r>
-        <w:t xml:space="preserve">Weekly overall model rank 12 (RB4). ROS overall rank 7 (RB3). Availability: UNKNOWN. Weekly ranks are preliminary when playing status is unconfirmed; they are separate from season ranks.</w:t>
+        <w:t xml:space="preserve">Weekly overall model rank 11 (RB4). ROS overall rank 7 (RB3). Availability: NO_ADVERSE_STATUS_REPORTED. Weekly ranks are preliminary when playing status is unconfirmed; they are separate from season ranks.</w:t>
       </w:r>
     </w:p>
     <w:p>
@@ -863,7 +863,7 @@
         <w:pStyle w:val="Normal"/>
       </w:pPr>
       <w:r>
-        <w:t xml:space="preserve">Weekly overall model rank 15 (RB5). ROS overall rank 8 (RB4). Availability: UNKNOWN. Weekly ranks are preliminary when playing status is unconfirmed; they are separate from season ranks.</w:t>
+        <w:t xml:space="preserve">Weekly overall model rank Not published (NOT_EXPECTED_TO_PLAY). ROS overall rank 8 (RB4). Availability: INJURED_RESERVE. Weekly ranks are preliminary when playing status is unconfirmed; they are separate from season ranks.</w:t>
       </w:r>
     </w:p>
     <w:p>
@@ -983,7 +983,7 @@
         <w:pStyle w:val="Normal"/>
       </w:pPr>
       <w:r>
-        <w:t xml:space="preserve">Weekly overall model rank Not published (GAME_STARTED_NO_ORIGINAL_WEEKLY_RANK). ROS overall rank 9 (WR5). Availability: UNKNOWN. Weekly ranks are preliminary when playing status is unconfirmed; they are separate from season ranks.</w:t>
+        <w:t xml:space="preserve">Weekly overall model rank Not published (GAME_STARTED_NO_ORIGINAL_WEEKLY_RANK). ROS overall rank 9 (WR5). Availability: QUESTIONABLE. Weekly ranks are preliminary when playing status is unconfirmed; they are separate from season ranks.</w:t>
       </w:r>
     </w:p>
     <w:p>
@@ -1103,7 +1103,7 @@
         <w:pStyle w:val="Normal"/>
       </w:pPr>
       <w:r>
-        <w:t xml:space="preserve">Weekly overall model rank 11 (RB3). ROS overall rank 10 (RB5). Availability: UNKNOWN. Weekly ranks are preliminary when playing status is unconfirmed; they are separate from season ranks.</w:t>
+        <w:t xml:space="preserve">Weekly overall model rank 10 (RB3). ROS overall rank 10 (RB5). Availability: NO_ADVERSE_STATUS_REPORTED. Weekly ranks are preliminary when playing status is unconfirmed; they are separate from season ranks.</w:t>
       </w:r>
     </w:p>
     <w:p>
@@ -1223,7 +1223,7 @@
         <w:pStyle w:val="Normal"/>
       </w:pPr>
       <w:r>
-        <w:t xml:space="preserve">Weekly overall model rank 8 (TE1). ROS overall rank 11 (TE1). Availability: UNKNOWN. Weekly ranks are preliminary when playing status is unconfirmed; they are separate from season ranks.</w:t>
+        <w:t xml:space="preserve">Weekly overall model rank 7 (TE1). ROS overall rank 11 (TE1). Availability: NO_ADVERSE_STATUS_REPORTED. Weekly ranks are preliminary when playing status is unconfirmed; they are separate from season ranks.</w:t>
       </w:r>
     </w:p>
     <w:p>
@@ -1343,7 +1343,7 @@
         <w:pStyle w:val="Normal"/>
       </w:pPr>
       <w:r>
-        <w:t xml:space="preserve">Weekly overall model rank 16 (RB6). ROS overall rank 12 (RB6). Availability: UNKNOWN. Weekly ranks are preliminary when playing status is unconfirmed; they are separate from season ranks.</w:t>
+        <w:t xml:space="preserve">Weekly overall model rank 14 (RB5). ROS overall rank 12 (RB6). Availability: NO_ADVERSE_STATUS_REPORTED. Weekly ranks are preliminary when playing status is unconfirmed; they are separate from season ranks.</w:t>
       </w:r>
     </w:p>
     <w:p>
@@ -1463,7 +1463,7 @@
         <w:pStyle w:val="Normal"/>
       </w:pPr>
       <w:r>
-        <w:t xml:space="preserve">Weekly overall model rank 10 (WR3). ROS overall rank 13 (WR6). Availability: UNKNOWN. Weekly ranks are preliminary when playing status is unconfirmed; they are separate from season ranks.</w:t>
+        <w:t xml:space="preserve">Weekly overall model rank 9 (WR3). ROS overall rank 13 (WR6). Availability: QUESTIONABLE. Weekly ranks are preliminary when playing status is unconfirmed; they are separate from season ranks.</w:t>
       </w:r>
     </w:p>
     <w:p>
@@ -1583,7 +1583,7 @@
         <w:pStyle w:val="Normal"/>
       </w:pPr>
       <w:r>
-        <w:t xml:space="preserve">Weekly overall model rank 39 (RB13). ROS overall rank 14 (RB7). Availability: UNKNOWN. Weekly ranks are preliminary when playing status is unconfirmed; they are separate from season ranks.</w:t>
+        <w:t xml:space="preserve">Weekly overall model rank 32 (RB10). ROS overall rank 14 (RB7). Availability: QUESTIONABLE. Weekly ranks are preliminary when playing status is unconfirmed; they are separate from season ranks.</w:t>
       </w:r>
     </w:p>
     <w:p>
@@ -1703,7 +1703,7 @@
         <w:pStyle w:val="Normal"/>
       </w:pPr>
       <w:r>
-        <w:t xml:space="preserve">Weekly overall model rank 35 (RB11). ROS overall rank 15 (RB8). Availability: UNKNOWN. Weekly ranks are preliminary when playing status is unconfirmed; they are separate from season ranks.</w:t>
+        <w:t xml:space="preserve">Weekly overall model rank 29 (RB9). ROS overall rank 15 (RB8). Availability: NO_ADVERSE_STATUS_REPORTED. Weekly ranks are preliminary when playing status is unconfirmed; they are separate from season ranks.</w:t>
       </w:r>
     </w:p>
     <w:p>
@@ -1823,7 +1823,7 @@
         <w:pStyle w:val="Normal"/>
       </w:pPr>
       <w:r>
-        <w:t xml:space="preserve">Weekly overall model rank 24 (WR7). ROS overall rank 16 (WR7). Availability: UNKNOWN. Weekly ranks are preliminary when playing status is unconfirmed; they are separate from season ranks.</w:t>
+        <w:t xml:space="preserve">Weekly overall model rank 20 (WR7). ROS overall rank 16 (WR7). Availability: NO_ADVERSE_STATUS_REPORTED. Weekly ranks are preliminary when playing status is unconfirmed; they are separate from season ranks.</w:t>
       </w:r>
     </w:p>
     <w:p>
@@ -1911,7 +1911,7 @@
         <w:pStyle w:val="Normal"/>
       </w:pPr>
       <w:r>
-        <w:t xml:space="preserve">Weekly overall model rank 32 (RB10). ROS overall rank 17 (RB9). Availability: UNKNOWN. Weekly ranks are preliminary when playing status is unconfirmed; they are separate from season ranks.</w:t>
+        <w:t xml:space="preserve">Weekly overall model rank 26 (RB8). ROS overall rank 17 (RB9). Availability: NO_ADVERSE_STATUS_REPORTED. Weekly ranks are preliminary when playing status is unconfirmed; they are separate from season ranks.</w:t>
       </w:r>
     </w:p>
     <w:p>
@@ -1999,7 +1999,7 @@
         <w:pStyle w:val="Normal"/>
       </w:pPr>
       <w:r>
-        <w:t xml:space="preserve">Weekly overall model rank 17 (WR5). ROS overall rank 18 (WR8). Availability: UNKNOWN. Weekly ranks are preliminary when playing status is unconfirmed; they are separate from season ranks.</w:t>
+        <w:t xml:space="preserve">Weekly overall model rank 15 (WR5). ROS overall rank 18 (WR8). Availability: NO_ADVERSE_STATUS_REPORTED. Weekly ranks are preliminary when playing status is unconfirmed; they are separate from season ranks.</w:t>
       </w:r>
     </w:p>
     <w:p>
@@ -2119,7 +2119,7 @@
         <w:pStyle w:val="Normal"/>
       </w:pPr>
       <w:r>
-        <w:t xml:space="preserve">Weekly overall model rank 31 (RB9). ROS overall rank 19 (RB10). Availability: UNKNOWN. Weekly ranks are preliminary when playing status is unconfirmed; they are separate from season ranks.</w:t>
+        <w:t xml:space="preserve">Weekly overall model rank Not published (NOT_EXPECTED_TO_PLAY). ROS overall rank 19 (RB10). Availability: OUT. Weekly ranks are preliminary when playing status is unconfirmed; they are separate from season ranks.</w:t>
       </w:r>
     </w:p>
     <w:p>
@@ -2239,7 +2239,7 @@
         <w:pStyle w:val="Normal"/>
       </w:pPr>
       <w:r>
-        <w:t xml:space="preserve">Weekly overall model rank 18 (TE2). ROS overall rank 20 (TE2). Availability: UNKNOWN. Weekly ranks are preliminary when playing status is unconfirmed; they are separate from season ranks.</w:t>
+        <w:t xml:space="preserve">Weekly overall model rank 16 (TE2). ROS overall rank 20 (TE2). Availability: NO_ADVERSE_STATUS_REPORTED. Weekly ranks are preliminary when playing status is unconfirmed; they are separate from season ranks.</w:t>
       </w:r>
     </w:p>
     <w:p>
@@ -2359,7 +2359,7 @@
         <w:pStyle w:val="Normal"/>
       </w:pPr>
       <w:r>
-        <w:t xml:space="preserve">Weekly overall model rank Not published (NO_CURRENT_WEEK_GAME). ROS overall rank 21 (RB11). Availability: UNKNOWN. Weekly ranks are preliminary when playing status is unconfirmed; they are separate from season ranks.</w:t>
+        <w:t xml:space="preserve">Weekly overall model rank Not published (NO_CURRENT_WEEK_GAME). ROS overall rank 21 (RB11). Availability: NO_ADVERSE_STATUS_REPORTED. Weekly ranks are preliminary when playing status is unconfirmed; they are separate from season ranks.</w:t>
       </w:r>
     </w:p>
     <w:p>
@@ -2479,7 +2479,7 @@
         <w:pStyle w:val="Normal"/>
       </w:pPr>
       <w:r>
-        <w:t xml:space="preserve">Weekly overall model rank 23 (RB7). ROS overall rank 22 (RB12). Availability: UNKNOWN. Weekly ranks are preliminary when playing status is unconfirmed; they are separate from season ranks.</w:t>
+        <w:t xml:space="preserve">Weekly overall model rank 19 (RB6). ROS overall rank 22 (RB12). Availability: NO_ADVERSE_STATUS_REPORTED. Weekly ranks are preliminary when playing status is unconfirmed; they are separate from season ranks.</w:t>
       </w:r>
     </w:p>
     <w:p>
@@ -2599,7 +2599,7 @@
         <w:pStyle w:val="Normal"/>
       </w:pPr>
       <w:r>
-        <w:t xml:space="preserve">Weekly overall model rank 41 (WR9). ROS overall rank 23 (WR9). Availability: UNKNOWN. Weekly ranks are preliminary when playing status is unconfirmed; they are separate from season ranks.</w:t>
+        <w:t xml:space="preserve">Weekly overall model rank Not published (NOT_EXPECTED_TO_PLAY). ROS overall rank 23 (WR9). Availability: OUT. Weekly ranks are preliminary when playing status is unconfirmed; they are separate from season ranks.</w:t>
       </w:r>
     </w:p>
     <w:p>
@@ -2719,7 +2719,7 @@
         <w:pStyle w:val="Normal"/>
       </w:pPr>
       <w:r>
-        <w:t xml:space="preserve">Weekly overall model rank 36 (RB12). ROS overall rank 24 (RB13). Availability: UNKNOWN. Weekly ranks are preliminary when playing status is unconfirmed; they are separate from season ranks.</w:t>
+        <w:t xml:space="preserve">Weekly overall model rank Not published (NOT_EXPECTED_TO_PLAY). ROS overall rank 24 (RB13). Availability: OUT. Weekly ranks are preliminary when playing status is unconfirmed; they are separate from season ranks.</w:t>
       </w:r>
     </w:p>
     <w:p>
@@ -2839,7 +2839,7 @@
         <w:pStyle w:val="Normal"/>
       </w:pPr>
       <w:r>
-        <w:t xml:space="preserve">Weekly overall model rank Not published (NOT_EXPECTED_TO_PLAY). ROS overall rank 25 (WR10). Availability: EXPECTED_INACTIVE. Weekly ranks are preliminary when playing status is unconfirmed; they are separate from season ranks.</w:t>
+        <w:t xml:space="preserve">Weekly overall model rank Not published (NOT_EXPECTED_TO_PLAY). ROS overall rank 25 (WR10). Availability: INJURED_RESERVE. Weekly ranks are preliminary when playing status is unconfirmed; they are separate from season ranks.</w:t>
       </w:r>
     </w:p>
     <w:p>
@@ -2959,7 +2959,7 @@
         <w:pStyle w:val="Normal"/>
       </w:pPr>
       <w:r>
-        <w:t xml:space="preserve">Weekly overall model rank 29 (RB8). ROS overall rank 26 (RB14). Availability: UNKNOWN. Weekly ranks are preliminary when playing status is unconfirmed; they are separate from season ranks.</w:t>
+        <w:t xml:space="preserve">Weekly overall model rank 24 (RB7). ROS overall rank 26 (RB14). Availability: NO_ADVERSE_STATUS_REPORTED. Weekly ranks are preliminary when playing status is unconfirmed; they are separate from season ranks.</w:t>
       </w:r>
     </w:p>
     <w:p>
@@ -3079,7 +3079,7 @@
         <w:pStyle w:val="Normal"/>
       </w:pPr>
       <w:r>
-        <w:t xml:space="preserve">Weekly overall model rank 37 (WR8). ROS overall rank 27 (WR11). Availability: UNKNOWN. Weekly ranks are preliminary when playing status is unconfirmed; they are separate from season ranks.</w:t>
+        <w:t xml:space="preserve">Weekly overall model rank 30 (WR8). ROS overall rank 27 (WR11). Availability: NO_ADVERSE_STATUS_REPORTED. Weekly ranks are preliminary when playing status is unconfirmed; they are separate from season ranks.</w:t>
       </w:r>
     </w:p>
     <w:p>
@@ -3199,7 +3199,7 @@
         <w:pStyle w:val="Normal"/>
       </w:pPr>
       <w:r>
-        <w:t xml:space="preserve">Weekly overall model rank Not published (NO_CURRENT_WEEK_GAME). ROS overall rank 28 (WR12). Availability: UNKNOWN. Weekly ranks are preliminary when playing status is unconfirmed; they are separate from season ranks.</w:t>
+        <w:t xml:space="preserve">Weekly overall model rank Not published (NO_CURRENT_WEEK_GAME). ROS overall rank 28 (WR12). Availability: NO_ADVERSE_STATUS_REPORTED. Weekly ranks are preliminary when playing status is unconfirmed; they are separate from season ranks.</w:t>
       </w:r>
     </w:p>
     <w:p>
@@ -3319,7 +3319,7 @@
         <w:pStyle w:val="Normal"/>
       </w:pPr>
       <w:r>
-        <w:t xml:space="preserve">Weekly overall model rank Not published (GAME_STARTED_NO_ORIGINAL_WEEKLY_RANK). ROS overall rank 29 (WR13). Availability: UNKNOWN. Weekly ranks are preliminary when playing status is unconfirmed; they are separate from season ranks.</w:t>
+        <w:t xml:space="preserve">Weekly overall model rank Not published (GAME_STARTED_NO_ORIGINAL_WEEKLY_RANK). ROS overall rank 29 (WR13). Availability: NO_ADVERSE_STATUS_REPORTED. Weekly ranks are preliminary when playing status is unconfirmed; they are separate from season ranks.</w:t>
       </w:r>
     </w:p>
     <w:p>
@@ -3439,7 +3439,7 @@
         <w:pStyle w:val="Normal"/>
       </w:pPr>
       <w:r>
-        <w:t xml:space="preserve">Weekly overall model rank 47 (WR12). ROS overall rank 30 (WR14). Availability: UNKNOWN. Weekly ranks are preliminary when playing status is unconfirmed; they are separate from season ranks.</w:t>
+        <w:t xml:space="preserve">Weekly overall model rank 38 (WR11). ROS overall rank 30 (WR14). Availability: NO_ADVERSE_STATUS_REPORTED. Weekly ranks are preliminary when playing status is unconfirmed; they are separate from season ranks.</w:t>
       </w:r>
     </w:p>
     <w:p>
@@ -3559,7 +3559,7 @@
         <w:pStyle w:val="Normal"/>
       </w:pPr>
       <w:r>
-        <w:t xml:space="preserve">Weekly overall model rank 2 (QB1). ROS overall rank 31 (QB1). Availability: UNKNOWN. Weekly ranks are preliminary when playing status is unconfirmed; they are separate from season ranks.</w:t>
+        <w:t xml:space="preserve">Weekly overall model rank 2 (QB1). ROS overall rank 31 (QB1). Availability: NO_ADVERSE_STATUS_REPORTED. Weekly ranks are preliminary when playing status is unconfirmed; they are separate from season ranks.</w:t>
       </w:r>
     </w:p>
     <w:p>
@@ -3679,7 +3679,7 @@
         <w:pStyle w:val="Normal"/>
       </w:pPr>
       <w:r>
-        <w:t xml:space="preserve">Weekly overall model rank 44 (WR10). ROS overall rank 32 (WR15). Availability: UNKNOWN. Weekly ranks are preliminary when playing status is unconfirmed; they are separate from season ranks.</w:t>
+        <w:t xml:space="preserve">Weekly overall model rank 35 (WR9). ROS overall rank 32 (WR15). Availability: QUESTIONABLE. Weekly ranks are preliminary when playing status is unconfirmed; they are separate from season ranks.</w:t>
       </w:r>
     </w:p>
     <w:p>
@@ -3799,7 +3799,7 @@
         <w:pStyle w:val="Normal"/>
       </w:pPr>
       <w:r>
-        <w:t xml:space="preserve">Weekly overall model rank 53 (WR15). ROS overall rank 33 (WR16). Availability: UNKNOWN. Weekly ranks are preliminary when playing status is unconfirmed; they are separate from season ranks.</w:t>
+        <w:t xml:space="preserve">Weekly overall model rank 43 (WR14). ROS overall rank 33 (WR16). Availability: NO_ADVERSE_STATUS_REPORTED. Weekly ranks are preliminary when playing status is unconfirmed; they are separate from season ranks.</w:t>
       </w:r>
     </w:p>
     <w:p>
@@ -3919,7 +3919,7 @@
         <w:pStyle w:val="Normal"/>
       </w:pPr>
       <w:r>
-        <w:t xml:space="preserve">Weekly overall model rank 46 (WR11). ROS overall rank 34 (WR17). Availability: UNKNOWN. Weekly ranks are preliminary when playing status is unconfirmed; they are separate from season ranks.</w:t>
+        <w:t xml:space="preserve">Weekly overall model rank 37 (WR10). ROS overall rank 34 (WR17). Availability: QUESTIONABLE. Weekly ranks are preliminary when playing status is unconfirmed; they are separate from season ranks.</w:t>
       </w:r>
     </w:p>
     <w:p>
@@ -4039,7 +4039,7 @@
         <w:pStyle w:val="Normal"/>
       </w:pPr>
       <w:r>
-        <w:t xml:space="preserve">Weekly overall model rank Not published (NO_CURRENT_WEEK_GAME). ROS overall rank 35 (WR18). Availability: UNKNOWN. Weekly ranks are preliminary when playing status is unconfirmed; they are separate from season ranks.</w:t>
+        <w:t xml:space="preserve">Weekly overall model rank Not published (NO_CURRENT_WEEK_GAME). ROS overall rank 35 (WR18). Availability: QUESTIONABLE. Weekly ranks are preliminary when playing status is unconfirmed; they are separate from season ranks.</w:t>
       </w:r>
     </w:p>
     <w:p>
@@ -4159,7 +4159,7 @@
         <w:pStyle w:val="Normal"/>
       </w:pPr>
       <w:r>
-        <w:t xml:space="preserve">Weekly overall model rank Not published (GAME_STARTED_NO_ORIGINAL_WEEKLY_RANK). ROS overall rank 36 (WR19). Availability: UNKNOWN. Weekly ranks are preliminary when playing status is unconfirmed; they are separate from season ranks.</w:t>
+        <w:t xml:space="preserve">Weekly overall model rank Not published (GAME_STARTED_NO_ORIGINAL_WEEKLY_RANK). ROS overall rank 36 (WR19). Availability: NO_ADVERSE_STATUS_REPORTED. Weekly ranks are preliminary when playing status is unconfirmed; they are separate from season ranks.</w:t>
       </w:r>
     </w:p>
     <w:p>
@@ -4279,7 +4279,7 @@
         <w:pStyle w:val="Normal"/>
       </w:pPr>
       <w:r>
-        <w:t xml:space="preserve">Weekly overall model rank 55 (WR16). ROS overall rank 37 (WR20). Availability: UNKNOWN. Weekly ranks are preliminary when playing status is unconfirmed; they are separate from season ranks.</w:t>
+        <w:t xml:space="preserve">Weekly overall model rank 44 (WR15). ROS overall rank 37 (WR20). Availability: QUESTIONABLE. Weekly ranks are preliminary when playing status is unconfirmed; they are separate from season ranks.</w:t>
       </w:r>
     </w:p>
     <w:p>
@@ -4399,7 +4399,7 @@
         <w:pStyle w:val="Normal"/>
       </w:pPr>
       <w:r>
-        <w:t xml:space="preserve">Weekly overall model rank 62 (WR19). ROS overall rank 38 (WR21). Availability: UNKNOWN. Weekly ranks are preliminary when playing status is unconfirmed; they are separate from season ranks.</w:t>
+        <w:t xml:space="preserve">Weekly overall model rank 50 (WR17). ROS overall rank 38 (WR21). Availability: NO_ADVERSE_STATUS_REPORTED. Weekly ranks are preliminary when playing status is unconfirmed; they are separate from season ranks.</w:t>
       </w:r>
     </w:p>
     <w:p>
@@ -4519,7 +4519,7 @@
         <w:pStyle w:val="Normal"/>
       </w:pPr>
       <w:r>
-        <w:t xml:space="preserve">Weekly overall model rank 6 (QB2). ROS overall rank 39 (QB2). Availability: UNKNOWN. Weekly ranks are preliminary when playing status is unconfirmed; they are separate from season ranks.</w:t>
+        <w:t xml:space="preserve">Weekly overall model rank Not published (NOT_EXPECTED_TO_PLAY). ROS overall rank 39 (QB2). Availability: OUT. Weekly ranks are preliminary when playing status is unconfirmed; they are separate from season ranks.</w:t>
       </w:r>
     </w:p>
     <w:p>
@@ -4639,7 +4639,7 @@
         <w:pStyle w:val="Normal"/>
       </w:pPr>
       <w:r>
-        <w:t xml:space="preserve">Weekly overall model rank 7 (QB3). ROS overall rank 40 (QB3). Availability: UNKNOWN. Weekly ranks are preliminary when playing status is unconfirmed; they are separate from season ranks.</w:t>
+        <w:t xml:space="preserve">Weekly overall model rank 6 (QB2). ROS overall rank 40 (QB3). Availability: NO_ADVERSE_STATUS_REPORTED. Weekly ranks are preliminary when playing status is unconfirmed; they are separate from season ranks.</w:t>
       </w:r>
     </w:p>
     <w:p>
@@ -4759,7 +4759,7 @@
         <w:pStyle w:val="Normal"/>
       </w:pPr>
       <w:r>
-        <w:t xml:space="preserve">Weekly overall model rank 43 (TE3). ROS overall rank 41 (TE3). Availability: UNKNOWN. Weekly ranks are preliminary when playing status is unconfirmed; they are separate from season ranks.</w:t>
+        <w:t xml:space="preserve">Weekly overall model rank 34 (TE3). ROS overall rank 41 (TE3). Availability: NO_ADVERSE_STATUS_REPORTED. Weekly ranks are preliminary when playing status is unconfirmed; they are separate from season ranks.</w:t>
       </w:r>
     </w:p>
     <w:p>
@@ -4879,7 +4879,7 @@
         <w:pStyle w:val="Normal"/>
       </w:pPr>
       <w:r>
-        <w:t xml:space="preserve">Weekly overall model rank 52 (WR14). ROS overall rank 42 (WR22). Availability: UNKNOWN. Weekly ranks are preliminary when playing status is unconfirmed; they are separate from season ranks.</w:t>
+        <w:t xml:space="preserve">Weekly overall model rank 42 (WR13). ROS overall rank 42 (WR22). Availability: NO_ADVERSE_STATUS_REPORTED. Weekly ranks are preliminary when playing status is unconfirmed; they are separate from season ranks.</w:t>
       </w:r>
     </w:p>
     <w:p>
@@ -4999,7 +4999,7 @@
         <w:pStyle w:val="Normal"/>
       </w:pPr>
       <w:r>
-        <w:t xml:space="preserve">Weekly overall model rank 58 (WR18). ROS overall rank 43 (WR23). Availability: UNKNOWN. Weekly ranks are preliminary when playing status is unconfirmed; they are separate from season ranks.</w:t>
+        <w:t xml:space="preserve">Weekly overall model rank Not published (GAME_STARTED_NO_ORIGINAL_WEEKLY_RANK). ROS overall rank 43 (WR23). Availability: NO_ADVERSE_STATUS_REPORTED. Weekly ranks are preliminary when playing status is unconfirmed; they are separate from season ranks.</w:t>
       </w:r>
     </w:p>
     <w:p>
@@ -5119,7 +5119,7 @@
         <w:pStyle w:val="Normal"/>
       </w:pPr>
       <w:r>
-        <w:t xml:space="preserve">Weekly overall model rank 50 (WR13). ROS overall rank 44 (WR24). Availability: UNKNOWN. Weekly ranks are preliminary when playing status is unconfirmed; they are separate from season ranks.</w:t>
+        <w:t xml:space="preserve">Weekly overall model rank 40 (WR12). ROS overall rank 44 (WR24). Availability: QUESTIONABLE. Weekly ranks are preliminary when playing status is unconfirmed; they are separate from season ranks.</w:t>
       </w:r>
     </w:p>
     <w:p>
@@ -5239,7 +5239,7 @@
         <w:pStyle w:val="Normal"/>
       </w:pPr>
       <w:r>
-        <w:t xml:space="preserve">Weekly overall model rank 69 (WR23). ROS overall rank 45 (WR25). Availability: UNKNOWN. Weekly ranks are preliminary when playing status is unconfirmed; they are separate from season ranks.</w:t>
+        <w:t xml:space="preserve">Weekly overall model rank 57 (WR21). ROS overall rank 45 (WR25). Availability: NO_ADVERSE_STATUS_REPORTED. Weekly ranks are preliminary when playing status is unconfirmed; they are separate from season ranks.</w:t>
       </w:r>
     </w:p>
     <w:p>
@@ -5359,7 +5359,7 @@
         <w:pStyle w:val="Normal"/>
       </w:pPr>
       <w:r>
-        <w:t xml:space="preserve">Weekly overall model rank 61 (TE5). ROS overall rank 46 (TE4). Availability: UNKNOWN. Weekly ranks are preliminary when playing status is unconfirmed; they are separate from season ranks.</w:t>
+        <w:t xml:space="preserve">Weekly overall model rank 49 (TE5). ROS overall rank 46 (TE4). Availability: NO_ADVERSE_STATUS_REPORTED. Weekly ranks are preliminary when playing status is unconfirmed; they are separate from season ranks.</w:t>
       </w:r>
     </w:p>
     <w:p>
@@ -5479,7 +5479,7 @@
         <w:pStyle w:val="Normal"/>
       </w:pPr>
       <w:r>
-        <w:t xml:space="preserve">Weekly overall model rank Not published (GAME_STARTED_NO_ORIGINAL_WEEKLY_RANK). ROS overall rank 47 (RB15). Availability: UNKNOWN. Weekly ranks are preliminary when playing status is unconfirmed; they are separate from season ranks.</w:t>
+        <w:t xml:space="preserve">Weekly overall model rank Not published (GAME_STARTED_NO_ORIGINAL_WEEKLY_RANK). ROS overall rank 47 (RB15). Availability: NO_ADVERSE_STATUS_REPORTED. Weekly ranks are preliminary when playing status is unconfirmed; they are separate from season ranks.</w:t>
       </w:r>
     </w:p>
     <w:p>
@@ -5599,7 +5599,7 @@
         <w:pStyle w:val="Normal"/>
       </w:pPr>
       <w:r>
-        <w:t xml:space="preserve">Weekly overall model rank Not published (GAME_STARTED_NO_ORIGINAL_WEEKLY_RANK). ROS overall rank 48 (RB16). Availability: UNKNOWN. Weekly ranks are preliminary when playing status is unconfirmed; they are separate from season ranks.</w:t>
+        <w:t xml:space="preserve">Weekly overall model rank Not published (GAME_STARTED_NO_ORIGINAL_WEEKLY_RANK). ROS overall rank 48 (RB16). Availability: NO_ADVERSE_STATUS_REPORTED. Weekly ranks are preliminary when playing status is unconfirmed; they are separate from season ranks.</w:t>
       </w:r>
     </w:p>
     <w:p>
@@ -5719,7 +5719,7 @@
         <w:pStyle w:val="Normal"/>
       </w:pPr>
       <w:r>
-        <w:t xml:space="preserve">Weekly overall model rank 54 (RB14). ROS overall rank 49 (RB17). Availability: UNKNOWN. Weekly ranks are preliminary when playing status is unconfirmed; they are separate from season ranks.</w:t>
+        <w:t xml:space="preserve">Weekly overall model rank Not published (NOT_EXPECTED_TO_PLAY). ROS overall rank 49 (RB17). Availability: INJURED_RESERVE. Weekly ranks are preliminary when playing status is unconfirmed; they are separate from season ranks.</w:t>
       </w:r>
     </w:p>
     <w:p>
@@ -5839,7 +5839,7 @@
         <w:pStyle w:val="Normal"/>
       </w:pPr>
       <w:r>
-        <w:t xml:space="preserve">Weekly overall model rank 72 (WR25). ROS overall rank 50 (WR26). Availability: UNKNOWN. Weekly ranks are preliminary when playing status is unconfirmed; they are separate from season ranks.</w:t>
+        <w:t xml:space="preserve">Weekly overall model rank 60 (WR23). ROS overall rank 50 (WR26). Availability: QUESTIONABLE. Weekly ranks are preliminary when playing status is unconfirmed; they are separate from season ranks.</w:t>
       </w:r>
     </w:p>
     <w:p>
@@ -5959,7 +5959,7 @@
         <w:pStyle w:val="Normal"/>
       </w:pPr>
       <w:r>
-        <w:t xml:space="preserve">Weekly overall model rank 93 (WR36). ROS overall rank 51 (WR27). Availability: UNKNOWN. Weekly ranks are preliminary when playing status is unconfirmed; they are separate from season ranks.</w:t>
+        <w:t xml:space="preserve">Weekly overall model rank 76 (WR30). ROS overall rank 51 (WR27). Availability: QUESTIONABLE. Weekly ranks are preliminary when playing status is unconfirmed; they are separate from season ranks.</w:t>
       </w:r>
     </w:p>
     <w:p>
@@ -6079,7 +6079,7 @@
         <w:pStyle w:val="Normal"/>
       </w:pPr>
       <w:r>
-        <w:t xml:space="preserve">Weekly overall model rank 30 (QB13). ROS overall rank 52 (QB4). Availability: UNKNOWN. Weekly ranks are preliminary when playing status is unconfirmed; they are separate from season ranks.</w:t>
+        <w:t xml:space="preserve">Weekly overall model rank 25 (QB9). ROS overall rank 52 (QB4). Availability: NO_ADVERSE_STATUS_REPORTED. Weekly ranks are preliminary when playing status is unconfirmed; they are separate from season ranks.</w:t>
       </w:r>
     </w:p>
     <w:p>
@@ -6199,7 +6199,7 @@
         <w:pStyle w:val="Normal"/>
       </w:pPr>
       <w:r>
-        <w:t xml:space="preserve">Weekly overall model rank 9 (QB4). ROS overall rank 53 (QB5). Availability: UNKNOWN. Weekly ranks are preliminary when playing status is unconfirmed; they are separate from season ranks.</w:t>
+        <w:t xml:space="preserve">Weekly overall model rank 8 (QB3). ROS overall rank 53 (QB5). Availability: NO_ADVERSE_STATUS_REPORTED. Weekly ranks are preliminary when playing status is unconfirmed; they are separate from season ranks.</w:t>
       </w:r>
     </w:p>
     <w:p>
@@ -6319,7 +6319,7 @@
         <w:pStyle w:val="Normal"/>
       </w:pPr>
       <w:r>
-        <w:t xml:space="preserve">Weekly overall model rank 63 (RB16). ROS overall rank 54 (RB18). Availability: UNKNOWN. Weekly ranks are preliminary when playing status is unconfirmed; they are separate from season ranks.</w:t>
+        <w:t xml:space="preserve">Weekly overall model rank 51 (RB12). ROS overall rank 54 (RB18). Availability: NO_ADVERSE_STATUS_REPORTED. Weekly ranks are preliminary when playing status is unconfirmed; they are separate from season ranks.</w:t>
       </w:r>
     </w:p>
     <w:p>
@@ -6439,7 +6439,7 @@
         <w:pStyle w:val="Normal"/>
       </w:pPr>
       <w:r>
-        <w:t xml:space="preserve">Weekly overall model rank 66 (RB17). ROS overall rank 55 (RB19). Availability: UNKNOWN. Weekly ranks are preliminary when playing status is unconfirmed; they are separate from season ranks.</w:t>
+        <w:t xml:space="preserve">Weekly overall model rank 54 (RB13). ROS overall rank 55 (RB19). Availability: NO_ADVERSE_STATUS_REPORTED. Weekly ranks are preliminary when playing status is unconfirmed; they are separate from season ranks.</w:t>
       </w:r>
     </w:p>
     <w:p>
@@ -6559,7 +6559,7 @@
         <w:pStyle w:val="Normal"/>
       </w:pPr>
       <w:r>
-        <w:t xml:space="preserve">Weekly overall model rank 57 (WR17). ROS overall rank 56 (WR28). Availability: UNKNOWN. Weekly ranks are preliminary when playing status is unconfirmed; they are separate from season ranks.</w:t>
+        <w:t xml:space="preserve">Weekly overall model rank 46 (WR16). ROS overall rank 56 (WR28). Availability: NO_ADVERSE_STATUS_REPORTED. Weekly ranks are preliminary when playing status is unconfirmed; they are separate from season ranks.</w:t>
       </w:r>
     </w:p>
     <w:p>
@@ -6799,7 +6799,7 @@
         <w:pStyle w:val="Normal"/>
       </w:pPr>
       <w:r>
-        <w:t xml:space="preserve">Weekly overall model rank 34 (QB15). ROS overall rank 58 (QB7). Availability: UNKNOWN. Weekly ranks are preliminary when playing status is unconfirmed; they are separate from season ranks.</w:t>
+        <w:t xml:space="preserve">Weekly overall model rank 28 (QB11). ROS overall rank 58 (QB7). Availability: NO_ADVERSE_STATUS_REPORTED. Weekly ranks are preliminary when playing status is unconfirmed; they are separate from season ranks.</w:t>
       </w:r>
     </w:p>
     <w:p>
@@ -6919,7 +6919,7 @@
         <w:pStyle w:val="Normal"/>
       </w:pPr>
       <w:r>
-        <w:t xml:space="preserve">Weekly overall model rank 33 (QB14). ROS overall rank 59 (QB8). Availability: UNKNOWN. Weekly ranks are preliminary when playing status is unconfirmed; they are separate from season ranks.</w:t>
+        <w:t xml:space="preserve">Weekly overall model rank 27 (QB10). ROS overall rank 59 (QB8). Availability: NO_ADVERSE_STATUS_REPORTED. Weekly ranks are preliminary when playing status is unconfirmed; they are separate from season ranks.</w:t>
       </w:r>
     </w:p>
     <w:p>
@@ -7039,7 +7039,7 @@
         <w:pStyle w:val="Normal"/>
       </w:pPr>
       <w:r>
-        <w:t xml:space="preserve">Weekly overall model rank 90 (WR33). ROS overall rank 60 (WR29). Availability: UNKNOWN. Weekly ranks are preliminary when playing status is unconfirmed; they are separate from season ranks.</w:t>
+        <w:t xml:space="preserve">Weekly overall model rank Not published (GAME_STARTED_NO_ORIGINAL_WEEKLY_RANK). ROS overall rank 60 (WR29). Availability: NO_ADVERSE_STATUS_REPORTED. Weekly ranks are preliminary when playing status is unconfirmed; they are separate from season ranks.</w:t>
       </w:r>
     </w:p>
     <w:p>
@@ -7159,7 +7159,7 @@
         <w:pStyle w:val="Normal"/>
       </w:pPr>
       <w:r>
-        <w:t xml:space="preserve">Weekly overall model rank 59 (RB15). ROS overall rank 61 (RB20). Availability: UNKNOWN. Weekly ranks are preliminary when playing status is unconfirmed; they are separate from season ranks.</w:t>
+        <w:t xml:space="preserve">Weekly overall model rank 47 (RB11). ROS overall rank 61 (RB20). Availability: NO_ADVERSE_STATUS_REPORTED. Weekly ranks are preliminary when playing status is unconfirmed; they are separate from season ranks.</w:t>
       </w:r>
     </w:p>
     <w:p>
@@ -7279,7 +7279,7 @@
         <w:pStyle w:val="Normal"/>
       </w:pPr>
       <w:r>
-        <w:t xml:space="preserve">Weekly overall model rank 73 (TE7). ROS overall rank 62 (TE5). Availability: UNKNOWN. Weekly ranks are preliminary when playing status is unconfirmed; they are separate from season ranks.</w:t>
+        <w:t xml:space="preserve">Weekly overall model rank 61 (TE7). ROS overall rank 62 (TE5). Availability: NO_ADVERSE_STATUS_REPORTED. Weekly ranks are preliminary when playing status is unconfirmed; they are separate from season ranks.</w:t>
       </w:r>
     </w:p>
     <w:p>
@@ -7367,7 +7367,7 @@
         <w:pStyle w:val="Normal"/>
       </w:pPr>
       <w:r>
-        <w:t xml:space="preserve">Weekly overall model rank 96 (RB20). ROS overall rank 63 (RB21). Availability: UNKNOWN. Weekly ranks are preliminary when playing status is unconfirmed; they are separate from season ranks.</w:t>
+        <w:t xml:space="preserve">Weekly overall model rank 79 (RB16). ROS overall rank 63 (RB21). Availability: NO_ADVERSE_STATUS_REPORTED. Weekly ranks are preliminary when playing status is unconfirmed; they are separate from season ranks.</w:t>
       </w:r>
     </w:p>
     <w:p>
@@ -7487,7 +7487,7 @@
         <w:pStyle w:val="Normal"/>
       </w:pPr>
       <w:r>
-        <w:t xml:space="preserve">Weekly overall model rank 115 (RB27). ROS overall rank 64 (RB22). Availability: UNKNOWN. Weekly ranks are preliminary when playing status is unconfirmed; they are separate from season ranks.</w:t>
+        <w:t xml:space="preserve">Weekly overall model rank 91 (RB22). ROS overall rank 64 (RB22). Availability: NO_ADVERSE_STATUS_REPORTED. Weekly ranks are preliminary when playing status is unconfirmed; they are separate from season ranks.</w:t>
       </w:r>
     </w:p>
     <w:p>
@@ -7607,7 +7607,7 @@
         <w:pStyle w:val="Normal"/>
       </w:pPr>
       <w:r>
-        <w:t xml:space="preserve">Weekly overall model rank 40 (QB17). ROS overall rank 65 (QB9). Availability: UNKNOWN. Weekly ranks are preliminary when playing status is unconfirmed; they are separate from season ranks.</w:t>
+        <w:t xml:space="preserve">Weekly overall model rank Not published (NOT_EXPECTED_TO_PLAY). ROS overall rank 65 (QB9). Availability: OUT. Weekly ranks are preliminary when playing status is unconfirmed; they are separate from season ranks.</w:t>
       </w:r>
     </w:p>
     <w:p>
@@ -7727,7 +7727,7 @@
         <w:pStyle w:val="Normal"/>
       </w:pPr>
       <w:r>
-        <w:t xml:space="preserve">Weekly overall model rank 91 (WR34). ROS overall rank 66 (WR30). Availability: UNKNOWN. Weekly ranks are preliminary when playing status is unconfirmed; they are separate from season ranks.</w:t>
+        <w:t xml:space="preserve">Weekly overall model rank 75 (WR29). ROS overall rank 66 (WR30). Availability: NO_ADVERSE_STATUS_REPORTED. Weekly ranks are preliminary when playing status is unconfirmed; they are separate from season ranks.</w:t>
       </w:r>
     </w:p>
     <w:p>
@@ -7847,7 +7847,7 @@
         <w:pStyle w:val="Normal"/>
       </w:pPr>
       <w:r>
-        <w:t xml:space="preserve">Weekly overall model rank 83 (WR30). ROS overall rank 67 (WR31). Availability: UNKNOWN. Weekly ranks are preliminary when playing status is unconfirmed; they are separate from season ranks.</w:t>
+        <w:t xml:space="preserve">Weekly overall model rank 69 (WR26). ROS overall rank 67 (WR31). Availability: NO_ADVERSE_STATUS_REPORTED. Weekly ranks are preliminary when playing status is unconfirmed; they are separate from season ranks.</w:t>
       </w:r>
     </w:p>
     <w:p>
@@ -7967,7 +7967,7 @@
         <w:pStyle w:val="Normal"/>
       </w:pPr>
       <w:r>
-        <w:t xml:space="preserve">Weekly overall model rank 86 (TE12). ROS overall rank 68 (TE6). Availability: UNKNOWN. Weekly ranks are preliminary when playing status is unconfirmed; they are separate from season ranks.</w:t>
+        <w:t xml:space="preserve">Weekly overall model rank 72 (TE12). ROS overall rank 68 (TE6). Availability: NO_ADVERSE_STATUS_REPORTED. Weekly ranks are preliminary when playing status is unconfirmed; they are separate from season ranks.</w:t>
       </w:r>
     </w:p>
     <w:p>
@@ -8087,7 +8087,7 @@
         <w:pStyle w:val="Normal"/>
       </w:pPr>
       <w:r>
-        <w:t xml:space="preserve">Weekly overall model rank 21 (QB7). ROS overall rank 69 (QB10). Availability: UNKNOWN. Weekly ranks are preliminary when playing status is unconfirmed; they are separate from season ranks.</w:t>
+        <w:t xml:space="preserve">Weekly overall model rank 18 (QB5). ROS overall rank 69 (QB10). Availability: NO_ADVERSE_STATUS_REPORTED. Weekly ranks are preliminary when playing status is unconfirmed; they are separate from season ranks.</w:t>
       </w:r>
     </w:p>
     <w:p>
@@ -8207,7 +8207,7 @@
         <w:pStyle w:val="Normal"/>
       </w:pPr>
       <w:r>
-        <w:t xml:space="preserve">Weekly overall model rank 22 (QB8). ROS overall rank 70 (QB11). Availability: UNKNOWN. Weekly ranks are preliminary when playing status is unconfirmed; they are separate from season ranks.</w:t>
+        <w:t xml:space="preserve">Weekly overall model rank Not published (NOT_EXPECTED_TO_PLAY). ROS overall rank 70 (QB11). Availability: OUT. Weekly ranks are preliminary when playing status is unconfirmed; they are separate from season ranks.</w:t>
       </w:r>
     </w:p>
     <w:p>
@@ -8327,7 +8327,7 @@
         <w:pStyle w:val="Normal"/>
       </w:pPr>
       <w:r>
-        <w:t xml:space="preserve">Weekly overall model rank 14 (QB5). ROS overall rank 71 (QB12). Availability: UNKNOWN. Weekly ranks are preliminary when playing status is unconfirmed; they are separate from season ranks.</w:t>
+        <w:t xml:space="preserve">Weekly overall model rank 13 (QB4). ROS overall rank 71 (QB12). Availability: NO_ADVERSE_STATUS_REPORTED. Weekly ranks are preliminary when playing status is unconfirmed; they are separate from season ranks.</w:t>
       </w:r>
     </w:p>
     <w:p>
@@ -8447,7 +8447,7 @@
         <w:pStyle w:val="Normal"/>
       </w:pPr>
       <w:r>
-        <w:t xml:space="preserve">Weekly overall model rank 67 (WR21). ROS overall rank 72 (WR32). Availability: UNKNOWN. Weekly ranks are preliminary when playing status is unconfirmed; they are separate from season ranks.</w:t>
+        <w:t xml:space="preserve">Weekly overall model rank 55 (WR19). ROS overall rank 72 (WR32). Availability: NO_ADVERSE_STATUS_REPORTED. Weekly ranks are preliminary when playing status is unconfirmed; they are separate from season ranks.</w:t>
       </w:r>
     </w:p>
     <w:p>
@@ -8567,7 +8567,7 @@
         <w:pStyle w:val="Normal"/>
       </w:pPr>
       <w:r>
-        <w:t xml:space="preserve">Weekly overall model rank 64 (WR20). ROS overall rank 73 (WR33). Availability: UNKNOWN. Weekly ranks are preliminary when playing status is unconfirmed; they are separate from season ranks.</w:t>
+        <w:t xml:space="preserve">Weekly overall model rank 52 (WR18). ROS overall rank 73 (WR33). Availability: NO_ADVERSE_STATUS_REPORTED. Weekly ranks are preliminary when playing status is unconfirmed; they are separate from season ranks.</w:t>
       </w:r>
     </w:p>
     <w:p>
@@ -8687,7 +8687,7 @@
         <w:pStyle w:val="Normal"/>
       </w:pPr>
       <w:r>
-        <w:t xml:space="preserve">Weekly overall model rank Not published (NOT_EXPECTED_TO_PLAY). ROS overall rank 74 (WR34). Availability: EXPECTED_INACTIVE. Weekly ranks are preliminary when playing status is unconfirmed; they are separate from season ranks.</w:t>
+        <w:t xml:space="preserve">Weekly overall model rank Not published (NOT_EXPECTED_TO_PLAY). ROS overall rank 74 (WR34). Availability: OUT. Weekly ranks are preliminary when playing status is unconfirmed; they are separate from season ranks.</w:t>
       </w:r>
     </w:p>
     <w:p>
@@ -8807,7 +8807,7 @@
         <w:pStyle w:val="Normal"/>
       </w:pPr>
       <w:r>
-        <w:t xml:space="preserve">Weekly overall model rank Not published (GAME_STARTED_NO_ORIGINAL_WEEKLY_RANK). ROS overall rank 75 (WR35). Availability: EXPECTED_ACTIVE. Weekly ranks are preliminary when playing status is unconfirmed; they are separate from season ranks.</w:t>
+        <w:t xml:space="preserve">Weekly overall model rank Not published (GAME_STARTED_NO_ORIGINAL_WEEKLY_RANK). ROS overall rank 75 (WR35). Availability: NO_ADVERSE_STATUS_REPORTED. Weekly ranks are preliminary when playing status is unconfirmed; they are separate from season ranks.</w:t>
       </w:r>
     </w:p>
     <w:p>
@@ -8927,7 +8927,7 @@
         <w:pStyle w:val="Normal"/>
       </w:pPr>
       <w:r>
-        <w:t xml:space="preserve">Weekly overall model rank 105 (WR42). ROS overall rank 76 (WR36). Availability: UNKNOWN. Weekly ranks are preliminary when playing status is unconfirmed; they are separate from season ranks.</w:t>
+        <w:t xml:space="preserve">Weekly overall model rank 84 (WR33). ROS overall rank 76 (WR36). Availability: NO_ADVERSE_STATUS_REPORTED. Weekly ranks are preliminary when playing status is unconfirmed; they are separate from season ranks.</w:t>
       </w:r>
     </w:p>
     <w:p>
@@ -9047,7 +9047,7 @@
         <w:pStyle w:val="Normal"/>
       </w:pPr>
       <w:r>
-        <w:t xml:space="preserve">Weekly overall model rank 51 (TE4). ROS overall rank 77 (TE7). Availability: UNKNOWN. Weekly ranks are preliminary when playing status is unconfirmed; they are separate from season ranks.</w:t>
+        <w:t xml:space="preserve">Weekly overall model rank 41 (TE4). ROS overall rank 77 (TE7). Availability: NO_ADVERSE_STATUS_REPORTED. Weekly ranks are preliminary when playing status is unconfirmed; they are separate from season ranks.</w:t>
       </w:r>
     </w:p>
     <w:p>
@@ -9167,7 +9167,7 @@
         <w:pStyle w:val="Normal"/>
       </w:pPr>
       <w:r>
-        <w:t xml:space="preserve">Weekly overall model rank 100 (RB23). ROS overall rank 78 (RB23). Availability: UNKNOWN. Weekly ranks are preliminary when playing status is unconfirmed; they are separate from season ranks.</w:t>
+        <w:t xml:space="preserve">Weekly overall model rank 81 (RB18). ROS overall rank 78 (RB23). Availability: NO_ADVERSE_STATUS_REPORTED. Weekly ranks are preliminary when playing status is unconfirmed; they are separate from season ranks.</w:t>
       </w:r>
     </w:p>
     <w:p>
@@ -9287,7 +9287,7 @@
         <w:pStyle w:val="Normal"/>
       </w:pPr>
       <w:r>
-        <w:t xml:space="preserve">Weekly overall model rank 122 (RB31). ROS overall rank 79 (RB24). Availability: UNKNOWN. Weekly ranks are preliminary when playing status is unconfirmed; they are separate from season ranks.</w:t>
+        <w:t xml:space="preserve">Weekly overall model rank Not published (NOT_EXPECTED_TO_PLAY). ROS overall rank 79 (RB24). Availability: OUT. Weekly ranks are preliminary when playing status is unconfirmed; they are separate from season ranks.</w:t>
       </w:r>
     </w:p>
     <w:p>
@@ -9407,7 +9407,7 @@
         <w:pStyle w:val="Normal"/>
       </w:pPr>
       <w:r>
-        <w:t xml:space="preserve">Weekly overall model rank 121 (RB30). ROS overall rank 80 (RB25). Availability: UNKNOWN. Weekly ranks are preliminary when playing status is unconfirmed; they are separate from season ranks.</w:t>
+        <w:t xml:space="preserve">Weekly overall model rank 95 (RB24). ROS overall rank 80 (RB25). Availability: NO_ADVERSE_STATUS_REPORTED. Weekly ranks are preliminary when playing status is unconfirmed; they are separate from season ranks.</w:t>
       </w:r>
     </w:p>
     <w:p>
@@ -9527,7 +9527,7 @@
         <w:pStyle w:val="Normal"/>
       </w:pPr>
       <w:r>
-        <w:t xml:space="preserve">Weekly overall model rank 82 (TE11). ROS overall rank 81 (TE8). Availability: UNKNOWN. Weekly ranks are preliminary when playing status is unconfirmed; they are separate from season ranks.</w:t>
+        <w:t xml:space="preserve">Weekly overall model rank 68 (TE11). ROS overall rank 81 (TE8). Availability: NO_ADVERSE_STATUS_REPORTED. Weekly ranks are preliminary when playing status is unconfirmed; they are separate from season ranks.</w:t>
       </w:r>
     </w:p>
     <w:p>
@@ -9647,7 +9647,7 @@
         <w:pStyle w:val="Normal"/>
       </w:pPr>
       <w:r>
-        <w:t xml:space="preserve">Weekly overall model rank 97 (RB21). ROS overall rank 82 (RB26). Availability: UNKNOWN. Weekly ranks are preliminary when playing status is unconfirmed; they are separate from season ranks.</w:t>
+        <w:t xml:space="preserve">Weekly overall model rank Not published (GAME_STARTED_NO_ORIGINAL_WEEKLY_RANK). ROS overall rank 82 (RB26). Availability: NO_ADVERSE_STATUS_REPORTED. Weekly ranks are preliminary when playing status is unconfirmed; they are separate from season ranks.</w:t>
       </w:r>
     </w:p>
     <w:p>
@@ -9767,7 +9767,7 @@
         <w:pStyle w:val="Normal"/>
       </w:pPr>
       <w:r>
-        <w:t xml:space="preserve">Weekly overall model rank 77 (WR27). ROS overall rank 83 (WR37). Availability: UNKNOWN. Weekly ranks are preliminary when playing status is unconfirmed; they are separate from season ranks.</w:t>
+        <w:t xml:space="preserve">Weekly overall model rank 64 (WR24). ROS overall rank 83 (WR37). Availability: NO_ADVERSE_STATUS_REPORTED. Weekly ranks are preliminary when playing status is unconfirmed; they are separate from season ranks.</w:t>
       </w:r>
     </w:p>
     <w:p>
@@ -9887,7 +9887,7 @@
         <w:pStyle w:val="Normal"/>
       </w:pPr>
       <w:r>
-        <w:t xml:space="preserve">Weekly overall model rank Not published (NO_CURRENT_WEEK_GAME). ROS overall rank 84 (QB13). Availability: UNKNOWN. Weekly ranks are preliminary when playing status is unconfirmed; they are separate from season ranks.</w:t>
+        <w:t xml:space="preserve">Weekly overall model rank Not published (NO_CURRENT_WEEK_GAME). ROS overall rank 84 (QB13). Availability: NO_ADVERSE_STATUS_REPORTED. Weekly ranks are preliminary when playing status is unconfirmed; they are separate from season ranks.</w:t>
       </w:r>
     </w:p>
     <w:p>
@@ -10007,7 +10007,7 @@
         <w:pStyle w:val="Normal"/>
       </w:pPr>
       <w:r>
-        <w:t xml:space="preserve">Weekly overall model rank 84 (WR31). ROS overall rank 85 (WR38). Availability: UNKNOWN. Weekly ranks are preliminary when playing status is unconfirmed; they are separate from season ranks.</w:t>
+        <w:t xml:space="preserve">Weekly overall model rank 70 (WR27). ROS overall rank 85 (WR38). Availability: NO_ADVERSE_STATUS_REPORTED. Weekly ranks are preliminary when playing status is unconfirmed; they are separate from season ranks.</w:t>
       </w:r>
     </w:p>
     <w:p>
@@ -10127,7 +10127,7 @@
         <w:pStyle w:val="Normal"/>
       </w:pPr>
       <w:r>
-        <w:t xml:space="preserve">Weekly overall model rank 79 (TE10). ROS overall rank 86 (TE9). Availability: UNKNOWN. Weekly ranks are preliminary when playing status is unconfirmed; they are separate from season ranks.</w:t>
+        <w:t xml:space="preserve">Weekly overall model rank 66 (TE10). ROS overall rank 86 (TE9). Availability: NO_ADVERSE_STATUS_REPORTED. Weekly ranks are preliminary when playing status is unconfirmed; they are separate from season ranks.</w:t>
       </w:r>
     </w:p>
     <w:p>
@@ -10247,7 +10247,7 @@
         <w:pStyle w:val="Normal"/>
       </w:pPr>
       <w:r>
-        <w:t xml:space="preserve">Weekly overall model rank 70 (WR24). ROS overall rank 87 (WR39). Availability: UNKNOWN. Weekly ranks are preliminary when playing status is unconfirmed; they are separate from season ranks.</w:t>
+        <w:t xml:space="preserve">Weekly overall model rank 58 (WR22). ROS overall rank 87 (WR39). Availability: NO_ADVERSE_STATUS_REPORTED. Weekly ranks are preliminary when playing status is unconfirmed; they are separate from season ranks.</w:t>
       </w:r>
     </w:p>
     <w:p>
@@ -10367,7 +10367,7 @@
         <w:pStyle w:val="Normal"/>
       </w:pPr>
       <w:r>
-        <w:t xml:space="preserve">Weekly overall model rank 78 (TE9). ROS overall rank 88 (TE10). Availability: UNKNOWN. Weekly ranks are preliminary when playing status is unconfirmed; they are separate from season ranks.</w:t>
+        <w:t xml:space="preserve">Weekly overall model rank 65 (TE9). ROS overall rank 88 (TE10). Availability: NO_ADVERSE_STATUS_REPORTED. Weekly ranks are preliminary when playing status is unconfirmed; they are separate from season ranks.</w:t>
       </w:r>
     </w:p>
     <w:p>
@@ -10487,7 +10487,7 @@
         <w:pStyle w:val="Normal"/>
       </w:pPr>
       <w:r>
-        <w:t xml:space="preserve">Weekly overall model rank 80 (WR28). ROS overall rank 89 (WR40). Availability: UNKNOWN. Weekly ranks are preliminary when playing status is unconfirmed; they are separate from season ranks.</w:t>
+        <w:t xml:space="preserve">Weekly overall model rank Not published (NOT_EXPECTED_TO_PLAY). ROS overall rank 89 (WR40). Availability: INJURED_RESERVE. Weekly ranks are preliminary when playing status is unconfirmed; they are separate from season ranks.</w:t>
       </w:r>
     </w:p>
     <w:p>
@@ -10607,7 +10607,7 @@
         <w:pStyle w:val="Normal"/>
       </w:pPr>
       <w:r>
-        <w:t xml:space="preserve">Weekly overall model rank 20 (QB6). ROS overall rank 90 (QB14). Availability: UNKNOWN. Weekly ranks are preliminary when playing status is unconfirmed; they are separate from season ranks.</w:t>
+        <w:t xml:space="preserve">Weekly overall model rank Not published (GAME_STARTED_NO_ORIGINAL_WEEKLY_RANK). ROS overall rank 90 (QB14). Availability: NO_ADVERSE_STATUS_REPORTED. Weekly ranks are preliminary when playing status is unconfirmed; they are separate from season ranks.</w:t>
       </w:r>
     </w:p>
     <w:p>
@@ -10727,7 +10727,7 @@
         <w:pStyle w:val="Normal"/>
       </w:pPr>
       <w:r>
-        <w:t xml:space="preserve">Weekly overall model rank 75 (TE8). ROS overall rank 91 (TE11). Availability: UNKNOWN. Weekly ranks are preliminary when playing status is unconfirmed; they are separate from season ranks.</w:t>
+        <w:t xml:space="preserve">Weekly overall model rank 62 (TE8). ROS overall rank 91 (TE11). Availability: NO_ADVERSE_STATUS_REPORTED. Weekly ranks are preliminary when playing status is unconfirmed; they are separate from season ranks.</w:t>
       </w:r>
     </w:p>
     <w:p>
@@ -10847,7 +10847,7 @@
         <w:pStyle w:val="Normal"/>
       </w:pPr>
       <w:r>
-        <w:t xml:space="preserve">Weekly overall model rank 109 (RB25). ROS overall rank 92 (RB27). Availability: UNKNOWN. Weekly ranks are preliminary when playing status is unconfirmed; they are separate from season ranks.</w:t>
+        <w:t xml:space="preserve">Weekly overall model rank 88 (RB20). ROS overall rank 92 (RB27). Availability: NO_ADVERSE_STATUS_REPORTED. Weekly ranks are preliminary when playing status is unconfirmed; they are separate from season ranks.</w:t>
       </w:r>
     </w:p>
     <w:p>
@@ -10935,7 +10935,7 @@
         <w:pStyle w:val="Normal"/>
       </w:pPr>
       <w:r>
-        <w:t xml:space="preserve">Weekly overall model rank 74 (WR26). ROS overall rank 93 (WR41). Availability: UNKNOWN. Weekly ranks are preliminary when playing status is unconfirmed; they are separate from season ranks.</w:t>
+        <w:t xml:space="preserve">Weekly overall model rank Not published (GAME_STARTED_NO_ORIGINAL_WEEKLY_RANK). ROS overall rank 93 (WR41). Availability: NO_ADVERSE_STATUS_REPORTED. Weekly ranks are preliminary when playing status is unconfirmed; they are separate from season ranks.</w:t>
       </w:r>
     </w:p>
     <w:p>
@@ -11055,7 +11055,7 @@
         <w:pStyle w:val="Normal"/>
       </w:pPr>
       <w:r>
-        <w:t xml:space="preserve">Weekly overall model rank 85 (WR32). ROS overall rank 94 (WR42). Availability: UNKNOWN. Weekly ranks are preliminary when playing status is unconfirmed; they are separate from season ranks.</w:t>
+        <w:t xml:space="preserve">Weekly overall model rank 71 (WR28). ROS overall rank 94 (WR42). Availability: QUESTIONABLE. Weekly ranks are preliminary when playing status is unconfirmed; they are separate from season ranks.</w:t>
       </w:r>
     </w:p>
     <w:p>
@@ -11175,7 +11175,7 @@
         <w:pStyle w:val="Normal"/>
       </w:pPr>
       <w:r>
-        <w:t xml:space="preserve">Weekly overall model rank 101 (WR40). ROS overall rank 95 (WR43). Availability: UNKNOWN. Weekly ranks are preliminary when playing status is unconfirmed; they are separate from season ranks.</w:t>
+        <w:t xml:space="preserve">Weekly overall model rank Not published (GAME_STARTED_NO_ORIGINAL_WEEKLY_RANK). ROS overall rank 95 (WR43). Availability: NO_ADVERSE_STATUS_REPORTED. Weekly ranks are preliminary when playing status is unconfirmed; they are separate from season ranks.</w:t>
       </w:r>
     </w:p>
     <w:p>
@@ -11295,7 +11295,7 @@
         <w:pStyle w:val="Normal"/>
       </w:pPr>
       <w:r>
-        <w:t xml:space="preserve">Weekly overall model rank 128 (WR49). ROS overall rank 96 (WR44). Availability: UNKNOWN. Weekly ranks are preliminary when playing status is unconfirmed; they are separate from season ranks.</w:t>
+        <w:t xml:space="preserve">Weekly overall model rank 101 (WR37). ROS overall rank 96 (WR44). Availability: NO_ADVERSE_STATUS_REPORTED. Weekly ranks are preliminary when playing status is unconfirmed; they are separate from season ranks.</w:t>
       </w:r>
     </w:p>
     <w:p>
@@ -11415,7 +11415,7 @@
         <w:pStyle w:val="Normal"/>
       </w:pPr>
       <w:r>
-        <w:t xml:space="preserve">Weekly overall model rank 113 (TE18). ROS overall rank 97 (TE12). Availability: UNKNOWN. Weekly ranks are preliminary when playing status is unconfirmed; they are separate from season ranks.</w:t>
+        <w:t xml:space="preserve">Weekly overall model rank Not published (GAME_STARTED_NO_ORIGINAL_WEEKLY_RANK). ROS overall rank 97 (TE12). Availability: NO_ADVERSE_STATUS_REPORTED. Weekly ranks are preliminary when playing status is unconfirmed; they are separate from season ranks.</w:t>
       </w:r>
     </w:p>
     <w:p>
@@ -11535,7 +11535,7 @@
         <w:pStyle w:val="Normal"/>
       </w:pPr>
       <w:r>
-        <w:t xml:space="preserve">Weekly overall model rank 81 (WR29). ROS overall rank 98 (WR45). Availability: UNKNOWN. Weekly ranks are preliminary when playing status is unconfirmed; they are separate from season ranks.</w:t>
+        <w:t xml:space="preserve">Weekly overall model rank 67 (WR25). ROS overall rank 98 (WR45). Availability: NO_ADVERSE_STATUS_REPORTED. Weekly ranks are preliminary when playing status is unconfirmed; they are separate from season ranks.</w:t>
       </w:r>
     </w:p>
     <w:p>
@@ -11655,7 +11655,7 @@
         <w:pStyle w:val="Normal"/>
       </w:pPr>
       <w:r>
-        <w:t xml:space="preserve">Weekly overall model rank 111 (WR44). ROS overall rank 99 (WR46). Availability: UNKNOWN. Weekly ranks are preliminary when playing status is unconfirmed; they are separate from season ranks.</w:t>
+        <w:t xml:space="preserve">Weekly overall model rank Not published (GAME_STARTED_NO_ORIGINAL_WEEKLY_RANK). ROS overall rank 99 (WR46). Availability: NO_ADVERSE_STATUS_REPORTED. Weekly ranks are preliminary when playing status is unconfirmed; they are separate from season ranks.</w:t>
       </w:r>
     </w:p>
     <w:p>
@@ -11775,7 +11775,7 @@
         <w:pStyle w:val="Normal"/>
       </w:pPr>
       <w:r>
-        <w:t xml:space="preserve">Weekly overall model rank 148 (RB47). ROS overall rank 100 (RB28). Availability: UNKNOWN. Weekly ranks are preliminary when playing status is unconfirmed; they are separate from season ranks.</w:t>
+        <w:t xml:space="preserve">Weekly overall model rank 118 (RB38). ROS overall rank 100 (RB28). Availability: UNKNOWN. Weekly ranks are preliminary when playing status is unconfirmed; they are separate from season ranks.</w:t>
       </w:r>
     </w:p>
     <w:p>
@@ -11895,7 +11895,7 @@
         <w:pStyle w:val="Normal"/>
       </w:pPr>
       <w:r>
-        <w:t xml:space="preserve">Weekly overall model rank 99 (WR39). ROS overall rank 101 (WR47). Availability: UNKNOWN. Weekly ranks are preliminary when playing status is unconfirmed; they are separate from season ranks.</w:t>
+        <w:t xml:space="preserve">Weekly overall model rank Not published (NOT_EXPECTED_TO_PLAY). ROS overall rank 101 (WR47). Availability: OUT. Weekly ranks are preliminary when playing status is unconfirmed; they are separate from season ranks.</w:t>
       </w:r>
     </w:p>
     <w:p>
@@ -12015,7 +12015,7 @@
         <w:pStyle w:val="Normal"/>
       </w:pPr>
       <w:r>
-        <w:t xml:space="preserve">Weekly overall model rank 95 (WR38). ROS overall rank 102 (WR48). Availability: UNKNOWN. Weekly ranks are preliminary when playing status is unconfirmed; they are separate from season ranks.</w:t>
+        <w:t xml:space="preserve">Weekly overall model rank 78 (WR32). ROS overall rank 102 (WR48). Availability: NO_ADVERSE_STATUS_REPORTED. Weekly ranks are preliminary when playing status is unconfirmed; they are separate from season ranks.</w:t>
       </w:r>
     </w:p>
     <w:p>
@@ -12135,7 +12135,7 @@
         <w:pStyle w:val="Normal"/>
       </w:pPr>
       <w:r>
-        <w:t xml:space="preserve">Weekly overall model rank Not published (GAME_STARTED_NO_ORIGINAL_WEEKLY_RANK). ROS overall rank 103 (QB15). Availability: UNKNOWN. Weekly ranks are preliminary when playing status is unconfirmed; they are separate from season ranks.</w:t>
+        <w:t xml:space="preserve">Weekly overall model rank Not published (GAME_STARTED_NO_ORIGINAL_WEEKLY_RANK). ROS overall rank 103 (QB15). Availability: NO_ADVERSE_STATUS_REPORTED. Weekly ranks are preliminary when playing status is unconfirmed; they are separate from season ranks.</w:t>
       </w:r>
     </w:p>
     <w:p>
@@ -12255,7 +12255,7 @@
         <w:pStyle w:val="Normal"/>
       </w:pPr>
       <w:r>
-        <w:t xml:space="preserve">Weekly overall model rank 28 (QB12). ROS overall rank 104 (QB16). Availability: UNKNOWN. Weekly ranks are preliminary when playing status is unconfirmed; they are separate from season ranks.</w:t>
+        <w:t xml:space="preserve">Weekly overall model rank Not published (GAME_STARTED_NO_ORIGINAL_WEEKLY_RANK). ROS overall rank 104 (QB16). Availability: NO_ADVERSE_STATUS_REPORTED. Weekly ranks are preliminary when playing status is unconfirmed; they are separate from season ranks.</w:t>
       </w:r>
     </w:p>
     <w:p>
@@ -12375,7 +12375,7 @@
         <w:pStyle w:val="Normal"/>
       </w:pPr>
       <w:r>
-        <w:t xml:space="preserve">Weekly overall model rank 108 (TE17). ROS overall rank 105 (TE13). Availability: UNKNOWN. Weekly ranks are preliminary when playing status is unconfirmed; they are separate from season ranks.</w:t>
+        <w:t xml:space="preserve">Weekly overall model rank 87 (TE16). ROS overall rank 105 (TE13). Availability: NO_ADVERSE_STATUS_REPORTED. Weekly ranks are preliminary when playing status is unconfirmed; they are separate from season ranks.</w:t>
       </w:r>
     </w:p>
     <w:p>
@@ -12495,7 +12495,7 @@
         <w:pStyle w:val="Normal"/>
       </w:pPr>
       <w:r>
-        <w:t xml:space="preserve">Weekly overall model rank Not published (NO_CURRENT_WEEK_GAME). ROS overall rank 106 (TE14). Availability: UNKNOWN. Weekly ranks are preliminary when playing status is unconfirmed; they are separate from season ranks.</w:t>
+        <w:t xml:space="preserve">Weekly overall model rank Not published (NO_CURRENT_WEEK_GAME). ROS overall rank 106 (TE14). Availability: NO_ADVERSE_STATUS_REPORTED. Weekly ranks are preliminary when playing status is unconfirmed; they are separate from season ranks.</w:t>
       </w:r>
     </w:p>
     <w:p>
@@ -12615,7 +12615,7 @@
         <w:pStyle w:val="Normal"/>
       </w:pPr>
       <w:r>
-        <w:t xml:space="preserve">Weekly overall model rank 119 (RB28). ROS overall rank 107 (RB29). Availability: UNKNOWN. Weekly ranks are preliminary when playing status is unconfirmed; they are separate from season ranks.</w:t>
+        <w:t xml:space="preserve">Weekly overall model rank 94 (RB23). ROS overall rank 107 (RB29). Availability: QUESTIONABLE. Weekly ranks are preliminary when playing status is unconfirmed; they are separate from season ranks.</w:t>
       </w:r>
     </w:p>
     <w:p>
@@ -12735,7 +12735,7 @@
         <w:pStyle w:val="Normal"/>
       </w:pPr>
       <w:r>
-        <w:t xml:space="preserve">Weekly overall model rank 107 (WR43). ROS overall rank 108 (WR49). Availability: UNKNOWN. Weekly ranks are preliminary when playing status is unconfirmed; they are separate from season ranks.</w:t>
+        <w:t xml:space="preserve">Weekly overall model rank 86 (WR34). ROS overall rank 108 (WR49). Availability: NO_ADVERSE_STATUS_REPORTED. Weekly ranks are preliminary when playing status is unconfirmed; they are separate from season ranks.</w:t>
       </w:r>
     </w:p>
     <w:p>
@@ -12855,7 +12855,7 @@
         <w:pStyle w:val="Normal"/>
       </w:pPr>
       <w:r>
-        <w:t xml:space="preserve">Weekly overall model rank 116 (WR46). ROS overall rank 109 (WR50). Availability: UNKNOWN. Weekly ranks are preliminary when playing status is unconfirmed; they are separate from season ranks.</w:t>
+        <w:t xml:space="preserve">Weekly overall model rank Not published (NOT_EXPECTED_TO_PLAY). ROS overall rank 109 (WR50). Availability: INJURED_RESERVE. Weekly ranks are preliminary when playing status is unconfirmed; they are separate from season ranks.</w:t>
       </w:r>
     </w:p>
     <w:p>
@@ -12975,7 +12975,7 @@
         <w:pStyle w:val="Normal"/>
       </w:pPr>
       <w:r>
-        <w:t xml:space="preserve">Weekly overall model rank 120 (RB29). ROS overall rank 110 (RB30). Availability: UNKNOWN. Weekly ranks are preliminary when playing status is unconfirmed; they are separate from season ranks.</w:t>
+        <w:t xml:space="preserve">Weekly overall model rank Not published (NOT_EXPECTED_TO_PLAY). ROS overall rank 110 (RB30). Availability: INJURED_RESERVE. Weekly ranks are preliminary when playing status is unconfirmed; they are separate from season ranks.</w:t>
       </w:r>
     </w:p>
     <w:p>
@@ -13095,7 +13095,7 @@
         <w:pStyle w:val="Normal"/>
       </w:pPr>
       <w:r>
-        <w:t xml:space="preserve">Weekly overall model rank 68 (WR22). ROS overall rank 111 (WR51). Availability: UNKNOWN. Weekly ranks are preliminary when playing status is unconfirmed; they are separate from season ranks.</w:t>
+        <w:t xml:space="preserve">Weekly overall model rank 56 (WR20). ROS overall rank 111 (WR51). Availability: NO_ADVERSE_STATUS_REPORTED. Weekly ranks are preliminary when playing status is unconfirmed; they are separate from season ranks.</w:t>
       </w:r>
     </w:p>
     <w:p>
@@ -13215,7 +13215,7 @@
         <w:pStyle w:val="Normal"/>
       </w:pPr>
       <w:r>
-        <w:t xml:space="preserve">Weekly overall model rank 92 (WR35). ROS overall rank 112 (WR52). Availability: UNKNOWN. Weekly ranks are preliminary when playing status is unconfirmed; they are separate from season ranks.</w:t>
+        <w:t xml:space="preserve">Weekly overall model rank Not published (NOT_EXPECTED_TO_PLAY). ROS overall rank 112 (WR52). Availability: OUT. Weekly ranks are preliminary when playing status is unconfirmed; they are separate from season ranks.</w:t>
       </w:r>
     </w:p>
     <w:p>
@@ -13335,7 +13335,7 @@
         <w:pStyle w:val="Normal"/>
       </w:pPr>
       <w:r>
-        <w:t xml:space="preserve">Weekly overall model rank Not published (GAME_STARTED_NO_ORIGINAL_WEEKLY_RANK). ROS overall rank 113 (TE15). Availability: UNKNOWN. Weekly ranks are preliminary when playing status is unconfirmed; they are separate from season ranks.</w:t>
+        <w:t xml:space="preserve">Weekly overall model rank Not published (GAME_STARTED_NO_ORIGINAL_WEEKLY_RANK). ROS overall rank 113 (TE15). Availability: NO_ADVERSE_STATUS_REPORTED. Weekly ranks are preliminary when playing status is unconfirmed; they are separate from season ranks.</w:t>
       </w:r>
     </w:p>
     <w:p>
@@ -13455,7 +13455,7 @@
         <w:pStyle w:val="Normal"/>
       </w:pPr>
       <w:r>
-        <w:t xml:space="preserve">Weekly overall model rank 102 (TE15). ROS overall rank 114 (TE16). Availability: UNKNOWN. Weekly ranks are preliminary when playing status is unconfirmed; they are separate from season ranks.</w:t>
+        <w:t xml:space="preserve">Weekly overall model rank 82 (TE14). ROS overall rank 114 (TE16). Availability: NO_ADVERSE_STATUS_REPORTED. Weekly ranks are preliminary when playing status is unconfirmed; they are separate from season ranks.</w:t>
       </w:r>
     </w:p>
     <w:p>
@@ -13575,7 +13575,7 @@
         <w:pStyle w:val="Normal"/>
       </w:pPr>
       <w:r>
-        <w:t xml:space="preserve">Weekly overall model rank 106 (RB24). ROS overall rank 115 (RB31). Availability: UNKNOWN. Weekly ranks are preliminary when playing status is unconfirmed; they are separate from season ranks.</w:t>
+        <w:t xml:space="preserve">Weekly overall model rank 85 (RB19). ROS overall rank 115 (RB31). Availability: NO_ADVERSE_STATUS_REPORTED. Weekly ranks are preliminary when playing status is unconfirmed; they are separate from season ranks.</w:t>
       </w:r>
     </w:p>
     <w:p>
@@ -13695,7 +13695,7 @@
         <w:pStyle w:val="Normal"/>
       </w:pPr>
       <w:r>
-        <w:t xml:space="preserve">Weekly overall model rank 123 (RB32). ROS overall rank 116 (RB32). Availability: UNKNOWN. Weekly ranks are preliminary when playing status is unconfirmed; they are separate from season ranks.</w:t>
+        <w:t xml:space="preserve">Weekly overall model rank 96 (RB25). ROS overall rank 116 (RB32). Availability: NO_ADVERSE_STATUS_REPORTED. Weekly ranks are preliminary when playing status is unconfirmed; they are separate from season ranks.</w:t>
       </w:r>
     </w:p>
     <w:p>
@@ -13815,7 +13815,7 @@
         <w:pStyle w:val="Normal"/>
       </w:pPr>
       <w:r>
-        <w:t xml:space="preserve">Weekly overall model rank 129 (WR50). ROS overall rank 117 (WR53). Availability: UNKNOWN. Weekly ranks are preliminary when playing status is unconfirmed; they are separate from season ranks.</w:t>
+        <w:t xml:space="preserve">Weekly overall model rank 102 (WR38). ROS overall rank 117 (WR53). Availability: NO_ADVERSE_STATUS_REPORTED. Weekly ranks are preliminary when playing status is unconfirmed; they are separate from season ranks.</w:t>
       </w:r>
     </w:p>
     <w:p>
@@ -13903,7 +13903,7 @@
         <w:pStyle w:val="Normal"/>
       </w:pPr>
       <w:r>
-        <w:t xml:space="preserve">Weekly overall model rank 87 (TE13). ROS overall rank 118 (TE17). Availability: UNKNOWN. Weekly ranks are preliminary when playing status is unconfirmed; they are separate from season ranks.</w:t>
+        <w:t xml:space="preserve">Weekly overall model rank 73 (TE13). ROS overall rank 118 (TE17). Availability: NO_ADVERSE_STATUS_REPORTED. Weekly ranks are preliminary when playing status is unconfirmed; they are separate from season ranks.</w:t>
       </w:r>
     </w:p>
     <w:p>
@@ -13991,7 +13991,7 @@
         <w:pStyle w:val="Normal"/>
       </w:pPr>
       <w:r>
-        <w:t xml:space="preserve">Weekly overall model rank 125 (TE21). ROS overall rank 119 (TE18). Availability: UNKNOWN. Weekly ranks are preliminary when playing status is unconfirmed; they are separate from season ranks.</w:t>
+        <w:t xml:space="preserve">Weekly overall model rank 98 (TE19). ROS overall rank 119 (TE18). Availability: NO_ADVERSE_STATUS_REPORTED. Weekly ranks are preliminary when playing status is unconfirmed; they are separate from season ranks.</w:t>
       </w:r>
     </w:p>
     <w:p>
@@ -14079,7 +14079,7 @@
         <w:pStyle w:val="Normal"/>
       </w:pPr>
       <w:r>
-        <w:t xml:space="preserve">Weekly overall model rank 130 (RB34). ROS overall rank 120 (RB33). Availability: UNKNOWN. Weekly ranks are preliminary when playing status is unconfirmed; they are separate from season ranks.</w:t>
+        <w:t xml:space="preserve">Weekly overall model rank 103 (RB27). ROS overall rank 120 (RB33). Availability: NO_ADVERSE_STATUS_REPORTED. Weekly ranks are preliminary when playing status is unconfirmed; they are separate from season ranks.</w:t>
       </w:r>
     </w:p>
     <w:p>
@@ -14199,7 +14199,7 @@
         <w:pStyle w:val="Normal"/>
       </w:pPr>
       <w:r>
-        <w:t xml:space="preserve">Weekly overall model rank 88 (RB19). ROS overall rank 121 (RB34). Availability: UNKNOWN. Weekly ranks are preliminary when playing status is unconfirmed; they are separate from season ranks.</w:t>
+        <w:t xml:space="preserve">Weekly overall model rank 74 (RB15). ROS overall rank 121 (RB34). Availability: NO_ADVERSE_STATUS_REPORTED. Weekly ranks are preliminary when playing status is unconfirmed; they are separate from season ranks.</w:t>
       </w:r>
     </w:p>
     <w:p>
@@ -14319,7 +14319,7 @@
         <w:pStyle w:val="Normal"/>
       </w:pPr>
       <w:r>
-        <w:t xml:space="preserve">Weekly overall model rank 132 (WR52). ROS overall rank 122 (WR54). Availability: UNKNOWN. Weekly ranks are preliminary when playing status is unconfirmed; they are separate from season ranks.</w:t>
+        <w:t xml:space="preserve">Weekly overall model rank 105 (WR40). ROS overall rank 122 (WR54). Availability: NO_ADVERSE_STATUS_REPORTED. Weekly ranks are preliminary when playing status is unconfirmed; they are separate from season ranks.</w:t>
       </w:r>
     </w:p>
     <w:p>
@@ -14439,7 +14439,7 @@
         <w:pStyle w:val="Normal"/>
       </w:pPr>
       <w:r>
-        <w:t xml:space="preserve">Weekly overall model rank 71 (TE6). ROS overall rank 123 (TE19). Availability: UNKNOWN. Weekly ranks are preliminary when playing status is unconfirmed; they are separate from season ranks.</w:t>
+        <w:t xml:space="preserve">Weekly overall model rank 59 (TE6). ROS overall rank 123 (TE19). Availability: NO_ADVERSE_STATUS_REPORTED. Weekly ranks are preliminary when playing status is unconfirmed; they are separate from season ranks.</w:t>
       </w:r>
     </w:p>
     <w:p>
@@ -14543,7 +14543,7 @@
         <w:pStyle w:val="Normal"/>
       </w:pPr>
       <w:r>
-        <w:t xml:space="preserve">Weekly overall model rank 98 (RB22). ROS overall rank 124 (RB35). Availability: UNKNOWN. Weekly ranks are preliminary when playing status is unconfirmed; they are separate from season ranks.</w:t>
+        <w:t xml:space="preserve">Weekly overall model rank 80 (RB17). ROS overall rank 124 (RB35). Availability: NO_ADVERSE_STATUS_REPORTED. Weekly ranks are preliminary when playing status is unconfirmed; they are separate from season ranks.</w:t>
       </w:r>
     </w:p>
     <w:p>
@@ -14663,7 +14663,7 @@
         <w:pStyle w:val="Normal"/>
       </w:pPr>
       <w:r>
-        <w:t xml:space="preserve">Weekly overall model rank 89 (TE14). ROS overall rank 125 (TE20). Availability: UNKNOWN. Weekly ranks are preliminary when playing status is unconfirmed; they are separate from season ranks.</w:t>
+        <w:t xml:space="preserve">Weekly overall model rank Not published (GAME_STARTED_NO_ORIGINAL_WEEKLY_RANK). ROS overall rank 125 (TE20). Availability: NO_ADVERSE_STATUS_REPORTED. Weekly ranks are preliminary when playing status is unconfirmed; they are separate from season ranks.</w:t>
       </w:r>
     </w:p>
     <w:p>
@@ -14783,7 +14783,7 @@
         <w:pStyle w:val="Normal"/>
       </w:pPr>
       <w:r>
-        <w:t xml:space="preserve">Weekly overall model rank Not published (NOT_EXPECTED_TO_PLAY). ROS overall rank 126 (WR55). Availability: EXPECTED_INACTIVE. Weekly ranks are preliminary when playing status is unconfirmed; they are separate from season ranks.</w:t>
+        <w:t xml:space="preserve">Weekly overall model rank Not published (NOT_EXPECTED_TO_PLAY). ROS overall rank 126 (WR55). Availability: INJURED_RESERVE. Weekly ranks are preliminary when playing status is unconfirmed; they are separate from season ranks.</w:t>
       </w:r>
     </w:p>
     <w:p>
@@ -14903,7 +14903,7 @@
         <w:pStyle w:val="Normal"/>
       </w:pPr>
       <w:r>
-        <w:t xml:space="preserve">Weekly overall model rank 104 (WR41). ROS overall rank 127 (WR56). Availability: UNKNOWN. Weekly ranks are preliminary when playing status is unconfirmed; they are separate from season ranks.</w:t>
+        <w:t xml:space="preserve">Weekly overall model rank Not published (NOT_EXPECTED_TO_PLAY). ROS overall rank 127 (WR56). Availability: OUT. Weekly ranks are preliminary when playing status is unconfirmed; they are separate from season ranks.</w:t>
       </w:r>
     </w:p>
     <w:p>
@@ -15023,7 +15023,7 @@
         <w:pStyle w:val="Normal"/>
       </w:pPr>
       <w:r>
-        <w:t xml:space="preserve">Weekly overall model rank 127 (RB33). ROS overall rank 128 (RB36). Availability: UNKNOWN. Weekly ranks are preliminary when playing status is unconfirmed; they are separate from season ranks.</w:t>
+        <w:t xml:space="preserve">Weekly overall model rank 100 (RB26). ROS overall rank 128 (RB36). Availability: NO_ADVERSE_STATUS_REPORTED. Weekly ranks are preliminary when playing status is unconfirmed; they are separate from season ranks.</w:t>
       </w:r>
     </w:p>
     <w:p>
@@ -15143,7 +15143,7 @@
         <w:pStyle w:val="Normal"/>
       </w:pPr>
       <w:r>
-        <w:t xml:space="preserve">Weekly overall model rank 112 (WR45). ROS overall rank 129 (WR57). Availability: UNKNOWN. Weekly ranks are preliminary when playing status is unconfirmed; they are separate from season ranks.</w:t>
+        <w:t xml:space="preserve">Weekly overall model rank Not published (NOT_EXPECTED_TO_PLAY). ROS overall rank 129 (WR57). Availability: OUT. Weekly ranks are preliminary when playing status is unconfirmed; they are separate from season ranks.</w:t>
       </w:r>
     </w:p>
     <w:p>
@@ -15263,7 +15263,7 @@
         <w:pStyle w:val="Normal"/>
       </w:pPr>
       <w:r>
-        <w:t xml:space="preserve">Weekly overall model rank 139 (RB40). ROS overall rank 130 (RB37). Availability: UNKNOWN. Weekly ranks are preliminary when playing status is unconfirmed; they are separate from season ranks.</w:t>
+        <w:t xml:space="preserve">Weekly overall model rank 110 (RB31). ROS overall rank 130 (RB37). Availability: NO_ADVERSE_STATUS_REPORTED. Weekly ranks are preliminary when playing status is unconfirmed; they are separate from season ranks.</w:t>
       </w:r>
     </w:p>
     <w:p>
@@ -15383,7 +15383,7 @@
         <w:pStyle w:val="Normal"/>
       </w:pPr>
       <w:r>
-        <w:t xml:space="preserve">Weekly overall model rank 126 (WR48). ROS overall rank 131 (WR58). Availability: UNKNOWN. Weekly ranks are preliminary when playing status is unconfirmed; they are separate from season ranks.</w:t>
+        <w:t xml:space="preserve">Weekly overall model rank 99 (WR36). ROS overall rank 131 (WR58). Availability: NO_ADVERSE_STATUS_REPORTED. Weekly ranks are preliminary when playing status is unconfirmed; they are separate from season ranks.</w:t>
       </w:r>
     </w:p>
     <w:p>
@@ -15503,7 +15503,7 @@
         <w:pStyle w:val="Normal"/>
       </w:pPr>
       <w:r>
-        <w:t xml:space="preserve">Weekly overall model rank Not published (NO_CURRENT_WEEK_GAME). ROS overall rank 132 (TE21). Availability: UNKNOWN. Weekly ranks are preliminary when playing status is unconfirmed; they are separate from season ranks.</w:t>
+        <w:t xml:space="preserve">Weekly overall model rank Not published (NO_CURRENT_WEEK_GAME). ROS overall rank 132 (TE21). Availability: NO_ADVERSE_STATUS_REPORTED. Weekly ranks are preliminary when playing status is unconfirmed; they are separate from season ranks.</w:t>
       </w:r>
     </w:p>
     <w:p>
@@ -15623,7 +15623,7 @@
         <w:pStyle w:val="Normal"/>
       </w:pPr>
       <w:r>
-        <w:t xml:space="preserve">Weekly overall model rank Not published (NO_CURRENT_WEEK_GAME). ROS overall rank 133 (WR59). Availability: UNKNOWN. Weekly ranks are preliminary when playing status is unconfirmed; they are separate from season ranks.</w:t>
+        <w:t xml:space="preserve">Weekly overall model rank Not published (NO_CURRENT_WEEK_GAME). ROS overall rank 133 (WR59). Availability: NO_ADVERSE_STATUS_REPORTED. Weekly ranks are preliminary when playing status is unconfirmed; they are separate from season ranks.</w:t>
       </w:r>
     </w:p>
     <w:p>
@@ -15863,7 +15863,7 @@
         <w:pStyle w:val="Normal"/>
       </w:pPr>
       <w:r>
-        <w:t xml:space="preserve">Weekly overall model rank 145 (RB45). ROS overall rank 135 (RB39). Availability: UNKNOWN. Weekly ranks are preliminary when playing status is unconfirmed; they are separate from season ranks.</w:t>
+        <w:t xml:space="preserve">Weekly overall model rank 116 (RB36). ROS overall rank 135 (RB39). Availability: NO_ADVERSE_STATUS_REPORTED. Weekly ranks are preliminary when playing status is unconfirmed; they are separate from season ranks.</w:t>
       </w:r>
     </w:p>
     <w:p>
@@ -15983,7 +15983,7 @@
         <w:pStyle w:val="Normal"/>
       </w:pPr>
       <w:r>
-        <w:t xml:space="preserve">Weekly overall model rank 134 (WR53). ROS overall rank 136 (WR60). Availability: UNKNOWN. Weekly ranks are preliminary when playing status is unconfirmed; they are separate from season ranks.</w:t>
+        <w:t xml:space="preserve">Weekly overall model rank 106 (WR41). ROS overall rank 136 (WR60). Availability: NO_ADVERSE_STATUS_REPORTED. Weekly ranks are preliminary when playing status is unconfirmed; they are separate from season ranks.</w:t>
       </w:r>
     </w:p>
     <w:p>
@@ -16103,7 +16103,7 @@
         <w:pStyle w:val="Normal"/>
       </w:pPr>
       <w:r>
-        <w:t xml:space="preserve">Weekly overall model rank 137 (RB38). ROS overall rank 137 (RB40). Availability: UNKNOWN. Weekly ranks are preliminary when playing status is unconfirmed; they are separate from season ranks.</w:t>
+        <w:t xml:space="preserve">Weekly overall model rank Not published (NOT_EXPECTED_TO_PLAY). ROS overall rank 137 (RB40). Availability: INJURED_RESERVE. Weekly ranks are preliminary when playing status is unconfirmed; they are separate from season ranks.</w:t>
       </w:r>
     </w:p>
     <w:p>
@@ -16223,7 +16223,7 @@
         <w:pStyle w:val="Normal"/>
       </w:pPr>
       <w:r>
-        <w:t xml:space="preserve">Weekly overall model rank Not published (NO_CURRENT_WEEK_GAME). ROS overall rank 138 (WR61). Availability: UNKNOWN. Weekly ranks are preliminary when playing status is unconfirmed; they are separate from season ranks.</w:t>
+        <w:t xml:space="preserve">Weekly overall model rank Not published (NO_CURRENT_WEEK_GAME). ROS overall rank 138 (WR61). Availability: QUESTIONABLE. Weekly ranks are preliminary when playing status is unconfirmed; they are separate from season ranks.</w:t>
       </w:r>
     </w:p>
     <w:p>
@@ -16343,7 +16343,7 @@
         <w:pStyle w:val="Normal"/>
       </w:pPr>
       <w:r>
-        <w:t xml:space="preserve">Weekly overall model rank 124 (TE20). ROS overall rank 139 (TE22). Availability: UNKNOWN. Weekly ranks are preliminary when playing status is unconfirmed; they are separate from season ranks.</w:t>
+        <w:t xml:space="preserve">Weekly overall model rank 97 (TE18). ROS overall rank 139 (TE22). Availability: NO_ADVERSE_STATUS_REPORTED. Weekly ranks are preliminary when playing status is unconfirmed; they are separate from season ranks.</w:t>
       </w:r>
     </w:p>
     <w:p>
@@ -16463,7 +16463,7 @@
         <w:pStyle w:val="Normal"/>
       </w:pPr>
       <w:r>
-        <w:t xml:space="preserve">Weekly overall model rank Not published (NO_CURRENT_WEEK_GAME). ROS overall rank 140 (RB41). Availability: UNKNOWN. Weekly ranks are preliminary when playing status is unconfirmed; they are separate from season ranks.</w:t>
+        <w:t xml:space="preserve">Weekly overall model rank Not published (NO_CURRENT_WEEK_GAME). ROS overall rank 140 (RB41). Availability: NO_ADVERSE_STATUS_REPORTED. Weekly ranks are preliminary when playing status is unconfirmed; they are separate from season ranks.</w:t>
       </w:r>
     </w:p>
     <w:p>
@@ -16583,7 +16583,7 @@
         <w:pStyle w:val="Normal"/>
       </w:pPr>
       <w:r>
-        <w:t xml:space="preserve">Weekly overall model rank 140 (RB41). ROS overall rank 141 (RB42). Availability: UNKNOWN. Weekly ranks are preliminary when playing status is unconfirmed; they are separate from season ranks.</w:t>
+        <w:t xml:space="preserve">Weekly overall model rank 111 (RB32). ROS overall rank 141 (RB42). Availability: NO_ADVERSE_STATUS_REPORTED. Weekly ranks are preliminary when playing status is unconfirmed; they are separate from season ranks.</w:t>
       </w:r>
     </w:p>
     <w:p>
@@ -16703,7 +16703,7 @@
         <w:pStyle w:val="Normal"/>
       </w:pPr>
       <w:r>
-        <w:t xml:space="preserve">Weekly overall model rank Not published (NOT_EXPECTED_TO_PLAY). ROS overall rank 142 (WR62). Availability: EXPECTED_INACTIVE. Weekly ranks are preliminary when playing status is unconfirmed; they are separate from season ranks.</w:t>
+        <w:t xml:space="preserve">Weekly overall model rank Not published (NOT_EXPECTED_TO_PLAY). ROS overall rank 142 (WR62). Availability: INJURED_RESERVE. Weekly ranks are preliminary when playing status is unconfirmed; they are separate from season ranks.</w:t>
       </w:r>
     </w:p>
     <w:p>
@@ -16823,7 +16823,7 @@
         <w:pStyle w:val="Normal"/>
       </w:pPr>
       <w:r>
-        <w:t xml:space="preserve">Weekly overall model rank Not published (NO_CURRENT_WEEK_GAME). ROS overall rank 143 (RB43). Availability: UNKNOWN. Weekly ranks are preliminary when playing status is unconfirmed; they are separate from season ranks.</w:t>
+        <w:t xml:space="preserve">Weekly overall model rank Not published (NO_CURRENT_WEEK_GAME). ROS overall rank 143 (RB43). Availability: NO_ADVERSE_STATUS_REPORTED. Weekly ranks are preliminary when playing status is unconfirmed; they are separate from season ranks.</w:t>
       </w:r>
     </w:p>
     <w:p>
@@ -16943,7 +16943,7 @@
         <w:pStyle w:val="Normal"/>
       </w:pPr>
       <w:r>
-        <w:t xml:space="preserve">Weekly overall model rank 118 (TE19). ROS overall rank 144 (TE23). Availability: UNKNOWN. Weekly ranks are preliminary when playing status is unconfirmed; they are separate from season ranks.</w:t>
+        <w:t xml:space="preserve">Weekly overall model rank 93 (TE17). ROS overall rank 144 (TE23). Availability: NO_ADVERSE_STATUS_REPORTED. Weekly ranks are preliminary when playing status is unconfirmed; they are separate from season ranks.</w:t>
       </w:r>
     </w:p>
     <w:p>
@@ -17063,7 +17063,7 @@
         <w:pStyle w:val="Normal"/>
       </w:pPr>
       <w:r>
-        <w:t xml:space="preserve">Weekly overall model rank 131 (WR51). ROS overall rank 145 (WR63). Availability: UNKNOWN. Weekly ranks are preliminary when playing status is unconfirmed; they are separate from season ranks.</w:t>
+        <w:t xml:space="preserve">Weekly overall model rank 104 (WR39). ROS overall rank 145 (WR63). Availability: NO_ADVERSE_STATUS_REPORTED. Weekly ranks are preliminary when playing status is unconfirmed; they are separate from season ranks.</w:t>
       </w:r>
     </w:p>
     <w:p>
@@ -17183,7 +17183,7 @@
         <w:pStyle w:val="Normal"/>
       </w:pPr>
       <w:r>
-        <w:t xml:space="preserve">Weekly overall model rank 138 (RB39). ROS overall rank 146 (RB44). Availability: UNKNOWN. Weekly ranks are preliminary when playing status is unconfirmed; they are separate from season ranks.</w:t>
+        <w:t xml:space="preserve">Weekly overall model rank 109 (RB30). ROS overall rank 146 (RB44). Availability: QUESTIONABLE. Weekly ranks are preliminary when playing status is unconfirmed; they are separate from season ranks.</w:t>
       </w:r>
     </w:p>
     <w:p>
@@ -17303,7 +17303,7 @@
         <w:pStyle w:val="Normal"/>
       </w:pPr>
       <w:r>
-        <w:t xml:space="preserve">Weekly overall model rank Not published (NO_CURRENT_WEEK_GAME). ROS overall rank 147 (RB45). Availability: UNKNOWN. Weekly ranks are preliminary when playing status is unconfirmed; they are separate from season ranks.</w:t>
+        <w:t xml:space="preserve">Weekly overall model rank Not published (NO_CURRENT_WEEK_GAME). ROS overall rank 147 (RB45). Availability: INJURED_RESERVE. Weekly ranks are preliminary when playing status is unconfirmed; they are separate from season ranks.</w:t>
       </w:r>
     </w:p>
     <w:p>
@@ -17423,7 +17423,7 @@
         <w:pStyle w:val="Normal"/>
       </w:pPr>
       <w:r>
-        <w:t xml:space="preserve">Weekly overall model rank 49 (QB21). ROS overall rank 148 (QB17). Availability: UNKNOWN. Weekly ranks are preliminary when playing status is unconfirmed; they are separate from season ranks.</w:t>
+        <w:t xml:space="preserve">Weekly overall model rank Not published (NOT_EXPECTED_TO_PLAY). ROS overall rank 148 (QB17). Availability: INJURED_RESERVE. Weekly ranks are preliminary when playing status is unconfirmed; they are separate from season ranks.</w:t>
       </w:r>
     </w:p>
     <w:p>
@@ -17543,7 +17543,7 @@
         <w:pStyle w:val="Normal"/>
       </w:pPr>
       <w:r>
-        <w:t xml:space="preserve">Weekly overall model rank 147 (WR55). ROS overall rank 149 (WR64). Availability: UNKNOWN. Weekly ranks are preliminary when playing status is unconfirmed; they are separate from season ranks.</w:t>
+        <w:t xml:space="preserve">Weekly overall model rank Not published (NOT_EXPECTED_TO_PLAY). ROS overall rank 149 (WR64). Availability: OUT. Weekly ranks are preliminary when playing status is unconfirmed; they are separate from season ranks.</w:t>
       </w:r>
     </w:p>
     <w:p>
@@ -17663,7 +17663,7 @@
         <w:pStyle w:val="Normal"/>
       </w:pPr>
       <w:r>
-        <w:t xml:space="preserve">Weekly overall model rank 76 (RB18). ROS overall rank 150 (RB46). Availability: UNKNOWN. Weekly ranks are preliminary when playing status is unconfirmed; they are separate from season ranks.</w:t>
+        <w:t xml:space="preserve">Weekly overall model rank 63 (RB14). ROS overall rank 150 (RB46). Availability: NO_ADVERSE_STATUS_REPORTED. Weekly ranks are preliminary when playing status is unconfirmed; they are separate from season ranks.</w:t>
       </w:r>
     </w:p>
     <w:p>
@@ -17783,7 +17783,7 @@
         <w:pStyle w:val="Normal"/>
       </w:pPr>
       <w:r>
-        <w:t xml:space="preserve">Weekly overall model rank Not published (GAME_STARTED_NO_ORIGINAL_WEEKLY_RANK). ROS overall rank 151 (WR65). Availability: UNKNOWN. Weekly ranks are preliminary when playing status is unconfirmed; they are separate from season ranks.</w:t>
+        <w:t xml:space="preserve">Weekly overall model rank Not published (GAME_STARTED_NO_ORIGINAL_WEEKLY_RANK). ROS overall rank 151 (WR65). Availability: NO_ADVERSE_STATUS_REPORTED. Weekly ranks are preliminary when playing status is unconfirmed; they are separate from season ranks.</w:t>
       </w:r>
     </w:p>
     <w:p>
@@ -17903,7 +17903,7 @@
         <w:pStyle w:val="Normal"/>
       </w:pPr>
       <w:r>
-        <w:t xml:space="preserve">Weekly overall model rank 103 (TE16). ROS overall rank 152 (TE24). Availability: UNKNOWN. Weekly ranks are preliminary when playing status is unconfirmed; they are separate from season ranks.</w:t>
+        <w:t xml:space="preserve">Weekly overall model rank 83 (TE15). ROS overall rank 152 (TE24). Availability: NO_ADVERSE_STATUS_REPORTED. Weekly ranks are preliminary when playing status is unconfirmed; they are separate from season ranks.</w:t>
       </w:r>
     </w:p>
     <w:p>
@@ -18023,7 +18023,7 @@
         <w:pStyle w:val="Normal"/>
       </w:pPr>
       <w:r>
-        <w:t xml:space="preserve">Weekly overall model rank 133 (RB35). ROS overall rank 153 (RB47). Availability: UNKNOWN. Weekly ranks are preliminary when playing status is unconfirmed; they are separate from season ranks.</w:t>
+        <w:t xml:space="preserve">Weekly overall model rank Not published (NOT_EXPECTED_TO_PLAY). ROS overall rank 153 (RB47). Availability: OUT. Weekly ranks are preliminary when playing status is unconfirmed; they are separate from season ranks.</w:t>
       </w:r>
     </w:p>
     <w:p>
@@ -18143,7 +18143,7 @@
         <w:pStyle w:val="Normal"/>
       </w:pPr>
       <w:r>
-        <w:t xml:space="preserve">Weekly overall model rank Not published (NOT_EXPECTED_TO_PLAY). ROS overall rank 154 (RB48). Availability: EXPECTED_INACTIVE. Weekly ranks are preliminary when playing status is unconfirmed; they are separate from season ranks.</w:t>
+        <w:t xml:space="preserve">Weekly overall model rank Not published (NOT_EXPECTED_TO_PLAY). ROS overall rank 154 (RB48). Availability: INJURED_RESERVE. Weekly ranks are preliminary when playing status is unconfirmed; they are separate from season ranks.</w:t>
       </w:r>
     </w:p>
     <w:p>
@@ -18263,7 +18263,7 @@
         <w:pStyle w:val="Normal"/>
       </w:pPr>
       <w:r>
-        <w:t xml:space="preserve">Weekly overall model rank 150 (RB49). ROS overall rank 155 (RB49). Availability: UNKNOWN. Weekly ranks are preliminary when playing status is unconfirmed; they are separate from season ranks.</w:t>
+        <w:t xml:space="preserve">Weekly overall model rank 120 (RB40). ROS overall rank 155 (RB49). Availability: QUESTIONABLE. Weekly ranks are preliminary when playing status is unconfirmed; they are separate from season ranks.</w:t>
       </w:r>
     </w:p>
     <w:p>
@@ -18383,7 +18383,7 @@
         <w:pStyle w:val="Normal"/>
       </w:pPr>
       <w:r>
-        <w:t xml:space="preserve">Weekly overall model rank 156 (RB54). ROS overall rank 156 (RB50). Availability: UNKNOWN. Weekly ranks are preliminary when playing status is unconfirmed; they are separate from season ranks.</w:t>
+        <w:t xml:space="preserve">Weekly overall model rank 125 (RB44). ROS overall rank 156 (RB50). Availability: NO_ADVERSE_STATUS_REPORTED. Weekly ranks are preliminary when playing status is unconfirmed; they are separate from season ranks.</w:t>
       </w:r>
     </w:p>
     <w:p>
@@ -18503,7 +18503,7 @@
         <w:pStyle w:val="Normal"/>
       </w:pPr>
       <w:r>
-        <w:t xml:space="preserve">Weekly overall model rank 110 (RB26). ROS overall rank 157 (RB51). Availability: UNKNOWN. Weekly ranks are preliminary when playing status is unconfirmed; they are separate from season ranks.</w:t>
+        <w:t xml:space="preserve">Weekly overall model rank 89 (RB21). ROS overall rank 157 (RB51). Availability: NO_ADVERSE_STATUS_REPORTED. Weekly ranks are preliminary when playing status is unconfirmed; they are separate from season ranks.</w:t>
       </w:r>
     </w:p>
     <w:p>
@@ -18623,7 +18623,7 @@
         <w:pStyle w:val="Normal"/>
       </w:pPr>
       <w:r>
-        <w:t xml:space="preserve">Weekly overall model rank 94 (WR37). ROS overall rank 158 (WR66). Availability: UNKNOWN. Weekly ranks are preliminary when playing status is unconfirmed; they are separate from season ranks.</w:t>
+        <w:t xml:space="preserve">Weekly overall model rank 77 (WR31). ROS overall rank 158 (WR66). Availability: NO_ADVERSE_STATUS_REPORTED. Weekly ranks are preliminary when playing status is unconfirmed; they are separate from season ranks.</w:t>
       </w:r>
     </w:p>
     <w:p>
@@ -18743,7 +18743,7 @@
         <w:pStyle w:val="Normal"/>
       </w:pPr>
       <w:r>
-        <w:t xml:space="preserve">Weekly overall model rank 151 (WR56). ROS overall rank 159 (WR67). Availability: UNKNOWN. Weekly ranks are preliminary when playing status is unconfirmed; they are separate from season ranks.</w:t>
+        <w:t xml:space="preserve">Weekly overall model rank 121 (WR43). ROS overall rank 159 (WR67). Availability: NO_ADVERSE_STATUS_REPORTED. Weekly ranks are preliminary when playing status is unconfirmed; they are separate from season ranks.</w:t>
       </w:r>
     </w:p>
     <w:p>
@@ -18863,7 +18863,7 @@
         <w:pStyle w:val="Normal"/>
       </w:pPr>
       <w:r>
-        <w:t xml:space="preserve">Weekly overall model rank 142 (RB42). ROS overall rank 160 (RB52). Availability: UNKNOWN. Weekly ranks are preliminary when playing status is unconfirmed; they are separate from season ranks.</w:t>
+        <w:t xml:space="preserve">Weekly overall model rank 113 (RB33). ROS overall rank 160 (RB52). Availability: NO_ADVERSE_STATUS_REPORTED. Weekly ranks are preliminary when playing status is unconfirmed; they are separate from season ranks.</w:t>
       </w:r>
     </w:p>
     <w:p>
@@ -18983,7 +18983,7 @@
         <w:pStyle w:val="Normal"/>
       </w:pPr>
       <w:r>
-        <w:t xml:space="preserve">Weekly overall model rank 136 (RB37). ROS overall rank 161 (RB53). Availability: UNKNOWN. Weekly ranks are preliminary when playing status is unconfirmed; they are separate from season ranks.</w:t>
+        <w:t xml:space="preserve">Weekly overall model rank 108 (RB29). ROS overall rank 161 (RB53). Availability: NO_ADVERSE_STATUS_REPORTED. Weekly ranks are preliminary when playing status is unconfirmed; they are separate from season ranks.</w:t>
       </w:r>
     </w:p>
     <w:p>
@@ -19103,7 +19103,7 @@
         <w:pStyle w:val="Normal"/>
       </w:pPr>
       <w:r>
-        <w:t xml:space="preserve">Weekly overall model rank 144 (RB44). ROS overall rank 162 (RB54). Availability: UNKNOWN. Weekly ranks are preliminary when playing status is unconfirmed; they are separate from season ranks.</w:t>
+        <w:t xml:space="preserve">Weekly overall model rank 115 (RB35). ROS overall rank 162 (RB54). Availability: NO_ADVERSE_STATUS_REPORTED. Weekly ranks are preliminary when playing status is unconfirmed; they are separate from season ranks.</w:t>
       </w:r>
     </w:p>
     <w:p>
@@ -19223,7 +19223,7 @@
         <w:pStyle w:val="Normal"/>
       </w:pPr>
       <w:r>
-        <w:t xml:space="preserve">Weekly overall model rank 117 (WR47). ROS overall rank 163 (WR68). Availability: UNKNOWN. Weekly ranks are preliminary when playing status is unconfirmed; they are separate from season ranks.</w:t>
+        <w:t xml:space="preserve">Weekly overall model rank 92 (WR35). ROS overall rank 163 (WR68). Availability: NO_ADVERSE_STATUS_REPORTED. Weekly ranks are preliminary when playing status is unconfirmed; they are separate from season ranks.</w:t>
       </w:r>
     </w:p>
     <w:p>
@@ -19311,7 +19311,7 @@
         <w:pStyle w:val="Normal"/>
       </w:pPr>
       <w:r>
-        <w:t xml:space="preserve">Weekly overall model rank 65 (QB24). ROS overall rank 164 (QB18). Availability: UNKNOWN. Weekly ranks are preliminary when playing status is unconfirmed; they are separate from season ranks.</w:t>
+        <w:t xml:space="preserve">Weekly overall model rank 53 (QB18). ROS overall rank 164 (QB18). Availability: NO_ADVERSE_STATUS_REPORTED. Weekly ranks are preliminary when playing status is unconfirmed; they are separate from season ranks.</w:t>
       </w:r>
     </w:p>
     <w:p>
@@ -19431,7 +19431,7 @@
         <w:pStyle w:val="Normal"/>
       </w:pPr>
       <w:r>
-        <w:t xml:space="preserve">Weekly overall model rank 25 (QB9). ROS overall rank 165 (QB19). Availability: UNKNOWN. Weekly ranks are preliminary when playing status is unconfirmed; they are separate from season ranks.</w:t>
+        <w:t xml:space="preserve">Weekly overall model rank 21 (QB6). ROS overall rank 165 (QB19). Availability: NO_ADVERSE_STATUS_REPORTED. Weekly ranks are preliminary when playing status is unconfirmed; they are separate from season ranks.</w:t>
       </w:r>
     </w:p>
     <w:p>
@@ -19551,7 +19551,7 @@
         <w:pStyle w:val="Normal"/>
       </w:pPr>
       <w:r>
-        <w:t xml:space="preserve">Weekly overall model rank 135 (RB36). ROS overall rank 166 (RB55). Availability: UNKNOWN. Weekly ranks are preliminary when playing status is unconfirmed; they are separate from season ranks.</w:t>
+        <w:t xml:space="preserve">Weekly overall model rank 107 (RB28). ROS overall rank 166 (RB55). Availability: NO_ADVERSE_STATUS_REPORTED. Weekly ranks are preliminary when playing status is unconfirmed; they are separate from season ranks.</w:t>
       </w:r>
     </w:p>
     <w:p>
@@ -19655,7 +19655,7 @@
         <w:pStyle w:val="Normal"/>
       </w:pPr>
       <w:r>
-        <w:t xml:space="preserve">Weekly overall model rank 146 (RB46). ROS overall rank 167 (RB56). Availability: UNKNOWN. Weekly ranks are preliminary when playing status is unconfirmed; they are separate from season ranks.</w:t>
+        <w:t xml:space="preserve">Weekly overall model rank 117 (RB37). ROS overall rank 167 (RB56). Availability: NO_ADVERSE_STATUS_REPORTED. Weekly ranks are preliminary when playing status is unconfirmed; they are separate from season ranks.</w:t>
       </w:r>
     </w:p>
     <w:p>
@@ -19775,7 +19775,7 @@
         <w:pStyle w:val="Normal"/>
       </w:pPr>
       <w:r>
-        <w:t xml:space="preserve">Weekly overall model rank 26 (QB10). ROS overall rank 168 (QB20). Availability: UNKNOWN. Weekly ranks are preliminary when playing status is unconfirmed; they are separate from season ranks.</w:t>
+        <w:t xml:space="preserve">Weekly overall model rank 22 (QB7). ROS overall rank 168 (QB20). Availability: NO_ADVERSE_STATUS_REPORTED. Weekly ranks are preliminary when playing status is unconfirmed; they are separate from season ranks.</w:t>
       </w:r>
     </w:p>
     <w:p>
@@ -19895,7 +19895,7 @@
         <w:pStyle w:val="Normal"/>
       </w:pPr>
       <w:r>
-        <w:t xml:space="preserve">Weekly overall model rank 154 (RB52). ROS overall rank 169 (RB57). Availability: UNKNOWN. Weekly ranks are preliminary when playing status is unconfirmed; they are separate from season ranks.</w:t>
+        <w:t xml:space="preserve">Weekly overall model rank Not published (GAME_STARTED_NO_ORIGINAL_WEEKLY_RANK). ROS overall rank 169 (RB57). Availability: NO_ADVERSE_STATUS_REPORTED. Weekly ranks are preliminary when playing status is unconfirmed; they are separate from season ranks.</w:t>
       </w:r>
     </w:p>
     <w:p>
@@ -19983,7 +19983,7 @@
         <w:pStyle w:val="Normal"/>
       </w:pPr>
       <w:r>
-        <w:t xml:space="preserve">Weekly overall model rank 27 (QB11). ROS overall rank 170 (QB21). Availability: UNKNOWN. Weekly ranks are preliminary when playing status is unconfirmed; they are separate from season ranks.</w:t>
+        <w:t xml:space="preserve">Weekly overall model rank 23 (QB8). ROS overall rank 170 (QB21). Availability: NO_ADVERSE_STATUS_REPORTED. Weekly ranks are preliminary when playing status is unconfirmed; they are separate from season ranks.</w:t>
       </w:r>
     </w:p>
     <w:p>
@@ -20103,7 +20103,7 @@
         <w:pStyle w:val="Normal"/>
       </w:pPr>
       <w:r>
-        <w:t xml:space="preserve">Weekly overall model rank 155 (RB53). ROS overall rank 171 (RB58). Availability: UNKNOWN. Weekly ranks are preliminary when playing status is unconfirmed; they are separate from season ranks.</w:t>
+        <w:t xml:space="preserve">Weekly overall model rank 124 (RB43). ROS overall rank 171 (RB58). Availability: NO_ADVERSE_STATUS_REPORTED. Weekly ranks are preliminary when playing status is unconfirmed; they are separate from season ranks.</w:t>
       </w:r>
     </w:p>
     <w:p>
@@ -20191,7 +20191,7 @@
         <w:pStyle w:val="Normal"/>
       </w:pPr>
       <w:r>
-        <w:t xml:space="preserve">Weekly overall model rank 153 (RB51). ROS overall rank 172 (RB59). Availability: UNKNOWN. Weekly ranks are preliminary when playing status is unconfirmed; they are separate from season ranks.</w:t>
+        <w:t xml:space="preserve">Weekly overall model rank 123 (RB42). ROS overall rank 172 (RB59). Availability: NO_ADVERSE_STATUS_REPORTED. Weekly ranks are preliminary when playing status is unconfirmed; they are separate from season ranks.</w:t>
       </w:r>
     </w:p>
     <w:p>
@@ -20311,7 +20311,7 @@
         <w:pStyle w:val="Normal"/>
       </w:pPr>
       <w:r>
-        <w:t xml:space="preserve">Weekly overall model rank 149 (RB48). ROS overall rank 173 (RB60). Availability: UNKNOWN. Weekly ranks are preliminary when playing status is unconfirmed; they are separate from season ranks.</w:t>
+        <w:t xml:space="preserve">Weekly overall model rank 119 (RB39). ROS overall rank 173 (RB60). Availability: UNKNOWN. Weekly ranks are preliminary when playing status is unconfirmed; they are separate from season ranks.</w:t>
       </w:r>
     </w:p>
     <w:p>
@@ -20431,7 +20431,7 @@
         <w:pStyle w:val="Normal"/>
       </w:pPr>
       <w:r>
-        <w:t xml:space="preserve">Weekly overall model rank 161 (WR59). ROS overall rank 174 (WR69). Availability: UNKNOWN. Weekly ranks are preliminary when playing status is unconfirmed; they are separate from season ranks.</w:t>
+        <w:t xml:space="preserve">Weekly overall model rank 129 (WR45). ROS overall rank 174 (WR69). Availability: NO_ADVERSE_STATUS_REPORTED. Weekly ranks are preliminary when playing status is unconfirmed; they are separate from season ranks.</w:t>
       </w:r>
     </w:p>
     <w:p>
@@ -20551,7 +20551,7 @@
         <w:pStyle w:val="Normal"/>
       </w:pPr>
       <w:r>
-        <w:t xml:space="preserve">Weekly overall model rank 38 (QB16). ROS overall rank 175 (QB22). Availability: UNKNOWN. Weekly ranks are preliminary when playing status is unconfirmed; they are separate from season ranks.</w:t>
+        <w:t xml:space="preserve">Weekly overall model rank 31 (QB12). ROS overall rank 175 (QB22). Availability: NO_ADVERSE_STATUS_REPORTED. Weekly ranks are preliminary when playing status is unconfirmed; they are separate from season ranks.</w:t>
       </w:r>
     </w:p>
     <w:p>
@@ -20671,7 +20671,7 @@
         <w:pStyle w:val="Normal"/>
       </w:pPr>
       <w:r>
-        <w:t xml:space="preserve">Weekly overall model rank 141 (WR54). ROS overall rank 176 (WR70). Availability: UNKNOWN. Weekly ranks are preliminary when playing status is unconfirmed; they are separate from season ranks.</w:t>
+        <w:t xml:space="preserve">Weekly overall model rank 112 (WR42). ROS overall rank 176 (WR70). Availability: NO_ADVERSE_STATUS_REPORTED. Weekly ranks are preliminary when playing status is unconfirmed; they are separate from season ranks.</w:t>
       </w:r>
     </w:p>
     <w:p>
@@ -20759,7 +20759,7 @@
         <w:pStyle w:val="Normal"/>
       </w:pPr>
       <w:r>
-        <w:t xml:space="preserve">Weekly overall model rank 160 (WR58). ROS overall rank 177 (WR71). Availability: UNKNOWN. Weekly ranks are preliminary when playing status is unconfirmed; they are separate from season ranks.</w:t>
+        <w:t xml:space="preserve">Weekly overall model rank 128 (WR44). ROS overall rank 177 (WR71). Availability: NO_ADVERSE_STATUS_REPORTED. Weekly ranks are preliminary when playing status is unconfirmed; they are separate from season ranks.</w:t>
       </w:r>
     </w:p>
     <w:p>
@@ -20879,7 +20879,7 @@
         <w:pStyle w:val="Normal"/>
       </w:pPr>
       <w:r>
-        <w:t xml:space="preserve">Weekly overall model rank 158 (WR57). ROS overall rank 178 (WR72). Availability: UNKNOWN. Weekly ranks are preliminary when playing status is unconfirmed; they are separate from season ranks.</w:t>
+        <w:t xml:space="preserve">Weekly overall model rank Not published (NOT_EXPECTED_TO_PLAY). ROS overall rank 178 (WR72). Availability: OUT. Weekly ranks are preliminary when playing status is unconfirmed; they are separate from season ranks.</w:t>
       </w:r>
     </w:p>
     <w:p>
@@ -20967,7 +20967,7 @@
         <w:pStyle w:val="Normal"/>
       </w:pPr>
       <w:r>
-        <w:t xml:space="preserve">Weekly overall model rank 163 (TE23). ROS overall rank 179 (TE25). Availability: UNKNOWN. Weekly ranks are preliminary when playing status is unconfirmed; they are separate from season ranks.</w:t>
+        <w:t xml:space="preserve">Weekly overall model rank 131 (TE21). ROS overall rank 179 (TE25). Availability: NO_ADVERSE_STATUS_REPORTED. Weekly ranks are preliminary when playing status is unconfirmed; they are separate from season ranks.</w:t>
       </w:r>
     </w:p>
     <w:p>
@@ -21087,7 +21087,7 @@
         <w:pStyle w:val="Normal"/>
       </w:pPr>
       <w:r>
-        <w:t xml:space="preserve">Weekly overall model rank 152 (RB50). ROS overall rank 180 (RB61). Availability: UNKNOWN. Weekly ranks are preliminary when playing status is unconfirmed; they are separate from season ranks.</w:t>
+        <w:t xml:space="preserve">Weekly overall model rank 122 (RB41). ROS overall rank 180 (RB61). Availability: NO_ADVERSE_STATUS_REPORTED. Weekly ranks are preliminary when playing status is unconfirmed; they are separate from season ranks.</w:t>
       </w:r>
     </w:p>
     <w:p>
@@ -21175,7 +21175,7 @@
         <w:pStyle w:val="Normal"/>
       </w:pPr>
       <w:r>
-        <w:t xml:space="preserve">Weekly overall model rank Not published (NOT_EXPECTED_TO_PLAY). ROS overall rank 181 (RB62). Availability: EXPECTED_INACTIVE. Weekly ranks are preliminary when playing status is unconfirmed; they are separate from season ranks.</w:t>
+        <w:t xml:space="preserve">Weekly overall model rank Not published (NOT_EXPECTED_TO_PLAY). ROS overall rank 181 (RB62). Availability: INJURED_RESERVE. Weekly ranks are preliminary when playing status is unconfirmed; they are separate from season ranks.</w:t>
       </w:r>
     </w:p>
     <w:p>
@@ -21295,7 +21295,7 @@
         <w:pStyle w:val="Normal"/>
       </w:pPr>
       <w:r>
-        <w:t xml:space="preserve">Weekly overall model rank 42 (QB18). ROS overall rank 182 (QB23). Availability: UNKNOWN. Weekly ranks are preliminary when playing status is unconfirmed; they are separate from season ranks.</w:t>
+        <w:t xml:space="preserve">Weekly overall model rank 33 (QB13). ROS overall rank 182 (QB23). Availability: NO_ADVERSE_STATUS_REPORTED. Weekly ranks are preliminary when playing status is unconfirmed; they are separate from season ranks.</w:t>
       </w:r>
     </w:p>
     <w:p>
@@ -21415,7 +21415,7 @@
         <w:pStyle w:val="Normal"/>
       </w:pPr>
       <w:r>
-        <w:t xml:space="preserve">Weekly overall model rank 157 (RB55). ROS overall rank 183 (RB63). Availability: UNKNOWN. Weekly ranks are preliminary when playing status is unconfirmed; they are separate from season ranks.</w:t>
+        <w:t xml:space="preserve">Weekly overall model rank 126 (RB45). ROS overall rank 183 (RB63). Availability: NO_ADVERSE_STATUS_REPORTED. Weekly ranks are preliminary when playing status is unconfirmed; they are separate from season ranks.</w:t>
       </w:r>
     </w:p>
     <w:p>
@@ -21535,7 +21535,7 @@
         <w:pStyle w:val="Normal"/>
       </w:pPr>
       <w:r>
-        <w:t xml:space="preserve">Weekly overall model rank 162 (RB56). ROS overall rank 184 (RB64). Availability: UNKNOWN. Weekly ranks are preliminary when playing status is unconfirmed; they are separate from season ranks.</w:t>
+        <w:t xml:space="preserve">Weekly overall model rank 130 (RB46). ROS overall rank 184 (RB64). Availability: QUESTIONABLE. Weekly ranks are preliminary when playing status is unconfirmed; they are separate from season ranks.</w:t>
       </w:r>
     </w:p>
     <w:p>
@@ -21655,7 +21655,7 @@
         <w:pStyle w:val="Normal"/>
       </w:pPr>
       <w:r>
-        <w:t xml:space="preserve">Weekly overall model rank 48 (QB20). ROS overall rank 185 (QB24). Availability: UNKNOWN. Weekly ranks are preliminary when playing status is unconfirmed; they are separate from season ranks.</w:t>
+        <w:t xml:space="preserve">Weekly overall model rank 39 (QB15). ROS overall rank 185 (QB24). Availability: NO_ADVERSE_STATUS_REPORTED. Weekly ranks are preliminary when playing status is unconfirmed; they are separate from season ranks.</w:t>
       </w:r>
     </w:p>
     <w:p>
@@ -21775,7 +21775,7 @@
         <w:pStyle w:val="Normal"/>
       </w:pPr>
       <w:r>
-        <w:t xml:space="preserve">Weekly overall model rank Not published (GAME_STARTED_NO_ORIGINAL_WEEKLY_RANK). ROS overall rank 186 (QB25). Availability: UNKNOWN. Weekly ranks are preliminary when playing status is unconfirmed; they are separate from season ranks.</w:t>
+        <w:t xml:space="preserve">Weekly overall model rank Not published (NOT_EXPECTED_TO_PLAY). ROS overall rank 186 (QB25). Availability: OUT. Weekly ranks are preliminary when playing status is unconfirmed; they are separate from season ranks.</w:t>
       </w:r>
     </w:p>
     <w:p>
@@ -21895,7 +21895,7 @@
         <w:pStyle w:val="Normal"/>
       </w:pPr>
       <w:r>
-        <w:t xml:space="preserve">Weekly overall model rank 159 (TE22). ROS overall rank 187 (TE26). Availability: UNKNOWN. Weekly ranks are preliminary when playing status is unconfirmed; they are separate from season ranks.</w:t>
+        <w:t xml:space="preserve">Weekly overall model rank 127 (TE20). ROS overall rank 187 (TE26). Availability: NO_ADVERSE_STATUS_REPORTED. Weekly ranks are preliminary when playing status is unconfirmed; they are separate from season ranks.</w:t>
       </w:r>
     </w:p>
     <w:p>
@@ -22015,7 +22015,7 @@
         <w:pStyle w:val="Normal"/>
       </w:pPr>
       <w:r>
-        <w:t xml:space="preserve">Weekly overall model rank 45 (QB19). ROS overall rank 188 (QB26). Availability: UNKNOWN. Weekly ranks are preliminary when playing status is unconfirmed; they are separate from season ranks.</w:t>
+        <w:t xml:space="preserve">Weekly overall model rank 36 (QB14). ROS overall rank 188 (QB26). Availability: NO_ADVERSE_STATUS_REPORTED. Weekly ranks are preliminary when playing status is unconfirmed; they are separate from season ranks.</w:t>
       </w:r>
     </w:p>
     <w:p>
@@ -22135,7 +22135,7 @@
         <w:pStyle w:val="Normal"/>
       </w:pPr>
       <w:r>
-        <w:t xml:space="preserve">Weekly overall model rank 166 (RB58). ROS overall rank 189 (RB65). Availability: UNKNOWN. Weekly ranks are preliminary when playing status is unconfirmed; they are separate from season ranks.</w:t>
+        <w:t xml:space="preserve">Weekly overall model rank Not published (NOT_EXPECTED_TO_PLAY). ROS overall rank 189 (RB65). Availability: INJURED_RESERVE. Weekly ranks are preliminary when playing status is unconfirmed; they are separate from season ranks.</w:t>
       </w:r>
     </w:p>
     <w:p>
@@ -22255,7 +22255,7 @@
         <w:pStyle w:val="Normal"/>
       </w:pPr>
       <w:r>
-        <w:t xml:space="preserve">Weekly overall model rank 114 (QB25). ROS overall rank 190 (QB27). Availability: UNKNOWN. Weekly ranks are preliminary when playing status is unconfirmed; they are separate from season ranks.</w:t>
+        <w:t xml:space="preserve">Weekly overall model rank 90 (QB19). ROS overall rank 190 (QB27). Availability: NO_ADVERSE_STATUS_REPORTED. Weekly ranks are preliminary when playing status is unconfirmed; they are separate from season ranks.</w:t>
       </w:r>
     </w:p>
     <w:p>
@@ -22343,7 +22343,7 @@
         <w:pStyle w:val="Normal"/>
       </w:pPr>
       <w:r>
-        <w:t xml:space="preserve">Weekly overall model rank 165 (RB57). ROS overall rank 191 (RB66). Availability: UNKNOWN. Weekly ranks are preliminary when playing status is unconfirmed; they are separate from season ranks.</w:t>
+        <w:t xml:space="preserve">Weekly overall model rank Not published (NOT_EXPECTED_TO_PLAY). ROS overall rank 191 (RB66). Availability: OUT. Weekly ranks are preliminary when playing status is unconfirmed; they are separate from season ranks.</w:t>
       </w:r>
     </w:p>
     <w:p>
@@ -22463,7 +22463,7 @@
         <w:pStyle w:val="Normal"/>
       </w:pPr>
       <w:r>
-        <w:t xml:space="preserve">Weekly overall model rank 56 (QB22). ROS overall rank 192 (QB28). Availability: UNKNOWN. Weekly ranks are preliminary when playing status is unconfirmed; they are separate from season ranks.</w:t>
+        <w:t xml:space="preserve">Weekly overall model rank 45 (QB16). ROS overall rank 192 (QB28). Availability: NO_ADVERSE_STATUS_REPORTED. Weekly ranks are preliminary when playing status is unconfirmed; they are separate from season ranks.</w:t>
       </w:r>
     </w:p>
     <w:p>
@@ -22583,7 +22583,7 @@
         <w:pStyle w:val="Normal"/>
       </w:pPr>
       <w:r>
-        <w:t xml:space="preserve">Weekly overall model rank 164 (WR60). ROS overall rank 193 (WR73). Availability: UNKNOWN. Weekly ranks are preliminary when playing status is unconfirmed; they are separate from season ranks.</w:t>
+        <w:t xml:space="preserve">Weekly overall model rank 132 (WR46). ROS overall rank 193 (WR73). Availability: NO_ADVERSE_STATUS_REPORTED. Weekly ranks are preliminary when playing status is unconfirmed; they are separate from season ranks.</w:t>
       </w:r>
     </w:p>
     <w:p>
@@ -22703,7 +22703,7 @@
         <w:pStyle w:val="Normal"/>
       </w:pPr>
       <w:r>
-        <w:t xml:space="preserve">Weekly overall model rank 60 (QB23). ROS overall rank 194 (QB29). Availability: UNKNOWN. Weekly ranks are preliminary when playing status is unconfirmed; they are separate from season ranks.</w:t>
+        <w:t xml:space="preserve">Weekly overall model rank 48 (QB17). ROS overall rank 194 (QB29). Availability: NO_ADVERSE_STATUS_REPORTED. Weekly ranks are preliminary when playing status is unconfirmed; they are separate from season ranks.</w:t>
       </w:r>
     </w:p>
     <w:p>
@@ -22823,7 +22823,7 @@
         <w:pStyle w:val="Normal"/>
       </w:pPr>
       <w:r>
-        <w:t xml:space="preserve">Weekly overall model rank Not published (NOT_EXPECTED_TO_PLAY). ROS overall rank 195 (WR74). Availability: EXPECTED_INACTIVE. Weekly ranks are preliminary when playing status is unconfirmed; they are separate from season ranks.</w:t>
+        <w:t xml:space="preserve">Weekly overall model rank Not published (NOT_EXPECTED_TO_PLAY). ROS overall rank 195 (WR74). Availability: INJURED_RESERVE. Weekly ranks are preliminary when playing status is unconfirmed; they are separate from season ranks.</w:t>
       </w:r>
     </w:p>
     <w:p>
@@ -22943,7 +22943,7 @@
         <w:pStyle w:val="Normal"/>
       </w:pPr>
       <w:r>
-        <w:t xml:space="preserve">Weekly overall model rank 167 (WR61). ROS overall rank 196 (WR75). Availability: UNKNOWN. Weekly ranks are preliminary when playing status is unconfirmed; they are separate from season ranks.</w:t>
+        <w:t xml:space="preserve">Weekly overall model rank Not published (NOT_EXPECTED_TO_PLAY). ROS overall rank 196 (WR75). Availability: INJURED_RESERVE. Weekly ranks are preliminary when playing status is unconfirmed; they are separate from season ranks.</w:t>
       </w:r>
     </w:p>
     <w:p>
@@ -23063,7 +23063,7 @@
         <w:pStyle w:val="Normal"/>
       </w:pPr>
       <w:r>
-        <w:t xml:space="preserve">Weekly overall model rank 143 (RB43). ROS overall rank 197 (RB67). Availability: UNKNOWN. Weekly ranks are preliminary when playing status is unconfirmed; they are separate from season ranks.</w:t>
+        <w:t xml:space="preserve">Weekly overall model rank 114 (RB34). ROS overall rank 197 (RB67). Availability: NO_ADVERSE_STATUS_REPORTED. Weekly ranks are preliminary when playing status is unconfirmed; they are separate from season ranks.</w:t>
       </w:r>
     </w:p>
     <w:p>

</xml_diff>

<commit_message>
Run ordered weekly production lifecycle
</commit_message>
<xml_diff>
--- a/exports/fantasy-2026-current.docx
+++ b/exports/fantasy-2026-current.docx
@@ -55,7 +55,7 @@
         <w:pStyle w:val="Normal"/>
       </w:pPr>
       <w:r>
-        <w:t xml:space="preserve">Weekly overall model rank 4 (RB2). ROS overall rank 1 (RB1). Availability: NO_ADVERSE_STATUS_REPORTED. Weekly ranks are preliminary when playing status is unconfirmed; they are separate from season ranks.</w:t>
+        <w:t xml:space="preserve">Weekly overall model rank 3 (RB2). ROS overall rank 1 (RB1). Availability: NO_ADVERSE_STATUS_REPORTED. Weekly ranks are preliminary when playing status is unconfirmed; they are separate from season ranks.</w:t>
       </w:r>
     </w:p>
     <w:p>
@@ -295,7 +295,7 @@
         <w:pStyle w:val="Normal"/>
       </w:pPr>
       <w:r>
-        <w:t xml:space="preserve">Weekly overall model rank 3 (WR1). ROS overall rank 3 (WR1). Availability: QUESTIONABLE. Weekly ranks are preliminary when playing status is unconfirmed; they are separate from season ranks.</w:t>
+        <w:t xml:space="preserve">Weekly overall model rank Not published (GAME_STARTED_NO_ORIGINAL_WEEKLY_RANK). ROS overall rank 3 (WR1). Availability: QUESTIONABLE. Weekly ranks are preliminary when playing status is unconfirmed; they are separate from season ranks.</w:t>
       </w:r>
     </w:p>
     <w:p>
@@ -415,7 +415,7 @@
         <w:pStyle w:val="Normal"/>
       </w:pPr>
       <w:r>
-        <w:t xml:space="preserve">Weekly overall model rank 17 (WR6). ROS overall rank 4 (WR2). Availability: NO_ADVERSE_STATUS_REPORTED. Weekly ranks are preliminary when playing status is unconfirmed; they are separate from season ranks.</w:t>
+        <w:t xml:space="preserve">Weekly overall model rank 9 (WR3). ROS overall rank 4 (WR2). Availability: NO_ADVERSE_STATUS_REPORTED. Weekly ranks are preliminary when playing status is unconfirmed; they are separate from season ranks.</w:t>
       </w:r>
     </w:p>
     <w:p>
@@ -535,7 +535,7 @@
         <w:pStyle w:val="Normal"/>
       </w:pPr>
       <w:r>
-        <w:t xml:space="preserve">Weekly overall model rank 12 (WR4). ROS overall rank 5 (WR3). Availability: NO_ADVERSE_STATUS_REPORTED. Weekly ranks are preliminary when playing status is unconfirmed; they are separate from season ranks.</w:t>
+        <w:t xml:space="preserve">Weekly overall model rank 7 (WR2). ROS overall rank 5 (WR3). Availability: NO_ADVERSE_STATUS_REPORTED. Weekly ranks are preliminary when playing status is unconfirmed; they are separate from season ranks.</w:t>
       </w:r>
     </w:p>
     <w:p>
@@ -655,7 +655,7 @@
         <w:pStyle w:val="Normal"/>
       </w:pPr>
       <w:r>
-        <w:t xml:space="preserve">Weekly overall model rank 5 (WR2). ROS overall rank 6 (WR4). Availability: NO_ADVERSE_STATUS_REPORTED. Weekly ranks are preliminary when playing status is unconfirmed; they are separate from season ranks.</w:t>
+        <w:t xml:space="preserve">Weekly overall model rank 4 (WR1). ROS overall rank 6 (WR4). Availability: NO_ADVERSE_STATUS_REPORTED. Weekly ranks are preliminary when playing status is unconfirmed; they are separate from season ranks.</w:t>
       </w:r>
     </w:p>
     <w:p>
@@ -743,7 +743,7 @@
         <w:pStyle w:val="Normal"/>
       </w:pPr>
       <w:r>
-        <w:t xml:space="preserve">Weekly overall model rank 11 (RB4). ROS overall rank 7 (RB3). Availability: NO_ADVERSE_STATUS_REPORTED. Weekly ranks are preliminary when playing status is unconfirmed; they are separate from season ranks.</w:t>
+        <w:t xml:space="preserve">Weekly overall model rank 6 (RB3). ROS overall rank 7 (RB3). Availability: NO_ADVERSE_STATUS_REPORTED. Weekly ranks are preliminary when playing status is unconfirmed; they are separate from season ranks.</w:t>
       </w:r>
     </w:p>
     <w:p>
@@ -1103,7 +1103,7 @@
         <w:pStyle w:val="Normal"/>
       </w:pPr>
       <w:r>
-        <w:t xml:space="preserve">Weekly overall model rank 10 (RB3). ROS overall rank 10 (RB5). Availability: NO_ADVERSE_STATUS_REPORTED. Weekly ranks are preliminary when playing status is unconfirmed; they are separate from season ranks.</w:t>
+        <w:t xml:space="preserve">Weekly overall model rank Not published (GAME_STARTED_NO_ORIGINAL_WEEKLY_RANK). ROS overall rank 10 (RB5). Availability: NO_ADVERSE_STATUS_REPORTED. Weekly ranks are preliminary when playing status is unconfirmed; they are separate from season ranks.</w:t>
       </w:r>
     </w:p>
     <w:p>
@@ -1223,7 +1223,7 @@
         <w:pStyle w:val="Normal"/>
       </w:pPr>
       <w:r>
-        <w:t xml:space="preserve">Weekly overall model rank 7 (TE1). ROS overall rank 11 (TE1). Availability: NO_ADVERSE_STATUS_REPORTED. Weekly ranks are preliminary when playing status is unconfirmed; they are separate from season ranks.</w:t>
+        <w:t xml:space="preserve">Weekly overall model rank 5 (TE1). ROS overall rank 11 (TE1). Availability: NO_ADVERSE_STATUS_REPORTED. Weekly ranks are preliminary when playing status is unconfirmed; they are separate from season ranks.</w:t>
       </w:r>
     </w:p>
     <w:p>
@@ -1343,7 +1343,7 @@
         <w:pStyle w:val="Normal"/>
       </w:pPr>
       <w:r>
-        <w:t xml:space="preserve">Weekly overall model rank 14 (RB5). ROS overall rank 12 (RB6). Availability: NO_ADVERSE_STATUS_REPORTED. Weekly ranks are preliminary when playing status is unconfirmed; they are separate from season ranks.</w:t>
+        <w:t xml:space="preserve">Weekly overall model rank 8 (RB4). ROS overall rank 12 (RB6). Availability: NO_ADVERSE_STATUS_REPORTED. Weekly ranks are preliminary when playing status is unconfirmed; they are separate from season ranks.</w:t>
       </w:r>
     </w:p>
     <w:p>
@@ -1463,7 +1463,7 @@
         <w:pStyle w:val="Normal"/>
       </w:pPr>
       <w:r>
-        <w:t xml:space="preserve">Weekly overall model rank 9 (WR3). ROS overall rank 13 (WR6). Availability: QUESTIONABLE. Weekly ranks are preliminary when playing status is unconfirmed; they are separate from season ranks.</w:t>
+        <w:t xml:space="preserve">Weekly overall model rank Not published (GAME_STARTED_NO_ORIGINAL_WEEKLY_RANK). ROS overall rank 13 (WR6). Availability: QUESTIONABLE. Weekly ranks are preliminary when playing status is unconfirmed; they are separate from season ranks.</w:t>
       </w:r>
     </w:p>
     <w:p>
@@ -1583,7 +1583,7 @@
         <w:pStyle w:val="Normal"/>
       </w:pPr>
       <w:r>
-        <w:t xml:space="preserve">Weekly overall model rank 32 (RB10). ROS overall rank 14 (RB7). Availability: QUESTIONABLE. Weekly ranks are preliminary when playing status is unconfirmed; they are separate from season ranks.</w:t>
+        <w:t xml:space="preserve">Weekly overall model rank Not published (GAME_STARTED_NO_ORIGINAL_WEEKLY_RANK). ROS overall rank 14 (RB7). Availability: QUESTIONABLE. Weekly ranks are preliminary when playing status is unconfirmed; they are separate from season ranks.</w:t>
       </w:r>
     </w:p>
     <w:p>
@@ -1703,7 +1703,7 @@
         <w:pStyle w:val="Normal"/>
       </w:pPr>
       <w:r>
-        <w:t xml:space="preserve">Weekly overall model rank 29 (RB9). ROS overall rank 15 (RB8). Availability: NO_ADVERSE_STATUS_REPORTED. Weekly ranks are preliminary when playing status is unconfirmed; they are separate from season ranks.</w:t>
+        <w:t xml:space="preserve">Weekly overall model rank Not published (GAME_STARTED_NO_ORIGINAL_WEEKLY_RANK). ROS overall rank 15 (RB8). Availability: NO_ADVERSE_STATUS_REPORTED. Weekly ranks are preliminary when playing status is unconfirmed; they are separate from season ranks.</w:t>
       </w:r>
     </w:p>
     <w:p>
@@ -1823,7 +1823,7 @@
         <w:pStyle w:val="Normal"/>
       </w:pPr>
       <w:r>
-        <w:t xml:space="preserve">Weekly overall model rank 20 (WR7). ROS overall rank 16 (WR7). Availability: NO_ADVERSE_STATUS_REPORTED. Weekly ranks are preliminary when playing status is unconfirmed; they are separate from season ranks.</w:t>
+        <w:t xml:space="preserve">Weekly overall model rank 11 (WR4). ROS overall rank 16 (WR7). Availability: NO_ADVERSE_STATUS_REPORTED. Weekly ranks are preliminary when playing status is unconfirmed; they are separate from season ranks.</w:t>
       </w:r>
     </w:p>
     <w:p>
@@ -1911,7 +1911,7 @@
         <w:pStyle w:val="Normal"/>
       </w:pPr>
       <w:r>
-        <w:t xml:space="preserve">Weekly overall model rank 26 (RB8). ROS overall rank 17 (RB9). Availability: NO_ADVERSE_STATUS_REPORTED. Weekly ranks are preliminary when playing status is unconfirmed; they are separate from season ranks.</w:t>
+        <w:t xml:space="preserve">Weekly overall model rank Not published (GAME_STARTED_NO_ORIGINAL_WEEKLY_RANK). ROS overall rank 17 (RB9). Availability: NO_ADVERSE_STATUS_REPORTED. Weekly ranks are preliminary when playing status is unconfirmed; they are separate from season ranks.</w:t>
       </w:r>
     </w:p>
     <w:p>
@@ -1999,7 +1999,7 @@
         <w:pStyle w:val="Normal"/>
       </w:pPr>
       <w:r>
-        <w:t xml:space="preserve">Weekly overall model rank 15 (WR5). ROS overall rank 18 (WR8). Availability: NO_ADVERSE_STATUS_REPORTED. Weekly ranks are preliminary when playing status is unconfirmed; they are separate from season ranks.</w:t>
+        <w:t xml:space="preserve">Weekly overall model rank Not published (GAME_STARTED_NO_ORIGINAL_WEEKLY_RANK). ROS overall rank 18 (WR8). Availability: NO_ADVERSE_STATUS_REPORTED. Weekly ranks are preliminary when playing status is unconfirmed; they are separate from season ranks.</w:t>
       </w:r>
     </w:p>
     <w:p>
@@ -2239,7 +2239,7 @@
         <w:pStyle w:val="Normal"/>
       </w:pPr>
       <w:r>
-        <w:t xml:space="preserve">Weekly overall model rank 16 (TE2). ROS overall rank 20 (TE2). Availability: NO_ADVERSE_STATUS_REPORTED. Weekly ranks are preliminary when playing status is unconfirmed; they are separate from season ranks.</w:t>
+        <w:t xml:space="preserve">Weekly overall model rank Not published (GAME_STARTED_NO_ORIGINAL_WEEKLY_RANK). ROS overall rank 20 (TE2). Availability: NO_ADVERSE_STATUS_REPORTED. Weekly ranks are preliminary when playing status is unconfirmed; they are separate from season ranks.</w:t>
       </w:r>
     </w:p>
     <w:p>
@@ -2479,7 +2479,7 @@
         <w:pStyle w:val="Normal"/>
       </w:pPr>
       <w:r>
-        <w:t xml:space="preserve">Weekly overall model rank 19 (RB6). ROS overall rank 22 (RB12). Availability: NO_ADVERSE_STATUS_REPORTED. Weekly ranks are preliminary when playing status is unconfirmed; they are separate from season ranks.</w:t>
+        <w:t xml:space="preserve">Weekly overall model rank 10 (RB5). ROS overall rank 22 (RB12). Availability: NO_ADVERSE_STATUS_REPORTED. Weekly ranks are preliminary when playing status is unconfirmed; they are separate from season ranks.</w:t>
       </w:r>
     </w:p>
     <w:p>
@@ -2959,7 +2959,7 @@
         <w:pStyle w:val="Normal"/>
       </w:pPr>
       <w:r>
-        <w:t xml:space="preserve">Weekly overall model rank 24 (RB7). ROS overall rank 26 (RB14). Availability: NO_ADVERSE_STATUS_REPORTED. Weekly ranks are preliminary when playing status is unconfirmed; they are separate from season ranks.</w:t>
+        <w:t xml:space="preserve">Weekly overall model rank 14 (RB6). ROS overall rank 26 (RB14). Availability: NO_ADVERSE_STATUS_REPORTED. Weekly ranks are preliminary when playing status is unconfirmed; they are separate from season ranks.</w:t>
       </w:r>
     </w:p>
     <w:p>
@@ -3079,7 +3079,7 @@
         <w:pStyle w:val="Normal"/>
       </w:pPr>
       <w:r>
-        <w:t xml:space="preserve">Weekly overall model rank 30 (WR8). ROS overall rank 27 (WR11). Availability: NO_ADVERSE_STATUS_REPORTED. Weekly ranks are preliminary when playing status is unconfirmed; they are separate from season ranks.</w:t>
+        <w:t xml:space="preserve">Weekly overall model rank Not published (GAME_STARTED_NO_ORIGINAL_WEEKLY_RANK). ROS overall rank 27 (WR11). Availability: NO_ADVERSE_STATUS_REPORTED. Weekly ranks are preliminary when playing status is unconfirmed; they are separate from season ranks.</w:t>
       </w:r>
     </w:p>
     <w:p>
@@ -3439,7 +3439,7 @@
         <w:pStyle w:val="Normal"/>
       </w:pPr>
       <w:r>
-        <w:t xml:space="preserve">Weekly overall model rank 38 (WR11). ROS overall rank 30 (WR14). Availability: NO_ADVERSE_STATUS_REPORTED. Weekly ranks are preliminary when playing status is unconfirmed; they are separate from season ranks.</w:t>
+        <w:t xml:space="preserve">Weekly overall model rank Not published (GAME_STARTED_NO_ORIGINAL_WEEKLY_RANK). ROS overall rank 30 (WR14). Availability: NO_ADVERSE_STATUS_REPORTED. Weekly ranks are preliminary when playing status is unconfirmed; they are separate from season ranks.</w:t>
       </w:r>
     </w:p>
     <w:p>
@@ -3679,7 +3679,7 @@
         <w:pStyle w:val="Normal"/>
       </w:pPr>
       <w:r>
-        <w:t xml:space="preserve">Weekly overall model rank 35 (WR9). ROS overall rank 32 (WR15). Availability: QUESTIONABLE. Weekly ranks are preliminary when playing status is unconfirmed; they are separate from season ranks.</w:t>
+        <w:t xml:space="preserve">Weekly overall model rank 17 (WR5). ROS overall rank 32 (WR15). Availability: QUESTIONABLE. Weekly ranks are preliminary when playing status is unconfirmed; they are separate from season ranks.</w:t>
       </w:r>
     </w:p>
     <w:p>
@@ -3799,7 +3799,7 @@
         <w:pStyle w:val="Normal"/>
       </w:pPr>
       <w:r>
-        <w:t xml:space="preserve">Weekly overall model rank 43 (WR14). ROS overall rank 33 (WR16). Availability: NO_ADVERSE_STATUS_REPORTED. Weekly ranks are preliminary when playing status is unconfirmed; they are separate from season ranks.</w:t>
+        <w:t xml:space="preserve">Weekly overall model rank 20 (WR7). ROS overall rank 33 (WR16). Availability: NO_ADVERSE_STATUS_REPORTED. Weekly ranks are preliminary when playing status is unconfirmed; they are separate from season ranks.</w:t>
       </w:r>
     </w:p>
     <w:p>
@@ -3919,7 +3919,7 @@
         <w:pStyle w:val="Normal"/>
       </w:pPr>
       <w:r>
-        <w:t xml:space="preserve">Weekly overall model rank 37 (WR10). ROS overall rank 34 (WR17). Availability: QUESTIONABLE. Weekly ranks are preliminary when playing status is unconfirmed; they are separate from season ranks.</w:t>
+        <w:t xml:space="preserve">Weekly overall model rank 18 (WR6). ROS overall rank 34 (WR17). Availability: QUESTIONABLE. Weekly ranks are preliminary when playing status is unconfirmed; they are separate from season ranks.</w:t>
       </w:r>
     </w:p>
     <w:p>
@@ -4279,7 +4279,7 @@
         <w:pStyle w:val="Normal"/>
       </w:pPr>
       <w:r>
-        <w:t xml:space="preserve">Weekly overall model rank 44 (WR15). ROS overall rank 37 (WR20). Availability: QUESTIONABLE. Weekly ranks are preliminary when playing status is unconfirmed; they are separate from season ranks.</w:t>
+        <w:t xml:space="preserve">Weekly overall model rank Not published (GAME_STARTED_NO_ORIGINAL_WEEKLY_RANK). ROS overall rank 37 (WR20). Availability: QUESTIONABLE. Weekly ranks are preliminary when playing status is unconfirmed; they are separate from season ranks.</w:t>
       </w:r>
     </w:p>
     <w:p>
@@ -4399,7 +4399,7 @@
         <w:pStyle w:val="Normal"/>
       </w:pPr>
       <w:r>
-        <w:t xml:space="preserve">Weekly overall model rank 50 (WR17). ROS overall rank 38 (WR21). Availability: NO_ADVERSE_STATUS_REPORTED. Weekly ranks are preliminary when playing status is unconfirmed; they are separate from season ranks.</w:t>
+        <w:t xml:space="preserve">Weekly overall model rank Not published (GAME_STARTED_NO_ORIGINAL_WEEKLY_RANK). ROS overall rank 38 (WR21). Availability: NO_ADVERSE_STATUS_REPORTED. Weekly ranks are preliminary when playing status is unconfirmed; they are separate from season ranks.</w:t>
       </w:r>
     </w:p>
     <w:p>
@@ -4639,7 +4639,7 @@
         <w:pStyle w:val="Normal"/>
       </w:pPr>
       <w:r>
-        <w:t xml:space="preserve">Weekly overall model rank 6 (QB2). ROS overall rank 40 (QB3). Availability: NO_ADVERSE_STATUS_REPORTED. Weekly ranks are preliminary when playing status is unconfirmed; they are separate from season ranks.</w:t>
+        <w:t xml:space="preserve">Weekly overall model rank Not published (GAME_STARTED_NO_ORIGINAL_WEEKLY_RANK). ROS overall rank 40 (QB3). Availability: NO_ADVERSE_STATUS_REPORTED. Weekly ranks are preliminary when playing status is unconfirmed; they are separate from season ranks.</w:t>
       </w:r>
     </w:p>
     <w:p>
@@ -4759,7 +4759,7 @@
         <w:pStyle w:val="Normal"/>
       </w:pPr>
       <w:r>
-        <w:t xml:space="preserve">Weekly overall model rank 34 (TE3). ROS overall rank 41 (TE3). Availability: NO_ADVERSE_STATUS_REPORTED. Weekly ranks are preliminary when playing status is unconfirmed; they are separate from season ranks.</w:t>
+        <w:t xml:space="preserve">Weekly overall model rank Not published (GAME_STARTED_NO_ORIGINAL_WEEKLY_RANK). ROS overall rank 41 (TE3). Availability: NO_ADVERSE_STATUS_REPORTED. Weekly ranks are preliminary when playing status is unconfirmed; they are separate from season ranks.</w:t>
       </w:r>
     </w:p>
     <w:p>
@@ -4879,7 +4879,7 @@
         <w:pStyle w:val="Normal"/>
       </w:pPr>
       <w:r>
-        <w:t xml:space="preserve">Weekly overall model rank 42 (WR13). ROS overall rank 42 (WR22). Availability: NO_ADVERSE_STATUS_REPORTED. Weekly ranks are preliminary when playing status is unconfirmed; they are separate from season ranks.</w:t>
+        <w:t xml:space="preserve">Weekly overall model rank Not published (GAME_STARTED_NO_ORIGINAL_WEEKLY_RANK). ROS overall rank 42 (WR22). Availability: NO_ADVERSE_STATUS_REPORTED. Weekly ranks are preliminary when playing status is unconfirmed; they are separate from season ranks.</w:t>
       </w:r>
     </w:p>
     <w:p>
@@ -5119,7 +5119,7 @@
         <w:pStyle w:val="Normal"/>
       </w:pPr>
       <w:r>
-        <w:t xml:space="preserve">Weekly overall model rank 40 (WR12). ROS overall rank 44 (WR24). Availability: QUESTIONABLE. Weekly ranks are preliminary when playing status is unconfirmed; they are separate from season ranks.</w:t>
+        <w:t xml:space="preserve">Weekly overall model rank Not published (GAME_STARTED_NO_ORIGINAL_WEEKLY_RANK). ROS overall rank 44 (WR24). Availability: QUESTIONABLE. Weekly ranks are preliminary when playing status is unconfirmed; they are separate from season ranks.</w:t>
       </w:r>
     </w:p>
     <w:p>
@@ -5239,7 +5239,7 @@
         <w:pStyle w:val="Normal"/>
       </w:pPr>
       <w:r>
-        <w:t xml:space="preserve">Weekly overall model rank 57 (WR21). ROS overall rank 45 (WR25). Availability: NO_ADVERSE_STATUS_REPORTED. Weekly ranks are preliminary when playing status is unconfirmed; they are separate from season ranks.</w:t>
+        <w:t xml:space="preserve">Weekly overall model rank Not published (GAME_STARTED_NO_ORIGINAL_WEEKLY_RANK). ROS overall rank 45 (WR25). Availability: NO_ADVERSE_STATUS_REPORTED. Weekly ranks are preliminary when playing status is unconfirmed; they are separate from season ranks.</w:t>
       </w:r>
     </w:p>
     <w:p>
@@ -5359,7 +5359,7 @@
         <w:pStyle w:val="Normal"/>
       </w:pPr>
       <w:r>
-        <w:t xml:space="preserve">Weekly overall model rank 49 (TE5). ROS overall rank 46 (TE4). Availability: NO_ADVERSE_STATUS_REPORTED. Weekly ranks are preliminary when playing status is unconfirmed; they are separate from season ranks.</w:t>
+        <w:t xml:space="preserve">Weekly overall model rank Not published (GAME_STARTED_NO_ORIGINAL_WEEKLY_RANK). ROS overall rank 46 (TE4). Availability: NO_ADVERSE_STATUS_REPORTED. Weekly ranks are preliminary when playing status is unconfirmed; they are separate from season ranks.</w:t>
       </w:r>
     </w:p>
     <w:p>
@@ -5839,7 +5839,7 @@
         <w:pStyle w:val="Normal"/>
       </w:pPr>
       <w:r>
-        <w:t xml:space="preserve">Weekly overall model rank 60 (WR23). ROS overall rank 50 (WR26). Availability: QUESTIONABLE. Weekly ranks are preliminary when playing status is unconfirmed; they are separate from season ranks.</w:t>
+        <w:t xml:space="preserve">Weekly overall model rank Not published (GAME_STARTED_NO_ORIGINAL_WEEKLY_RANK). ROS overall rank 50 (WR26). Availability: QUESTIONABLE. Weekly ranks are preliminary when playing status is unconfirmed; they are separate from season ranks.</w:t>
       </w:r>
     </w:p>
     <w:p>
@@ -5959,7 +5959,7 @@
         <w:pStyle w:val="Normal"/>
       </w:pPr>
       <w:r>
-        <w:t xml:space="preserve">Weekly overall model rank 76 (WR30). ROS overall rank 51 (WR27). Availability: QUESTIONABLE. Weekly ranks are preliminary when playing status is unconfirmed; they are separate from season ranks.</w:t>
+        <w:t xml:space="preserve">Weekly overall model rank Not published (GAME_STARTED_NO_ORIGINAL_WEEKLY_RANK). ROS overall rank 51 (WR27). Availability: QUESTIONABLE. Weekly ranks are preliminary when playing status is unconfirmed; they are separate from season ranks.</w:t>
       </w:r>
     </w:p>
     <w:p>
@@ -6079,7 +6079,7 @@
         <w:pStyle w:val="Normal"/>
       </w:pPr>
       <w:r>
-        <w:t xml:space="preserve">Weekly overall model rank 25 (QB9). ROS overall rank 52 (QB4). Availability: NO_ADVERSE_STATUS_REPORTED. Weekly ranks are preliminary when playing status is unconfirmed; they are separate from season ranks.</w:t>
+        <w:t xml:space="preserve">Weekly overall model rank 15 (QB4). ROS overall rank 52 (QB4). Availability: NO_ADVERSE_STATUS_REPORTED. Weekly ranks are preliminary when playing status is unconfirmed; they are separate from season ranks.</w:t>
       </w:r>
     </w:p>
     <w:p>
@@ -6199,7 +6199,7 @@
         <w:pStyle w:val="Normal"/>
       </w:pPr>
       <w:r>
-        <w:t xml:space="preserve">Weekly overall model rank 8 (QB3). ROS overall rank 53 (QB5). Availability: NO_ADVERSE_STATUS_REPORTED. Weekly ranks are preliminary when playing status is unconfirmed; they are separate from season ranks.</w:t>
+        <w:t xml:space="preserve">Weekly overall model rank Not published (GAME_STARTED_NO_ORIGINAL_WEEKLY_RANK). ROS overall rank 53 (QB5). Availability: NO_ADVERSE_STATUS_REPORTED. Weekly ranks are preliminary when playing status is unconfirmed; they are separate from season ranks.</w:t>
       </w:r>
     </w:p>
     <w:p>
@@ -6319,7 +6319,7 @@
         <w:pStyle w:val="Normal"/>
       </w:pPr>
       <w:r>
-        <w:t xml:space="preserve">Weekly overall model rank 51 (RB12). ROS overall rank 54 (RB18). Availability: NO_ADVERSE_STATUS_REPORTED. Weekly ranks are preliminary when playing status is unconfirmed; they are separate from season ranks.</w:t>
+        <w:t xml:space="preserve">Weekly overall model rank Not published (NOT_EXPECTED_TO_PLAY). ROS overall rank 54 (RB18). Availability: OUT. Weekly ranks are preliminary when playing status is unconfirmed; they are separate from season ranks.</w:t>
       </w:r>
     </w:p>
     <w:p>
@@ -6439,7 +6439,7 @@
         <w:pStyle w:val="Normal"/>
       </w:pPr>
       <w:r>
-        <w:t xml:space="preserve">Weekly overall model rank 54 (RB13). ROS overall rank 55 (RB19). Availability: NO_ADVERSE_STATUS_REPORTED. Weekly ranks are preliminary when playing status is unconfirmed; they are separate from season ranks.</w:t>
+        <w:t xml:space="preserve">Weekly overall model rank Not published (NOT_EXPECTED_TO_PLAY). ROS overall rank 55 (RB19). Availability: OUT. Weekly ranks are preliminary when playing status is unconfirmed; they are separate from season ranks.</w:t>
       </w:r>
     </w:p>
     <w:p>
@@ -6559,7 +6559,7 @@
         <w:pStyle w:val="Normal"/>
       </w:pPr>
       <w:r>
-        <w:t xml:space="preserve">Weekly overall model rank 46 (WR16). ROS overall rank 56 (WR28). Availability: NO_ADVERSE_STATUS_REPORTED. Weekly ranks are preliminary when playing status is unconfirmed; they are separate from season ranks.</w:t>
+        <w:t xml:space="preserve">Weekly overall model rank Not published (GAME_STARTED_NO_ORIGINAL_WEEKLY_RANK). ROS overall rank 56 (WR28). Availability: NO_ADVERSE_STATUS_REPORTED. Weekly ranks are preliminary when playing status is unconfirmed; they are separate from season ranks.</w:t>
       </w:r>
     </w:p>
     <w:p>
@@ -6799,7 +6799,7 @@
         <w:pStyle w:val="Normal"/>
       </w:pPr>
       <w:r>
-        <w:t xml:space="preserve">Weekly overall model rank 28 (QB11). ROS overall rank 58 (QB7). Availability: NO_ADVERSE_STATUS_REPORTED. Weekly ranks are preliminary when playing status is unconfirmed; they are separate from season ranks.</w:t>
+        <w:t xml:space="preserve">Weekly overall model rank Not published (GAME_STARTED_NO_ORIGINAL_WEEKLY_RANK). ROS overall rank 58 (QB7). Availability: NO_ADVERSE_STATUS_REPORTED. Weekly ranks are preliminary when playing status is unconfirmed; they are separate from season ranks.</w:t>
       </w:r>
     </w:p>
     <w:p>
@@ -6919,7 +6919,7 @@
         <w:pStyle w:val="Normal"/>
       </w:pPr>
       <w:r>
-        <w:t xml:space="preserve">Weekly overall model rank 27 (QB10). ROS overall rank 59 (QB8). Availability: NO_ADVERSE_STATUS_REPORTED. Weekly ranks are preliminary when playing status is unconfirmed; they are separate from season ranks.</w:t>
+        <w:t xml:space="preserve">Weekly overall model rank Not published (GAME_STARTED_NO_ORIGINAL_WEEKLY_RANK). ROS overall rank 59 (QB8). Availability: NO_ADVERSE_STATUS_REPORTED. Weekly ranks are preliminary when playing status is unconfirmed; they are separate from season ranks.</w:t>
       </w:r>
     </w:p>
     <w:p>
@@ -7159,7 +7159,7 @@
         <w:pStyle w:val="Normal"/>
       </w:pPr>
       <w:r>
-        <w:t xml:space="preserve">Weekly overall model rank 47 (RB11). ROS overall rank 61 (RB20). Availability: NO_ADVERSE_STATUS_REPORTED. Weekly ranks are preliminary when playing status is unconfirmed; they are separate from season ranks.</w:t>
+        <w:t xml:space="preserve">Weekly overall model rank Not published (GAME_STARTED_NO_ORIGINAL_WEEKLY_RANK). ROS overall rank 61 (RB20). Availability: NO_ADVERSE_STATUS_REPORTED. Weekly ranks are preliminary when playing status is unconfirmed; they are separate from season ranks.</w:t>
       </w:r>
     </w:p>
     <w:p>
@@ -7279,7 +7279,7 @@
         <w:pStyle w:val="Normal"/>
       </w:pPr>
       <w:r>
-        <w:t xml:space="preserve">Weekly overall model rank 61 (TE7). ROS overall rank 62 (TE5). Availability: NO_ADVERSE_STATUS_REPORTED. Weekly ranks are preliminary when playing status is unconfirmed; they are separate from season ranks.</w:t>
+        <w:t xml:space="preserve">Weekly overall model rank Not published (GAME_STARTED_NO_ORIGINAL_WEEKLY_RANK). ROS overall rank 62 (TE5). Availability: NO_ADVERSE_STATUS_REPORTED. Weekly ranks are preliminary when playing status is unconfirmed; they are separate from season ranks.</w:t>
       </w:r>
     </w:p>
     <w:p>
@@ -7367,7 +7367,7 @@
         <w:pStyle w:val="Normal"/>
       </w:pPr>
       <w:r>
-        <w:t xml:space="preserve">Weekly overall model rank 79 (RB16). ROS overall rank 63 (RB21). Availability: NO_ADVERSE_STATUS_REPORTED. Weekly ranks are preliminary when playing status is unconfirmed; they are separate from season ranks.</w:t>
+        <w:t xml:space="preserve">Weekly overall model rank Not published (GAME_STARTED_NO_ORIGINAL_WEEKLY_RANK). ROS overall rank 63 (RB21). Availability: NO_ADVERSE_STATUS_REPORTED. Weekly ranks are preliminary when playing status is unconfirmed; they are separate from season ranks.</w:t>
       </w:r>
     </w:p>
     <w:p>
@@ -7487,7 +7487,7 @@
         <w:pStyle w:val="Normal"/>
       </w:pPr>
       <w:r>
-        <w:t xml:space="preserve">Weekly overall model rank 91 (RB22). ROS overall rank 64 (RB22). Availability: NO_ADVERSE_STATUS_REPORTED. Weekly ranks are preliminary when playing status is unconfirmed; they are separate from season ranks.</w:t>
+        <w:t xml:space="preserve">Weekly overall model rank 32 (RB8). ROS overall rank 64 (RB22). Availability: NO_ADVERSE_STATUS_REPORTED. Weekly ranks are preliminary when playing status is unconfirmed; they are separate from season ranks.</w:t>
       </w:r>
     </w:p>
     <w:p>
@@ -7727,7 +7727,7 @@
         <w:pStyle w:val="Normal"/>
       </w:pPr>
       <w:r>
-        <w:t xml:space="preserve">Weekly overall model rank 75 (WR29). ROS overall rank 66 (WR30). Availability: NO_ADVERSE_STATUS_REPORTED. Weekly ranks are preliminary when playing status is unconfirmed; they are separate from season ranks.</w:t>
+        <w:t xml:space="preserve">Weekly overall model rank Not published (GAME_STARTED_NO_ORIGINAL_WEEKLY_RANK). ROS overall rank 66 (WR30). Availability: NO_ADVERSE_STATUS_REPORTED. Weekly ranks are preliminary when playing status is unconfirmed; they are separate from season ranks.</w:t>
       </w:r>
     </w:p>
     <w:p>
@@ -7847,7 +7847,7 @@
         <w:pStyle w:val="Normal"/>
       </w:pPr>
       <w:r>
-        <w:t xml:space="preserve">Weekly overall model rank 69 (WR26). ROS overall rank 67 (WR31). Availability: NO_ADVERSE_STATUS_REPORTED. Weekly ranks are preliminary when playing status is unconfirmed; they are separate from season ranks.</w:t>
+        <w:t xml:space="preserve">Weekly overall model rank 26 (WR10). ROS overall rank 67 (WR31). Availability: NO_ADVERSE_STATUS_REPORTED. Weekly ranks are preliminary when playing status is unconfirmed; they are separate from season ranks.</w:t>
       </w:r>
     </w:p>
     <w:p>
@@ -7967,7 +7967,7 @@
         <w:pStyle w:val="Normal"/>
       </w:pPr>
       <w:r>
-        <w:t xml:space="preserve">Weekly overall model rank 72 (TE12). ROS overall rank 68 (TE6). Availability: NO_ADVERSE_STATUS_REPORTED. Weekly ranks are preliminary when playing status is unconfirmed; they are separate from season ranks.</w:t>
+        <w:t xml:space="preserve">Weekly overall model rank 27 (TE5). ROS overall rank 68 (TE6). Availability: NO_ADVERSE_STATUS_REPORTED. Weekly ranks are preliminary when playing status is unconfirmed; they are separate from season ranks.</w:t>
       </w:r>
     </w:p>
     <w:p>
@@ -8087,7 +8087,7 @@
         <w:pStyle w:val="Normal"/>
       </w:pPr>
       <w:r>
-        <w:t xml:space="preserve">Weekly overall model rank 18 (QB5). ROS overall rank 69 (QB10). Availability: NO_ADVERSE_STATUS_REPORTED. Weekly ranks are preliminary when playing status is unconfirmed; they are separate from season ranks.</w:t>
+        <w:t xml:space="preserve">Weekly overall model rank Not published (GAME_STARTED_NO_ORIGINAL_WEEKLY_RANK). ROS overall rank 69 (QB10). Availability: NO_ADVERSE_STATUS_REPORTED. Weekly ranks are preliminary when playing status is unconfirmed; they are separate from season ranks.</w:t>
       </w:r>
     </w:p>
     <w:p>
@@ -8327,7 +8327,7 @@
         <w:pStyle w:val="Normal"/>
       </w:pPr>
       <w:r>
-        <w:t xml:space="preserve">Weekly overall model rank 13 (QB4). ROS overall rank 71 (QB12). Availability: NO_ADVERSE_STATUS_REPORTED. Weekly ranks are preliminary when playing status is unconfirmed; they are separate from season ranks.</w:t>
+        <w:t xml:space="preserve">Weekly overall model rank Not published (GAME_STARTED_NO_ORIGINAL_WEEKLY_RANK). ROS overall rank 71 (QB12). Availability: NO_ADVERSE_STATUS_REPORTED. Weekly ranks are preliminary when playing status is unconfirmed; they are separate from season ranks.</w:t>
       </w:r>
     </w:p>
     <w:p>
@@ -8447,7 +8447,7 @@
         <w:pStyle w:val="Normal"/>
       </w:pPr>
       <w:r>
-        <w:t xml:space="preserve">Weekly overall model rank 55 (WR19). ROS overall rank 72 (WR32). Availability: NO_ADVERSE_STATUS_REPORTED. Weekly ranks are preliminary when playing status is unconfirmed; they are separate from season ranks.</w:t>
+        <w:t xml:space="preserve">Weekly overall model rank 22 (WR8). ROS overall rank 72 (WR32). Availability: NO_ADVERSE_STATUS_REPORTED. Weekly ranks are preliminary when playing status is unconfirmed; they are separate from season ranks.</w:t>
       </w:r>
     </w:p>
     <w:p>
@@ -8567,7 +8567,7 @@
         <w:pStyle w:val="Normal"/>
       </w:pPr>
       <w:r>
-        <w:t xml:space="preserve">Weekly overall model rank 52 (WR18). ROS overall rank 73 (WR33). Availability: NO_ADVERSE_STATUS_REPORTED. Weekly ranks are preliminary when playing status is unconfirmed; they are separate from season ranks.</w:t>
+        <w:t xml:space="preserve">Weekly overall model rank Not published (GAME_STARTED_NO_ORIGINAL_WEEKLY_RANK). ROS overall rank 73 (WR33). Availability: NO_ADVERSE_STATUS_REPORTED. Weekly ranks are preliminary when playing status is unconfirmed; they are separate from season ranks.</w:t>
       </w:r>
     </w:p>
     <w:p>
@@ -8927,7 +8927,7 @@
         <w:pStyle w:val="Normal"/>
       </w:pPr>
       <w:r>
-        <w:t xml:space="preserve">Weekly overall model rank 84 (WR33). ROS overall rank 76 (WR36). Availability: NO_ADVERSE_STATUS_REPORTED. Weekly ranks are preliminary when playing status is unconfirmed; they are separate from season ranks.</w:t>
+        <w:t xml:space="preserve">Weekly overall model rank Not published (GAME_STARTED_NO_ORIGINAL_WEEKLY_RANK). ROS overall rank 76 (WR36). Availability: NO_ADVERSE_STATUS_REPORTED. Weekly ranks are preliminary when playing status is unconfirmed; they are separate from season ranks.</w:t>
       </w:r>
     </w:p>
     <w:p>
@@ -9047,7 +9047,7 @@
         <w:pStyle w:val="Normal"/>
       </w:pPr>
       <w:r>
-        <w:t xml:space="preserve">Weekly overall model rank 41 (TE4). ROS overall rank 77 (TE7). Availability: NO_ADVERSE_STATUS_REPORTED. Weekly ranks are preliminary when playing status is unconfirmed; they are separate from season ranks.</w:t>
+        <w:t xml:space="preserve">Weekly overall model rank 19 (TE2). ROS overall rank 77 (TE7). Availability: NO_ADVERSE_STATUS_REPORTED. Weekly ranks are preliminary when playing status is unconfirmed; they are separate from season ranks.</w:t>
       </w:r>
     </w:p>
     <w:p>
@@ -9167,7 +9167,7 @@
         <w:pStyle w:val="Normal"/>
       </w:pPr>
       <w:r>
-        <w:t xml:space="preserve">Weekly overall model rank 81 (RB18). ROS overall rank 78 (RB23). Availability: NO_ADVERSE_STATUS_REPORTED. Weekly ranks are preliminary when playing status is unconfirmed; they are separate from season ranks.</w:t>
+        <w:t xml:space="preserve">Weekly overall model rank Not published (GAME_STARTED_NO_ORIGINAL_WEEKLY_RANK). ROS overall rank 78 (RB23). Availability: NO_ADVERSE_STATUS_REPORTED. Weekly ranks are preliminary when playing status is unconfirmed; they are separate from season ranks.</w:t>
       </w:r>
     </w:p>
     <w:p>
@@ -9407,7 +9407,7 @@
         <w:pStyle w:val="Normal"/>
       </w:pPr>
       <w:r>
-        <w:t xml:space="preserve">Weekly overall model rank 95 (RB24). ROS overall rank 80 (RB25). Availability: NO_ADVERSE_STATUS_REPORTED. Weekly ranks are preliminary when playing status is unconfirmed; they are separate from season ranks.</w:t>
+        <w:t xml:space="preserve">Weekly overall model rank Not published (GAME_STARTED_NO_ORIGINAL_WEEKLY_RANK). ROS overall rank 80 (RB25). Availability: NO_ADVERSE_STATUS_REPORTED. Weekly ranks are preliminary when playing status is unconfirmed; they are separate from season ranks.</w:t>
       </w:r>
     </w:p>
     <w:p>
@@ -9527,7 +9527,7 @@
         <w:pStyle w:val="Normal"/>
       </w:pPr>
       <w:r>
-        <w:t xml:space="preserve">Weekly overall model rank 68 (TE11). ROS overall rank 81 (TE8). Availability: NO_ADVERSE_STATUS_REPORTED. Weekly ranks are preliminary when playing status is unconfirmed; they are separate from season ranks.</w:t>
+        <w:t xml:space="preserve">Weekly overall model rank 25 (TE4). ROS overall rank 81 (TE8). Availability: NO_ADVERSE_STATUS_REPORTED. Weekly ranks are preliminary when playing status is unconfirmed; they are separate from season ranks.</w:t>
       </w:r>
     </w:p>
     <w:p>
@@ -9767,7 +9767,7 @@
         <w:pStyle w:val="Normal"/>
       </w:pPr>
       <w:r>
-        <w:t xml:space="preserve">Weekly overall model rank 64 (WR24). ROS overall rank 83 (WR37). Availability: NO_ADVERSE_STATUS_REPORTED. Weekly ranks are preliminary when playing status is unconfirmed; they are separate from season ranks.</w:t>
+        <w:t xml:space="preserve">Weekly overall model rank Not published (GAME_STARTED_NO_ORIGINAL_WEEKLY_RANK). ROS overall rank 83 (WR37). Availability: NO_ADVERSE_STATUS_REPORTED. Weekly ranks are preliminary when playing status is unconfirmed; they are separate from season ranks.</w:t>
       </w:r>
     </w:p>
     <w:p>
@@ -10007,7 +10007,7 @@
         <w:pStyle w:val="Normal"/>
       </w:pPr>
       <w:r>
-        <w:t xml:space="preserve">Weekly overall model rank 70 (WR27). ROS overall rank 85 (WR38). Availability: NO_ADVERSE_STATUS_REPORTED. Weekly ranks are preliminary when playing status is unconfirmed; they are separate from season ranks.</w:t>
+        <w:t xml:space="preserve">Weekly overall model rank Not published (GAME_STARTED_NO_ORIGINAL_WEEKLY_RANK). ROS overall rank 85 (WR38). Availability: NO_ADVERSE_STATUS_REPORTED. Weekly ranks are preliminary when playing status is unconfirmed; they are separate from season ranks.</w:t>
       </w:r>
     </w:p>
     <w:p>
@@ -10127,7 +10127,7 @@
         <w:pStyle w:val="Normal"/>
       </w:pPr>
       <w:r>
-        <w:t xml:space="preserve">Weekly overall model rank 66 (TE10). ROS overall rank 86 (TE9). Availability: NO_ADVERSE_STATUS_REPORTED. Weekly ranks are preliminary when playing status is unconfirmed; they are separate from season ranks.</w:t>
+        <w:t xml:space="preserve">Weekly overall model rank Not published (NOT_EXPECTED_TO_PLAY). ROS overall rank 86 (TE9). Availability: OUT. Weekly ranks are preliminary when playing status is unconfirmed; they are separate from season ranks.</w:t>
       </w:r>
     </w:p>
     <w:p>
@@ -10247,7 +10247,7 @@
         <w:pStyle w:val="Normal"/>
       </w:pPr>
       <w:r>
-        <w:t xml:space="preserve">Weekly overall model rank 58 (WR22). ROS overall rank 87 (WR39). Availability: NO_ADVERSE_STATUS_REPORTED. Weekly ranks are preliminary when playing status is unconfirmed; they are separate from season ranks.</w:t>
+        <w:t xml:space="preserve">Weekly overall model rank Not published (GAME_STARTED_NO_ORIGINAL_WEEKLY_RANK). ROS overall rank 87 (WR39). Availability: NO_ADVERSE_STATUS_REPORTED. Weekly ranks are preliminary when playing status is unconfirmed; they are separate from season ranks.</w:t>
       </w:r>
     </w:p>
     <w:p>
@@ -10367,7 +10367,7 @@
         <w:pStyle w:val="Normal"/>
       </w:pPr>
       <w:r>
-        <w:t xml:space="preserve">Weekly overall model rank 65 (TE9). ROS overall rank 88 (TE10). Availability: NO_ADVERSE_STATUS_REPORTED. Weekly ranks are preliminary when playing status is unconfirmed; they are separate from season ranks.</w:t>
+        <w:t xml:space="preserve">Weekly overall model rank Not published (GAME_STARTED_NO_ORIGINAL_WEEKLY_RANK). ROS overall rank 88 (TE10). Availability: NO_ADVERSE_STATUS_REPORTED. Weekly ranks are preliminary when playing status is unconfirmed; they are separate from season ranks.</w:t>
       </w:r>
     </w:p>
     <w:p>
@@ -10727,7 +10727,7 @@
         <w:pStyle w:val="Normal"/>
       </w:pPr>
       <w:r>
-        <w:t xml:space="preserve">Weekly overall model rank 62 (TE8). ROS overall rank 91 (TE11). Availability: NO_ADVERSE_STATUS_REPORTED. Weekly ranks are preliminary when playing status is unconfirmed; they are separate from season ranks.</w:t>
+        <w:t xml:space="preserve">Weekly overall model rank Not published (GAME_STARTED_NO_ORIGINAL_WEEKLY_RANK). ROS overall rank 91 (TE11). Availability: NO_ADVERSE_STATUS_REPORTED. Weekly ranks are preliminary when playing status is unconfirmed; they are separate from season ranks.</w:t>
       </w:r>
     </w:p>
     <w:p>
@@ -10847,7 +10847,7 @@
         <w:pStyle w:val="Normal"/>
       </w:pPr>
       <w:r>
-        <w:t xml:space="preserve">Weekly overall model rank 88 (RB20). ROS overall rank 92 (RB27). Availability: NO_ADVERSE_STATUS_REPORTED. Weekly ranks are preliminary when playing status is unconfirmed; they are separate from season ranks.</w:t>
+        <w:t xml:space="preserve">Weekly overall model rank Not published (GAME_STARTED_NO_ORIGINAL_WEEKLY_RANK). ROS overall rank 92 (RB27). Availability: NO_ADVERSE_STATUS_REPORTED. Weekly ranks are preliminary when playing status is unconfirmed; they are separate from season ranks.</w:t>
       </w:r>
     </w:p>
     <w:p>
@@ -11055,7 +11055,7 @@
         <w:pStyle w:val="Normal"/>
       </w:pPr>
       <w:r>
-        <w:t xml:space="preserve">Weekly overall model rank 71 (WR28). ROS overall rank 94 (WR42). Availability: QUESTIONABLE. Weekly ranks are preliminary when playing status is unconfirmed; they are separate from season ranks.</w:t>
+        <w:t xml:space="preserve">Weekly overall model rank Not published (GAME_STARTED_NO_ORIGINAL_WEEKLY_RANK). ROS overall rank 94 (WR42). Availability: QUESTIONABLE. Weekly ranks are preliminary when playing status is unconfirmed; they are separate from season ranks.</w:t>
       </w:r>
     </w:p>
     <w:p>
@@ -11295,7 +11295,7 @@
         <w:pStyle w:val="Normal"/>
       </w:pPr>
       <w:r>
-        <w:t xml:space="preserve">Weekly overall model rank 101 (WR37). ROS overall rank 96 (WR44). Availability: NO_ADVERSE_STATUS_REPORTED. Weekly ranks are preliminary when playing status is unconfirmed; they are separate from season ranks.</w:t>
+        <w:t xml:space="preserve">Weekly overall model rank 34 (WR13). ROS overall rank 96 (WR44). Availability: NO_ADVERSE_STATUS_REPORTED. Weekly ranks are preliminary when playing status is unconfirmed; they are separate from season ranks.</w:t>
       </w:r>
     </w:p>
     <w:p>
@@ -11535,7 +11535,7 @@
         <w:pStyle w:val="Normal"/>
       </w:pPr>
       <w:r>
-        <w:t xml:space="preserve">Weekly overall model rank 67 (WR25). ROS overall rank 98 (WR45). Availability: NO_ADVERSE_STATUS_REPORTED. Weekly ranks are preliminary when playing status is unconfirmed; they are separate from season ranks.</w:t>
+        <w:t xml:space="preserve">Weekly overall model rank Not published (GAME_STARTED_NO_ORIGINAL_WEEKLY_RANK). ROS overall rank 98 (WR45). Availability: NO_ADVERSE_STATUS_REPORTED. Weekly ranks are preliminary when playing status is unconfirmed; they are separate from season ranks.</w:t>
       </w:r>
     </w:p>
     <w:p>
@@ -11775,7 +11775,7 @@
         <w:pStyle w:val="Normal"/>
       </w:pPr>
       <w:r>
-        <w:t xml:space="preserve">Weekly overall model rank 118 (RB38). ROS overall rank 100 (RB28). Availability: UNKNOWN. Weekly ranks are preliminary when playing status is unconfirmed; they are separate from season ranks.</w:t>
+        <w:t xml:space="preserve">Weekly overall model rank Not published (GAME_STARTED_NO_ORIGINAL_WEEKLY_RANK). ROS overall rank 100 (RB28). Availability: UNKNOWN. Weekly ranks are preliminary when playing status is unconfirmed; they are separate from season ranks.</w:t>
       </w:r>
     </w:p>
     <w:p>
@@ -12015,7 +12015,7 @@
         <w:pStyle w:val="Normal"/>
       </w:pPr>
       <w:r>
-        <w:t xml:space="preserve">Weekly overall model rank 78 (WR32). ROS overall rank 102 (WR48). Availability: NO_ADVERSE_STATUS_REPORTED. Weekly ranks are preliminary when playing status is unconfirmed; they are separate from season ranks.</w:t>
+        <w:t xml:space="preserve">Weekly overall model rank 29 (WR12). ROS overall rank 102 (WR48). Availability: NO_ADVERSE_STATUS_REPORTED. Weekly ranks are preliminary when playing status is unconfirmed; they are separate from season ranks.</w:t>
       </w:r>
     </w:p>
     <w:p>
@@ -12375,7 +12375,7 @@
         <w:pStyle w:val="Normal"/>
       </w:pPr>
       <w:r>
-        <w:t xml:space="preserve">Weekly overall model rank 87 (TE16). ROS overall rank 105 (TE13). Availability: NO_ADVERSE_STATUS_REPORTED. Weekly ranks are preliminary when playing status is unconfirmed; they are separate from season ranks.</w:t>
+        <w:t xml:space="preserve">Weekly overall model rank Not published (GAME_STARTED_NO_ORIGINAL_WEEKLY_RANK). ROS overall rank 105 (TE13). Availability: NO_ADVERSE_STATUS_REPORTED. Weekly ranks are preliminary when playing status is unconfirmed; they are separate from season ranks.</w:t>
       </w:r>
     </w:p>
     <w:p>
@@ -12615,7 +12615,7 @@
         <w:pStyle w:val="Normal"/>
       </w:pPr>
       <w:r>
-        <w:t xml:space="preserve">Weekly overall model rank 94 (RB23). ROS overall rank 107 (RB29). Availability: QUESTIONABLE. Weekly ranks are preliminary when playing status is unconfirmed; they are separate from season ranks.</w:t>
+        <w:t xml:space="preserve">Weekly overall model rank Not published (GAME_STARTED_NO_ORIGINAL_WEEKLY_RANK). ROS overall rank 107 (RB29). Availability: QUESTIONABLE. Weekly ranks are preliminary when playing status is unconfirmed; they are separate from season ranks.</w:t>
       </w:r>
     </w:p>
     <w:p>
@@ -12735,7 +12735,7 @@
         <w:pStyle w:val="Normal"/>
       </w:pPr>
       <w:r>
-        <w:t xml:space="preserve">Weekly overall model rank 86 (WR34). ROS overall rank 108 (WR49). Availability: NO_ADVERSE_STATUS_REPORTED. Weekly ranks are preliminary when playing status is unconfirmed; they are separate from season ranks.</w:t>
+        <w:t xml:space="preserve">Weekly overall model rank Not published (GAME_STARTED_NO_ORIGINAL_WEEKLY_RANK). ROS overall rank 108 (WR49). Availability: NO_ADVERSE_STATUS_REPORTED. Weekly ranks are preliminary when playing status is unconfirmed; they are separate from season ranks.</w:t>
       </w:r>
     </w:p>
     <w:p>
@@ -13095,7 +13095,7 @@
         <w:pStyle w:val="Normal"/>
       </w:pPr>
       <w:r>
-        <w:t xml:space="preserve">Weekly overall model rank 56 (WR20). ROS overall rank 111 (WR51). Availability: NO_ADVERSE_STATUS_REPORTED. Weekly ranks are preliminary when playing status is unconfirmed; they are separate from season ranks.</w:t>
+        <w:t xml:space="preserve">Weekly overall model rank 23 (WR9). ROS overall rank 111 (WR51). Availability: NO_ADVERSE_STATUS_REPORTED. Weekly ranks are preliminary when playing status is unconfirmed; they are separate from season ranks.</w:t>
       </w:r>
     </w:p>
     <w:p>
@@ -13455,7 +13455,7 @@
         <w:pStyle w:val="Normal"/>
       </w:pPr>
       <w:r>
-        <w:t xml:space="preserve">Weekly overall model rank 82 (TE14). ROS overall rank 114 (TE16). Availability: NO_ADVERSE_STATUS_REPORTED. Weekly ranks are preliminary when playing status is unconfirmed; they are separate from season ranks.</w:t>
+        <w:t xml:space="preserve">Weekly overall model rank 30 (TE6). ROS overall rank 114 (TE16). Availability: NO_ADVERSE_STATUS_REPORTED. Weekly ranks are preliminary when playing status is unconfirmed; they are separate from season ranks.</w:t>
       </w:r>
     </w:p>
     <w:p>
@@ -13575,7 +13575,7 @@
         <w:pStyle w:val="Normal"/>
       </w:pPr>
       <w:r>
-        <w:t xml:space="preserve">Weekly overall model rank 85 (RB19). ROS overall rank 115 (RB31). Availability: NO_ADVERSE_STATUS_REPORTED. Weekly ranks are preliminary when playing status is unconfirmed; they are separate from season ranks.</w:t>
+        <w:t xml:space="preserve">Weekly overall model rank 31 (RB7). ROS overall rank 115 (RB31). Availability: NO_ADVERSE_STATUS_REPORTED. Weekly ranks are preliminary when playing status is unconfirmed; they are separate from season ranks.</w:t>
       </w:r>
     </w:p>
     <w:p>
@@ -13695,7 +13695,7 @@
         <w:pStyle w:val="Normal"/>
       </w:pPr>
       <w:r>
-        <w:t xml:space="preserve">Weekly overall model rank 96 (RB25). ROS overall rank 116 (RB32). Availability: NO_ADVERSE_STATUS_REPORTED. Weekly ranks are preliminary when playing status is unconfirmed; they are separate from season ranks.</w:t>
+        <w:t xml:space="preserve">Weekly overall model rank Not published (GAME_STARTED_NO_ORIGINAL_WEEKLY_RANK). ROS overall rank 116 (RB32). Availability: NO_ADVERSE_STATUS_REPORTED. Weekly ranks are preliminary when playing status is unconfirmed; they are separate from season ranks.</w:t>
       </w:r>
     </w:p>
     <w:p>
@@ -13815,7 +13815,7 @@
         <w:pStyle w:val="Normal"/>
       </w:pPr>
       <w:r>
-        <w:t xml:space="preserve">Weekly overall model rank 102 (WR38). ROS overall rank 117 (WR53). Availability: NO_ADVERSE_STATUS_REPORTED. Weekly ranks are preliminary when playing status is unconfirmed; they are separate from season ranks.</w:t>
+        <w:t xml:space="preserve">Weekly overall model rank 35 (WR14). ROS overall rank 117 (WR53). Availability: NO_ADVERSE_STATUS_REPORTED. Weekly ranks are preliminary when playing status is unconfirmed; they are separate from season ranks.</w:t>
       </w:r>
     </w:p>
     <w:p>
@@ -13903,7 +13903,7 @@
         <w:pStyle w:val="Normal"/>
       </w:pPr>
       <w:r>
-        <w:t xml:space="preserve">Weekly overall model rank 73 (TE13). ROS overall rank 118 (TE17). Availability: NO_ADVERSE_STATUS_REPORTED. Weekly ranks are preliminary when playing status is unconfirmed; they are separate from season ranks.</w:t>
+        <w:t xml:space="preserve">Weekly overall model rank Not published (GAME_STARTED_NO_ORIGINAL_WEEKLY_RANK). ROS overall rank 118 (TE17). Availability: NO_ADVERSE_STATUS_REPORTED. Weekly ranks are preliminary when playing status is unconfirmed; they are separate from season ranks.</w:t>
       </w:r>
     </w:p>
     <w:p>
@@ -13991,7 +13991,7 @@
         <w:pStyle w:val="Normal"/>
       </w:pPr>
       <w:r>
-        <w:t xml:space="preserve">Weekly overall model rank 98 (TE19). ROS overall rank 119 (TE18). Availability: NO_ADVERSE_STATUS_REPORTED. Weekly ranks are preliminary when playing status is unconfirmed; they are separate from season ranks.</w:t>
+        <w:t xml:space="preserve">Weekly overall model rank Not published (GAME_STARTED_NO_ORIGINAL_WEEKLY_RANK). ROS overall rank 119 (TE18). Availability: NO_ADVERSE_STATUS_REPORTED. Weekly ranks are preliminary when playing status is unconfirmed; they are separate from season ranks.</w:t>
       </w:r>
     </w:p>
     <w:p>
@@ -14079,7 +14079,7 @@
         <w:pStyle w:val="Normal"/>
       </w:pPr>
       <w:r>
-        <w:t xml:space="preserve">Weekly overall model rank 103 (RB27). ROS overall rank 120 (RB33). Availability: NO_ADVERSE_STATUS_REPORTED. Weekly ranks are preliminary when playing status is unconfirmed; they are separate from season ranks.</w:t>
+        <w:t xml:space="preserve">Weekly overall model rank 36 (RB9). ROS overall rank 120 (RB33). Availability: NO_ADVERSE_STATUS_REPORTED. Weekly ranks are preliminary when playing status is unconfirmed; they are separate from season ranks.</w:t>
       </w:r>
     </w:p>
     <w:p>
@@ -14199,7 +14199,7 @@
         <w:pStyle w:val="Normal"/>
       </w:pPr>
       <w:r>
-        <w:t xml:space="preserve">Weekly overall model rank 74 (RB15). ROS overall rank 121 (RB34). Availability: NO_ADVERSE_STATUS_REPORTED. Weekly ranks are preliminary when playing status is unconfirmed; they are separate from season ranks.</w:t>
+        <w:t xml:space="preserve">Weekly overall model rank Not published (GAME_STARTED_NO_ORIGINAL_WEEKLY_RANK). ROS overall rank 121 (RB34). Availability: NO_ADVERSE_STATUS_REPORTED. Weekly ranks are preliminary when playing status is unconfirmed; they are separate from season ranks.</w:t>
       </w:r>
     </w:p>
     <w:p>
@@ -14319,7 +14319,7 @@
         <w:pStyle w:val="Normal"/>
       </w:pPr>
       <w:r>
-        <w:t xml:space="preserve">Weekly overall model rank 105 (WR40). ROS overall rank 122 (WR54). Availability: NO_ADVERSE_STATUS_REPORTED. Weekly ranks are preliminary when playing status is unconfirmed; they are separate from season ranks.</w:t>
+        <w:t xml:space="preserve">Weekly overall model rank Not published (GAME_STARTED_NO_ORIGINAL_WEEKLY_RANK). ROS overall rank 122 (WR54). Availability: NO_ADVERSE_STATUS_REPORTED. Weekly ranks are preliminary when playing status is unconfirmed; they are separate from season ranks.</w:t>
       </w:r>
     </w:p>
     <w:p>
@@ -14439,7 +14439,7 @@
         <w:pStyle w:val="Normal"/>
       </w:pPr>
       <w:r>
-        <w:t xml:space="preserve">Weekly overall model rank 59 (TE6). ROS overall rank 123 (TE19). Availability: NO_ADVERSE_STATUS_REPORTED. Weekly ranks are preliminary when playing status is unconfirmed; they are separate from season ranks.</w:t>
+        <w:t xml:space="preserve">Weekly overall model rank 24 (TE3). ROS overall rank 123 (TE19). Availability: NO_ADVERSE_STATUS_REPORTED. Weekly ranks are preliminary when playing status is unconfirmed; they are separate from season ranks.</w:t>
       </w:r>
     </w:p>
     <w:p>
@@ -14543,7 +14543,7 @@
         <w:pStyle w:val="Normal"/>
       </w:pPr>
       <w:r>
-        <w:t xml:space="preserve">Weekly overall model rank 80 (RB17). ROS overall rank 124 (RB35). Availability: NO_ADVERSE_STATUS_REPORTED. Weekly ranks are preliminary when playing status is unconfirmed; they are separate from season ranks.</w:t>
+        <w:t xml:space="preserve">Weekly overall model rank Not published (GAME_STARTED_NO_ORIGINAL_WEEKLY_RANK). ROS overall rank 124 (RB35). Availability: NO_ADVERSE_STATUS_REPORTED. Weekly ranks are preliminary when playing status is unconfirmed; they are separate from season ranks.</w:t>
       </w:r>
     </w:p>
     <w:p>
@@ -15023,7 +15023,7 @@
         <w:pStyle w:val="Normal"/>
       </w:pPr>
       <w:r>
-        <w:t xml:space="preserve">Weekly overall model rank 100 (RB26). ROS overall rank 128 (RB36). Availability: NO_ADVERSE_STATUS_REPORTED. Weekly ranks are preliminary when playing status is unconfirmed; they are separate from season ranks.</w:t>
+        <w:t xml:space="preserve">Weekly overall model rank Not published (GAME_STARTED_NO_ORIGINAL_WEEKLY_RANK). ROS overall rank 128 (RB36). Availability: NO_ADVERSE_STATUS_REPORTED. Weekly ranks are preliminary when playing status is unconfirmed; they are separate from season ranks.</w:t>
       </w:r>
     </w:p>
     <w:p>
@@ -15263,7 +15263,7 @@
         <w:pStyle w:val="Normal"/>
       </w:pPr>
       <w:r>
-        <w:t xml:space="preserve">Weekly overall model rank 110 (RB31). ROS overall rank 130 (RB37). Availability: NO_ADVERSE_STATUS_REPORTED. Weekly ranks are preliminary when playing status is unconfirmed; they are separate from season ranks.</w:t>
+        <w:t xml:space="preserve">Weekly overall model rank 39 (RB11). ROS overall rank 130 (RB37). Availability: NO_ADVERSE_STATUS_REPORTED. Weekly ranks are preliminary when playing status is unconfirmed; they are separate from season ranks.</w:t>
       </w:r>
     </w:p>
     <w:p>
@@ -15383,7 +15383,7 @@
         <w:pStyle w:val="Normal"/>
       </w:pPr>
       <w:r>
-        <w:t xml:space="preserve">Weekly overall model rank 99 (WR36). ROS overall rank 131 (WR58). Availability: NO_ADVERSE_STATUS_REPORTED. Weekly ranks are preliminary when playing status is unconfirmed; they are separate from season ranks.</w:t>
+        <w:t xml:space="preserve">Weekly overall model rank Not published (NOT_EXPECTED_TO_PLAY). ROS overall rank 131 (WR58). Availability: OUT. Weekly ranks are preliminary when playing status is unconfirmed; they are separate from season ranks.</w:t>
       </w:r>
     </w:p>
     <w:p>
@@ -15863,7 +15863,7 @@
         <w:pStyle w:val="Normal"/>
       </w:pPr>
       <w:r>
-        <w:t xml:space="preserve">Weekly overall model rank 116 (RB36). ROS overall rank 135 (RB39). Availability: NO_ADVERSE_STATUS_REPORTED. Weekly ranks are preliminary when playing status is unconfirmed; they are separate from season ranks.</w:t>
+        <w:t xml:space="preserve">Weekly overall model rank Not published (GAME_STARTED_NO_ORIGINAL_WEEKLY_RANK). ROS overall rank 135 (RB39). Availability: NO_ADVERSE_STATUS_REPORTED. Weekly ranks are preliminary when playing status is unconfirmed; they are separate from season ranks.</w:t>
       </w:r>
     </w:p>
     <w:p>
@@ -15983,7 +15983,7 @@
         <w:pStyle w:val="Normal"/>
       </w:pPr>
       <w:r>
-        <w:t xml:space="preserve">Weekly overall model rank 106 (WR41). ROS overall rank 136 (WR60). Availability: NO_ADVERSE_STATUS_REPORTED. Weekly ranks are preliminary when playing status is unconfirmed; they are separate from season ranks.</w:t>
+        <w:t xml:space="preserve">Weekly overall model rank Not published (GAME_STARTED_NO_ORIGINAL_WEEKLY_RANK). ROS overall rank 136 (WR60). Availability: NO_ADVERSE_STATUS_REPORTED. Weekly ranks are preliminary when playing status is unconfirmed; they are separate from season ranks.</w:t>
       </w:r>
     </w:p>
     <w:p>
@@ -16343,7 +16343,7 @@
         <w:pStyle w:val="Normal"/>
       </w:pPr>
       <w:r>
-        <w:t xml:space="preserve">Weekly overall model rank 97 (TE18). ROS overall rank 139 (TE22). Availability: NO_ADVERSE_STATUS_REPORTED. Weekly ranks are preliminary when playing status is unconfirmed; they are separate from season ranks.</w:t>
+        <w:t xml:space="preserve">Weekly overall model rank Not published (GAME_STARTED_NO_ORIGINAL_WEEKLY_RANK). ROS overall rank 139 (TE22). Availability: NO_ADVERSE_STATUS_REPORTED. Weekly ranks are preliminary when playing status is unconfirmed; they are separate from season ranks.</w:t>
       </w:r>
     </w:p>
     <w:p>
@@ -16583,7 +16583,7 @@
         <w:pStyle w:val="Normal"/>
       </w:pPr>
       <w:r>
-        <w:t xml:space="preserve">Weekly overall model rank 111 (RB32). ROS overall rank 141 (RB42). Availability: NO_ADVERSE_STATUS_REPORTED. Weekly ranks are preliminary when playing status is unconfirmed; they are separate from season ranks.</w:t>
+        <w:t xml:space="preserve">Weekly overall model rank Not published (GAME_STARTED_NO_ORIGINAL_WEEKLY_RANK). ROS overall rank 141 (RB42). Availability: NO_ADVERSE_STATUS_REPORTED. Weekly ranks are preliminary when playing status is unconfirmed; they are separate from season ranks.</w:t>
       </w:r>
     </w:p>
     <w:p>
@@ -16943,7 +16943,7 @@
         <w:pStyle w:val="Normal"/>
       </w:pPr>
       <w:r>
-        <w:t xml:space="preserve">Weekly overall model rank 93 (TE17). ROS overall rank 144 (TE23). Availability: NO_ADVERSE_STATUS_REPORTED. Weekly ranks are preliminary when playing status is unconfirmed; they are separate from season ranks.</w:t>
+        <w:t xml:space="preserve">Weekly overall model rank 33 (TE7). ROS overall rank 144 (TE23). Availability: NO_ADVERSE_STATUS_REPORTED. Weekly ranks are preliminary when playing status is unconfirmed; they are separate from season ranks.</w:t>
       </w:r>
     </w:p>
     <w:p>
@@ -17063,7 +17063,7 @@
         <w:pStyle w:val="Normal"/>
       </w:pPr>
       <w:r>
-        <w:t xml:space="preserve">Weekly overall model rank 104 (WR39). ROS overall rank 145 (WR63). Availability: NO_ADVERSE_STATUS_REPORTED. Weekly ranks are preliminary when playing status is unconfirmed; they are separate from season ranks.</w:t>
+        <w:t xml:space="preserve">Weekly overall model rank 37 (WR15). ROS overall rank 145 (WR63). Availability: NO_ADVERSE_STATUS_REPORTED. Weekly ranks are preliminary when playing status is unconfirmed; they are separate from season ranks.</w:t>
       </w:r>
     </w:p>
     <w:p>
@@ -17183,7 +17183,7 @@
         <w:pStyle w:val="Normal"/>
       </w:pPr>
       <w:r>
-        <w:t xml:space="preserve">Weekly overall model rank 109 (RB30). ROS overall rank 146 (RB44). Availability: QUESTIONABLE. Weekly ranks are preliminary when playing status is unconfirmed; they are separate from season ranks.</w:t>
+        <w:t xml:space="preserve">Weekly overall model rank 38 (RB10). ROS overall rank 146 (RB44). Availability: QUESTIONABLE. Weekly ranks are preliminary when playing status is unconfirmed; they are separate from season ranks.</w:t>
       </w:r>
     </w:p>
     <w:p>
@@ -17663,7 +17663,7 @@
         <w:pStyle w:val="Normal"/>
       </w:pPr>
       <w:r>
-        <w:t xml:space="preserve">Weekly overall model rank 63 (RB14). ROS overall rank 150 (RB46). Availability: NO_ADVERSE_STATUS_REPORTED. Weekly ranks are preliminary when playing status is unconfirmed; they are separate from season ranks.</w:t>
+        <w:t xml:space="preserve">Weekly overall model rank Not published (GAME_STARTED_NO_ORIGINAL_WEEKLY_RANK). ROS overall rank 150 (RB46). Availability: NO_ADVERSE_STATUS_REPORTED. Weekly ranks are preliminary when playing status is unconfirmed; they are separate from season ranks.</w:t>
       </w:r>
     </w:p>
     <w:p>
@@ -17903,7 +17903,7 @@
         <w:pStyle w:val="Normal"/>
       </w:pPr>
       <w:r>
-        <w:t xml:space="preserve">Weekly overall model rank 83 (TE15). ROS overall rank 152 (TE24). Availability: NO_ADVERSE_STATUS_REPORTED. Weekly ranks are preliminary when playing status is unconfirmed; they are separate from season ranks.</w:t>
+        <w:t xml:space="preserve">Weekly overall model rank Not published (GAME_STARTED_NO_ORIGINAL_WEEKLY_RANK). ROS overall rank 152 (TE24). Availability: NO_ADVERSE_STATUS_REPORTED. Weekly ranks are preliminary when playing status is unconfirmed; they are separate from season ranks.</w:t>
       </w:r>
     </w:p>
     <w:p>
@@ -18263,7 +18263,7 @@
         <w:pStyle w:val="Normal"/>
       </w:pPr>
       <w:r>
-        <w:t xml:space="preserve">Weekly overall model rank 120 (RB40). ROS overall rank 155 (RB49). Availability: QUESTIONABLE. Weekly ranks are preliminary when playing status is unconfirmed; they are separate from season ranks.</w:t>
+        <w:t xml:space="preserve">Weekly overall model rank Not published (GAME_STARTED_NO_ORIGINAL_WEEKLY_RANK). ROS overall rank 155 (RB49). Availability: QUESTIONABLE. Weekly ranks are preliminary when playing status is unconfirmed; they are separate from season ranks.</w:t>
       </w:r>
     </w:p>
     <w:p>
@@ -18383,7 +18383,7 @@
         <w:pStyle w:val="Normal"/>
       </w:pPr>
       <w:r>
-        <w:t xml:space="preserve">Weekly overall model rank 125 (RB44). ROS overall rank 156 (RB50). Availability: NO_ADVERSE_STATUS_REPORTED. Weekly ranks are preliminary when playing status is unconfirmed; they are separate from season ranks.</w:t>
+        <w:t xml:space="preserve">Weekly overall model rank Not published (GAME_STARTED_NO_ORIGINAL_WEEKLY_RANK). ROS overall rank 156 (RB50). Availability: NO_ADVERSE_STATUS_REPORTED. Weekly ranks are preliminary when playing status is unconfirmed; they are separate from season ranks.</w:t>
       </w:r>
     </w:p>
     <w:p>
@@ -18503,7 +18503,7 @@
         <w:pStyle w:val="Normal"/>
       </w:pPr>
       <w:r>
-        <w:t xml:space="preserve">Weekly overall model rank 89 (RB21). ROS overall rank 157 (RB51). Availability: NO_ADVERSE_STATUS_REPORTED. Weekly ranks are preliminary when playing status is unconfirmed; they are separate from season ranks.</w:t>
+        <w:t xml:space="preserve">Weekly overall model rank Not published (GAME_STARTED_NO_ORIGINAL_WEEKLY_RANK). ROS overall rank 157 (RB51). Availability: NO_ADVERSE_STATUS_REPORTED. Weekly ranks are preliminary when playing status is unconfirmed; they are separate from season ranks.</w:t>
       </w:r>
     </w:p>
     <w:p>
@@ -18623,7 +18623,7 @@
         <w:pStyle w:val="Normal"/>
       </w:pPr>
       <w:r>
-        <w:t xml:space="preserve">Weekly overall model rank 77 (WR31). ROS overall rank 158 (WR66). Availability: NO_ADVERSE_STATUS_REPORTED. Weekly ranks are preliminary when playing status is unconfirmed; they are separate from season ranks.</w:t>
+        <w:t xml:space="preserve">Weekly overall model rank 28 (WR11). ROS overall rank 158 (WR66). Availability: NO_ADVERSE_STATUS_REPORTED. Weekly ranks are preliminary when playing status is unconfirmed; they are separate from season ranks.</w:t>
       </w:r>
     </w:p>
     <w:p>
@@ -18743,7 +18743,7 @@
         <w:pStyle w:val="Normal"/>
       </w:pPr>
       <w:r>
-        <w:t xml:space="preserve">Weekly overall model rank 121 (WR43). ROS overall rank 159 (WR67). Availability: NO_ADVERSE_STATUS_REPORTED. Weekly ranks are preliminary when playing status is unconfirmed; they are separate from season ranks.</w:t>
+        <w:t xml:space="preserve">Weekly overall model rank Not published (GAME_STARTED_NO_ORIGINAL_WEEKLY_RANK). ROS overall rank 159 (WR67). Availability: NO_ADVERSE_STATUS_REPORTED. Weekly ranks are preliminary when playing status is unconfirmed; they are separate from season ranks.</w:t>
       </w:r>
     </w:p>
     <w:p>
@@ -18863,7 +18863,7 @@
         <w:pStyle w:val="Normal"/>
       </w:pPr>
       <w:r>
-        <w:t xml:space="preserve">Weekly overall model rank 113 (RB33). ROS overall rank 160 (RB52). Availability: NO_ADVERSE_STATUS_REPORTED. Weekly ranks are preliminary when playing status is unconfirmed; they are separate from season ranks.</w:t>
+        <w:t xml:space="preserve">Weekly overall model rank Not published (GAME_STARTED_NO_ORIGINAL_WEEKLY_RANK). ROS overall rank 160 (RB52). Availability: NO_ADVERSE_STATUS_REPORTED. Weekly ranks are preliminary when playing status is unconfirmed; they are separate from season ranks.</w:t>
       </w:r>
     </w:p>
     <w:p>
@@ -18983,7 +18983,7 @@
         <w:pStyle w:val="Normal"/>
       </w:pPr>
       <w:r>
-        <w:t xml:space="preserve">Weekly overall model rank 108 (RB29). ROS overall rank 161 (RB53). Availability: NO_ADVERSE_STATUS_REPORTED. Weekly ranks are preliminary when playing status is unconfirmed; they are separate from season ranks.</w:t>
+        <w:t xml:space="preserve">Weekly overall model rank Not published (GAME_STARTED_NO_ORIGINAL_WEEKLY_RANK). ROS overall rank 161 (RB53). Availability: NO_ADVERSE_STATUS_REPORTED. Weekly ranks are preliminary when playing status is unconfirmed; they are separate from season ranks.</w:t>
       </w:r>
     </w:p>
     <w:p>
@@ -19103,7 +19103,7 @@
         <w:pStyle w:val="Normal"/>
       </w:pPr>
       <w:r>
-        <w:t xml:space="preserve">Weekly overall model rank 115 (RB35). ROS overall rank 162 (RB54). Availability: NO_ADVERSE_STATUS_REPORTED. Weekly ranks are preliminary when playing status is unconfirmed; they are separate from season ranks.</w:t>
+        <w:t xml:space="preserve">Weekly overall model rank Not published (GAME_STARTED_NO_ORIGINAL_WEEKLY_RANK). ROS overall rank 162 (RB54). Availability: NO_ADVERSE_STATUS_REPORTED. Weekly ranks are preliminary when playing status is unconfirmed; they are separate from season ranks.</w:t>
       </w:r>
     </w:p>
     <w:p>
@@ -19223,7 +19223,7 @@
         <w:pStyle w:val="Normal"/>
       </w:pPr>
       <w:r>
-        <w:t xml:space="preserve">Weekly overall model rank 92 (WR35). ROS overall rank 163 (WR68). Availability: NO_ADVERSE_STATUS_REPORTED. Weekly ranks are preliminary when playing status is unconfirmed; they are separate from season ranks.</w:t>
+        <w:t xml:space="preserve">Weekly overall model rank Not published (GAME_STARTED_NO_ORIGINAL_WEEKLY_RANK). ROS overall rank 163 (WR68). Availability: NO_ADVERSE_STATUS_REPORTED. Weekly ranks are preliminary when playing status is unconfirmed; they are separate from season ranks.</w:t>
       </w:r>
     </w:p>
     <w:p>
@@ -19311,7 +19311,7 @@
         <w:pStyle w:val="Normal"/>
       </w:pPr>
       <w:r>
-        <w:t xml:space="preserve">Weekly overall model rank 53 (QB18). ROS overall rank 164 (QB18). Availability: NO_ADVERSE_STATUS_REPORTED. Weekly ranks are preliminary when playing status is unconfirmed; they are separate from season ranks.</w:t>
+        <w:t xml:space="preserve">Weekly overall model rank Not published (GAME_STARTED_NO_ORIGINAL_WEEKLY_RANK). ROS overall rank 164 (QB18). Availability: NO_ADVERSE_STATUS_REPORTED. Weekly ranks are preliminary when playing status is unconfirmed; they are separate from season ranks.</w:t>
       </w:r>
     </w:p>
     <w:p>
@@ -19431,7 +19431,7 @@
         <w:pStyle w:val="Normal"/>
       </w:pPr>
       <w:r>
-        <w:t xml:space="preserve">Weekly overall model rank 21 (QB6). ROS overall rank 165 (QB19). Availability: NO_ADVERSE_STATUS_REPORTED. Weekly ranks are preliminary when playing status is unconfirmed; they are separate from season ranks.</w:t>
+        <w:t xml:space="preserve">Weekly overall model rank Not published (GAME_STARTED_NO_ORIGINAL_WEEKLY_RANK). ROS overall rank 165 (QB19). Availability: NO_ADVERSE_STATUS_REPORTED. Weekly ranks are preliminary when playing status is unconfirmed; they are separate from season ranks.</w:t>
       </w:r>
     </w:p>
     <w:p>
@@ -19551,7 +19551,7 @@
         <w:pStyle w:val="Normal"/>
       </w:pPr>
       <w:r>
-        <w:t xml:space="preserve">Weekly overall model rank 107 (RB28). ROS overall rank 166 (RB55). Availability: NO_ADVERSE_STATUS_REPORTED. Weekly ranks are preliminary when playing status is unconfirmed; they are separate from season ranks.</w:t>
+        <w:t xml:space="preserve">Weekly overall model rank Not published (GAME_STARTED_NO_ORIGINAL_WEEKLY_RANK). ROS overall rank 166 (RB55). Availability: NO_ADVERSE_STATUS_REPORTED. Weekly ranks are preliminary when playing status is unconfirmed; they are separate from season ranks.</w:t>
       </w:r>
     </w:p>
     <w:p>
@@ -19655,7 +19655,7 @@
         <w:pStyle w:val="Normal"/>
       </w:pPr>
       <w:r>
-        <w:t xml:space="preserve">Weekly overall model rank 117 (RB37). ROS overall rank 167 (RB56). Availability: NO_ADVERSE_STATUS_REPORTED. Weekly ranks are preliminary when playing status is unconfirmed; they are separate from season ranks.</w:t>
+        <w:t xml:space="preserve">Weekly overall model rank Not published (GAME_STARTED_NO_ORIGINAL_WEEKLY_RANK). ROS overall rank 167 (RB56). Availability: NO_ADVERSE_STATUS_REPORTED. Weekly ranks are preliminary when playing status is unconfirmed; they are separate from season ranks.</w:t>
       </w:r>
     </w:p>
     <w:p>
@@ -19775,7 +19775,7 @@
         <w:pStyle w:val="Normal"/>
       </w:pPr>
       <w:r>
-        <w:t xml:space="preserve">Weekly overall model rank 22 (QB7). ROS overall rank 168 (QB20). Availability: NO_ADVERSE_STATUS_REPORTED. Weekly ranks are preliminary when playing status is unconfirmed; they are separate from season ranks.</w:t>
+        <w:t xml:space="preserve">Weekly overall model rank 12 (QB2). ROS overall rank 168 (QB20). Availability: NO_ADVERSE_STATUS_REPORTED. Weekly ranks are preliminary when playing status is unconfirmed; they are separate from season ranks.</w:t>
       </w:r>
     </w:p>
     <w:p>
@@ -19983,7 +19983,7 @@
         <w:pStyle w:val="Normal"/>
       </w:pPr>
       <w:r>
-        <w:t xml:space="preserve">Weekly overall model rank 23 (QB8). ROS overall rank 170 (QB21). Availability: NO_ADVERSE_STATUS_REPORTED. Weekly ranks are preliminary when playing status is unconfirmed; they are separate from season ranks.</w:t>
+        <w:t xml:space="preserve">Weekly overall model rank 13 (QB3). ROS overall rank 170 (QB21). Availability: NO_ADVERSE_STATUS_REPORTED. Weekly ranks are preliminary when playing status is unconfirmed; they are separate from season ranks.</w:t>
       </w:r>
     </w:p>
     <w:p>
@@ -20103,7 +20103,7 @@
         <w:pStyle w:val="Normal"/>
       </w:pPr>
       <w:r>
-        <w:t xml:space="preserve">Weekly overall model rank 124 (RB43). ROS overall rank 171 (RB58). Availability: NO_ADVERSE_STATUS_REPORTED. Weekly ranks are preliminary when playing status is unconfirmed; they are separate from season ranks.</w:t>
+        <w:t xml:space="preserve">Weekly overall model rank 41 (RB13). ROS overall rank 171 (RB58). Availability: NO_ADVERSE_STATUS_REPORTED. Weekly ranks are preliminary when playing status is unconfirmed; they are separate from season ranks.</w:t>
       </w:r>
     </w:p>
     <w:p>
@@ -20191,7 +20191,7 @@
         <w:pStyle w:val="Normal"/>
       </w:pPr>
       <w:r>
-        <w:t xml:space="preserve">Weekly overall model rank 123 (RB42). ROS overall rank 172 (RB59). Availability: NO_ADVERSE_STATUS_REPORTED. Weekly ranks are preliminary when playing status is unconfirmed; they are separate from season ranks.</w:t>
+        <w:t xml:space="preserve">Weekly overall model rank Not published (GAME_STARTED_NO_ORIGINAL_WEEKLY_RANK). ROS overall rank 172 (RB59). Availability: NO_ADVERSE_STATUS_REPORTED. Weekly ranks are preliminary when playing status is unconfirmed; they are separate from season ranks.</w:t>
       </w:r>
     </w:p>
     <w:p>
@@ -20311,7 +20311,7 @@
         <w:pStyle w:val="Normal"/>
       </w:pPr>
       <w:r>
-        <w:t xml:space="preserve">Weekly overall model rank 119 (RB39). ROS overall rank 173 (RB60). Availability: UNKNOWN. Weekly ranks are preliminary when playing status is unconfirmed; they are separate from season ranks.</w:t>
+        <w:t xml:space="preserve">Weekly overall model rank Not published (GAME_STARTED_NO_ORIGINAL_WEEKLY_RANK). ROS overall rank 173 (RB60). Availability: UNKNOWN. Weekly ranks are preliminary when playing status is unconfirmed; they are separate from season ranks.</w:t>
       </w:r>
     </w:p>
     <w:p>
@@ -20431,7 +20431,7 @@
         <w:pStyle w:val="Normal"/>
       </w:pPr>
       <w:r>
-        <w:t xml:space="preserve">Weekly overall model rank 129 (WR45). ROS overall rank 174 (WR69). Availability: NO_ADVERSE_STATUS_REPORTED. Weekly ranks are preliminary when playing status is unconfirmed; they are separate from season ranks.</w:t>
+        <w:t xml:space="preserve">Weekly overall model rank Not published (GAME_STARTED_NO_ORIGINAL_WEEKLY_RANK). ROS overall rank 174 (WR69). Availability: NO_ADVERSE_STATUS_REPORTED. Weekly ranks are preliminary when playing status is unconfirmed; they are separate from season ranks.</w:t>
       </w:r>
     </w:p>
     <w:p>
@@ -20551,7 +20551,7 @@
         <w:pStyle w:val="Normal"/>
       </w:pPr>
       <w:r>
-        <w:t xml:space="preserve">Weekly overall model rank 31 (QB12). ROS overall rank 175 (QB22). Availability: NO_ADVERSE_STATUS_REPORTED. Weekly ranks are preliminary when playing status is unconfirmed; they are separate from season ranks.</w:t>
+        <w:t xml:space="preserve">Weekly overall model rank Not published (GAME_STARTED_NO_ORIGINAL_WEEKLY_RANK). ROS overall rank 175 (QB22). Availability: NO_ADVERSE_STATUS_REPORTED. Weekly ranks are preliminary when playing status is unconfirmed; they are separate from season ranks.</w:t>
       </w:r>
     </w:p>
     <w:p>
@@ -20671,7 +20671,7 @@
         <w:pStyle w:val="Normal"/>
       </w:pPr>
       <w:r>
-        <w:t xml:space="preserve">Weekly overall model rank 112 (WR42). ROS overall rank 176 (WR70). Availability: NO_ADVERSE_STATUS_REPORTED. Weekly ranks are preliminary when playing status is unconfirmed; they are separate from season ranks.</w:t>
+        <w:t xml:space="preserve">Weekly overall model rank Not published (GAME_STARTED_NO_ORIGINAL_WEEKLY_RANK). ROS overall rank 176 (WR70). Availability: NO_ADVERSE_STATUS_REPORTED. Weekly ranks are preliminary when playing status is unconfirmed; they are separate from season ranks.</w:t>
       </w:r>
     </w:p>
     <w:p>
@@ -20759,7 +20759,7 @@
         <w:pStyle w:val="Normal"/>
       </w:pPr>
       <w:r>
-        <w:t xml:space="preserve">Weekly overall model rank 128 (WR44). ROS overall rank 177 (WR71). Availability: NO_ADVERSE_STATUS_REPORTED. Weekly ranks are preliminary when playing status is unconfirmed; they are separate from season ranks.</w:t>
+        <w:t xml:space="preserve">Weekly overall model rank Not published (GAME_STARTED_NO_ORIGINAL_WEEKLY_RANK). ROS overall rank 177 (WR71). Availability: NO_ADVERSE_STATUS_REPORTED. Weekly ranks are preliminary when playing status is unconfirmed; they are separate from season ranks.</w:t>
       </w:r>
     </w:p>
     <w:p>
@@ -20967,7 +20967,7 @@
         <w:pStyle w:val="Normal"/>
       </w:pPr>
       <w:r>
-        <w:t xml:space="preserve">Weekly overall model rank 131 (TE21). ROS overall rank 179 (TE25). Availability: NO_ADVERSE_STATUS_REPORTED. Weekly ranks are preliminary when playing status is unconfirmed; they are separate from season ranks.</w:t>
+        <w:t xml:space="preserve">Weekly overall model rank Not published (GAME_STARTED_NO_ORIGINAL_WEEKLY_RANK). ROS overall rank 179 (TE25). Availability: NO_ADVERSE_STATUS_REPORTED. Weekly ranks are preliminary when playing status is unconfirmed; they are separate from season ranks.</w:t>
       </w:r>
     </w:p>
     <w:p>
@@ -21087,7 +21087,7 @@
         <w:pStyle w:val="Normal"/>
       </w:pPr>
       <w:r>
-        <w:t xml:space="preserve">Weekly overall model rank 122 (RB41). ROS overall rank 180 (RB61). Availability: NO_ADVERSE_STATUS_REPORTED. Weekly ranks are preliminary when playing status is unconfirmed; they are separate from season ranks.</w:t>
+        <w:t xml:space="preserve">Weekly overall model rank Not published (GAME_STARTED_NO_ORIGINAL_WEEKLY_RANK). ROS overall rank 180 (RB61). Availability: NO_ADVERSE_STATUS_REPORTED. Weekly ranks are preliminary when playing status is unconfirmed; they are separate from season ranks.</w:t>
       </w:r>
     </w:p>
     <w:p>
@@ -21295,7 +21295,7 @@
         <w:pStyle w:val="Normal"/>
       </w:pPr>
       <w:r>
-        <w:t xml:space="preserve">Weekly overall model rank 33 (QB13). ROS overall rank 182 (QB23). Availability: NO_ADVERSE_STATUS_REPORTED. Weekly ranks are preliminary when playing status is unconfirmed; they are separate from season ranks.</w:t>
+        <w:t xml:space="preserve">Weekly overall model rank 16 (QB5). ROS overall rank 182 (QB23). Availability: NO_ADVERSE_STATUS_REPORTED. Weekly ranks are preliminary when playing status is unconfirmed; they are separate from season ranks.</w:t>
       </w:r>
     </w:p>
     <w:p>
@@ -21415,7 +21415,7 @@
         <w:pStyle w:val="Normal"/>
       </w:pPr>
       <w:r>
-        <w:t xml:space="preserve">Weekly overall model rank 126 (RB45). ROS overall rank 183 (RB63). Availability: NO_ADVERSE_STATUS_REPORTED. Weekly ranks are preliminary when playing status is unconfirmed; they are separate from season ranks.</w:t>
+        <w:t xml:space="preserve">Weekly overall model rank Not published (GAME_STARTED_NO_ORIGINAL_WEEKLY_RANK). ROS overall rank 183 (RB63). Availability: NO_ADVERSE_STATUS_REPORTED. Weekly ranks are preliminary when playing status is unconfirmed; they are separate from season ranks.</w:t>
       </w:r>
     </w:p>
     <w:p>
@@ -21535,7 +21535,7 @@
         <w:pStyle w:val="Normal"/>
       </w:pPr>
       <w:r>
-        <w:t xml:space="preserve">Weekly overall model rank 130 (RB46). ROS overall rank 184 (RB64). Availability: QUESTIONABLE. Weekly ranks are preliminary when playing status is unconfirmed; they are separate from season ranks.</w:t>
+        <w:t xml:space="preserve">Weekly overall model rank Not published (GAME_STARTED_NO_ORIGINAL_WEEKLY_RANK). ROS overall rank 184 (RB64). Availability: QUESTIONABLE. Weekly ranks are preliminary when playing status is unconfirmed; they are separate from season ranks.</w:t>
       </w:r>
     </w:p>
     <w:p>
@@ -21655,7 +21655,7 @@
         <w:pStyle w:val="Normal"/>
       </w:pPr>
       <w:r>
-        <w:t xml:space="preserve">Weekly overall model rank 39 (QB15). ROS overall rank 185 (QB24). Availability: NO_ADVERSE_STATUS_REPORTED. Weekly ranks are preliminary when playing status is unconfirmed; they are separate from season ranks.</w:t>
+        <w:t xml:space="preserve">Weekly overall model rank Not published (GAME_STARTED_NO_ORIGINAL_WEEKLY_RANK). ROS overall rank 185 (QB24). Availability: NO_ADVERSE_STATUS_REPORTED. Weekly ranks are preliminary when playing status is unconfirmed; they are separate from season ranks.</w:t>
       </w:r>
     </w:p>
     <w:p>
@@ -21895,7 +21895,7 @@
         <w:pStyle w:val="Normal"/>
       </w:pPr>
       <w:r>
-        <w:t xml:space="preserve">Weekly overall model rank 127 (TE20). ROS overall rank 187 (TE26). Availability: NO_ADVERSE_STATUS_REPORTED. Weekly ranks are preliminary when playing status is unconfirmed; they are separate from season ranks.</w:t>
+        <w:t xml:space="preserve">Weekly overall model rank Not published (GAME_STARTED_NO_ORIGINAL_WEEKLY_RANK). ROS overall rank 187 (TE26). Availability: NO_ADVERSE_STATUS_REPORTED. Weekly ranks are preliminary when playing status is unconfirmed; they are separate from season ranks.</w:t>
       </w:r>
     </w:p>
     <w:p>
@@ -22015,7 +22015,7 @@
         <w:pStyle w:val="Normal"/>
       </w:pPr>
       <w:r>
-        <w:t xml:space="preserve">Weekly overall model rank 36 (QB14). ROS overall rank 188 (QB26). Availability: NO_ADVERSE_STATUS_REPORTED. Weekly ranks are preliminary when playing status is unconfirmed; they are separate from season ranks.</w:t>
+        <w:t xml:space="preserve">Weekly overall model rank Not published (GAME_STARTED_NO_ORIGINAL_WEEKLY_RANK). ROS overall rank 188 (QB26). Availability: NO_ADVERSE_STATUS_REPORTED. Weekly ranks are preliminary when playing status is unconfirmed; they are separate from season ranks.</w:t>
       </w:r>
     </w:p>
     <w:p>
@@ -22255,7 +22255,7 @@
         <w:pStyle w:val="Normal"/>
       </w:pPr>
       <w:r>
-        <w:t xml:space="preserve">Weekly overall model rank 90 (QB19). ROS overall rank 190 (QB27). Availability: NO_ADVERSE_STATUS_REPORTED. Weekly ranks are preliminary when playing status is unconfirmed; they are separate from season ranks.</w:t>
+        <w:t xml:space="preserve">Weekly overall model rank Not published (GAME_STARTED_NO_ORIGINAL_WEEKLY_RANK). ROS overall rank 190 (QB27). Availability: NO_ADVERSE_STATUS_REPORTED. Weekly ranks are preliminary when playing status is unconfirmed; they are separate from season ranks.</w:t>
       </w:r>
     </w:p>
     <w:p>
@@ -22463,7 +22463,7 @@
         <w:pStyle w:val="Normal"/>
       </w:pPr>
       <w:r>
-        <w:t xml:space="preserve">Weekly overall model rank 45 (QB16). ROS overall rank 192 (QB28). Availability: NO_ADVERSE_STATUS_REPORTED. Weekly ranks are preliminary when playing status is unconfirmed; they are separate from season ranks.</w:t>
+        <w:t xml:space="preserve">Weekly overall model rank 21 (QB6). ROS overall rank 192 (QB28). Availability: NO_ADVERSE_STATUS_REPORTED. Weekly ranks are preliminary when playing status is unconfirmed; they are separate from season ranks.</w:t>
       </w:r>
     </w:p>
     <w:p>
@@ -22583,7 +22583,7 @@
         <w:pStyle w:val="Normal"/>
       </w:pPr>
       <w:r>
-        <w:t xml:space="preserve">Weekly overall model rank 132 (WR46). ROS overall rank 193 (WR73). Availability: NO_ADVERSE_STATUS_REPORTED. Weekly ranks are preliminary when playing status is unconfirmed; they are separate from season ranks.</w:t>
+        <w:t xml:space="preserve">Weekly overall model rank Not published (GAME_STARTED_NO_ORIGINAL_WEEKLY_RANK). ROS overall rank 193 (WR73). Availability: NO_ADVERSE_STATUS_REPORTED. Weekly ranks are preliminary when playing status is unconfirmed; they are separate from season ranks.</w:t>
       </w:r>
     </w:p>
     <w:p>
@@ -22703,7 +22703,7 @@
         <w:pStyle w:val="Normal"/>
       </w:pPr>
       <w:r>
-        <w:t xml:space="preserve">Weekly overall model rank 48 (QB17). ROS overall rank 194 (QB29). Availability: NO_ADVERSE_STATUS_REPORTED. Weekly ranks are preliminary when playing status is unconfirmed; they are separate from season ranks.</w:t>
+        <w:t xml:space="preserve">Weekly overall model rank Not published (GAME_STARTED_NO_ORIGINAL_WEEKLY_RANK). ROS overall rank 194 (QB29). Availability: NO_ADVERSE_STATUS_REPORTED. Weekly ranks are preliminary when playing status is unconfirmed; they are separate from season ranks.</w:t>
       </w:r>
     </w:p>
     <w:p>
@@ -23063,7 +23063,7 @@
         <w:pStyle w:val="Normal"/>
       </w:pPr>
       <w:r>
-        <w:t xml:space="preserve">Weekly overall model rank 114 (RB34). ROS overall rank 197 (RB67). Availability: NO_ADVERSE_STATUS_REPORTED. Weekly ranks are preliminary when playing status is unconfirmed; they are separate from season ranks.</w:t>
+        <w:t xml:space="preserve">Weekly overall model rank 40 (RB12). ROS overall rank 197 (RB67). Availability: NO_ADVERSE_STATUS_REPORTED. Weekly ranks are preliminary when playing status is unconfirmed; they are separate from season ranks.</w:t>
       </w:r>
     </w:p>
     <w:p>

</xml_diff>

<commit_message>
Advance production context to Week 8
</commit_message>
<xml_diff>
--- a/exports/fantasy-2026-current.docx
+++ b/exports/fantasy-2026-current.docx
@@ -47,15 +47,15 @@
         <w:pStyle w:val="Heading2"/>
       </w:pPr>
       <w:r>
-        <w:t xml:space="preserve">Week 7 outlook</w:t>
-      </w:r>
-    </w:p>
-    <w:p>
-      <w:pPr>
-        <w:pStyle w:val="Normal"/>
-      </w:pPr>
-      <w:r>
-        <w:t xml:space="preserve">Weekly overall model rank Not published (GAME_STARTED_NO_ORIGINAL_WEEKLY_RANK). ROS overall rank 1 (RB1). Availability: NO_ADVERSE_STATUS_REPORTED. Weekly ranks are preliminary when playing status is unconfirmed; they are separate from season ranks.</w:t>
+        <w:t xml:space="preserve">Week 8 outlook</w:t>
+      </w:r>
+    </w:p>
+    <w:p>
+      <w:pPr>
+        <w:pStyle w:val="Normal"/>
+      </w:pPr>
+      <w:r>
+        <w:t xml:space="preserve">Weekly overall model rank 5 (RB2). ROS overall rank 1 (RB1). Availability: NO_ADVERSE_STATUS_REPORTED. Weekly ranks are preliminary when playing status is unconfirmed; they are separate from season ranks.</w:t>
       </w:r>
     </w:p>
     <w:p>
@@ -167,15 +167,15 @@
         <w:pStyle w:val="Heading2"/>
       </w:pPr>
       <w:r>
-        <w:t xml:space="preserve">Week 7 outlook</w:t>
-      </w:r>
-    </w:p>
-    <w:p>
-      <w:pPr>
-        <w:pStyle w:val="Normal"/>
-      </w:pPr>
-      <w:r>
-        <w:t xml:space="preserve">Weekly overall model rank Not published (GAME_STARTED_NO_ORIGINAL_WEEKLY_RANK). ROS overall rank 2 (RB2). Availability: NO_ADVERSE_STATUS_REPORTED. Weekly ranks are preliminary when playing status is unconfirmed; they are separate from season ranks.</w:t>
+        <w:t xml:space="preserve">Week 8 outlook</w:t>
+      </w:r>
+    </w:p>
+    <w:p>
+      <w:pPr>
+        <w:pStyle w:val="Normal"/>
+      </w:pPr>
+      <w:r>
+        <w:t xml:space="preserve">Weekly overall model rank 1 (RB1). ROS overall rank 2 (RB2). Availability: NO_ADVERSE_STATUS_REPORTED. Weekly ranks are preliminary when playing status is unconfirmed; they are separate from season ranks.</w:t>
       </w:r>
     </w:p>
     <w:p>
@@ -287,15 +287,15 @@
         <w:pStyle w:val="Heading2"/>
       </w:pPr>
       <w:r>
-        <w:t xml:space="preserve">Week 7 outlook</w:t>
-      </w:r>
-    </w:p>
-    <w:p>
-      <w:pPr>
-        <w:pStyle w:val="Normal"/>
-      </w:pPr>
-      <w:r>
-        <w:t xml:space="preserve">Weekly overall model rank Not published (GAME_STARTED_NO_ORIGINAL_WEEKLY_RANK). ROS overall rank 3 (WR1). Availability: NO_ADVERSE_STATUS_REPORTED. Weekly ranks are preliminary when playing status is unconfirmed; they are separate from season ranks.</w:t>
+        <w:t xml:space="preserve">Week 8 outlook</w:t>
+      </w:r>
+    </w:p>
+    <w:p>
+      <w:pPr>
+        <w:pStyle w:val="Normal"/>
+      </w:pPr>
+      <w:r>
+        <w:t xml:space="preserve">Weekly overall model rank 4 (WR1). ROS overall rank 3 (WR1). Availability: NO_ADVERSE_STATUS_REPORTED. Weekly ranks are preliminary when playing status is unconfirmed; they are separate from season ranks.</w:t>
       </w:r>
     </w:p>
     <w:p>
@@ -407,15 +407,15 @@
         <w:pStyle w:val="Heading2"/>
       </w:pPr>
       <w:r>
-        <w:t xml:space="preserve">Week 7 outlook</w:t>
-      </w:r>
-    </w:p>
-    <w:p>
-      <w:pPr>
-        <w:pStyle w:val="Normal"/>
-      </w:pPr>
-      <w:r>
-        <w:t xml:space="preserve">Weekly overall model rank Not published (GAME_STARTED_NO_ORIGINAL_WEEKLY_RANK). ROS overall rank 4 (WR2). Availability: QUESTIONABLE. Weekly ranks are preliminary when playing status is unconfirmed; they are separate from season ranks.</w:t>
+        <w:t xml:space="preserve">Week 8 outlook</w:t>
+      </w:r>
+    </w:p>
+    <w:p>
+      <w:pPr>
+        <w:pStyle w:val="Normal"/>
+      </w:pPr>
+      <w:r>
+        <w:t xml:space="preserve">Weekly overall model rank 18 (WR6). ROS overall rank 4 (WR2). Availability: NO_ADVERSE_STATUS_REPORTED. Weekly ranks are preliminary when playing status is unconfirmed; they are separate from season ranks.</w:t>
       </w:r>
     </w:p>
     <w:p>
@@ -527,15 +527,15 @@
         <w:pStyle w:val="Heading2"/>
       </w:pPr>
       <w:r>
-        <w:t xml:space="preserve">Week 7 outlook</w:t>
-      </w:r>
-    </w:p>
-    <w:p>
-      <w:pPr>
-        <w:pStyle w:val="Normal"/>
-      </w:pPr>
-      <w:r>
-        <w:t xml:space="preserve">Weekly overall model rank Not published (GAME_STARTED_NO_ORIGINAL_WEEKLY_RANK). ROS overall rank 5 (WR3). Availability: NO_ADVERSE_STATUS_REPORTED. Weekly ranks are preliminary when playing status is unconfirmed; they are separate from season ranks.</w:t>
+        <w:t xml:space="preserve">Week 8 outlook</w:t>
+      </w:r>
+    </w:p>
+    <w:p>
+      <w:pPr>
+        <w:pStyle w:val="Normal"/>
+      </w:pPr>
+      <w:r>
+        <w:t xml:space="preserve">Weekly overall model rank 13 (WR4). ROS overall rank 5 (WR3). Availability: NO_ADVERSE_STATUS_REPORTED. Weekly ranks are preliminary when playing status is unconfirmed; they are separate from season ranks.</w:t>
       </w:r>
     </w:p>
     <w:p>
@@ -647,15 +647,15 @@
         <w:pStyle w:val="Heading2"/>
       </w:pPr>
       <w:r>
-        <w:t xml:space="preserve">Week 7 outlook</w:t>
-      </w:r>
-    </w:p>
-    <w:p>
-      <w:pPr>
-        <w:pStyle w:val="Normal"/>
-      </w:pPr>
-      <w:r>
-        <w:t xml:space="preserve">Weekly overall model rank Not published (GAME_STARTED_NO_ORIGINAL_WEEKLY_RANK). ROS overall rank 6 (WR4). Availability: QUESTIONABLE. Weekly ranks are preliminary when playing status is unconfirmed; they are separate from season ranks.</w:t>
+        <w:t xml:space="preserve">Week 8 outlook</w:t>
+      </w:r>
+    </w:p>
+    <w:p>
+      <w:pPr>
+        <w:pStyle w:val="Normal"/>
+      </w:pPr>
+      <w:r>
+        <w:t xml:space="preserve">Weekly overall model rank 6 (WR2). ROS overall rank 6 (WR4). Availability: NO_ADVERSE_STATUS_REPORTED. Weekly ranks are preliminary when playing status is unconfirmed; they are separate from season ranks.</w:t>
       </w:r>
     </w:p>
     <w:p>
@@ -735,15 +735,15 @@
         <w:pStyle w:val="Heading2"/>
       </w:pPr>
       <w:r>
-        <w:t xml:space="preserve">Week 7 outlook</w:t>
-      </w:r>
-    </w:p>
-    <w:p>
-      <w:pPr>
-        <w:pStyle w:val="Normal"/>
-      </w:pPr>
-      <w:r>
-        <w:t xml:space="preserve">Weekly overall model rank Not published (GAME_STARTED_NO_ORIGINAL_WEEKLY_RANK). ROS overall rank 7 (RB3). Availability: QUESTIONABLE. Weekly ranks are preliminary when playing status is unconfirmed; they are separate from season ranks.</w:t>
+        <w:t xml:space="preserve">Week 8 outlook</w:t>
+      </w:r>
+    </w:p>
+    <w:p>
+      <w:pPr>
+        <w:pStyle w:val="Normal"/>
+      </w:pPr>
+      <w:r>
+        <w:t xml:space="preserve">Weekly overall model rank Not published (NO_CURRENT_WEEK_GAME). ROS overall rank 7 (RB3). Availability: QUESTIONABLE. Weekly ranks are preliminary when playing status is unconfirmed; they are separate from season ranks.</w:t>
       </w:r>
     </w:p>
     <w:p>
@@ -855,7 +855,7 @@
         <w:pStyle w:val="Heading2"/>
       </w:pPr>
       <w:r>
-        <w:t xml:space="preserve">Week 7 outlook</w:t>
+        <w:t xml:space="preserve">Week 8 outlook</w:t>
       </w:r>
     </w:p>
     <w:p>
@@ -975,15 +975,15 @@
         <w:pStyle w:val="Heading2"/>
       </w:pPr>
       <w:r>
-        <w:t xml:space="preserve">Week 7 outlook</w:t>
-      </w:r>
-    </w:p>
-    <w:p>
-      <w:pPr>
-        <w:pStyle w:val="Normal"/>
-      </w:pPr>
-      <w:r>
-        <w:t xml:space="preserve">Weekly overall model rank Not published (GAME_STARTED_NO_ORIGINAL_WEEKLY_RANK). ROS overall rank 9 (WR5). Availability: UNKNOWN. Weekly ranks are preliminary when playing status is unconfirmed; they are separate from season ranks.</w:t>
+        <w:t xml:space="preserve">Week 8 outlook</w:t>
+      </w:r>
+    </w:p>
+    <w:p>
+      <w:pPr>
+        <w:pStyle w:val="Normal"/>
+      </w:pPr>
+      <w:r>
+        <w:t xml:space="preserve">Weekly overall model rank 14 (WR5). ROS overall rank 9 (WR5). Availability: NO_ADVERSE_STATUS_REPORTED. Weekly ranks are preliminary when playing status is unconfirmed; they are separate from season ranks.</w:t>
       </w:r>
     </w:p>
     <w:p>
@@ -1095,15 +1095,15 @@
         <w:pStyle w:val="Heading2"/>
       </w:pPr>
       <w:r>
-        <w:t xml:space="preserve">Week 7 outlook</w:t>
-      </w:r>
-    </w:p>
-    <w:p>
-      <w:pPr>
-        <w:pStyle w:val="Normal"/>
-      </w:pPr>
-      <w:r>
-        <w:t xml:space="preserve">Weekly overall model rank Not published (GAME_STARTED_NO_ORIGINAL_WEEKLY_RANK). ROS overall rank 10 (RB5). Availability: NO_ADVERSE_STATUS_REPORTED. Weekly ranks are preliminary when playing status is unconfirmed; they are separate from season ranks.</w:t>
+        <w:t xml:space="preserve">Week 8 outlook</w:t>
+      </w:r>
+    </w:p>
+    <w:p>
+      <w:pPr>
+        <w:pStyle w:val="Normal"/>
+      </w:pPr>
+      <w:r>
+        <w:t xml:space="preserve">Weekly overall model rank 12 (RB3). ROS overall rank 10 (RB5). Availability: NO_ADVERSE_STATUS_REPORTED. Weekly ranks are preliminary when playing status is unconfirmed; they are separate from season ranks.</w:t>
       </w:r>
     </w:p>
     <w:p>
@@ -1215,15 +1215,15 @@
         <w:pStyle w:val="Heading2"/>
       </w:pPr>
       <w:r>
-        <w:t xml:space="preserve">Week 7 outlook</w:t>
-      </w:r>
-    </w:p>
-    <w:p>
-      <w:pPr>
-        <w:pStyle w:val="Normal"/>
-      </w:pPr>
-      <w:r>
-        <w:t xml:space="preserve">Weekly overall model rank Not published (GAME_STARTED_NO_ORIGINAL_WEEKLY_RANK). ROS overall rank 11 (TE1). Availability: NO_ADVERSE_STATUS_REPORTED. Weekly ranks are preliminary when playing status is unconfirmed; they are separate from season ranks.</w:t>
+        <w:t xml:space="preserve">Week 8 outlook</w:t>
+      </w:r>
+    </w:p>
+    <w:p>
+      <w:pPr>
+        <w:pStyle w:val="Normal"/>
+      </w:pPr>
+      <w:r>
+        <w:t xml:space="preserve">Weekly overall model rank 9 (TE1). ROS overall rank 11 (TE1). Availability: NO_ADVERSE_STATUS_REPORTED. Weekly ranks are preliminary when playing status is unconfirmed; they are separate from season ranks.</w:t>
       </w:r>
     </w:p>
     <w:p>
@@ -1335,15 +1335,15 @@
         <w:pStyle w:val="Heading2"/>
       </w:pPr>
       <w:r>
-        <w:t xml:space="preserve">Week 7 outlook</w:t>
-      </w:r>
-    </w:p>
-    <w:p>
-      <w:pPr>
-        <w:pStyle w:val="Normal"/>
-      </w:pPr>
-      <w:r>
-        <w:t xml:space="preserve">Weekly overall model rank Not published (NO_CURRENT_WEEK_GAME). ROS overall rank 12 (RB6). Availability: UNKNOWN. Weekly ranks are preliminary when playing status is unconfirmed; they are separate from season ranks.</w:t>
+        <w:t xml:space="preserve">Week 8 outlook</w:t>
+      </w:r>
+    </w:p>
+    <w:p>
+      <w:pPr>
+        <w:pStyle w:val="Normal"/>
+      </w:pPr>
+      <w:r>
+        <w:t xml:space="preserve">Weekly overall model rank 16 (RB4). ROS overall rank 12 (RB6). Availability: NO_ADVERSE_STATUS_REPORTED. Weekly ranks are preliminary when playing status is unconfirmed; they are separate from season ranks.</w:t>
       </w:r>
     </w:p>
     <w:p>
@@ -1455,15 +1455,15 @@
         <w:pStyle w:val="Heading2"/>
       </w:pPr>
       <w:r>
-        <w:t xml:space="preserve">Week 7 outlook</w:t>
-      </w:r>
-    </w:p>
-    <w:p>
-      <w:pPr>
-        <w:pStyle w:val="Normal"/>
-      </w:pPr>
-      <w:r>
-        <w:t xml:space="preserve">Weekly overall model rank Not published (GAME_STARTED_NO_ORIGINAL_WEEKLY_RANK). ROS overall rank 13 (WR6). Availability: UNKNOWN. Weekly ranks are preliminary when playing status is unconfirmed; they are separate from season ranks.</w:t>
+        <w:t xml:space="preserve">Week 8 outlook</w:t>
+      </w:r>
+    </w:p>
+    <w:p>
+      <w:pPr>
+        <w:pStyle w:val="Normal"/>
+      </w:pPr>
+      <w:r>
+        <w:t xml:space="preserve">Weekly overall model rank 11 (WR3). ROS overall rank 13 (WR6). Availability: NO_ADVERSE_STATUS_REPORTED. Weekly ranks are preliminary when playing status is unconfirmed; they are separate from season ranks.</w:t>
       </w:r>
     </w:p>
     <w:p>
@@ -1575,15 +1575,15 @@
         <w:pStyle w:val="Heading2"/>
       </w:pPr>
       <w:r>
-        <w:t xml:space="preserve">Week 7 outlook</w:t>
-      </w:r>
-    </w:p>
-    <w:p>
-      <w:pPr>
-        <w:pStyle w:val="Normal"/>
-      </w:pPr>
-      <w:r>
-        <w:t xml:space="preserve">Weekly overall model rank Not published (GAME_STARTED_NO_ORIGINAL_WEEKLY_RANK). ROS overall rank 14 (RB7). Availability: NO_ADVERSE_STATUS_REPORTED. Weekly ranks are preliminary when playing status is unconfirmed; they are separate from season ranks.</w:t>
+        <w:t xml:space="preserve">Week 8 outlook</w:t>
+      </w:r>
+    </w:p>
+    <w:p>
+      <w:pPr>
+        <w:pStyle w:val="Normal"/>
+      </w:pPr>
+      <w:r>
+        <w:t xml:space="preserve">Weekly overall model rank 41 (RB12). ROS overall rank 14 (RB7). Availability: NO_ADVERSE_STATUS_REPORTED. Weekly ranks are preliminary when playing status is unconfirmed; they are separate from season ranks.</w:t>
       </w:r>
     </w:p>
     <w:p>
@@ -1695,15 +1695,15 @@
         <w:pStyle w:val="Heading2"/>
       </w:pPr>
       <w:r>
-        <w:t xml:space="preserve">Week 7 outlook</w:t>
-      </w:r>
-    </w:p>
-    <w:p>
-      <w:pPr>
-        <w:pStyle w:val="Normal"/>
-      </w:pPr>
-      <w:r>
-        <w:t xml:space="preserve">Weekly overall model rank Not published (NO_CURRENT_WEEK_GAME). ROS overall rank 15 (RB8). Availability: UNKNOWN. Weekly ranks are preliminary when playing status is unconfirmed; they are separate from season ranks.</w:t>
+        <w:t xml:space="preserve">Week 8 outlook</w:t>
+      </w:r>
+    </w:p>
+    <w:p>
+      <w:pPr>
+        <w:pStyle w:val="Normal"/>
+      </w:pPr>
+      <w:r>
+        <w:t xml:space="preserve">Weekly overall model rank 37 (RB10). ROS overall rank 15 (RB8). Availability: NO_ADVERSE_STATUS_REPORTED. Weekly ranks are preliminary when playing status is unconfirmed; they are separate from season ranks.</w:t>
       </w:r>
     </w:p>
     <w:p>
@@ -1815,15 +1815,15 @@
         <w:pStyle w:val="Heading2"/>
       </w:pPr>
       <w:r>
-        <w:t xml:space="preserve">Week 7 outlook</w:t>
-      </w:r>
-    </w:p>
-    <w:p>
-      <w:pPr>
-        <w:pStyle w:val="Normal"/>
-      </w:pPr>
-      <w:r>
-        <w:t xml:space="preserve">Weekly overall model rank Not published (GAME_STARTED_NO_ORIGINAL_WEEKLY_RANK). ROS overall rank 16 (WR7). Availability: NO_ADVERSE_STATUS_REPORTED. Weekly ranks are preliminary when playing status is unconfirmed; they are separate from season ranks.</w:t>
+        <w:t xml:space="preserve">Week 8 outlook</w:t>
+      </w:r>
+    </w:p>
+    <w:p>
+      <w:pPr>
+        <w:pStyle w:val="Normal"/>
+      </w:pPr>
+      <w:r>
+        <w:t xml:space="preserve">Weekly overall model rank 24 (WR9). ROS overall rank 16 (WR7). Availability: NO_ADVERSE_STATUS_REPORTED. Weekly ranks are preliminary when playing status is unconfirmed; they are separate from season ranks.</w:t>
       </w:r>
     </w:p>
     <w:p>
@@ -1903,15 +1903,15 @@
         <w:pStyle w:val="Heading2"/>
       </w:pPr>
       <w:r>
-        <w:t xml:space="preserve">Week 7 outlook</w:t>
-      </w:r>
-    </w:p>
-    <w:p>
-      <w:pPr>
-        <w:pStyle w:val="Normal"/>
-      </w:pPr>
-      <w:r>
-        <w:t xml:space="preserve">Weekly overall model rank Not published (GAME_STARTED_NO_ORIGINAL_WEEKLY_RANK). ROS overall rank 17 (RB9). Availability: NO_ADVERSE_STATUS_REPORTED. Weekly ranks are preliminary when playing status is unconfirmed; they are separate from season ranks.</w:t>
+        <w:t xml:space="preserve">Week 8 outlook</w:t>
+      </w:r>
+    </w:p>
+    <w:p>
+      <w:pPr>
+        <w:pStyle w:val="Normal"/>
+      </w:pPr>
+      <w:r>
+        <w:t xml:space="preserve">Weekly overall model rank 34 (RB9). ROS overall rank 17 (RB9). Availability: NO_ADVERSE_STATUS_REPORTED. Weekly ranks are preliminary when playing status is unconfirmed; they are separate from season ranks.</w:t>
       </w:r>
     </w:p>
     <w:p>
@@ -1991,15 +1991,15 @@
         <w:pStyle w:val="Heading2"/>
       </w:pPr>
       <w:r>
-        <w:t xml:space="preserve">Week 7 outlook</w:t>
-      </w:r>
-    </w:p>
-    <w:p>
-      <w:pPr>
-        <w:pStyle w:val="Normal"/>
-      </w:pPr>
-      <w:r>
-        <w:t xml:space="preserve">Weekly overall model rank Not published (GAME_STARTED_NO_ORIGINAL_WEEKLY_RANK). ROS overall rank 18 (WR8). Availability: NO_ADVERSE_STATUS_REPORTED. Weekly ranks are preliminary when playing status is unconfirmed; they are separate from season ranks.</w:t>
+        <w:t xml:space="preserve">Week 8 outlook</w:t>
+      </w:r>
+    </w:p>
+    <w:p>
+      <w:pPr>
+        <w:pStyle w:val="Normal"/>
+      </w:pPr>
+      <w:r>
+        <w:t xml:space="preserve">Weekly overall model rank Not published (NO_CURRENT_WEEK_GAME). ROS overall rank 18 (WR8). Availability: NO_ADVERSE_STATUS_REPORTED. Weekly ranks are preliminary when playing status is unconfirmed; they are separate from season ranks.</w:t>
       </w:r>
     </w:p>
     <w:p>
@@ -2111,15 +2111,15 @@
         <w:pStyle w:val="Heading2"/>
       </w:pPr>
       <w:r>
-        <w:t xml:space="preserve">Week 7 outlook</w:t>
-      </w:r>
-    </w:p>
-    <w:p>
-      <w:pPr>
-        <w:pStyle w:val="Normal"/>
-      </w:pPr>
-      <w:r>
-        <w:t xml:space="preserve">Weekly overall model rank Not published (GAME_STARTED_NO_ORIGINAL_WEEKLY_RANK). ROS overall rank 19 (RB10). Availability: QUESTIONABLE. Weekly ranks are preliminary when playing status is unconfirmed; they are separate from season ranks.</w:t>
+        <w:t xml:space="preserve">Week 8 outlook</w:t>
+      </w:r>
+    </w:p>
+    <w:p>
+      <w:pPr>
+        <w:pStyle w:val="Normal"/>
+      </w:pPr>
+      <w:r>
+        <w:t xml:space="preserve">Weekly overall model rank 33 (RB8). ROS overall rank 19 (RB10). Availability: QUESTIONABLE. Weekly ranks are preliminary when playing status is unconfirmed; they are separate from season ranks.</w:t>
       </w:r>
     </w:p>
     <w:p>
@@ -2231,15 +2231,15 @@
         <w:pStyle w:val="Heading2"/>
       </w:pPr>
       <w:r>
-        <w:t xml:space="preserve">Week 7 outlook</w:t>
-      </w:r>
-    </w:p>
-    <w:p>
-      <w:pPr>
-        <w:pStyle w:val="Normal"/>
-      </w:pPr>
-      <w:r>
-        <w:t xml:space="preserve">Weekly overall model rank Not published (GAME_STARTED_NO_ORIGINAL_WEEKLY_RANK). ROS overall rank 20 (TE2). Availability: UNKNOWN. Weekly ranks are preliminary when playing status is unconfirmed; they are separate from season ranks.</w:t>
+        <w:t xml:space="preserve">Week 8 outlook</w:t>
+      </w:r>
+    </w:p>
+    <w:p>
+      <w:pPr>
+        <w:pStyle w:val="Normal"/>
+      </w:pPr>
+      <w:r>
+        <w:t xml:space="preserve">Weekly overall model rank 17 (TE2). ROS overall rank 20 (TE2). Availability: NO_ADVERSE_STATUS_REPORTED. Weekly ranks are preliminary when playing status is unconfirmed; they are separate from season ranks.</w:t>
       </w:r>
     </w:p>
     <w:p>
@@ -2351,15 +2351,15 @@
         <w:pStyle w:val="Heading2"/>
       </w:pPr>
       <w:r>
-        <w:t xml:space="preserve">Week 7 outlook</w:t>
-      </w:r>
-    </w:p>
-    <w:p>
-      <w:pPr>
-        <w:pStyle w:val="Normal"/>
-      </w:pPr>
-      <w:r>
-        <w:t xml:space="preserve">Weekly overall model rank Not published (GAME_STARTED_NO_ORIGINAL_WEEKLY_RANK). ROS overall rank 21 (RB11). Availability: NO_ADVERSE_STATUS_REPORTED. Weekly ranks are preliminary when playing status is unconfirmed; they are separate from season ranks.</w:t>
+        <w:t xml:space="preserve">Week 8 outlook</w:t>
+      </w:r>
+    </w:p>
+    <w:p>
+      <w:pPr>
+        <w:pStyle w:val="Normal"/>
+      </w:pPr>
+      <w:r>
+        <w:t xml:space="preserve">Weekly overall model rank 31 (RB7). ROS overall rank 21 (RB11). Availability: NO_ADVERSE_STATUS_REPORTED. Weekly ranks are preliminary when playing status is unconfirmed; they are separate from season ranks.</w:t>
       </w:r>
     </w:p>
     <w:p>
@@ -2471,15 +2471,15 @@
         <w:pStyle w:val="Heading2"/>
       </w:pPr>
       <w:r>
-        <w:t xml:space="preserve">Week 7 outlook</w:t>
-      </w:r>
-    </w:p>
-    <w:p>
-      <w:pPr>
-        <w:pStyle w:val="Normal"/>
-      </w:pPr>
-      <w:r>
-        <w:t xml:space="preserve">Weekly overall model rank Not published (GAME_STARTED_NO_ORIGINAL_WEEKLY_RANK). ROS overall rank 22 (RB12). Availability: NO_ADVERSE_STATUS_REPORTED. Weekly ranks are preliminary when playing status is unconfirmed; they are separate from season ranks.</w:t>
+        <w:t xml:space="preserve">Week 8 outlook</w:t>
+      </w:r>
+    </w:p>
+    <w:p>
+      <w:pPr>
+        <w:pStyle w:val="Normal"/>
+      </w:pPr>
+      <w:r>
+        <w:t xml:space="preserve">Weekly overall model rank 23 (RB5). ROS overall rank 22 (RB12). Availability: NO_ADVERSE_STATUS_REPORTED. Weekly ranks are preliminary when playing status is unconfirmed; they are separate from season ranks.</w:t>
       </w:r>
     </w:p>
     <w:p>
@@ -2591,15 +2591,15 @@
         <w:pStyle w:val="Heading2"/>
       </w:pPr>
       <w:r>
-        <w:t xml:space="preserve">Week 7 outlook</w:t>
-      </w:r>
-    </w:p>
-    <w:p>
-      <w:pPr>
-        <w:pStyle w:val="Normal"/>
-      </w:pPr>
-      <w:r>
-        <w:t xml:space="preserve">Weekly overall model rank Not published (NOT_EXPECTED_TO_PLAY). ROS overall rank 23 (WR9). Availability: OUT. Weekly ranks are preliminary when playing status is unconfirmed; they are separate from season ranks.</w:t>
+        <w:t xml:space="preserve">Week 8 outlook</w:t>
+      </w:r>
+    </w:p>
+    <w:p>
+      <w:pPr>
+        <w:pStyle w:val="Normal"/>
+      </w:pPr>
+      <w:r>
+        <w:t xml:space="preserve">Weekly overall model rank 43 (WR11). ROS overall rank 23 (WR9). Availability: QUESTIONABLE. Weekly ranks are preliminary when playing status is unconfirmed; they are separate from season ranks.</w:t>
       </w:r>
     </w:p>
     <w:p>
@@ -2711,15 +2711,15 @@
         <w:pStyle w:val="Heading2"/>
       </w:pPr>
       <w:r>
-        <w:t xml:space="preserve">Week 7 outlook</w:t>
-      </w:r>
-    </w:p>
-    <w:p>
-      <w:pPr>
-        <w:pStyle w:val="Normal"/>
-      </w:pPr>
-      <w:r>
-        <w:t xml:space="preserve">Weekly overall model rank Not published (NOT_EXPECTED_TO_PLAY). ROS overall rank 24 (RB13). Availability: OUT. Weekly ranks are preliminary when playing status is unconfirmed; they are separate from season ranks.</w:t>
+        <w:t xml:space="preserve">Week 8 outlook</w:t>
+      </w:r>
+    </w:p>
+    <w:p>
+      <w:pPr>
+        <w:pStyle w:val="Normal"/>
+      </w:pPr>
+      <w:r>
+        <w:t xml:space="preserve">Weekly overall model rank 38 (RB11). ROS overall rank 24 (RB13). Availability: QUESTIONABLE. Weekly ranks are preliminary when playing status is unconfirmed; they are separate from season ranks.</w:t>
       </w:r>
     </w:p>
     <w:p>
@@ -2831,15 +2831,15 @@
         <w:pStyle w:val="Heading2"/>
       </w:pPr>
       <w:r>
-        <w:t xml:space="preserve">Week 7 outlook</w:t>
-      </w:r>
-    </w:p>
-    <w:p>
-      <w:pPr>
-        <w:pStyle w:val="Normal"/>
-      </w:pPr>
-      <w:r>
-        <w:t xml:space="preserve">Weekly overall model rank Not published (GAME_STARTED_NO_ORIGINAL_WEEKLY_RANK). ROS overall rank 25 (WR10). Availability: UNKNOWN. Weekly ranks are preliminary when playing status is unconfirmed; they are separate from season ranks.</w:t>
+        <w:t xml:space="preserve">Week 8 outlook</w:t>
+      </w:r>
+    </w:p>
+    <w:p>
+      <w:pPr>
+        <w:pStyle w:val="Normal"/>
+      </w:pPr>
+      <w:r>
+        <w:t xml:space="preserve">Weekly overall model rank 20 (WR7). ROS overall rank 25 (WR10). Availability: QUESTIONABLE. Weekly ranks are preliminary when playing status is unconfirmed; they are separate from season ranks.</w:t>
       </w:r>
     </w:p>
     <w:p>
@@ -2951,15 +2951,15 @@
         <w:pStyle w:val="Heading2"/>
       </w:pPr>
       <w:r>
-        <w:t xml:space="preserve">Week 7 outlook</w:t>
-      </w:r>
-    </w:p>
-    <w:p>
-      <w:pPr>
-        <w:pStyle w:val="Normal"/>
-      </w:pPr>
-      <w:r>
-        <w:t xml:space="preserve">Weekly overall model rank Not published (GAME_STARTED_NO_ORIGINAL_WEEKLY_RANK). ROS overall rank 26 (RB14). Availability: NO_ADVERSE_STATUS_REPORTED. Weekly ranks are preliminary when playing status is unconfirmed; they are separate from season ranks.</w:t>
+        <w:t xml:space="preserve">Week 8 outlook</w:t>
+      </w:r>
+    </w:p>
+    <w:p>
+      <w:pPr>
+        <w:pStyle w:val="Normal"/>
+      </w:pPr>
+      <w:r>
+        <w:t xml:space="preserve">Weekly overall model rank 29 (RB6). ROS overall rank 26 (RB14). Availability: NO_ADVERSE_STATUS_REPORTED. Weekly ranks are preliminary when playing status is unconfirmed; they are separate from season ranks.</w:t>
       </w:r>
     </w:p>
     <w:p>
@@ -3071,15 +3071,15 @@
         <w:pStyle w:val="Heading2"/>
       </w:pPr>
       <w:r>
-        <w:t xml:space="preserve">Week 7 outlook</w:t>
-      </w:r>
-    </w:p>
-    <w:p>
-      <w:pPr>
-        <w:pStyle w:val="Normal"/>
-      </w:pPr>
-      <w:r>
-        <w:t xml:space="preserve">Weekly overall model rank Not published (GAME_STARTED_NO_ORIGINAL_WEEKLY_RANK). ROS overall rank 27 (WR11). Availability: NO_ADVERSE_STATUS_REPORTED. Weekly ranks are preliminary when playing status is unconfirmed; they are separate from season ranks.</w:t>
+        <w:t xml:space="preserve">Week 8 outlook</w:t>
+      </w:r>
+    </w:p>
+    <w:p>
+      <w:pPr>
+        <w:pStyle w:val="Normal"/>
+      </w:pPr>
+      <w:r>
+        <w:t xml:space="preserve">Weekly overall model rank Not published (NO_CURRENT_WEEK_GAME). ROS overall rank 27 (WR11). Availability: NO_ADVERSE_STATUS_REPORTED. Weekly ranks are preliminary when playing status is unconfirmed; they are separate from season ranks.</w:t>
       </w:r>
     </w:p>
     <w:p>
@@ -3191,7 +3191,7 @@
         <w:pStyle w:val="Heading2"/>
       </w:pPr>
       <w:r>
-        <w:t xml:space="preserve">Week 7 outlook</w:t>
+        <w:t xml:space="preserve">Week 8 outlook</w:t>
       </w:r>
     </w:p>
     <w:p>
@@ -3311,15 +3311,15 @@
         <w:pStyle w:val="Heading2"/>
       </w:pPr>
       <w:r>
-        <w:t xml:space="preserve">Week 7 outlook</w:t>
-      </w:r>
-    </w:p>
-    <w:p>
-      <w:pPr>
-        <w:pStyle w:val="Normal"/>
-      </w:pPr>
-      <w:r>
-        <w:t xml:space="preserve">Weekly overall model rank Not published (GAME_STARTED_NO_ORIGINAL_WEEKLY_RANK). ROS overall rank 29 (WR13). Availability: UNKNOWN. Weekly ranks are preliminary when playing status is unconfirmed; they are separate from season ranks.</w:t>
+        <w:t xml:space="preserve">Week 8 outlook</w:t>
+      </w:r>
+    </w:p>
+    <w:p>
+      <w:pPr>
+        <w:pStyle w:val="Normal"/>
+      </w:pPr>
+      <w:r>
+        <w:t xml:space="preserve">Weekly overall model rank 28 (WR10). ROS overall rank 29 (WR13). Availability: QUESTIONABLE. Weekly ranks are preliminary when playing status is unconfirmed; they are separate from season ranks.</w:t>
       </w:r>
     </w:p>
     <w:p>
@@ -3431,15 +3431,15 @@
         <w:pStyle w:val="Heading2"/>
       </w:pPr>
       <w:r>
-        <w:t xml:space="preserve">Week 7 outlook</w:t>
-      </w:r>
-    </w:p>
-    <w:p>
-      <w:pPr>
-        <w:pStyle w:val="Normal"/>
-      </w:pPr>
-      <w:r>
-        <w:t xml:space="preserve">Weekly overall model rank Not published (GAME_STARTED_NO_ORIGINAL_WEEKLY_RANK). ROS overall rank 30 (WR14). Availability: NO_ADVERSE_STATUS_REPORTED. Weekly ranks are preliminary when playing status is unconfirmed; they are separate from season ranks.</w:t>
+        <w:t xml:space="preserve">Week 8 outlook</w:t>
+      </w:r>
+    </w:p>
+    <w:p>
+      <w:pPr>
+        <w:pStyle w:val="Normal"/>
+      </w:pPr>
+      <w:r>
+        <w:t xml:space="preserve">Weekly overall model rank 48 (WR14). ROS overall rank 30 (WR14). Availability: NO_ADVERSE_STATUS_REPORTED. Weekly ranks are preliminary when playing status is unconfirmed; they are separate from season ranks.</w:t>
       </w:r>
     </w:p>
     <w:p>
@@ -3551,15 +3551,15 @@
         <w:pStyle w:val="Heading2"/>
       </w:pPr>
       <w:r>
-        <w:t xml:space="preserve">Week 7 outlook</w:t>
-      </w:r>
-    </w:p>
-    <w:p>
-      <w:pPr>
-        <w:pStyle w:val="Normal"/>
-      </w:pPr>
-      <w:r>
-        <w:t xml:space="preserve">Weekly overall model rank Not published (NO_CURRENT_WEEK_GAME). ROS overall rank 31 (QB1). Availability: UNKNOWN. Weekly ranks are preliminary when playing status is unconfirmed; they are separate from season ranks.</w:t>
+        <w:t xml:space="preserve">Week 8 outlook</w:t>
+      </w:r>
+    </w:p>
+    <w:p>
+      <w:pPr>
+        <w:pStyle w:val="Normal"/>
+      </w:pPr>
+      <w:r>
+        <w:t xml:space="preserve">Weekly overall model rank 2 (QB1). ROS overall rank 31 (QB1). Availability: NO_ADVERSE_STATUS_REPORTED. Weekly ranks are preliminary when playing status is unconfirmed; they are separate from season ranks.</w:t>
       </w:r>
     </w:p>
     <w:p>
@@ -3671,15 +3671,15 @@
         <w:pStyle w:val="Heading2"/>
       </w:pPr>
       <w:r>
-        <w:t xml:space="preserve">Week 7 outlook</w:t>
-      </w:r>
-    </w:p>
-    <w:p>
-      <w:pPr>
-        <w:pStyle w:val="Normal"/>
-      </w:pPr>
-      <w:r>
-        <w:t xml:space="preserve">Weekly overall model rank Not published (GAME_STARTED_NO_ORIGINAL_WEEKLY_RANK). ROS overall rank 32 (WR15). Availability: NO_ADVERSE_STATUS_REPORTED. Weekly ranks are preliminary when playing status is unconfirmed; they are separate from season ranks.</w:t>
+        <w:t xml:space="preserve">Week 8 outlook</w:t>
+      </w:r>
+    </w:p>
+    <w:p>
+      <w:pPr>
+        <w:pStyle w:val="Normal"/>
+      </w:pPr>
+      <w:r>
+        <w:t xml:space="preserve">Weekly overall model rank 46 (WR12). ROS overall rank 32 (WR15). Availability: NO_ADVERSE_STATUS_REPORTED. Weekly ranks are preliminary when playing status is unconfirmed; they are separate from season ranks.</w:t>
       </w:r>
     </w:p>
     <w:p>
@@ -3791,15 +3791,15 @@
         <w:pStyle w:val="Heading2"/>
       </w:pPr>
       <w:r>
-        <w:t xml:space="preserve">Week 7 outlook</w:t>
-      </w:r>
-    </w:p>
-    <w:p>
-      <w:pPr>
-        <w:pStyle w:val="Normal"/>
-      </w:pPr>
-      <w:r>
-        <w:t xml:space="preserve">Weekly overall model rank Not published (GAME_STARTED_NO_ORIGINAL_WEEKLY_RANK). ROS overall rank 33 (WR16). Availability: NO_ADVERSE_STATUS_REPORTED. Weekly ranks are preliminary when playing status is unconfirmed; they are separate from season ranks.</w:t>
+        <w:t xml:space="preserve">Week 8 outlook</w:t>
+      </w:r>
+    </w:p>
+    <w:p>
+      <w:pPr>
+        <w:pStyle w:val="Normal"/>
+      </w:pPr>
+      <w:r>
+        <w:t xml:space="preserve">Weekly overall model rank 53 (WR17). ROS overall rank 33 (WR16). Availability: NO_ADVERSE_STATUS_REPORTED. Weekly ranks are preliminary when playing status is unconfirmed; they are separate from season ranks.</w:t>
       </w:r>
     </w:p>
     <w:p>
@@ -3911,15 +3911,15 @@
         <w:pStyle w:val="Heading2"/>
       </w:pPr>
       <w:r>
-        <w:t xml:space="preserve">Week 7 outlook</w:t>
-      </w:r>
-    </w:p>
-    <w:p>
-      <w:pPr>
-        <w:pStyle w:val="Normal"/>
-      </w:pPr>
-      <w:r>
-        <w:t xml:space="preserve">Weekly overall model rank Not published (NO_CURRENT_WEEK_GAME). ROS overall rank 34 (WR17). Availability: QUESTIONABLE. Weekly ranks are preliminary when playing status is unconfirmed; they are separate from season ranks.</w:t>
+        <w:t xml:space="preserve">Week 8 outlook</w:t>
+      </w:r>
+    </w:p>
+    <w:p>
+      <w:pPr>
+        <w:pStyle w:val="Normal"/>
+      </w:pPr>
+      <w:r>
+        <w:t xml:space="preserve">Weekly overall model rank 47 (WR13). ROS overall rank 34 (WR17). Availability: QUESTIONABLE. Weekly ranks are preliminary when playing status is unconfirmed; they are separate from season ranks.</w:t>
       </w:r>
     </w:p>
     <w:p>
@@ -4031,15 +4031,15 @@
         <w:pStyle w:val="Heading2"/>
       </w:pPr>
       <w:r>
-        <w:t xml:space="preserve">Week 7 outlook</w:t>
-      </w:r>
-    </w:p>
-    <w:p>
-      <w:pPr>
-        <w:pStyle w:val="Normal"/>
-      </w:pPr>
-      <w:r>
-        <w:t xml:space="preserve">Weekly overall model rank Not published (NOT_EXPECTED_TO_PLAY). ROS overall rank 35 (WR18). Availability: OUT. Weekly ranks are preliminary when playing status is unconfirmed; they are separate from season ranks.</w:t>
+        <w:t xml:space="preserve">Week 8 outlook</w:t>
+      </w:r>
+    </w:p>
+    <w:p>
+      <w:pPr>
+        <w:pStyle w:val="Normal"/>
+      </w:pPr>
+      <w:r>
+        <w:t xml:space="preserve">Weekly overall model rank 22 (WR8). ROS overall rank 35 (WR18). Availability: QUESTIONABLE. Weekly ranks are preliminary when playing status is unconfirmed; they are separate from season ranks.</w:t>
       </w:r>
     </w:p>
     <w:p>
@@ -4151,15 +4151,15 @@
         <w:pStyle w:val="Heading2"/>
       </w:pPr>
       <w:r>
-        <w:t xml:space="preserve">Week 7 outlook</w:t>
-      </w:r>
-    </w:p>
-    <w:p>
-      <w:pPr>
-        <w:pStyle w:val="Normal"/>
-      </w:pPr>
-      <w:r>
-        <w:t xml:space="preserve">Weekly overall model rank Not published (NOT_EXPECTED_TO_PLAY). ROS overall rank 36 (WR19). Availability: OUT. Weekly ranks are preliminary when playing status is unconfirmed; they are separate from season ranks.</w:t>
+        <w:t xml:space="preserve">Week 8 outlook</w:t>
+      </w:r>
+    </w:p>
+    <w:p>
+      <w:pPr>
+        <w:pStyle w:val="Normal"/>
+      </w:pPr>
+      <w:r>
+        <w:t xml:space="preserve">Weekly overall model rank 54 (WR18). ROS overall rank 36 (WR19). Availability: QUESTIONABLE. Weekly ranks are preliminary when playing status is unconfirmed; they are separate from season ranks.</w:t>
       </w:r>
     </w:p>
     <w:p>
@@ -4271,15 +4271,15 @@
         <w:pStyle w:val="Heading2"/>
       </w:pPr>
       <w:r>
-        <w:t xml:space="preserve">Week 7 outlook</w:t>
-      </w:r>
-    </w:p>
-    <w:p>
-      <w:pPr>
-        <w:pStyle w:val="Normal"/>
-      </w:pPr>
-      <w:r>
-        <w:t xml:space="preserve">Weekly overall model rank Not published (NO_CURRENT_WEEK_GAME). ROS overall rank 37 (WR20). Availability: QUESTIONABLE. Weekly ranks are preliminary when playing status is unconfirmed; they are separate from season ranks.</w:t>
+        <w:t xml:space="preserve">Week 8 outlook</w:t>
+      </w:r>
+    </w:p>
+    <w:p>
+      <w:pPr>
+        <w:pStyle w:val="Normal"/>
+      </w:pPr>
+      <w:r>
+        <w:t xml:space="preserve">Weekly overall model rank 55 (WR19). ROS overall rank 37 (WR20). Availability: QUESTIONABLE. Weekly ranks are preliminary when playing status is unconfirmed; they are separate from season ranks.</w:t>
       </w:r>
     </w:p>
     <w:p>
@@ -4391,15 +4391,15 @@
         <w:pStyle w:val="Heading2"/>
       </w:pPr>
       <w:r>
-        <w:t xml:space="preserve">Week 7 outlook</w:t>
-      </w:r>
-    </w:p>
-    <w:p>
-      <w:pPr>
-        <w:pStyle w:val="Normal"/>
-      </w:pPr>
-      <w:r>
-        <w:t xml:space="preserve">Weekly overall model rank Not published (GAME_STARTED_NO_ORIGINAL_WEEKLY_RANK). ROS overall rank 38 (WR21). Availability: UNKNOWN. Weekly ranks are preliminary when playing status is unconfirmed; they are separate from season ranks.</w:t>
+        <w:t xml:space="preserve">Week 8 outlook</w:t>
+      </w:r>
+    </w:p>
+    <w:p>
+      <w:pPr>
+        <w:pStyle w:val="Normal"/>
+      </w:pPr>
+      <w:r>
+        <w:t xml:space="preserve">Weekly overall model rank 60 (WR21). ROS overall rank 38 (WR21). Availability: NO_ADVERSE_STATUS_REPORTED. Weekly ranks are preliminary when playing status is unconfirmed; they are separate from season ranks.</w:t>
       </w:r>
     </w:p>
     <w:p>
@@ -4511,15 +4511,15 @@
         <w:pStyle w:val="Heading2"/>
       </w:pPr>
       <w:r>
-        <w:t xml:space="preserve">Week 7 outlook</w:t>
-      </w:r>
-    </w:p>
-    <w:p>
-      <w:pPr>
-        <w:pStyle w:val="Normal"/>
-      </w:pPr>
-      <w:r>
-        <w:t xml:space="preserve">Weekly overall model rank Not published (NOT_EXPECTED_TO_PLAY). ROS overall rank 39 (QB2). Availability: OUT. Weekly ranks are preliminary when playing status is unconfirmed; they are separate from season ranks.</w:t>
+        <w:t xml:space="preserve">Week 8 outlook</w:t>
+      </w:r>
+    </w:p>
+    <w:p>
+      <w:pPr>
+        <w:pStyle w:val="Normal"/>
+      </w:pPr>
+      <w:r>
+        <w:t xml:space="preserve">Weekly overall model rank 7 (QB3). ROS overall rank 39 (QB2). Availability: QUESTIONABLE. Weekly ranks are preliminary when playing status is unconfirmed; they are separate from season ranks.</w:t>
       </w:r>
     </w:p>
     <w:p>
@@ -4631,15 +4631,15 @@
         <w:pStyle w:val="Heading2"/>
       </w:pPr>
       <w:r>
-        <w:t xml:space="preserve">Week 7 outlook</w:t>
-      </w:r>
-    </w:p>
-    <w:p>
-      <w:pPr>
-        <w:pStyle w:val="Normal"/>
-      </w:pPr>
-      <w:r>
-        <w:t xml:space="preserve">Weekly overall model rank Not published (GAME_STARTED_NO_ORIGINAL_WEEKLY_RANK). ROS overall rank 40 (QB3). Availability: UNKNOWN. Weekly ranks are preliminary when playing status is unconfirmed; they are separate from season ranks.</w:t>
+        <w:t xml:space="preserve">Week 8 outlook</w:t>
+      </w:r>
+    </w:p>
+    <w:p>
+      <w:pPr>
+        <w:pStyle w:val="Normal"/>
+      </w:pPr>
+      <w:r>
+        <w:t xml:space="preserve">Weekly overall model rank 8 (QB4). ROS overall rank 40 (QB3). Availability: NO_ADVERSE_STATUS_REPORTED. Weekly ranks are preliminary when playing status is unconfirmed; they are separate from season ranks.</w:t>
       </w:r>
     </w:p>
     <w:p>
@@ -4751,15 +4751,15 @@
         <w:pStyle w:val="Heading2"/>
       </w:pPr>
       <w:r>
-        <w:t xml:space="preserve">Week 7 outlook</w:t>
-      </w:r>
-    </w:p>
-    <w:p>
-      <w:pPr>
-        <w:pStyle w:val="Normal"/>
-      </w:pPr>
-      <w:r>
-        <w:t xml:space="preserve">Weekly overall model rank Not published (GAME_STARTED_NO_ORIGINAL_WEEKLY_RANK). ROS overall rank 41 (TE3). Availability: UNKNOWN. Weekly ranks are preliminary when playing status is unconfirmed; they are separate from season ranks.</w:t>
+        <w:t xml:space="preserve">Week 8 outlook</w:t>
+      </w:r>
+    </w:p>
+    <w:p>
+      <w:pPr>
+        <w:pStyle w:val="Normal"/>
+      </w:pPr>
+      <w:r>
+        <w:t xml:space="preserve">Weekly overall model rank 45 (TE3). ROS overall rank 41 (TE3). Availability: NO_ADVERSE_STATUS_REPORTED. Weekly ranks are preliminary when playing status is unconfirmed; they are separate from season ranks.</w:t>
       </w:r>
     </w:p>
     <w:p>
@@ -4871,15 +4871,15 @@
         <w:pStyle w:val="Heading2"/>
       </w:pPr>
       <w:r>
-        <w:t xml:space="preserve">Week 7 outlook</w:t>
-      </w:r>
-    </w:p>
-    <w:p>
-      <w:pPr>
-        <w:pStyle w:val="Normal"/>
-      </w:pPr>
-      <w:r>
-        <w:t xml:space="preserve">Weekly overall model rank Not published (GAME_STARTED_NO_ORIGINAL_WEEKLY_RANK). ROS overall rank 42 (WR22). Availability: QUESTIONABLE. Weekly ranks are preliminary when playing status is unconfirmed; they are separate from season ranks.</w:t>
+        <w:t xml:space="preserve">Week 8 outlook</w:t>
+      </w:r>
+    </w:p>
+    <w:p>
+      <w:pPr>
+        <w:pStyle w:val="Normal"/>
+      </w:pPr>
+      <w:r>
+        <w:t xml:space="preserve">Weekly overall model rank 52 (WR16). ROS overall rank 42 (WR22). Availability: QUESTIONABLE. Weekly ranks are preliminary when playing status is unconfirmed; they are separate from season ranks.</w:t>
       </w:r>
     </w:p>
     <w:p>
@@ -4991,15 +4991,15 @@
         <w:pStyle w:val="Heading2"/>
       </w:pPr>
       <w:r>
-        <w:t xml:space="preserve">Week 7 outlook</w:t>
-      </w:r>
-    </w:p>
-    <w:p>
-      <w:pPr>
-        <w:pStyle w:val="Normal"/>
-      </w:pPr>
-      <w:r>
-        <w:t xml:space="preserve">Weekly overall model rank Not published (NO_CURRENT_WEEK_GAME). ROS overall rank 43 (WR23). Availability: UNKNOWN. Weekly ranks are preliminary when playing status is unconfirmed; they are separate from season ranks.</w:t>
+        <w:t xml:space="preserve">Week 8 outlook</w:t>
+      </w:r>
+    </w:p>
+    <w:p>
+      <w:pPr>
+        <w:pStyle w:val="Normal"/>
+      </w:pPr>
+      <w:r>
+        <w:t xml:space="preserve">Weekly overall model rank 57 (WR20). ROS overall rank 43 (WR23). Availability: NO_ADVERSE_STATUS_REPORTED. Weekly ranks are preliminary when playing status is unconfirmed; they are separate from season ranks.</w:t>
       </w:r>
     </w:p>
     <w:p>
@@ -5111,15 +5111,15 @@
         <w:pStyle w:val="Heading2"/>
       </w:pPr>
       <w:r>
-        <w:t xml:space="preserve">Week 7 outlook</w:t>
-      </w:r>
-    </w:p>
-    <w:p>
-      <w:pPr>
-        <w:pStyle w:val="Normal"/>
-      </w:pPr>
-      <w:r>
-        <w:t xml:space="preserve">Weekly overall model rank Not published (GAME_STARTED_NO_ORIGINAL_WEEKLY_RANK). ROS overall rank 44 (WR24). Availability: NO_ADVERSE_STATUS_REPORTED. Weekly ranks are preliminary when playing status is unconfirmed; they are separate from season ranks.</w:t>
+        <w:t xml:space="preserve">Week 8 outlook</w:t>
+      </w:r>
+    </w:p>
+    <w:p>
+      <w:pPr>
+        <w:pStyle w:val="Normal"/>
+      </w:pPr>
+      <w:r>
+        <w:t xml:space="preserve">Weekly overall model rank 49 (WR15). ROS overall rank 44 (WR24). Availability: NO_ADVERSE_STATUS_REPORTED. Weekly ranks are preliminary when playing status is unconfirmed; they are separate from season ranks.</w:t>
       </w:r>
     </w:p>
     <w:p>
@@ -5231,15 +5231,15 @@
         <w:pStyle w:val="Heading2"/>
       </w:pPr>
       <w:r>
-        <w:t xml:space="preserve">Week 7 outlook</w:t>
-      </w:r>
-    </w:p>
-    <w:p>
-      <w:pPr>
-        <w:pStyle w:val="Normal"/>
-      </w:pPr>
-      <w:r>
-        <w:t xml:space="preserve">Weekly overall model rank Not published (GAME_STARTED_NO_ORIGINAL_WEEKLY_RANK). ROS overall rank 45 (WR25). Availability: UNKNOWN. Weekly ranks are preliminary when playing status is unconfirmed; they are separate from season ranks.</w:t>
+        <w:t xml:space="preserve">Week 8 outlook</w:t>
+      </w:r>
+    </w:p>
+    <w:p>
+      <w:pPr>
+        <w:pStyle w:val="Normal"/>
+      </w:pPr>
+      <w:r>
+        <w:t xml:space="preserve">Weekly overall model rank 66 (WR24). ROS overall rank 45 (WR25). Availability: NO_ADVERSE_STATUS_REPORTED. Weekly ranks are preliminary when playing status is unconfirmed; they are separate from season ranks.</w:t>
       </w:r>
     </w:p>
     <w:p>
@@ -5351,15 +5351,15 @@
         <w:pStyle w:val="Heading2"/>
       </w:pPr>
       <w:r>
-        <w:t xml:space="preserve">Week 7 outlook</w:t>
-      </w:r>
-    </w:p>
-    <w:p>
-      <w:pPr>
-        <w:pStyle w:val="Normal"/>
-      </w:pPr>
-      <w:r>
-        <w:t xml:space="preserve">Weekly overall model rank Not published (NOT_EXPECTED_TO_PLAY). ROS overall rank 46 (TE4). Availability: OUT. Weekly ranks are preliminary when playing status is unconfirmed; they are separate from season ranks.</w:t>
+        <w:t xml:space="preserve">Week 8 outlook</w:t>
+      </w:r>
+    </w:p>
+    <w:p>
+      <w:pPr>
+        <w:pStyle w:val="Normal"/>
+      </w:pPr>
+      <w:r>
+        <w:t xml:space="preserve">Weekly overall model rank 59 (TE5). ROS overall rank 46 (TE4). Availability: QUESTIONABLE. Weekly ranks are preliminary when playing status is unconfirmed; they are separate from season ranks.</w:t>
       </w:r>
     </w:p>
     <w:p>
@@ -5471,15 +5471,15 @@
         <w:pStyle w:val="Heading2"/>
       </w:pPr>
       <w:r>
-        <w:t xml:space="preserve">Week 7 outlook</w:t>
-      </w:r>
-    </w:p>
-    <w:p>
-      <w:pPr>
-        <w:pStyle w:val="Normal"/>
-      </w:pPr>
-      <w:r>
-        <w:t xml:space="preserve">Weekly overall model rank Not published (GAME_STARTED_NO_ORIGINAL_WEEKLY_RANK). ROS overall rank 47 (RB15). Availability: UNKNOWN. Weekly ranks are preliminary when playing status is unconfirmed; they are separate from season ranks.</w:t>
+        <w:t xml:space="preserve">Week 8 outlook</w:t>
+      </w:r>
+    </w:p>
+    <w:p>
+      <w:pPr>
+        <w:pStyle w:val="Normal"/>
+      </w:pPr>
+      <w:r>
+        <w:t xml:space="preserve">Weekly overall model rank 50 (RB13). ROS overall rank 47 (RB15). Availability: NO_ADVERSE_STATUS_REPORTED. Weekly ranks are preliminary when playing status is unconfirmed; they are separate from season ranks.</w:t>
       </w:r>
     </w:p>
     <w:p>
@@ -5591,15 +5591,15 @@
         <w:pStyle w:val="Heading2"/>
       </w:pPr>
       <w:r>
-        <w:t xml:space="preserve">Week 7 outlook</w:t>
-      </w:r>
-    </w:p>
-    <w:p>
-      <w:pPr>
-        <w:pStyle w:val="Normal"/>
-      </w:pPr>
-      <w:r>
-        <w:t xml:space="preserve">Weekly overall model rank Not published (GAME_STARTED_NO_ORIGINAL_WEEKLY_RANK). ROS overall rank 48 (RB16). Availability: NO_ADVERSE_STATUS_REPORTED. Weekly ranks are preliminary when playing status is unconfirmed; they are separate from season ranks.</w:t>
+        <w:t xml:space="preserve">Week 8 outlook</w:t>
+      </w:r>
+    </w:p>
+    <w:p>
+      <w:pPr>
+        <w:pStyle w:val="Normal"/>
+      </w:pPr>
+      <w:r>
+        <w:t xml:space="preserve">Weekly overall model rank 64 (RB16). ROS overall rank 48 (RB16). Availability: NO_ADVERSE_STATUS_REPORTED. Weekly ranks are preliminary when playing status is unconfirmed; they are separate from season ranks.</w:t>
       </w:r>
     </w:p>
     <w:p>
@@ -5711,15 +5711,15 @@
         <w:pStyle w:val="Heading2"/>
       </w:pPr>
       <w:r>
-        <w:t xml:space="preserve">Week 7 outlook</w:t>
-      </w:r>
-    </w:p>
-    <w:p>
-      <w:pPr>
-        <w:pStyle w:val="Normal"/>
-      </w:pPr>
-      <w:r>
-        <w:t xml:space="preserve">Weekly overall model rank Not published (NOT_EXPECTED_TO_PLAY). ROS overall rank 49 (RB17). Availability: INJURED_RESERVE. Weekly ranks are preliminary when playing status is unconfirmed; they are separate from season ranks.</w:t>
+        <w:t xml:space="preserve">Week 8 outlook</w:t>
+      </w:r>
+    </w:p>
+    <w:p>
+      <w:pPr>
+        <w:pStyle w:val="Normal"/>
+      </w:pPr>
+      <w:r>
+        <w:t xml:space="preserve">Weekly overall model rank Not published (NO_CURRENT_WEEK_GAME). ROS overall rank 49 (RB17). Availability: INJURED_RESERVE. Weekly ranks are preliminary when playing status is unconfirmed; they are separate from season ranks.</w:t>
       </w:r>
     </w:p>
     <w:p>
@@ -5831,15 +5831,15 @@
         <w:pStyle w:val="Heading2"/>
       </w:pPr>
       <w:r>
-        <w:t xml:space="preserve">Week 7 outlook</w:t>
-      </w:r>
-    </w:p>
-    <w:p>
-      <w:pPr>
-        <w:pStyle w:val="Normal"/>
-      </w:pPr>
-      <w:r>
-        <w:t xml:space="preserve">Weekly overall model rank Not published (NO_CURRENT_WEEK_GAME). ROS overall rank 50 (WR26). Availability: OUT. Weekly ranks are preliminary when playing status is unconfirmed; they are separate from season ranks.</w:t>
+        <w:t xml:space="preserve">Week 8 outlook</w:t>
+      </w:r>
+    </w:p>
+    <w:p>
+      <w:pPr>
+        <w:pStyle w:val="Normal"/>
+      </w:pPr>
+      <w:r>
+        <w:t xml:space="preserve">Weekly overall model rank Not published (NOT_EXPECTED_TO_PLAY). ROS overall rank 50 (WR26). Availability: INJURED_RESERVE. Weekly ranks are preliminary when playing status is unconfirmed; they are separate from season ranks.</w:t>
       </w:r>
     </w:p>
     <w:p>
@@ -5951,15 +5951,15 @@
         <w:pStyle w:val="Heading2"/>
       </w:pPr>
       <w:r>
-        <w:t xml:space="preserve">Week 7 outlook</w:t>
-      </w:r>
-    </w:p>
-    <w:p>
-      <w:pPr>
-        <w:pStyle w:val="Normal"/>
-      </w:pPr>
-      <w:r>
-        <w:t xml:space="preserve">Weekly overall model rank Not published (GAME_STARTED_NO_ORIGINAL_WEEKLY_RANK). ROS overall rank 51 (WR27). Availability: NO_ADVERSE_STATUS_REPORTED. Weekly ranks are preliminary when playing status is unconfirmed; they are separate from season ranks.</w:t>
+        <w:t xml:space="preserve">Week 8 outlook</w:t>
+      </w:r>
+    </w:p>
+    <w:p>
+      <w:pPr>
+        <w:pStyle w:val="Normal"/>
+      </w:pPr>
+      <w:r>
+        <w:t xml:space="preserve">Weekly overall model rank 87 (WR35). ROS overall rank 51 (WR27). Availability: QUESTIONABLE. Weekly ranks are preliminary when playing status is unconfirmed; they are separate from season ranks.</w:t>
       </w:r>
     </w:p>
     <w:p>
@@ -6071,15 +6071,15 @@
         <w:pStyle w:val="Heading2"/>
       </w:pPr>
       <w:r>
-        <w:t xml:space="preserve">Week 7 outlook</w:t>
-      </w:r>
-    </w:p>
-    <w:p>
-      <w:pPr>
-        <w:pStyle w:val="Normal"/>
-      </w:pPr>
-      <w:r>
-        <w:t xml:space="preserve">Weekly overall model rank Not published (GAME_STARTED_NO_ORIGINAL_WEEKLY_RANK). ROS overall rank 52 (QB4). Availability: NO_ADVERSE_STATUS_REPORTED. Weekly ranks are preliminary when playing status is unconfirmed; they are separate from season ranks.</w:t>
+        <w:t xml:space="preserve">Week 8 outlook</w:t>
+      </w:r>
+    </w:p>
+    <w:p>
+      <w:pPr>
+        <w:pStyle w:val="Normal"/>
+      </w:pPr>
+      <w:r>
+        <w:t xml:space="preserve">Weekly overall model rank 30 (QB12). ROS overall rank 52 (QB4). Availability: NO_ADVERSE_STATUS_REPORTED. Weekly ranks are preliminary when playing status is unconfirmed; they are separate from season ranks.</w:t>
       </w:r>
     </w:p>
     <w:p>
@@ -6191,15 +6191,15 @@
         <w:pStyle w:val="Heading2"/>
       </w:pPr>
       <w:r>
-        <w:t xml:space="preserve">Week 7 outlook</w:t>
-      </w:r>
-    </w:p>
-    <w:p>
-      <w:pPr>
-        <w:pStyle w:val="Normal"/>
-      </w:pPr>
-      <w:r>
-        <w:t xml:space="preserve">Weekly overall model rank Not published (GAME_STARTED_NO_ORIGINAL_WEEKLY_RANK). ROS overall rank 53 (QB5). Availability: NO_ADVERSE_STATUS_REPORTED. Weekly ranks are preliminary when playing status is unconfirmed; they are separate from season ranks.</w:t>
+        <w:t xml:space="preserve">Week 8 outlook</w:t>
+      </w:r>
+    </w:p>
+    <w:p>
+      <w:pPr>
+        <w:pStyle w:val="Normal"/>
+      </w:pPr>
+      <w:r>
+        <w:t xml:space="preserve">Weekly overall model rank 10 (QB5). ROS overall rank 53 (QB5). Availability: NO_ADVERSE_STATUS_REPORTED. Weekly ranks are preliminary when playing status is unconfirmed; they are separate from season ranks.</w:t>
       </w:r>
     </w:p>
     <w:p>
@@ -6311,15 +6311,15 @@
         <w:pStyle w:val="Heading2"/>
       </w:pPr>
       <w:r>
-        <w:t xml:space="preserve">Week 7 outlook</w:t>
-      </w:r>
-    </w:p>
-    <w:p>
-      <w:pPr>
-        <w:pStyle w:val="Normal"/>
-      </w:pPr>
-      <w:r>
-        <w:t xml:space="preserve">Weekly overall model rank Not published (GAME_STARTED_NO_ORIGINAL_WEEKLY_RANK). ROS overall rank 54 (RB18). Availability: UNKNOWN. Weekly ranks are preliminary when playing status is unconfirmed; they are separate from season ranks.</w:t>
+        <w:t xml:space="preserve">Week 8 outlook</w:t>
+      </w:r>
+    </w:p>
+    <w:p>
+      <w:pPr>
+        <w:pStyle w:val="Normal"/>
+      </w:pPr>
+      <w:r>
+        <w:t xml:space="preserve">Weekly overall model rank 61 (RB15). ROS overall rank 54 (RB18). Availability: QUESTIONABLE. Weekly ranks are preliminary when playing status is unconfirmed; they are separate from season ranks.</w:t>
       </w:r>
     </w:p>
     <w:p>
@@ -6431,15 +6431,15 @@
         <w:pStyle w:val="Heading2"/>
       </w:pPr>
       <w:r>
-        <w:t xml:space="preserve">Week 7 outlook</w:t>
-      </w:r>
-    </w:p>
-    <w:p>
-      <w:pPr>
-        <w:pStyle w:val="Normal"/>
-      </w:pPr>
-      <w:r>
-        <w:t xml:space="preserve">Weekly overall model rank Not published (NOT_EXPECTED_TO_PLAY). ROS overall rank 55 (RB19). Availability: OUT. Weekly ranks are preliminary when playing status is unconfirmed; they are separate from season ranks.</w:t>
+        <w:t xml:space="preserve">Week 8 outlook</w:t>
+      </w:r>
+    </w:p>
+    <w:p>
+      <w:pPr>
+        <w:pStyle w:val="Normal"/>
+      </w:pPr>
+      <w:r>
+        <w:t xml:space="preserve">Weekly overall model rank Not published (NO_CURRENT_WEEK_GAME). ROS overall rank 55 (RB19). Availability: QUESTIONABLE. Weekly ranks are preliminary when playing status is unconfirmed; they are separate from season ranks.</w:t>
       </w:r>
     </w:p>
     <w:p>
@@ -6551,15 +6551,15 @@
         <w:pStyle w:val="Heading2"/>
       </w:pPr>
       <w:r>
-        <w:t xml:space="preserve">Week 7 outlook</w:t>
-      </w:r>
-    </w:p>
-    <w:p>
-      <w:pPr>
-        <w:pStyle w:val="Normal"/>
-      </w:pPr>
-      <w:r>
-        <w:t xml:space="preserve">Weekly overall model rank Not published (GAME_STARTED_NO_ORIGINAL_WEEKLY_RANK). ROS overall rank 56 (WR28). Availability: NO_ADVERSE_STATUS_REPORTED. Weekly ranks are preliminary when playing status is unconfirmed; they are separate from season ranks.</w:t>
+        <w:t xml:space="preserve">Week 8 outlook</w:t>
+      </w:r>
+    </w:p>
+    <w:p>
+      <w:pPr>
+        <w:pStyle w:val="Normal"/>
+      </w:pPr>
+      <w:r>
+        <w:t xml:space="preserve">Weekly overall model rank Not published (NO_CURRENT_WEEK_GAME). ROS overall rank 56 (WR28). Availability: NO_ADVERSE_STATUS_REPORTED. Weekly ranks are preliminary when playing status is unconfirmed; they are separate from season ranks.</w:t>
       </w:r>
     </w:p>
     <w:p>
@@ -6671,15 +6671,15 @@
         <w:pStyle w:val="Heading2"/>
       </w:pPr>
       <w:r>
-        <w:t xml:space="preserve">Week 7 outlook</w:t>
-      </w:r>
-    </w:p>
-    <w:p>
-      <w:pPr>
-        <w:pStyle w:val="Normal"/>
-      </w:pPr>
-      <w:r>
-        <w:t xml:space="preserve">Weekly overall model rank Not published (GAME_STARTED_NO_ORIGINAL_WEEKLY_RANK). ROS overall rank 57 (QB6). Availability: UNKNOWN. Weekly ranks are preliminary when playing status is unconfirmed; they are separate from season ranks.</w:t>
+        <w:t xml:space="preserve">Week 8 outlook</w:t>
+      </w:r>
+    </w:p>
+    <w:p>
+      <w:pPr>
+        <w:pStyle w:val="Normal"/>
+      </w:pPr>
+      <w:r>
+        <w:t xml:space="preserve">Weekly overall model rank 35 (QB14). ROS overall rank 57 (QB6). Availability: UNKNOWN. Weekly ranks are preliminary when playing status is unconfirmed; they are separate from season ranks.</w:t>
       </w:r>
     </w:p>
     <w:p>
@@ -6791,15 +6791,15 @@
         <w:pStyle w:val="Heading2"/>
       </w:pPr>
       <w:r>
-        <w:t xml:space="preserve">Week 7 outlook</w:t>
-      </w:r>
-    </w:p>
-    <w:p>
-      <w:pPr>
-        <w:pStyle w:val="Normal"/>
-      </w:pPr>
-      <w:r>
-        <w:t xml:space="preserve">Weekly overall model rank Not published (GAME_STARTED_NO_ORIGINAL_WEEKLY_RANK). ROS overall rank 58 (QB7). Availability: NO_ADVERSE_STATUS_REPORTED. Weekly ranks are preliminary when playing status is unconfirmed; they are separate from season ranks.</w:t>
+        <w:t xml:space="preserve">Week 8 outlook</w:t>
+      </w:r>
+    </w:p>
+    <w:p>
+      <w:pPr>
+        <w:pStyle w:val="Normal"/>
+      </w:pPr>
+      <w:r>
+        <w:t xml:space="preserve">Weekly overall model rank 36 (QB15). ROS overall rank 58 (QB7). Availability: NO_ADVERSE_STATUS_REPORTED. Weekly ranks are preliminary when playing status is unconfirmed; they are separate from season ranks.</w:t>
       </w:r>
     </w:p>
     <w:p>
@@ -6911,15 +6911,15 @@
         <w:pStyle w:val="Heading2"/>
       </w:pPr>
       <w:r>
-        <w:t xml:space="preserve">Week 7 outlook</w:t>
-      </w:r>
-    </w:p>
-    <w:p>
-      <w:pPr>
-        <w:pStyle w:val="Normal"/>
-      </w:pPr>
-      <w:r>
-        <w:t xml:space="preserve">Weekly overall model rank Not published (GAME_STARTED_NO_ORIGINAL_WEEKLY_RANK). ROS overall rank 59 (QB8). Availability: UNKNOWN. Weekly ranks are preliminary when playing status is unconfirmed; they are separate from season ranks.</w:t>
+        <w:t xml:space="preserve">Week 8 outlook</w:t>
+      </w:r>
+    </w:p>
+    <w:p>
+      <w:pPr>
+        <w:pStyle w:val="Normal"/>
+      </w:pPr>
+      <w:r>
+        <w:t xml:space="preserve">Weekly overall model rank Not published (NO_CURRENT_WEEK_GAME). ROS overall rank 59 (QB8). Availability: UNKNOWN. Weekly ranks are preliminary when playing status is unconfirmed; they are separate from season ranks.</w:t>
       </w:r>
     </w:p>
     <w:p>
@@ -7031,15 +7031,15 @@
         <w:pStyle w:val="Heading2"/>
       </w:pPr>
       <w:r>
-        <w:t xml:space="preserve">Week 7 outlook</w:t>
-      </w:r>
-    </w:p>
-    <w:p>
-      <w:pPr>
-        <w:pStyle w:val="Normal"/>
-      </w:pPr>
-      <w:r>
-        <w:t xml:space="preserve">Weekly overall model rank Not published (NO_CURRENT_WEEK_GAME). ROS overall rank 60 (WR29). Availability: UNKNOWN. Weekly ranks are preliminary when playing status is unconfirmed; they are separate from season ranks.</w:t>
+        <w:t xml:space="preserve">Week 8 outlook</w:t>
+      </w:r>
+    </w:p>
+    <w:p>
+      <w:pPr>
+        <w:pStyle w:val="Normal"/>
+      </w:pPr>
+      <w:r>
+        <w:t xml:space="preserve">Weekly overall model rank 84 (WR32). ROS overall rank 60 (WR29). Availability: NO_ADVERSE_STATUS_REPORTED. Weekly ranks are preliminary when playing status is unconfirmed; they are separate from season ranks.</w:t>
       </w:r>
     </w:p>
     <w:p>
@@ -7151,15 +7151,15 @@
         <w:pStyle w:val="Heading2"/>
       </w:pPr>
       <w:r>
-        <w:t xml:space="preserve">Week 7 outlook</w:t>
-      </w:r>
-    </w:p>
-    <w:p>
-      <w:pPr>
-        <w:pStyle w:val="Normal"/>
-      </w:pPr>
-      <w:r>
-        <w:t xml:space="preserve">Weekly overall model rank Not published (GAME_STARTED_NO_ORIGINAL_WEEKLY_RANK). ROS overall rank 61 (RB20). Availability: UNKNOWN. Weekly ranks are preliminary when playing status is unconfirmed; they are separate from season ranks.</w:t>
+        <w:t xml:space="preserve">Week 8 outlook</w:t>
+      </w:r>
+    </w:p>
+    <w:p>
+      <w:pPr>
+        <w:pStyle w:val="Normal"/>
+      </w:pPr>
+      <w:r>
+        <w:t xml:space="preserve">Weekly overall model rank 58 (RB14). ROS overall rank 61 (RB20). Availability: NO_ADVERSE_STATUS_REPORTED. Weekly ranks are preliminary when playing status is unconfirmed; they are separate from season ranks.</w:t>
       </w:r>
     </w:p>
     <w:p>
@@ -7271,15 +7271,15 @@
         <w:pStyle w:val="Heading2"/>
       </w:pPr>
       <w:r>
-        <w:t xml:space="preserve">Week 7 outlook</w:t>
-      </w:r>
-    </w:p>
-    <w:p>
-      <w:pPr>
-        <w:pStyle w:val="Normal"/>
-      </w:pPr>
-      <w:r>
-        <w:t xml:space="preserve">Weekly overall model rank Not published (GAME_STARTED_NO_ORIGINAL_WEEKLY_RANK). ROS overall rank 62 (TE5). Availability: NO_ADVERSE_STATUS_REPORTED. Weekly ranks are preliminary when playing status is unconfirmed; they are separate from season ranks.</w:t>
+        <w:t xml:space="preserve">Week 8 outlook</w:t>
+      </w:r>
+    </w:p>
+    <w:p>
+      <w:pPr>
+        <w:pStyle w:val="Normal"/>
+      </w:pPr>
+      <w:r>
+        <w:t xml:space="preserve">Weekly overall model rank 70 (TE7). ROS overall rank 62 (TE5). Availability: NO_ADVERSE_STATUS_REPORTED. Weekly ranks are preliminary when playing status is unconfirmed; they are separate from season ranks.</w:t>
       </w:r>
     </w:p>
     <w:p>
@@ -7359,15 +7359,15 @@
         <w:pStyle w:val="Heading2"/>
       </w:pPr>
       <w:r>
-        <w:t xml:space="preserve">Week 7 outlook</w:t>
-      </w:r>
-    </w:p>
-    <w:p>
-      <w:pPr>
-        <w:pStyle w:val="Normal"/>
-      </w:pPr>
-      <w:r>
-        <w:t xml:space="preserve">Weekly overall model rank Not published (GAME_STARTED_NO_ORIGINAL_WEEKLY_RANK). ROS overall rank 63 (RB21). Availability: QUESTIONABLE. Weekly ranks are preliminary when playing status is unconfirmed; they are separate from season ranks.</w:t>
+        <w:t xml:space="preserve">Week 8 outlook</w:t>
+      </w:r>
+    </w:p>
+    <w:p>
+      <w:pPr>
+        <w:pStyle w:val="Normal"/>
+      </w:pPr>
+      <w:r>
+        <w:t xml:space="preserve">Weekly overall model rank Not published (NO_CURRENT_WEEK_GAME). ROS overall rank 63 (RB21). Availability: QUESTIONABLE. Weekly ranks are preliminary when playing status is unconfirmed; they are separate from season ranks.</w:t>
       </w:r>
     </w:p>
     <w:p>
@@ -7479,15 +7479,15 @@
         <w:pStyle w:val="Heading2"/>
       </w:pPr>
       <w:r>
-        <w:t xml:space="preserve">Week 7 outlook</w:t>
-      </w:r>
-    </w:p>
-    <w:p>
-      <w:pPr>
-        <w:pStyle w:val="Normal"/>
-      </w:pPr>
-      <w:r>
-        <w:t xml:space="preserve">Weekly overall model rank Not published (NOT_EXPECTED_TO_PLAY). ROS overall rank 64 (RB22). Availability: OUT. Weekly ranks are preliminary when playing status is unconfirmed; they are separate from season ranks.</w:t>
+        <w:t xml:space="preserve">Week 8 outlook</w:t>
+      </w:r>
+    </w:p>
+    <w:p>
+      <w:pPr>
+        <w:pStyle w:val="Normal"/>
+      </w:pPr>
+      <w:r>
+        <w:t xml:space="preserve">Weekly overall model rank 104 (RB24). ROS overall rank 64 (RB22). Availability: QUESTIONABLE. Weekly ranks are preliminary when playing status is unconfirmed; they are separate from season ranks.</w:t>
       </w:r>
     </w:p>
     <w:p>
@@ -7599,15 +7599,15 @@
         <w:pStyle w:val="Heading2"/>
       </w:pPr>
       <w:r>
-        <w:t xml:space="preserve">Week 7 outlook</w:t>
-      </w:r>
-    </w:p>
-    <w:p>
-      <w:pPr>
-        <w:pStyle w:val="Normal"/>
-      </w:pPr>
-      <w:r>
-        <w:t xml:space="preserve">Weekly overall model rank Not published (NO_CURRENT_WEEK_GAME). ROS overall rank 65 (QB9). Availability: QUESTIONABLE. Weekly ranks are preliminary when playing status is unconfirmed; they are separate from season ranks.</w:t>
+        <w:t xml:space="preserve">Week 8 outlook</w:t>
+      </w:r>
+    </w:p>
+    <w:p>
+      <w:pPr>
+        <w:pStyle w:val="Normal"/>
+      </w:pPr>
+      <w:r>
+        <w:t xml:space="preserve">Weekly overall model rank 42 (QB18). ROS overall rank 65 (QB9). Availability: UNKNOWN. Weekly ranks are preliminary when playing status is unconfirmed; they are separate from season ranks.</w:t>
       </w:r>
     </w:p>
     <w:p>
@@ -7719,15 +7719,15 @@
         <w:pStyle w:val="Heading2"/>
       </w:pPr>
       <w:r>
-        <w:t xml:space="preserve">Week 7 outlook</w:t>
-      </w:r>
-    </w:p>
-    <w:p>
-      <w:pPr>
-        <w:pStyle w:val="Normal"/>
-      </w:pPr>
-      <w:r>
-        <w:t xml:space="preserve">Weekly overall model rank Not published (GAME_STARTED_NO_ORIGINAL_WEEKLY_RANK). ROS overall rank 66 (WR30). Availability: NO_ADVERSE_STATUS_REPORTED. Weekly ranks are preliminary when playing status is unconfirmed; they are separate from season ranks.</w:t>
+        <w:t xml:space="preserve">Week 8 outlook</w:t>
+      </w:r>
+    </w:p>
+    <w:p>
+      <w:pPr>
+        <w:pStyle w:val="Normal"/>
+      </w:pPr>
+      <w:r>
+        <w:t xml:space="preserve">Weekly overall model rank 85 (WR33). ROS overall rank 66 (WR30). Availability: NO_ADVERSE_STATUS_REPORTED. Weekly ranks are preliminary when playing status is unconfirmed; they are separate from season ranks.</w:t>
       </w:r>
     </w:p>
     <w:p>
@@ -7839,15 +7839,15 @@
         <w:pStyle w:val="Heading2"/>
       </w:pPr>
       <w:r>
-        <w:t xml:space="preserve">Week 7 outlook</w:t>
-      </w:r>
-    </w:p>
-    <w:p>
-      <w:pPr>
-        <w:pStyle w:val="Normal"/>
-      </w:pPr>
-      <w:r>
-        <w:t xml:space="preserve">Weekly overall model rank Not published (NOT_EXPECTED_TO_PLAY). ROS overall rank 67 (WR31). Availability: OUT. Weekly ranks are preliminary when playing status is unconfirmed; they are separate from season ranks.</w:t>
+        <w:t xml:space="preserve">Week 8 outlook</w:t>
+      </w:r>
+    </w:p>
+    <w:p>
+      <w:pPr>
+        <w:pStyle w:val="Normal"/>
+      </w:pPr>
+      <w:r>
+        <w:t xml:space="preserve">Weekly overall model rank Not published (NO_CURRENT_WEEK_GAME). ROS overall rank 67 (WR31). Availability: QUESTIONABLE. Weekly ranks are preliminary when playing status is unconfirmed; they are separate from season ranks.</w:t>
       </w:r>
     </w:p>
     <w:p>
@@ -7959,15 +7959,15 @@
         <w:pStyle w:val="Heading2"/>
       </w:pPr>
       <w:r>
-        <w:t xml:space="preserve">Week 7 outlook</w:t>
-      </w:r>
-    </w:p>
-    <w:p>
-      <w:pPr>
-        <w:pStyle w:val="Normal"/>
-      </w:pPr>
-      <w:r>
-        <w:t xml:space="preserve">Weekly overall model rank Not published (GAME_STARTED_NO_ORIGINAL_WEEKLY_RANK). ROS overall rank 68 (TE6). Availability: NO_ADVERSE_STATUS_REPORTED. Weekly ranks are preliminary when playing status is unconfirmed; they are separate from season ranks.</w:t>
+        <w:t xml:space="preserve">Week 8 outlook</w:t>
+      </w:r>
+    </w:p>
+    <w:p>
+      <w:pPr>
+        <w:pStyle w:val="Normal"/>
+      </w:pPr>
+      <w:r>
+        <w:t xml:space="preserve">Weekly overall model rank 81 (TE12). ROS overall rank 68 (TE6). Availability: NO_ADVERSE_STATUS_REPORTED. Weekly ranks are preliminary when playing status is unconfirmed; they are separate from season ranks.</w:t>
       </w:r>
     </w:p>
     <w:p>
@@ -8079,15 +8079,15 @@
         <w:pStyle w:val="Heading2"/>
       </w:pPr>
       <w:r>
-        <w:t xml:space="preserve">Week 7 outlook</w:t>
-      </w:r>
-    </w:p>
-    <w:p>
-      <w:pPr>
-        <w:pStyle w:val="Normal"/>
-      </w:pPr>
-      <w:r>
-        <w:t xml:space="preserve">Weekly overall model rank Not published (NO_CURRENT_WEEK_GAME). ROS overall rank 69 (QB10). Availability: UNKNOWN. Weekly ranks are preliminary when playing status is unconfirmed; they are separate from season ranks.</w:t>
+        <w:t xml:space="preserve">Week 8 outlook</w:t>
+      </w:r>
+    </w:p>
+    <w:p>
+      <w:pPr>
+        <w:pStyle w:val="Normal"/>
+      </w:pPr>
+      <w:r>
+        <w:t xml:space="preserve">Weekly overall model rank 19 (QB7). ROS overall rank 69 (QB10). Availability: NO_ADVERSE_STATUS_REPORTED. Weekly ranks are preliminary when playing status is unconfirmed; they are separate from season ranks.</w:t>
       </w:r>
     </w:p>
     <w:p>
@@ -8199,15 +8199,15 @@
         <w:pStyle w:val="Heading2"/>
       </w:pPr>
       <w:r>
-        <w:t xml:space="preserve">Week 7 outlook</w:t>
-      </w:r>
-    </w:p>
-    <w:p>
-      <w:pPr>
-        <w:pStyle w:val="Normal"/>
-      </w:pPr>
-      <w:r>
-        <w:t xml:space="preserve">Weekly overall model rank Not published (GAME_STARTED_NO_ORIGINAL_WEEKLY_RANK). ROS overall rank 70 (QB11). Availability: UNKNOWN. Weekly ranks are preliminary when playing status is unconfirmed; they are separate from season ranks.</w:t>
+        <w:t xml:space="preserve">Week 8 outlook</w:t>
+      </w:r>
+    </w:p>
+    <w:p>
+      <w:pPr>
+        <w:pStyle w:val="Normal"/>
+      </w:pPr>
+      <w:r>
+        <w:t xml:space="preserve">Weekly overall model rank 21 (QB8). ROS overall rank 70 (QB11). Availability: NO_ADVERSE_STATUS_REPORTED. Weekly ranks are preliminary when playing status is unconfirmed; they are separate from season ranks.</w:t>
       </w:r>
     </w:p>
     <w:p>
@@ -8319,15 +8319,15 @@
         <w:pStyle w:val="Heading2"/>
       </w:pPr>
       <w:r>
-        <w:t xml:space="preserve">Week 7 outlook</w:t>
-      </w:r>
-    </w:p>
-    <w:p>
-      <w:pPr>
-        <w:pStyle w:val="Normal"/>
-      </w:pPr>
-      <w:r>
-        <w:t xml:space="preserve">Weekly overall model rank Not published (NO_CURRENT_WEEK_GAME). ROS overall rank 71 (QB12). Availability: UNKNOWN. Weekly ranks are preliminary when playing status is unconfirmed; they are separate from season ranks.</w:t>
+        <w:t xml:space="preserve">Week 8 outlook</w:t>
+      </w:r>
+    </w:p>
+    <w:p>
+      <w:pPr>
+        <w:pStyle w:val="Normal"/>
+      </w:pPr>
+      <w:r>
+        <w:t xml:space="preserve">Weekly overall model rank 15 (QB6). ROS overall rank 71 (QB12). Availability: NO_ADVERSE_STATUS_REPORTED. Weekly ranks are preliminary when playing status is unconfirmed; they are separate from season ranks.</w:t>
       </w:r>
     </w:p>
     <w:p>
@@ -8439,15 +8439,15 @@
         <w:pStyle w:val="Heading2"/>
       </w:pPr>
       <w:r>
-        <w:t xml:space="preserve">Week 7 outlook</w:t>
-      </w:r>
-    </w:p>
-    <w:p>
-      <w:pPr>
-        <w:pStyle w:val="Normal"/>
-      </w:pPr>
-      <w:r>
-        <w:t xml:space="preserve">Weekly overall model rank Not published (GAME_STARTED_NO_ORIGINAL_WEEKLY_RANK). ROS overall rank 72 (WR32). Availability: UNKNOWN. Weekly ranks are preliminary when playing status is unconfirmed; they are separate from season ranks.</w:t>
+        <w:t xml:space="preserve">Week 8 outlook</w:t>
+      </w:r>
+    </w:p>
+    <w:p>
+      <w:pPr>
+        <w:pStyle w:val="Normal"/>
+      </w:pPr>
+      <w:r>
+        <w:t xml:space="preserve">Weekly overall model rank 65 (WR23). ROS overall rank 72 (WR32). Availability: NO_ADVERSE_STATUS_REPORTED. Weekly ranks are preliminary when playing status is unconfirmed; they are separate from season ranks.</w:t>
       </w:r>
     </w:p>
     <w:p>
@@ -8559,15 +8559,15 @@
         <w:pStyle w:val="Heading2"/>
       </w:pPr>
       <w:r>
-        <w:t xml:space="preserve">Week 7 outlook</w:t>
-      </w:r>
-    </w:p>
-    <w:p>
-      <w:pPr>
-        <w:pStyle w:val="Normal"/>
-      </w:pPr>
-      <w:r>
-        <w:t xml:space="preserve">Weekly overall model rank Not published (GAME_STARTED_NO_ORIGINAL_WEEKLY_RANK). ROS overall rank 73 (WR33). Availability: UNKNOWN. Weekly ranks are preliminary when playing status is unconfirmed; they are separate from season ranks.</w:t>
+        <w:t xml:space="preserve">Week 8 outlook</w:t>
+      </w:r>
+    </w:p>
+    <w:p>
+      <w:pPr>
+        <w:pStyle w:val="Normal"/>
+      </w:pPr>
+      <w:r>
+        <w:t xml:space="preserve">Weekly overall model rank 62 (WR22). ROS overall rank 73 (WR33). Availability: NO_ADVERSE_STATUS_REPORTED. Weekly ranks are preliminary when playing status is unconfirmed; they are separate from season ranks.</w:t>
       </w:r>
     </w:p>
     <w:p>
@@ -8679,15 +8679,15 @@
         <w:pStyle w:val="Heading2"/>
       </w:pPr>
       <w:r>
-        <w:t xml:space="preserve">Week 7 outlook</w:t>
-      </w:r>
-    </w:p>
-    <w:p>
-      <w:pPr>
-        <w:pStyle w:val="Normal"/>
-      </w:pPr>
-      <w:r>
-        <w:t xml:space="preserve">Weekly overall model rank Not published (GAME_STARTED_NO_ORIGINAL_WEEKLY_RANK). ROS overall rank 74 (WR34). Availability: UNKNOWN. Weekly ranks are preliminary when playing status is unconfirmed; they are separate from season ranks.</w:t>
+        <w:t xml:space="preserve">Week 8 outlook</w:t>
+      </w:r>
+    </w:p>
+    <w:p>
+      <w:pPr>
+        <w:pStyle w:val="Normal"/>
+      </w:pPr>
+      <w:r>
+        <w:t xml:space="preserve">Weekly overall model rank 69 (WR26). ROS overall rank 74 (WR34). Availability: UNKNOWN. Weekly ranks are preliminary when playing status is unconfirmed; they are separate from season ranks.</w:t>
       </w:r>
     </w:p>
     <w:p>
@@ -8799,15 +8799,15 @@
         <w:pStyle w:val="Heading2"/>
       </w:pPr>
       <w:r>
-        <w:t xml:space="preserve">Week 7 outlook</w:t>
-      </w:r>
-    </w:p>
-    <w:p>
-      <w:pPr>
-        <w:pStyle w:val="Normal"/>
-      </w:pPr>
-      <w:r>
-        <w:t xml:space="preserve">Weekly overall model rank Not published (GAME_STARTED_NO_ORIGINAL_WEEKLY_RANK). ROS overall rank 75 (WR35). Availability: UNKNOWN. Weekly ranks are preliminary when playing status is unconfirmed; they are separate from season ranks.</w:t>
+        <w:t xml:space="preserve">Week 8 outlook</w:t>
+      </w:r>
+    </w:p>
+    <w:p>
+      <w:pPr>
+        <w:pStyle w:val="Normal"/>
+      </w:pPr>
+      <w:r>
+        <w:t xml:space="preserve">Weekly overall model rank 67 (WR25). ROS overall rank 75 (WR35). Availability: NO_ADVERSE_STATUS_REPORTED. Weekly ranks are preliminary when playing status is unconfirmed; they are separate from season ranks.</w:t>
       </w:r>
     </w:p>
     <w:p>
@@ -8919,15 +8919,15 @@
         <w:pStyle w:val="Heading2"/>
       </w:pPr>
       <w:r>
-        <w:t xml:space="preserve">Week 7 outlook</w:t>
-      </w:r>
-    </w:p>
-    <w:p>
-      <w:pPr>
-        <w:pStyle w:val="Normal"/>
-      </w:pPr>
-      <w:r>
-        <w:t xml:space="preserve">Weekly overall model rank Not published (GAME_STARTED_NO_ORIGINAL_WEEKLY_RANK). ROS overall rank 76 (WR36). Availability: NO_ADVERSE_STATUS_REPORTED. Weekly ranks are preliminary when playing status is unconfirmed; they are separate from season ranks.</w:t>
+        <w:t xml:space="preserve">Week 8 outlook</w:t>
+      </w:r>
+    </w:p>
+    <w:p>
+      <w:pPr>
+        <w:pStyle w:val="Normal"/>
+      </w:pPr>
+      <w:r>
+        <w:t xml:space="preserve">Weekly overall model rank Not published (GAME_STARTED_NO_ORIGINAL_WEEKLY_RANK). ROS overall rank 76 (WR36). Availability: QUESTIONABLE. Weekly ranks are preliminary when playing status is unconfirmed; they are separate from season ranks.</w:t>
       </w:r>
     </w:p>
     <w:p>
@@ -9039,15 +9039,15 @@
         <w:pStyle w:val="Heading2"/>
       </w:pPr>
       <w:r>
-        <w:t xml:space="preserve">Week 7 outlook</w:t>
-      </w:r>
-    </w:p>
-    <w:p>
-      <w:pPr>
-        <w:pStyle w:val="Normal"/>
-      </w:pPr>
-      <w:r>
-        <w:t xml:space="preserve">Weekly overall model rank Not published (GAME_STARTED_NO_ORIGINAL_WEEKLY_RANK). ROS overall rank 77 (TE7). Availability: NO_ADVERSE_STATUS_REPORTED. Weekly ranks are preliminary when playing status is unconfirmed; they are separate from season ranks.</w:t>
+        <w:t xml:space="preserve">Week 8 outlook</w:t>
+      </w:r>
+    </w:p>
+    <w:p>
+      <w:pPr>
+        <w:pStyle w:val="Normal"/>
+      </w:pPr>
+      <w:r>
+        <w:t xml:space="preserve">Weekly overall model rank 51 (TE4). ROS overall rank 77 (TE7). Availability: NO_ADVERSE_STATUS_REPORTED. Weekly ranks are preliminary when playing status is unconfirmed; they are separate from season ranks.</w:t>
       </w:r>
     </w:p>
     <w:p>
@@ -9159,15 +9159,15 @@
         <w:pStyle w:val="Heading2"/>
       </w:pPr>
       <w:r>
-        <w:t xml:space="preserve">Week 7 outlook</w:t>
-      </w:r>
-    </w:p>
-    <w:p>
-      <w:pPr>
-        <w:pStyle w:val="Normal"/>
-      </w:pPr>
-      <w:r>
-        <w:t xml:space="preserve">Weekly overall model rank Not published (GAME_STARTED_NO_ORIGINAL_WEEKLY_RANK). ROS overall rank 78 (RB23). Availability: NO_ADVERSE_STATUS_REPORTED. Weekly ranks are preliminary when playing status is unconfirmed; they are separate from season ranks.</w:t>
+        <w:t xml:space="preserve">Week 8 outlook</w:t>
+      </w:r>
+    </w:p>
+    <w:p>
+      <w:pPr>
+        <w:pStyle w:val="Normal"/>
+      </w:pPr>
+      <w:r>
+        <w:t xml:space="preserve">Weekly overall model rank 92 (RB20). ROS overall rank 78 (RB23). Availability: NO_ADVERSE_STATUS_REPORTED. Weekly ranks are preliminary when playing status is unconfirmed; they are separate from season ranks.</w:t>
       </w:r>
     </w:p>
     <w:p>
@@ -9279,15 +9279,15 @@
         <w:pStyle w:val="Heading2"/>
       </w:pPr>
       <w:r>
-        <w:t xml:space="preserve">Week 7 outlook</w:t>
-      </w:r>
-    </w:p>
-    <w:p>
-      <w:pPr>
-        <w:pStyle w:val="Normal"/>
-      </w:pPr>
-      <w:r>
-        <w:t xml:space="preserve">Weekly overall model rank Not published (NOT_EXPECTED_TO_PLAY). ROS overall rank 79 (RB24). Availability: OUT. Weekly ranks are preliminary when playing status is unconfirmed; they are separate from season ranks.</w:t>
+        <w:t xml:space="preserve">Week 8 outlook</w:t>
+      </w:r>
+    </w:p>
+    <w:p>
+      <w:pPr>
+        <w:pStyle w:val="Normal"/>
+      </w:pPr>
+      <w:r>
+        <w:t xml:space="preserve">Weekly overall model rank 108 (RB26). ROS overall rank 79 (RB24). Availability: QUESTIONABLE. Weekly ranks are preliminary when playing status is unconfirmed; they are separate from season ranks.</w:t>
       </w:r>
     </w:p>
     <w:p>
@@ -9399,15 +9399,15 @@
         <w:pStyle w:val="Heading2"/>
       </w:pPr>
       <w:r>
-        <w:t xml:space="preserve">Week 7 outlook</w:t>
-      </w:r>
-    </w:p>
-    <w:p>
-      <w:pPr>
-        <w:pStyle w:val="Normal"/>
-      </w:pPr>
-      <w:r>
-        <w:t xml:space="preserve">Weekly overall model rank Not published (NO_CURRENT_WEEK_GAME). ROS overall rank 80 (RB25). Availability: INJURED_RESERVE. Weekly ranks are preliminary when playing status is unconfirmed; they are separate from season ranks.</w:t>
+        <w:t xml:space="preserve">Week 8 outlook</w:t>
+      </w:r>
+    </w:p>
+    <w:p>
+      <w:pPr>
+        <w:pStyle w:val="Normal"/>
+      </w:pPr>
+      <w:r>
+        <w:t xml:space="preserve">Weekly overall model rank Not published (NOT_EXPECTED_TO_PLAY). ROS overall rank 80 (RB25). Availability: INJURED_RESERVE. Weekly ranks are preliminary when playing status is unconfirmed; they are separate from season ranks.</w:t>
       </w:r>
     </w:p>
     <w:p>
@@ -9519,15 +9519,15 @@
         <w:pStyle w:val="Heading2"/>
       </w:pPr>
       <w:r>
-        <w:t xml:space="preserve">Week 7 outlook</w:t>
-      </w:r>
-    </w:p>
-    <w:p>
-      <w:pPr>
-        <w:pStyle w:val="Normal"/>
-      </w:pPr>
-      <w:r>
-        <w:t xml:space="preserve">Weekly overall model rank Not published (GAME_STARTED_NO_ORIGINAL_WEEKLY_RANK). ROS overall rank 81 (TE8). Availability: NO_ADVERSE_STATUS_REPORTED. Weekly ranks are preliminary when playing status is unconfirmed; they are separate from season ranks.</w:t>
+        <w:t xml:space="preserve">Week 8 outlook</w:t>
+      </w:r>
+    </w:p>
+    <w:p>
+      <w:pPr>
+        <w:pStyle w:val="Normal"/>
+      </w:pPr>
+      <w:r>
+        <w:t xml:space="preserve">Weekly overall model rank 78 (TE11). ROS overall rank 81 (TE8). Availability: NO_ADVERSE_STATUS_REPORTED. Weekly ranks are preliminary when playing status is unconfirmed; they are separate from season ranks.</w:t>
       </w:r>
     </w:p>
     <w:p>
@@ -9639,15 +9639,15 @@
         <w:pStyle w:val="Heading2"/>
       </w:pPr>
       <w:r>
-        <w:t xml:space="preserve">Week 7 outlook</w:t>
-      </w:r>
-    </w:p>
-    <w:p>
-      <w:pPr>
-        <w:pStyle w:val="Normal"/>
-      </w:pPr>
-      <w:r>
-        <w:t xml:space="preserve">Weekly overall model rank Not published (NO_CURRENT_WEEK_GAME). ROS overall rank 82 (RB26). Availability: UNKNOWN. Weekly ranks are preliminary when playing status is unconfirmed; they are separate from season ranks.</w:t>
+        <w:t xml:space="preserve">Week 8 outlook</w:t>
+      </w:r>
+    </w:p>
+    <w:p>
+      <w:pPr>
+        <w:pStyle w:val="Normal"/>
+      </w:pPr>
+      <w:r>
+        <w:t xml:space="preserve">Weekly overall model rank 89 (RB18). ROS overall rank 82 (RB26). Availability: NO_ADVERSE_STATUS_REPORTED. Weekly ranks are preliminary when playing status is unconfirmed; they are separate from season ranks.</w:t>
       </w:r>
     </w:p>
     <w:p>
@@ -9759,15 +9759,15 @@
         <w:pStyle w:val="Heading2"/>
       </w:pPr>
       <w:r>
-        <w:t xml:space="preserve">Week 7 outlook</w:t>
-      </w:r>
-    </w:p>
-    <w:p>
-      <w:pPr>
-        <w:pStyle w:val="Normal"/>
-      </w:pPr>
-      <w:r>
-        <w:t xml:space="preserve">Weekly overall model rank Not published (GAME_STARTED_NO_ORIGINAL_WEEKLY_RANK). ROS overall rank 83 (WR37). Availability: NO_ADVERSE_STATUS_REPORTED. Weekly ranks are preliminary when playing status is unconfirmed; they are separate from season ranks.</w:t>
+        <w:t xml:space="preserve">Week 8 outlook</w:t>
+      </w:r>
+    </w:p>
+    <w:p>
+      <w:pPr>
+        <w:pStyle w:val="Normal"/>
+      </w:pPr>
+      <w:r>
+        <w:t xml:space="preserve">Weekly overall model rank 74 (WR28). ROS overall rank 83 (WR37). Availability: NO_ADVERSE_STATUS_REPORTED. Weekly ranks are preliminary when playing status is unconfirmed; they are separate from season ranks.</w:t>
       </w:r>
     </w:p>
     <w:p>
@@ -9879,15 +9879,15 @@
         <w:pStyle w:val="Heading2"/>
       </w:pPr>
       <w:r>
-        <w:t xml:space="preserve">Week 7 outlook</w:t>
-      </w:r>
-    </w:p>
-    <w:p>
-      <w:pPr>
-        <w:pStyle w:val="Normal"/>
-      </w:pPr>
-      <w:r>
-        <w:t xml:space="preserve">Weekly overall model rank Not published (GAME_STARTED_NO_ORIGINAL_WEEKLY_RANK). ROS overall rank 84 (QB13). Availability: NO_ADVERSE_STATUS_REPORTED. Weekly ranks are preliminary when playing status is unconfirmed; they are separate from season ranks.</w:t>
+        <w:t xml:space="preserve">Week 8 outlook</w:t>
+      </w:r>
+    </w:p>
+    <w:p>
+      <w:pPr>
+        <w:pStyle w:val="Normal"/>
+      </w:pPr>
+      <w:r>
+        <w:t xml:space="preserve">Weekly overall model rank 3 (QB2). ROS overall rank 84 (QB13). Availability: NO_ADVERSE_STATUS_REPORTED. Weekly ranks are preliminary when playing status is unconfirmed; they are separate from season ranks.</w:t>
       </w:r>
     </w:p>
     <w:p>
@@ -9999,15 +9999,15 @@
         <w:pStyle w:val="Heading2"/>
       </w:pPr>
       <w:r>
-        <w:t xml:space="preserve">Week 7 outlook</w:t>
-      </w:r>
-    </w:p>
-    <w:p>
-      <w:pPr>
-        <w:pStyle w:val="Normal"/>
-      </w:pPr>
-      <w:r>
-        <w:t xml:space="preserve">Weekly overall model rank Not published (GAME_STARTED_NO_ORIGINAL_WEEKLY_RANK). ROS overall rank 85 (WR38). Availability: NO_ADVERSE_STATUS_REPORTED. Weekly ranks are preliminary when playing status is unconfirmed; they are separate from season ranks.</w:t>
+        <w:t xml:space="preserve">Week 8 outlook</w:t>
+      </w:r>
+    </w:p>
+    <w:p>
+      <w:pPr>
+        <w:pStyle w:val="Normal"/>
+      </w:pPr>
+      <w:r>
+        <w:t xml:space="preserve">Weekly overall model rank 79 (WR30). ROS overall rank 85 (WR38). Availability: NO_ADVERSE_STATUS_REPORTED. Weekly ranks are preliminary when playing status is unconfirmed; they are separate from season ranks.</w:t>
       </w:r>
     </w:p>
     <w:p>
@@ -10119,15 +10119,15 @@
         <w:pStyle w:val="Heading2"/>
       </w:pPr>
       <w:r>
-        <w:t xml:space="preserve">Week 7 outlook</w:t>
-      </w:r>
-    </w:p>
-    <w:p>
-      <w:pPr>
-        <w:pStyle w:val="Normal"/>
-      </w:pPr>
-      <w:r>
-        <w:t xml:space="preserve">Weekly overall model rank Not published (GAME_STARTED_NO_ORIGINAL_WEEKLY_RANK). ROS overall rank 86 (TE9). Availability: NO_ADVERSE_STATUS_REPORTED. Weekly ranks are preliminary when playing status is unconfirmed; they are separate from season ranks.</w:t>
+        <w:t xml:space="preserve">Week 8 outlook</w:t>
+      </w:r>
+    </w:p>
+    <w:p>
+      <w:pPr>
+        <w:pStyle w:val="Normal"/>
+      </w:pPr>
+      <w:r>
+        <w:t xml:space="preserve">Weekly overall model rank 75 (TE9). ROS overall rank 86 (TE9). Availability: NO_ADVERSE_STATUS_REPORTED. Weekly ranks are preliminary when playing status is unconfirmed; they are separate from season ranks.</w:t>
       </w:r>
     </w:p>
     <w:p>
@@ -10239,15 +10239,15 @@
         <w:pStyle w:val="Heading2"/>
       </w:pPr>
       <w:r>
-        <w:t xml:space="preserve">Week 7 outlook</w:t>
-      </w:r>
-    </w:p>
-    <w:p>
-      <w:pPr>
-        <w:pStyle w:val="Normal"/>
-      </w:pPr>
-      <w:r>
-        <w:t xml:space="preserve">Weekly overall model rank Not published (GAME_STARTED_NO_ORIGINAL_WEEKLY_RANK). ROS overall rank 87 (WR39). Availability: NO_ADVERSE_STATUS_REPORTED. Weekly ranks are preliminary when playing status is unconfirmed; they are separate from season ranks.</w:t>
+        <w:t xml:space="preserve">Week 8 outlook</w:t>
+      </w:r>
+    </w:p>
+    <w:p>
+      <w:pPr>
+        <w:pStyle w:val="Normal"/>
+      </w:pPr>
+      <w:r>
+        <w:t xml:space="preserve">Weekly overall model rank Not published (NO_CURRENT_WEEK_GAME). ROS overall rank 87 (WR39). Availability: NO_ADVERSE_STATUS_REPORTED. Weekly ranks are preliminary when playing status is unconfirmed; they are separate from season ranks.</w:t>
       </w:r>
     </w:p>
     <w:p>
@@ -10359,15 +10359,15 @@
         <w:pStyle w:val="Heading2"/>
       </w:pPr>
       <w:r>
-        <w:t xml:space="preserve">Week 7 outlook</w:t>
-      </w:r>
-    </w:p>
-    <w:p>
-      <w:pPr>
-        <w:pStyle w:val="Normal"/>
-      </w:pPr>
-      <w:r>
-        <w:t xml:space="preserve">Weekly overall model rank Not published (GAME_STARTED_NO_ORIGINAL_WEEKLY_RANK). ROS overall rank 88 (TE10). Availability: NO_ADVERSE_STATUS_REPORTED. Weekly ranks are preliminary when playing status is unconfirmed; they are separate from season ranks.</w:t>
+        <w:t xml:space="preserve">Week 8 outlook</w:t>
+      </w:r>
+    </w:p>
+    <w:p>
+      <w:pPr>
+        <w:pStyle w:val="Normal"/>
+      </w:pPr>
+      <w:r>
+        <w:t xml:space="preserve">Weekly overall model rank Not published (NO_CURRENT_WEEK_GAME). ROS overall rank 88 (TE10). Availability: NO_ADVERSE_STATUS_REPORTED. Weekly ranks are preliminary when playing status is unconfirmed; they are separate from season ranks.</w:t>
       </w:r>
     </w:p>
     <w:p>
@@ -10479,7 +10479,7 @@
         <w:pStyle w:val="Heading2"/>
       </w:pPr>
       <w:r>
-        <w:t xml:space="preserve">Week 7 outlook</w:t>
+        <w:t xml:space="preserve">Week 8 outlook</w:t>
       </w:r>
     </w:p>
     <w:p>
@@ -10599,7 +10599,7 @@
         <w:pStyle w:val="Heading2"/>
       </w:pPr>
       <w:r>
-        <w:t xml:space="preserve">Week 7 outlook</w:t>
+        <w:t xml:space="preserve">Week 8 outlook</w:t>
       </w:r>
     </w:p>
     <w:p>
@@ -10719,15 +10719,15 @@
         <w:pStyle w:val="Heading2"/>
       </w:pPr>
       <w:r>
-        <w:t xml:space="preserve">Week 7 outlook</w:t>
-      </w:r>
-    </w:p>
-    <w:p>
-      <w:pPr>
-        <w:pStyle w:val="Normal"/>
-      </w:pPr>
-      <w:r>
-        <w:t xml:space="preserve">Weekly overall model rank Not published (GAME_STARTED_NO_ORIGINAL_WEEKLY_RANK). ROS overall rank 91 (TE11). Availability: NO_ADVERSE_STATUS_REPORTED. Weekly ranks are preliminary when playing status is unconfirmed; they are separate from season ranks.</w:t>
+        <w:t xml:space="preserve">Week 8 outlook</w:t>
+      </w:r>
+    </w:p>
+    <w:p>
+      <w:pPr>
+        <w:pStyle w:val="Normal"/>
+      </w:pPr>
+      <w:r>
+        <w:t xml:space="preserve">Weekly overall model rank Not published (NO_CURRENT_WEEK_GAME). ROS overall rank 91 (TE11). Availability: NO_ADVERSE_STATUS_REPORTED. Weekly ranks are preliminary when playing status is unconfirmed; they are separate from season ranks.</w:t>
       </w:r>
     </w:p>
     <w:p>
@@ -10839,15 +10839,15 @@
         <w:pStyle w:val="Heading2"/>
       </w:pPr>
       <w:r>
-        <w:t xml:space="preserve">Week 7 outlook</w:t>
-      </w:r>
-    </w:p>
-    <w:p>
-      <w:pPr>
-        <w:pStyle w:val="Normal"/>
-      </w:pPr>
-      <w:r>
-        <w:t xml:space="preserve">Weekly overall model rank Not published (GAME_STARTED_NO_ORIGINAL_WEEKLY_RANK). ROS overall rank 92 (RB27). Availability: NO_ADVERSE_STATUS_REPORTED. Weekly ranks are preliminary when playing status is unconfirmed; they are separate from season ranks.</w:t>
+        <w:t xml:space="preserve">Week 8 outlook</w:t>
+      </w:r>
+    </w:p>
+    <w:p>
+      <w:pPr>
+        <w:pStyle w:val="Normal"/>
+      </w:pPr>
+      <w:r>
+        <w:t xml:space="preserve">Weekly overall model rank 97 (RB22). ROS overall rank 92 (RB27). Availability: NO_ADVERSE_STATUS_REPORTED. Weekly ranks are preliminary when playing status is unconfirmed; they are separate from season ranks.</w:t>
       </w:r>
     </w:p>
     <w:p>
@@ -10927,15 +10927,15 @@
         <w:pStyle w:val="Heading2"/>
       </w:pPr>
       <w:r>
-        <w:t xml:space="preserve">Week 7 outlook</w:t>
-      </w:r>
-    </w:p>
-    <w:p>
-      <w:pPr>
-        <w:pStyle w:val="Normal"/>
-      </w:pPr>
-      <w:r>
-        <w:t xml:space="preserve">Weekly overall model rank Not published (NOT_EXPECTED_TO_PLAY). ROS overall rank 93 (WR41). Availability: OUT. Weekly ranks are preliminary when playing status is unconfirmed; they are separate from season ranks.</w:t>
+        <w:t xml:space="preserve">Week 8 outlook</w:t>
+      </w:r>
+    </w:p>
+    <w:p>
+      <w:pPr>
+        <w:pStyle w:val="Normal"/>
+      </w:pPr>
+      <w:r>
+        <w:t xml:space="preserve">Weekly overall model rank 72 (WR27). ROS overall rank 93 (WR41). Availability: QUESTIONABLE. Weekly ranks are preliminary when playing status is unconfirmed; they are separate from season ranks.</w:t>
       </w:r>
     </w:p>
     <w:p>
@@ -11047,15 +11047,15 @@
         <w:pStyle w:val="Heading2"/>
       </w:pPr>
       <w:r>
-        <w:t xml:space="preserve">Week 7 outlook</w:t>
-      </w:r>
-    </w:p>
-    <w:p>
-      <w:pPr>
-        <w:pStyle w:val="Normal"/>
-      </w:pPr>
-      <w:r>
-        <w:t xml:space="preserve">Weekly overall model rank Not published (GAME_STARTED_NO_ORIGINAL_WEEKLY_RANK). ROS overall rank 94 (WR42). Availability: NO_ADVERSE_STATUS_REPORTED. Weekly ranks are preliminary when playing status is unconfirmed; they are separate from season ranks.</w:t>
+        <w:t xml:space="preserve">Week 8 outlook</w:t>
+      </w:r>
+    </w:p>
+    <w:p>
+      <w:pPr>
+        <w:pStyle w:val="Normal"/>
+      </w:pPr>
+      <w:r>
+        <w:t xml:space="preserve">Weekly overall model rank 80 (WR31). ROS overall rank 94 (WR42). Availability: NO_ADVERSE_STATUS_REPORTED. Weekly ranks are preliminary when playing status is unconfirmed; they are separate from season ranks.</w:t>
       </w:r>
     </w:p>
     <w:p>
@@ -11167,15 +11167,15 @@
         <w:pStyle w:val="Heading2"/>
       </w:pPr>
       <w:r>
-        <w:t xml:space="preserve">Week 7 outlook</w:t>
-      </w:r>
-    </w:p>
-    <w:p>
-      <w:pPr>
-        <w:pStyle w:val="Normal"/>
-      </w:pPr>
-      <w:r>
-        <w:t xml:space="preserve">Weekly overall model rank Not published (NO_CURRENT_WEEK_GAME). ROS overall rank 95 (WR43). Availability: UNKNOWN. Weekly ranks are preliminary when playing status is unconfirmed; they are separate from season ranks.</w:t>
+        <w:t xml:space="preserve">Week 8 outlook</w:t>
+      </w:r>
+    </w:p>
+    <w:p>
+      <w:pPr>
+        <w:pStyle w:val="Normal"/>
+      </w:pPr>
+      <w:r>
+        <w:t xml:space="preserve">Weekly overall model rank 93 (WR38). ROS overall rank 95 (WR43). Availability: QUESTIONABLE. Weekly ranks are preliminary when playing status is unconfirmed; they are separate from season ranks.</w:t>
       </w:r>
     </w:p>
     <w:p>
@@ -11287,15 +11287,15 @@
         <w:pStyle w:val="Heading2"/>
       </w:pPr>
       <w:r>
-        <w:t xml:space="preserve">Week 7 outlook</w:t>
-      </w:r>
-    </w:p>
-    <w:p>
-      <w:pPr>
-        <w:pStyle w:val="Normal"/>
-      </w:pPr>
-      <w:r>
-        <w:t xml:space="preserve">Weekly overall model rank Not published (GAME_STARTED_NO_ORIGINAL_WEEKLY_RANK). ROS overall rank 96 (WR44). Availability: NO_ADVERSE_STATUS_REPORTED. Weekly ranks are preliminary when playing status is unconfirmed; they are separate from season ranks.</w:t>
+        <w:t xml:space="preserve">Week 8 outlook</w:t>
+      </w:r>
+    </w:p>
+    <w:p>
+      <w:pPr>
+        <w:pStyle w:val="Normal"/>
+      </w:pPr>
+      <w:r>
+        <w:t xml:space="preserve">Weekly overall model rank 114 (WR46). ROS overall rank 96 (WR44). Availability: QUESTIONABLE. Weekly ranks are preliminary when playing status is unconfirmed; they are separate from season ranks.</w:t>
       </w:r>
     </w:p>
     <w:p>
@@ -11407,15 +11407,15 @@
         <w:pStyle w:val="Heading2"/>
       </w:pPr>
       <w:r>
-        <w:t xml:space="preserve">Week 7 outlook</w:t>
-      </w:r>
-    </w:p>
-    <w:p>
-      <w:pPr>
-        <w:pStyle w:val="Normal"/>
-      </w:pPr>
-      <w:r>
-        <w:t xml:space="preserve">Weekly overall model rank Not published (NO_CURRENT_WEEK_GAME). ROS overall rank 97 (TE12). Availability: UNKNOWN. Weekly ranks are preliminary when playing status is unconfirmed; they are separate from season ranks.</w:t>
+        <w:t xml:space="preserve">Week 8 outlook</w:t>
+      </w:r>
+    </w:p>
+    <w:p>
+      <w:pPr>
+        <w:pStyle w:val="Normal"/>
+      </w:pPr>
+      <w:r>
+        <w:t xml:space="preserve">Weekly overall model rank 102 (TE15). ROS overall rank 97 (TE12). Availability: NO_ADVERSE_STATUS_REPORTED. Weekly ranks are preliminary when playing status is unconfirmed; they are separate from season ranks.</w:t>
       </w:r>
     </w:p>
     <w:p>
@@ -11527,15 +11527,15 @@
         <w:pStyle w:val="Heading2"/>
       </w:pPr>
       <w:r>
-        <w:t xml:space="preserve">Week 7 outlook</w:t>
-      </w:r>
-    </w:p>
-    <w:p>
-      <w:pPr>
-        <w:pStyle w:val="Normal"/>
-      </w:pPr>
-      <w:r>
-        <w:t xml:space="preserve">Weekly overall model rank Not published (GAME_STARTED_NO_ORIGINAL_WEEKLY_RANK). ROS overall rank 98 (WR45). Availability: NO_ADVERSE_STATUS_REPORTED. Weekly ranks are preliminary when playing status is unconfirmed; they are separate from season ranks.</w:t>
+        <w:t xml:space="preserve">Week 8 outlook</w:t>
+      </w:r>
+    </w:p>
+    <w:p>
+      <w:pPr>
+        <w:pStyle w:val="Normal"/>
+      </w:pPr>
+      <w:r>
+        <w:t xml:space="preserve">Weekly overall model rank 76 (WR29). ROS overall rank 98 (WR45). Availability: NO_ADVERSE_STATUS_REPORTED. Weekly ranks are preliminary when playing status is unconfirmed; they are separate from season ranks.</w:t>
       </w:r>
     </w:p>
     <w:p>
@@ -11647,15 +11647,15 @@
         <w:pStyle w:val="Heading2"/>
       </w:pPr>
       <w:r>
-        <w:t xml:space="preserve">Week 7 outlook</w:t>
-      </w:r>
-    </w:p>
-    <w:p>
-      <w:pPr>
-        <w:pStyle w:val="Normal"/>
-      </w:pPr>
-      <w:r>
-        <w:t xml:space="preserve">Weekly overall model rank Not published (GAME_STARTED_NO_ORIGINAL_WEEKLY_RANK). ROS overall rank 99 (WR46). Availability: UNKNOWN. Weekly ranks are preliminary when playing status is unconfirmed; they are separate from season ranks.</w:t>
+        <w:t xml:space="preserve">Week 8 outlook</w:t>
+      </w:r>
+    </w:p>
+    <w:p>
+      <w:pPr>
+        <w:pStyle w:val="Normal"/>
+      </w:pPr>
+      <w:r>
+        <w:t xml:space="preserve">Weekly overall model rank 99 (WR41). ROS overall rank 99 (WR46). Availability: NO_ADVERSE_STATUS_REPORTED. Weekly ranks are preliminary when playing status is unconfirmed; they are separate from season ranks.</w:t>
       </w:r>
     </w:p>
     <w:p>
@@ -11767,7 +11767,7 @@
         <w:pStyle w:val="Heading2"/>
       </w:pPr>
       <w:r>
-        <w:t xml:space="preserve">Week 7 outlook</w:t>
+        <w:t xml:space="preserve">Week 8 outlook</w:t>
       </w:r>
     </w:p>
     <w:p>
@@ -11887,15 +11887,15 @@
         <w:pStyle w:val="Heading2"/>
       </w:pPr>
       <w:r>
-        <w:t xml:space="preserve">Week 7 outlook</w:t>
-      </w:r>
-    </w:p>
-    <w:p>
-      <w:pPr>
-        <w:pStyle w:val="Normal"/>
-      </w:pPr>
-      <w:r>
-        <w:t xml:space="preserve">Weekly overall model rank Not published (GAME_STARTED_NO_ORIGINAL_WEEKLY_RANK). ROS overall rank 101 (WR47). Availability: NO_ADVERSE_STATUS_REPORTED. Weekly ranks are preliminary when playing status is unconfirmed; they are separate from season ranks.</w:t>
+        <w:t xml:space="preserve">Week 8 outlook</w:t>
+      </w:r>
+    </w:p>
+    <w:p>
+      <w:pPr>
+        <w:pStyle w:val="Normal"/>
+      </w:pPr>
+      <w:r>
+        <w:t xml:space="preserve">Weekly overall model rank 91 (WR37). ROS overall rank 101 (WR47). Availability: NO_ADVERSE_STATUS_REPORTED. Weekly ranks are preliminary when playing status is unconfirmed; they are separate from season ranks.</w:t>
       </w:r>
     </w:p>
     <w:p>
@@ -12007,15 +12007,15 @@
         <w:pStyle w:val="Heading2"/>
       </w:pPr>
       <w:r>
-        <w:t xml:space="preserve">Week 7 outlook</w:t>
-      </w:r>
-    </w:p>
-    <w:p>
-      <w:pPr>
-        <w:pStyle w:val="Normal"/>
-      </w:pPr>
-      <w:r>
-        <w:t xml:space="preserve">Weekly overall model rank Not published (GAME_STARTED_NO_ORIGINAL_WEEKLY_RANK). ROS overall rank 102 (WR48). Availability: NO_ADVERSE_STATUS_REPORTED. Weekly ranks are preliminary when playing status is unconfirmed; they are separate from season ranks.</w:t>
+        <w:t xml:space="preserve">Week 8 outlook</w:t>
+      </w:r>
+    </w:p>
+    <w:p>
+      <w:pPr>
+        <w:pStyle w:val="Normal"/>
+      </w:pPr>
+      <w:r>
+        <w:t xml:space="preserve">Weekly overall model rank 88 (WR36). ROS overall rank 102 (WR48). Availability: NO_ADVERSE_STATUS_REPORTED. Weekly ranks are preliminary when playing status is unconfirmed; they are separate from season ranks.</w:t>
       </w:r>
     </w:p>
     <w:p>
@@ -12127,15 +12127,15 @@
         <w:pStyle w:val="Heading2"/>
       </w:pPr>
       <w:r>
-        <w:t xml:space="preserve">Week 7 outlook</w:t>
-      </w:r>
-    </w:p>
-    <w:p>
-      <w:pPr>
-        <w:pStyle w:val="Normal"/>
-      </w:pPr>
-      <w:r>
-        <w:t xml:space="preserve">Weekly overall model rank Not published (GAME_STARTED_NO_ORIGINAL_WEEKLY_RANK). ROS overall rank 103 (QB15). Availability: UNKNOWN. Weekly ranks are preliminary when playing status is unconfirmed; they are separate from season ranks.</w:t>
+        <w:t xml:space="preserve">Week 8 outlook</w:t>
+      </w:r>
+    </w:p>
+    <w:p>
+      <w:pPr>
+        <w:pStyle w:val="Normal"/>
+      </w:pPr>
+      <w:r>
+        <w:t xml:space="preserve">Weekly overall model rank 32 (QB13). ROS overall rank 103 (QB15). Availability: NO_ADVERSE_STATUS_REPORTED. Weekly ranks are preliminary when playing status is unconfirmed; they are separate from season ranks.</w:t>
       </w:r>
     </w:p>
     <w:p>
@@ -12247,15 +12247,15 @@
         <w:pStyle w:val="Heading2"/>
       </w:pPr>
       <w:r>
-        <w:t xml:space="preserve">Week 7 outlook</w:t>
-      </w:r>
-    </w:p>
-    <w:p>
-      <w:pPr>
-        <w:pStyle w:val="Normal"/>
-      </w:pPr>
-      <w:r>
-        <w:t xml:space="preserve">Weekly overall model rank Not published (NO_CURRENT_WEEK_GAME). ROS overall rank 104 (QB16). Availability: UNKNOWN. Weekly ranks are preliminary when playing status is unconfirmed; they are separate from season ranks.</w:t>
+        <w:t xml:space="preserve">Week 8 outlook</w:t>
+      </w:r>
+    </w:p>
+    <w:p>
+      <w:pPr>
+        <w:pStyle w:val="Normal"/>
+      </w:pPr>
+      <w:r>
+        <w:t xml:space="preserve">Weekly overall model rank 27 (QB11). ROS overall rank 104 (QB16). Availability: NO_ADVERSE_STATUS_REPORTED. Weekly ranks are preliminary when playing status is unconfirmed; they are separate from season ranks.</w:t>
       </w:r>
     </w:p>
     <w:p>
@@ -12367,15 +12367,15 @@
         <w:pStyle w:val="Heading2"/>
       </w:pPr>
       <w:r>
-        <w:t xml:space="preserve">Week 7 outlook</w:t>
-      </w:r>
-    </w:p>
-    <w:p>
-      <w:pPr>
-        <w:pStyle w:val="Normal"/>
-      </w:pPr>
-      <w:r>
-        <w:t xml:space="preserve">Weekly overall model rank Not published (GAME_STARTED_NO_ORIGINAL_WEEKLY_RANK). ROS overall rank 105 (TE13). Availability: NO_ADVERSE_STATUS_REPORTED. Weekly ranks are preliminary when playing status is unconfirmed; they are separate from season ranks.</w:t>
+        <w:t xml:space="preserve">Week 8 outlook</w:t>
+      </w:r>
+    </w:p>
+    <w:p>
+      <w:pPr>
+        <w:pStyle w:val="Normal"/>
+      </w:pPr>
+      <w:r>
+        <w:t xml:space="preserve">Weekly overall model rank Not published (NO_CURRENT_WEEK_GAME). ROS overall rank 105 (TE13). Availability: NO_ADVERSE_STATUS_REPORTED. Weekly ranks are preliminary when playing status is unconfirmed; they are separate from season ranks.</w:t>
       </w:r>
     </w:p>
     <w:p>
@@ -12487,7 +12487,7 @@
         <w:pStyle w:val="Heading2"/>
       </w:pPr>
       <w:r>
-        <w:t xml:space="preserve">Week 7 outlook</w:t>
+        <w:t xml:space="preserve">Week 8 outlook</w:t>
       </w:r>
     </w:p>
     <w:p>
@@ -12607,15 +12607,15 @@
         <w:pStyle w:val="Heading2"/>
       </w:pPr>
       <w:r>
-        <w:t xml:space="preserve">Week 7 outlook</w:t>
-      </w:r>
-    </w:p>
-    <w:p>
-      <w:pPr>
-        <w:pStyle w:val="Normal"/>
-      </w:pPr>
-      <w:r>
-        <w:t xml:space="preserve">Weekly overall model rank Not published (GAME_STARTED_NO_ORIGINAL_WEEKLY_RANK). ROS overall rank 107 (RB29). Availability: UNKNOWN. Weekly ranks are preliminary when playing status is unconfirmed; they are separate from season ranks.</w:t>
+        <w:t xml:space="preserve">Week 8 outlook</w:t>
+      </w:r>
+    </w:p>
+    <w:p>
+      <w:pPr>
+        <w:pStyle w:val="Normal"/>
+      </w:pPr>
+      <w:r>
+        <w:t xml:space="preserve">Weekly overall model rank 107 (RB25). ROS overall rank 107 (RB29). Availability: NO_ADVERSE_STATUS_REPORTED. Weekly ranks are preliminary when playing status is unconfirmed; they are separate from season ranks.</w:t>
       </w:r>
     </w:p>
     <w:p>
@@ -12727,15 +12727,15 @@
         <w:pStyle w:val="Heading2"/>
       </w:pPr>
       <w:r>
-        <w:t xml:space="preserve">Week 7 outlook</w:t>
-      </w:r>
-    </w:p>
-    <w:p>
-      <w:pPr>
-        <w:pStyle w:val="Normal"/>
-      </w:pPr>
-      <w:r>
-        <w:t xml:space="preserve">Weekly overall model rank Not published (GAME_STARTED_NO_ORIGINAL_WEEKLY_RANK). ROS overall rank 108 (WR49). Availability: NO_ADVERSE_STATUS_REPORTED. Weekly ranks are preliminary when playing status is unconfirmed; they are separate from season ranks.</w:t>
+        <w:t xml:space="preserve">Week 8 outlook</w:t>
+      </w:r>
+    </w:p>
+    <w:p>
+      <w:pPr>
+        <w:pStyle w:val="Normal"/>
+      </w:pPr>
+      <w:r>
+        <w:t xml:space="preserve">Weekly overall model rank 96 (WR40). ROS overall rank 108 (WR49). Availability: NO_ADVERSE_STATUS_REPORTED. Weekly ranks are preliminary when playing status is unconfirmed; they are separate from season ranks.</w:t>
       </w:r>
     </w:p>
     <w:p>
@@ -12847,7 +12847,7 @@
         <w:pStyle w:val="Heading2"/>
       </w:pPr>
       <w:r>
-        <w:t xml:space="preserve">Week 7 outlook</w:t>
+        <w:t xml:space="preserve">Week 8 outlook</w:t>
       </w:r>
     </w:p>
     <w:p>
@@ -12967,7 +12967,7 @@
         <w:pStyle w:val="Heading2"/>
       </w:pPr>
       <w:r>
-        <w:t xml:space="preserve">Week 7 outlook</w:t>
+        <w:t xml:space="preserve">Week 8 outlook</w:t>
       </w:r>
     </w:p>
     <w:p>
@@ -13087,7 +13087,7 @@
         <w:pStyle w:val="Heading2"/>
       </w:pPr>
       <w:r>
-        <w:t xml:space="preserve">Week 7 outlook</w:t>
+        <w:t xml:space="preserve">Week 8 outlook</w:t>
       </w:r>
     </w:p>
     <w:p>
@@ -13207,15 +13207,15 @@
         <w:pStyle w:val="Heading2"/>
       </w:pPr>
       <w:r>
-        <w:t xml:space="preserve">Week 7 outlook</w:t>
-      </w:r>
-    </w:p>
-    <w:p>
-      <w:pPr>
-        <w:pStyle w:val="Normal"/>
-      </w:pPr>
-      <w:r>
-        <w:t xml:space="preserve">Weekly overall model rank Not published (GAME_STARTED_NO_ORIGINAL_WEEKLY_RANK). ROS overall rank 112 (WR52). Availability: NO_ADVERSE_STATUS_REPORTED. Weekly ranks are preliminary when playing status is unconfirmed; they are separate from season ranks.</w:t>
+        <w:t xml:space="preserve">Week 8 outlook</w:t>
+      </w:r>
+    </w:p>
+    <w:p>
+      <w:pPr>
+        <w:pStyle w:val="Normal"/>
+      </w:pPr>
+      <w:r>
+        <w:t xml:space="preserve">Weekly overall model rank 86 (WR34). ROS overall rank 112 (WR52). Availability: NO_ADVERSE_STATUS_REPORTED. Weekly ranks are preliminary when playing status is unconfirmed; they are separate from season ranks.</w:t>
       </w:r>
     </w:p>
     <w:p>
@@ -13327,15 +13327,15 @@
         <w:pStyle w:val="Heading2"/>
       </w:pPr>
       <w:r>
-        <w:t xml:space="preserve">Week 7 outlook</w:t>
-      </w:r>
-    </w:p>
-    <w:p>
-      <w:pPr>
-        <w:pStyle w:val="Normal"/>
-      </w:pPr>
-      <w:r>
-        <w:t xml:space="preserve">Weekly overall model rank Not published (GAME_STARTED_NO_ORIGINAL_WEEKLY_RANK). ROS overall rank 113 (TE15). Availability: UNKNOWN. Weekly ranks are preliminary when playing status is unconfirmed; they are separate from season ranks.</w:t>
+        <w:t xml:space="preserve">Week 8 outlook</w:t>
+      </w:r>
+    </w:p>
+    <w:p>
+      <w:pPr>
+        <w:pStyle w:val="Normal"/>
+      </w:pPr>
+      <w:r>
+        <w:t xml:space="preserve">Weekly overall model rank 77 (TE10). ROS overall rank 113 (TE15). Availability: NO_ADVERSE_STATUS_REPORTED. Weekly ranks are preliminary when playing status is unconfirmed; they are separate from season ranks.</w:t>
       </w:r>
     </w:p>
     <w:p>
@@ -13447,15 +13447,15 @@
         <w:pStyle w:val="Heading2"/>
       </w:pPr>
       <w:r>
-        <w:t xml:space="preserve">Week 7 outlook</w:t>
-      </w:r>
-    </w:p>
-    <w:p>
-      <w:pPr>
-        <w:pStyle w:val="Normal"/>
-      </w:pPr>
-      <w:r>
-        <w:t xml:space="preserve">Weekly overall model rank Not published (GAME_STARTED_NO_ORIGINAL_WEEKLY_RANK). ROS overall rank 114 (TE16). Availability: NO_ADVERSE_STATUS_REPORTED. Weekly ranks are preliminary when playing status is unconfirmed; they are separate from season ranks.</w:t>
+        <w:t xml:space="preserve">Week 8 outlook</w:t>
+      </w:r>
+    </w:p>
+    <w:p>
+      <w:pPr>
+        <w:pStyle w:val="Normal"/>
+      </w:pPr>
+      <w:r>
+        <w:t xml:space="preserve">Weekly overall model rank Not published (NO_CURRENT_WEEK_GAME). ROS overall rank 114 (TE16). Availability: NO_ADVERSE_STATUS_REPORTED. Weekly ranks are preliminary when playing status is unconfirmed; they are separate from season ranks.</w:t>
       </w:r>
     </w:p>
     <w:p>
@@ -13567,15 +13567,15 @@
         <w:pStyle w:val="Heading2"/>
       </w:pPr>
       <w:r>
-        <w:t xml:space="preserve">Week 7 outlook</w:t>
-      </w:r>
-    </w:p>
-    <w:p>
-      <w:pPr>
-        <w:pStyle w:val="Normal"/>
-      </w:pPr>
-      <w:r>
-        <w:t xml:space="preserve">Weekly overall model rank Not published (GAME_STARTED_NO_ORIGINAL_WEEKLY_RANK). ROS overall rank 115 (RB31). Availability: NO_ADVERSE_STATUS_REPORTED. Weekly ranks are preliminary when playing status is unconfirmed; they are separate from season ranks.</w:t>
+        <w:t xml:space="preserve">Week 8 outlook</w:t>
+      </w:r>
+    </w:p>
+    <w:p>
+      <w:pPr>
+        <w:pStyle w:val="Normal"/>
+      </w:pPr>
+      <w:r>
+        <w:t xml:space="preserve">Weekly overall model rank 95 (RB21). ROS overall rank 115 (RB31). Availability: NO_ADVERSE_STATUS_REPORTED. Weekly ranks are preliminary when playing status is unconfirmed; they are separate from season ranks.</w:t>
       </w:r>
     </w:p>
     <w:p>
@@ -13687,15 +13687,15 @@
         <w:pStyle w:val="Heading2"/>
       </w:pPr>
       <w:r>
-        <w:t xml:space="preserve">Week 7 outlook</w:t>
-      </w:r>
-    </w:p>
-    <w:p>
-      <w:pPr>
-        <w:pStyle w:val="Normal"/>
-      </w:pPr>
-      <w:r>
-        <w:t xml:space="preserve">Weekly overall model rank Not published (GAME_STARTED_NO_ORIGINAL_WEEKLY_RANK). ROS overall rank 116 (RB32). Availability: NO_ADVERSE_STATUS_REPORTED. Weekly ranks are preliminary when playing status is unconfirmed; they are separate from season ranks.</w:t>
+        <w:t xml:space="preserve">Week 8 outlook</w:t>
+      </w:r>
+    </w:p>
+    <w:p>
+      <w:pPr>
+        <w:pStyle w:val="Normal"/>
+      </w:pPr>
+      <w:r>
+        <w:t xml:space="preserve">Weekly overall model rank 109 (RB27). ROS overall rank 116 (RB32). Availability: NO_ADVERSE_STATUS_REPORTED. Weekly ranks are preliminary when playing status is unconfirmed; they are separate from season ranks.</w:t>
       </w:r>
     </w:p>
     <w:p>
@@ -13807,15 +13807,15 @@
         <w:pStyle w:val="Heading2"/>
       </w:pPr>
       <w:r>
-        <w:t xml:space="preserve">Week 7 outlook</w:t>
-      </w:r>
-    </w:p>
-    <w:p>
-      <w:pPr>
-        <w:pStyle w:val="Normal"/>
-      </w:pPr>
-      <w:r>
-        <w:t xml:space="preserve">Weekly overall model rank Not published (NO_CURRENT_WEEK_GAME). ROS overall rank 117 (WR53). Availability: UNKNOWN. Weekly ranks are preliminary when playing status is unconfirmed; they are separate from season ranks.</w:t>
+        <w:t xml:space="preserve">Week 8 outlook</w:t>
+      </w:r>
+    </w:p>
+    <w:p>
+      <w:pPr>
+        <w:pStyle w:val="Normal"/>
+      </w:pPr>
+      <w:r>
+        <w:t xml:space="preserve">Weekly overall model rank 115 (WR47). ROS overall rank 117 (WR53). Availability: NO_ADVERSE_STATUS_REPORTED. Weekly ranks are preliminary when playing status is unconfirmed; they are separate from season ranks.</w:t>
       </w:r>
     </w:p>
     <w:p>
@@ -13895,15 +13895,15 @@
         <w:pStyle w:val="Heading2"/>
       </w:pPr>
       <w:r>
-        <w:t xml:space="preserve">Week 7 outlook</w:t>
-      </w:r>
-    </w:p>
-    <w:p>
-      <w:pPr>
-        <w:pStyle w:val="Normal"/>
-      </w:pPr>
-      <w:r>
-        <w:t xml:space="preserve">Weekly overall model rank Not published (GAME_STARTED_NO_ORIGINAL_WEEKLY_RANK). ROS overall rank 118 (TE17). Availability: UNKNOWN. Weekly ranks are preliminary when playing status is unconfirmed; they are separate from season ranks.</w:t>
+        <w:t xml:space="preserve">Week 8 outlook</w:t>
+      </w:r>
+    </w:p>
+    <w:p>
+      <w:pPr>
+        <w:pStyle w:val="Normal"/>
+      </w:pPr>
+      <w:r>
+        <w:t xml:space="preserve">Weekly overall model rank 82 (TE13). ROS overall rank 118 (TE17). Availability: NO_ADVERSE_STATUS_REPORTED. Weekly ranks are preliminary when playing status is unconfirmed; they are separate from season ranks.</w:t>
       </w:r>
     </w:p>
     <w:p>
@@ -13983,15 +13983,15 @@
         <w:pStyle w:val="Heading2"/>
       </w:pPr>
       <w:r>
-        <w:t xml:space="preserve">Week 7 outlook</w:t>
-      </w:r>
-    </w:p>
-    <w:p>
-      <w:pPr>
-        <w:pStyle w:val="Normal"/>
-      </w:pPr>
-      <w:r>
-        <w:t xml:space="preserve">Weekly overall model rank Not published (NO_CURRENT_WEEK_GAME). ROS overall rank 119 (TE18). Availability: UNKNOWN. Weekly ranks are preliminary when playing status is unconfirmed; they are separate from season ranks.</w:t>
+        <w:t xml:space="preserve">Week 8 outlook</w:t>
+      </w:r>
+    </w:p>
+    <w:p>
+      <w:pPr>
+        <w:pStyle w:val="Normal"/>
+      </w:pPr>
+      <w:r>
+        <w:t xml:space="preserve">Weekly overall model rank 111 (TE18). ROS overall rank 119 (TE18). Availability: NO_ADVERSE_STATUS_REPORTED. Weekly ranks are preliminary when playing status is unconfirmed; they are separate from season ranks.</w:t>
       </w:r>
     </w:p>
     <w:p>
@@ -14071,15 +14071,15 @@
         <w:pStyle w:val="Heading2"/>
       </w:pPr>
       <w:r>
-        <w:t xml:space="preserve">Week 7 outlook</w:t>
-      </w:r>
-    </w:p>
-    <w:p>
-      <w:pPr>
-        <w:pStyle w:val="Normal"/>
-      </w:pPr>
-      <w:r>
-        <w:t xml:space="preserve">Weekly overall model rank Not published (GAME_STARTED_NO_ORIGINAL_WEEKLY_RANK). ROS overall rank 120 (RB33). Availability: NO_ADVERSE_STATUS_REPORTED. Weekly ranks are preliminary when playing status is unconfirmed; they are separate from season ranks.</w:t>
+        <w:t xml:space="preserve">Week 8 outlook</w:t>
+      </w:r>
+    </w:p>
+    <w:p>
+      <w:pPr>
+        <w:pStyle w:val="Normal"/>
+      </w:pPr>
+      <w:r>
+        <w:t xml:space="preserve">Weekly overall model rank 116 (RB29). ROS overall rank 120 (RB33). Availability: QUESTIONABLE. Weekly ranks are preliminary when playing status is unconfirmed; they are separate from season ranks.</w:t>
       </w:r>
     </w:p>
     <w:p>
@@ -14191,7 +14191,7 @@
         <w:pStyle w:val="Heading2"/>
       </w:pPr>
       <w:r>
-        <w:t xml:space="preserve">Week 7 outlook</w:t>
+        <w:t xml:space="preserve">Week 8 outlook</w:t>
       </w:r>
     </w:p>
     <w:p>
@@ -14311,7 +14311,7 @@
         <w:pStyle w:val="Heading2"/>
       </w:pPr>
       <w:r>
-        <w:t xml:space="preserve">Week 7 outlook</w:t>
+        <w:t xml:space="preserve">Week 8 outlook</w:t>
       </w:r>
     </w:p>
     <w:p>
@@ -14431,15 +14431,15 @@
         <w:pStyle w:val="Heading2"/>
       </w:pPr>
       <w:r>
-        <w:t xml:space="preserve">Week 7 outlook</w:t>
-      </w:r>
-    </w:p>
-    <w:p>
-      <w:pPr>
-        <w:pStyle w:val="Normal"/>
-      </w:pPr>
-      <w:r>
-        <w:t xml:space="preserve">Weekly overall model rank Not published (GAME_STARTED_NO_ORIGINAL_WEEKLY_RANK). ROS overall rank 123 (TE19). Availability: NO_ADVERSE_STATUS_REPORTED. Weekly ranks are preliminary when playing status is unconfirmed; they are separate from season ranks.</w:t>
+        <w:t xml:space="preserve">Week 8 outlook</w:t>
+      </w:r>
+    </w:p>
+    <w:p>
+      <w:pPr>
+        <w:pStyle w:val="Normal"/>
+      </w:pPr>
+      <w:r>
+        <w:t xml:space="preserve">Weekly overall model rank 68 (TE6). ROS overall rank 123 (TE19). Availability: NO_ADVERSE_STATUS_REPORTED. Weekly ranks are preliminary when playing status is unconfirmed; they are separate from season ranks.</w:t>
       </w:r>
     </w:p>
     <w:p>
@@ -14535,15 +14535,15 @@
         <w:pStyle w:val="Heading2"/>
       </w:pPr>
       <w:r>
-        <w:t xml:space="preserve">Week 7 outlook</w:t>
-      </w:r>
-    </w:p>
-    <w:p>
-      <w:pPr>
-        <w:pStyle w:val="Normal"/>
-      </w:pPr>
-      <w:r>
-        <w:t xml:space="preserve">Weekly overall model rank Not published (GAME_STARTED_NO_ORIGINAL_WEEKLY_RANK). ROS overall rank 124 (RB35). Availability: NO_ADVERSE_STATUS_REPORTED. Weekly ranks are preliminary when playing status is unconfirmed; they are separate from season ranks.</w:t>
+        <w:t xml:space="preserve">Week 8 outlook</w:t>
+      </w:r>
+    </w:p>
+    <w:p>
+      <w:pPr>
+        <w:pStyle w:val="Normal"/>
+      </w:pPr>
+      <w:r>
+        <w:t xml:space="preserve">Weekly overall model rank 90 (RB19). ROS overall rank 124 (RB35). Availability: NO_ADVERSE_STATUS_REPORTED. Weekly ranks are preliminary when playing status is unconfirmed; they are separate from season ranks.</w:t>
       </w:r>
     </w:p>
     <w:p>
@@ -14655,15 +14655,15 @@
         <w:pStyle w:val="Heading2"/>
       </w:pPr>
       <w:r>
-        <w:t xml:space="preserve">Week 7 outlook</w:t>
-      </w:r>
-    </w:p>
-    <w:p>
-      <w:pPr>
-        <w:pStyle w:val="Normal"/>
-      </w:pPr>
-      <w:r>
-        <w:t xml:space="preserve">Weekly overall model rank Not published (GAME_STARTED_NO_ORIGINAL_WEEKLY_RANK). ROS overall rank 125 (TE20). Availability: UNKNOWN. Weekly ranks are preliminary when playing status is unconfirmed; they are separate from season ranks.</w:t>
+        <w:t xml:space="preserve">Week 8 outlook</w:t>
+      </w:r>
+    </w:p>
+    <w:p>
+      <w:pPr>
+        <w:pStyle w:val="Normal"/>
+      </w:pPr>
+      <w:r>
+        <w:t xml:space="preserve">Weekly overall model rank 83 (TE14). ROS overall rank 125 (TE20). Availability: NO_ADVERSE_STATUS_REPORTED. Weekly ranks are preliminary when playing status is unconfirmed; they are separate from season ranks.</w:t>
       </w:r>
     </w:p>
     <w:p>
@@ -14775,7 +14775,7 @@
         <w:pStyle w:val="Heading2"/>
       </w:pPr>
       <w:r>
-        <w:t xml:space="preserve">Week 7 outlook</w:t>
+        <w:t xml:space="preserve">Week 8 outlook</w:t>
       </w:r>
     </w:p>
     <w:p>
@@ -14895,15 +14895,15 @@
         <w:pStyle w:val="Heading2"/>
       </w:pPr>
       <w:r>
-        <w:t xml:space="preserve">Week 7 outlook</w:t>
-      </w:r>
-    </w:p>
-    <w:p>
-      <w:pPr>
-        <w:pStyle w:val="Normal"/>
-      </w:pPr>
-      <w:r>
-        <w:t xml:space="preserve">Weekly overall model rank Not published (GAME_STARTED_NO_ORIGINAL_WEEKLY_RANK). ROS overall rank 127 (WR56). Availability: NO_ADVERSE_STATUS_REPORTED. Weekly ranks are preliminary when playing status is unconfirmed; they are separate from season ranks.</w:t>
+        <w:t xml:space="preserve">Week 8 outlook</w:t>
+      </w:r>
+    </w:p>
+    <w:p>
+      <w:pPr>
+        <w:pStyle w:val="Normal"/>
+      </w:pPr>
+      <w:r>
+        <w:t xml:space="preserve">Weekly overall model rank 94 (WR39). ROS overall rank 127 (WR56). Availability: NO_ADVERSE_STATUS_REPORTED. Weekly ranks are preliminary when playing status is unconfirmed; they are separate from season ranks.</w:t>
       </w:r>
     </w:p>
     <w:p>
@@ -15015,15 +15015,15 @@
         <w:pStyle w:val="Heading2"/>
       </w:pPr>
       <w:r>
-        <w:t xml:space="preserve">Week 7 outlook</w:t>
-      </w:r>
-    </w:p>
-    <w:p>
-      <w:pPr>
-        <w:pStyle w:val="Normal"/>
-      </w:pPr>
-      <w:r>
-        <w:t xml:space="preserve">Weekly overall model rank Not published (NO_CURRENT_WEEK_GAME). ROS overall rank 128 (RB36). Availability: UNKNOWN. Weekly ranks are preliminary when playing status is unconfirmed; they are separate from season ranks.</w:t>
+        <w:t xml:space="preserve">Week 8 outlook</w:t>
+      </w:r>
+    </w:p>
+    <w:p>
+      <w:pPr>
+        <w:pStyle w:val="Normal"/>
+      </w:pPr>
+      <w:r>
+        <w:t xml:space="preserve">Weekly overall model rank 113 (RB28). ROS overall rank 128 (RB36). Availability: NO_ADVERSE_STATUS_REPORTED. Weekly ranks are preliminary when playing status is unconfirmed; they are separate from season ranks.</w:t>
       </w:r>
     </w:p>
     <w:p>
@@ -15135,15 +15135,15 @@
         <w:pStyle w:val="Heading2"/>
       </w:pPr>
       <w:r>
-        <w:t xml:space="preserve">Week 7 outlook</w:t>
-      </w:r>
-    </w:p>
-    <w:p>
-      <w:pPr>
-        <w:pStyle w:val="Normal"/>
-      </w:pPr>
-      <w:r>
-        <w:t xml:space="preserve">Weekly overall model rank Not published (NO_CURRENT_WEEK_GAME). ROS overall rank 129 (WR57). Availability: UNKNOWN. Weekly ranks are preliminary when playing status is unconfirmed; they are separate from season ranks.</w:t>
+        <w:t xml:space="preserve">Week 8 outlook</w:t>
+      </w:r>
+    </w:p>
+    <w:p>
+      <w:pPr>
+        <w:pStyle w:val="Normal"/>
+      </w:pPr>
+      <w:r>
+        <w:t xml:space="preserve">Weekly overall model rank 100 (WR42). ROS overall rank 129 (WR57). Availability: NO_ADVERSE_STATUS_REPORTED. Weekly ranks are preliminary when playing status is unconfirmed; they are separate from season ranks.</w:t>
       </w:r>
     </w:p>
     <w:p>
@@ -15255,15 +15255,15 @@
         <w:pStyle w:val="Heading2"/>
       </w:pPr>
       <w:r>
-        <w:t xml:space="preserve">Week 7 outlook</w:t>
-      </w:r>
-    </w:p>
-    <w:p>
-      <w:pPr>
-        <w:pStyle w:val="Normal"/>
-      </w:pPr>
-      <w:r>
-        <w:t xml:space="preserve">Weekly overall model rank Not published (GAME_STARTED_NO_ORIGINAL_WEEKLY_RANK). ROS overall rank 130 (RB37). Availability: NO_ADVERSE_STATUS_REPORTED. Weekly ranks are preliminary when playing status is unconfirmed; they are separate from season ranks.</w:t>
+        <w:t xml:space="preserve">Week 8 outlook</w:t>
+      </w:r>
+    </w:p>
+    <w:p>
+      <w:pPr>
+        <w:pStyle w:val="Normal"/>
+      </w:pPr>
+      <w:r>
+        <w:t xml:space="preserve">Weekly overall model rank 125 (RB36). ROS overall rank 130 (RB37). Availability: NO_ADVERSE_STATUS_REPORTED. Weekly ranks are preliminary when playing status is unconfirmed; they are separate from season ranks.</w:t>
       </w:r>
     </w:p>
     <w:p>
@@ -15375,15 +15375,15 @@
         <w:pStyle w:val="Heading2"/>
       </w:pPr>
       <w:r>
-        <w:t xml:space="preserve">Week 7 outlook</w:t>
-      </w:r>
-    </w:p>
-    <w:p>
-      <w:pPr>
-        <w:pStyle w:val="Normal"/>
-      </w:pPr>
-      <w:r>
-        <w:t xml:space="preserve">Weekly overall model rank Not published (GAME_STARTED_NO_ORIGINAL_WEEKLY_RANK). ROS overall rank 131 (WR58). Availability: NO_ADVERSE_STATUS_REPORTED. Weekly ranks are preliminary when playing status is unconfirmed; they are separate from season ranks.</w:t>
+        <w:t xml:space="preserve">Week 8 outlook</w:t>
+      </w:r>
+    </w:p>
+    <w:p>
+      <w:pPr>
+        <w:pStyle w:val="Normal"/>
+      </w:pPr>
+      <w:r>
+        <w:t xml:space="preserve">Weekly overall model rank 112 (WR45). ROS overall rank 131 (WR58). Availability: NO_ADVERSE_STATUS_REPORTED. Weekly ranks are preliminary when playing status is unconfirmed; they are separate from season ranks.</w:t>
       </w:r>
     </w:p>
     <w:p>
@@ -15495,15 +15495,15 @@
         <w:pStyle w:val="Heading2"/>
       </w:pPr>
       <w:r>
-        <w:t xml:space="preserve">Week 7 outlook</w:t>
-      </w:r>
-    </w:p>
-    <w:p>
-      <w:pPr>
-        <w:pStyle w:val="Normal"/>
-      </w:pPr>
-      <w:r>
-        <w:t xml:space="preserve">Weekly overall model rank Not published (GAME_STARTED_NO_ORIGINAL_WEEKLY_RANK). ROS overall rank 132 (TE21). Availability: NO_ADVERSE_STATUS_REPORTED. Weekly ranks are preliminary when playing status is unconfirmed; they are separate from season ranks.</w:t>
+        <w:t xml:space="preserve">Week 8 outlook</w:t>
+      </w:r>
+    </w:p>
+    <w:p>
+      <w:pPr>
+        <w:pStyle w:val="Normal"/>
+      </w:pPr>
+      <w:r>
+        <w:t xml:space="preserve">Weekly overall model rank 71 (TE8). ROS overall rank 132 (TE21). Availability: QUESTIONABLE. Weekly ranks are preliminary when playing status is unconfirmed; they are separate from season ranks.</w:t>
       </w:r>
     </w:p>
     <w:p>
@@ -15615,15 +15615,15 @@
         <w:pStyle w:val="Heading2"/>
       </w:pPr>
       <w:r>
-        <w:t xml:space="preserve">Week 7 outlook</w:t>
-      </w:r>
-    </w:p>
-    <w:p>
-      <w:pPr>
-        <w:pStyle w:val="Normal"/>
-      </w:pPr>
-      <w:r>
-        <w:t xml:space="preserve">Weekly overall model rank Not published (GAME_STARTED_NO_ORIGINAL_WEEKLY_RANK). ROS overall rank 133 (WR59). Availability: NO_ADVERSE_STATUS_REPORTED. Weekly ranks are preliminary when playing status is unconfirmed; they are separate from season ranks.</w:t>
+        <w:t xml:space="preserve">Week 8 outlook</w:t>
+      </w:r>
+    </w:p>
+    <w:p>
+      <w:pPr>
+        <w:pStyle w:val="Normal"/>
+      </w:pPr>
+      <w:r>
+        <w:t xml:space="preserve">Weekly overall model rank 119 (WR49). ROS overall rank 133 (WR59). Availability: NO_ADVERSE_STATUS_REPORTED. Weekly ranks are preliminary when playing status is unconfirmed; they are separate from season ranks.</w:t>
       </w:r>
     </w:p>
     <w:p>
@@ -15735,15 +15735,15 @@
         <w:pStyle w:val="Heading2"/>
       </w:pPr>
       <w:r>
-        <w:t xml:space="preserve">Week 7 outlook</w:t>
-      </w:r>
-    </w:p>
-    <w:p>
-      <w:pPr>
-        <w:pStyle w:val="Normal"/>
-      </w:pPr>
-      <w:r>
-        <w:t xml:space="preserve">Weekly overall model rank Not published (GAME_STARTED_NO_ORIGINAL_WEEKLY_RANK). ROS overall rank 134 (RB38). Availability: UNKNOWN. Weekly ranks are preliminary when playing status is unconfirmed; they are separate from season ranks.</w:t>
+        <w:t xml:space="preserve">Week 8 outlook</w:t>
+      </w:r>
+    </w:p>
+    <w:p>
+      <w:pPr>
+        <w:pStyle w:val="Normal"/>
+      </w:pPr>
+      <w:r>
+        <w:t xml:space="preserve">Weekly overall model rank 121 (RB32). ROS overall rank 134 (RB38). Availability: UNKNOWN. Weekly ranks are preliminary when playing status is unconfirmed; they are separate from season ranks.</w:t>
       </w:r>
     </w:p>
     <w:p>
@@ -15855,15 +15855,15 @@
         <w:pStyle w:val="Heading2"/>
       </w:pPr>
       <w:r>
-        <w:t xml:space="preserve">Week 7 outlook</w:t>
-      </w:r>
-    </w:p>
-    <w:p>
-      <w:pPr>
-        <w:pStyle w:val="Normal"/>
-      </w:pPr>
-      <w:r>
-        <w:t xml:space="preserve">Weekly overall model rank Not published (GAME_STARTED_NO_ORIGINAL_WEEKLY_RANK). ROS overall rank 135 (RB39). Availability: NO_ADVERSE_STATUS_REPORTED. Weekly ranks are preliminary when playing status is unconfirmed; they are separate from season ranks.</w:t>
+        <w:t xml:space="preserve">Week 8 outlook</w:t>
+      </w:r>
+    </w:p>
+    <w:p>
+      <w:pPr>
+        <w:pStyle w:val="Normal"/>
+      </w:pPr>
+      <w:r>
+        <w:t xml:space="preserve">Weekly overall model rank Not published (NO_CURRENT_WEEK_GAME). ROS overall rank 135 (RB39). Availability: NO_ADVERSE_STATUS_REPORTED. Weekly ranks are preliminary when playing status is unconfirmed; they are separate from season ranks.</w:t>
       </w:r>
     </w:p>
     <w:p>
@@ -15975,7 +15975,7 @@
         <w:pStyle w:val="Heading2"/>
       </w:pPr>
       <w:r>
-        <w:t xml:space="preserve">Week 7 outlook</w:t>
+        <w:t xml:space="preserve">Week 8 outlook</w:t>
       </w:r>
     </w:p>
     <w:p>
@@ -16095,15 +16095,15 @@
         <w:pStyle w:val="Heading2"/>
       </w:pPr>
       <w:r>
-        <w:t xml:space="preserve">Week 7 outlook</w:t>
-      </w:r>
-    </w:p>
-    <w:p>
-      <w:pPr>
-        <w:pStyle w:val="Normal"/>
-      </w:pPr>
-      <w:r>
-        <w:t xml:space="preserve">Weekly overall model rank Not published (GAME_STARTED_NO_ORIGINAL_WEEKLY_RANK). ROS overall rank 137 (RB40). Availability: QUESTIONABLE. Weekly ranks are preliminary when playing status is unconfirmed; they are separate from season ranks.</w:t>
+        <w:t xml:space="preserve">Week 8 outlook</w:t>
+      </w:r>
+    </w:p>
+    <w:p>
+      <w:pPr>
+        <w:pStyle w:val="Normal"/>
+      </w:pPr>
+      <w:r>
+        <w:t xml:space="preserve">Weekly overall model rank 123 (RB34). ROS overall rank 137 (RB40). Availability: NO_ADVERSE_STATUS_REPORTED. Weekly ranks are preliminary when playing status is unconfirmed; they are separate from season ranks.</w:t>
       </w:r>
     </w:p>
     <w:p>
@@ -16215,15 +16215,15 @@
         <w:pStyle w:val="Heading2"/>
       </w:pPr>
       <w:r>
-        <w:t xml:space="preserve">Week 7 outlook</w:t>
-      </w:r>
-    </w:p>
-    <w:p>
-      <w:pPr>
-        <w:pStyle w:val="Normal"/>
-      </w:pPr>
-      <w:r>
-        <w:t xml:space="preserve">Weekly overall model rank Not published (GAME_STARTED_NO_ORIGINAL_WEEKLY_RANK). ROS overall rank 138 (WR61). Availability: QUESTIONABLE. Weekly ranks are preliminary when playing status is unconfirmed; they are separate from season ranks.</w:t>
+        <w:t xml:space="preserve">Week 8 outlook</w:t>
+      </w:r>
+    </w:p>
+    <w:p>
+      <w:pPr>
+        <w:pStyle w:val="Normal"/>
+      </w:pPr>
+      <w:r>
+        <w:t xml:space="preserve">Weekly overall model rank Not published (GAME_STARTED_NO_ORIGINAL_WEEKLY_RANK). ROS overall rank 138 (WR61). Availability: NO_ADVERSE_STATUS_REPORTED. Weekly ranks are preliminary when playing status is unconfirmed; they are separate from season ranks.</w:t>
       </w:r>
     </w:p>
     <w:p>
@@ -16335,15 +16335,15 @@
         <w:pStyle w:val="Heading2"/>
       </w:pPr>
       <w:r>
-        <w:t xml:space="preserve">Week 7 outlook</w:t>
-      </w:r>
-    </w:p>
-    <w:p>
-      <w:pPr>
-        <w:pStyle w:val="Normal"/>
-      </w:pPr>
-      <w:r>
-        <w:t xml:space="preserve">Weekly overall model rank Not published (NO_CURRENT_WEEK_GAME). ROS overall rank 139 (TE22). Availability: UNKNOWN. Weekly ranks are preliminary when playing status is unconfirmed; they are separate from season ranks.</w:t>
+        <w:t xml:space="preserve">Week 8 outlook</w:t>
+      </w:r>
+    </w:p>
+    <w:p>
+      <w:pPr>
+        <w:pStyle w:val="Normal"/>
+      </w:pPr>
+      <w:r>
+        <w:t xml:space="preserve">Weekly overall model rank 110 (TE17). ROS overall rank 139 (TE22). Availability: NO_ADVERSE_STATUS_REPORTED. Weekly ranks are preliminary when playing status is unconfirmed; they are separate from season ranks.</w:t>
       </w:r>
     </w:p>
     <w:p>
@@ -16455,7 +16455,7 @@
         <w:pStyle w:val="Heading2"/>
       </w:pPr>
       <w:r>
-        <w:t xml:space="preserve">Week 7 outlook</w:t>
+        <w:t xml:space="preserve">Week 8 outlook</w:t>
       </w:r>
     </w:p>
     <w:p>
@@ -16575,15 +16575,15 @@
         <w:pStyle w:val="Heading2"/>
       </w:pPr>
       <w:r>
-        <w:t xml:space="preserve">Week 7 outlook</w:t>
-      </w:r>
-    </w:p>
-    <w:p>
-      <w:pPr>
-        <w:pStyle w:val="Normal"/>
-      </w:pPr>
-      <w:r>
-        <w:t xml:space="preserve">Weekly overall model rank Not published (GAME_STARTED_NO_ORIGINAL_WEEKLY_RANK). ROS overall rank 141 (RB42). Availability: NO_ADVERSE_STATUS_REPORTED. Weekly ranks are preliminary when playing status is unconfirmed; they are separate from season ranks.</w:t>
+        <w:t xml:space="preserve">Week 8 outlook</w:t>
+      </w:r>
+    </w:p>
+    <w:p>
+      <w:pPr>
+        <w:pStyle w:val="Normal"/>
+      </w:pPr>
+      <w:r>
+        <w:t xml:space="preserve">Weekly overall model rank Not published (NO_CURRENT_WEEK_GAME). ROS overall rank 141 (RB42). Availability: NO_ADVERSE_STATUS_REPORTED. Weekly ranks are preliminary when playing status is unconfirmed; they are separate from season ranks.</w:t>
       </w:r>
     </w:p>
     <w:p>
@@ -16695,7 +16695,7 @@
         <w:pStyle w:val="Heading2"/>
       </w:pPr>
       <w:r>
-        <w:t xml:space="preserve">Week 7 outlook</w:t>
+        <w:t xml:space="preserve">Week 8 outlook</w:t>
       </w:r>
     </w:p>
     <w:p>
@@ -16815,15 +16815,15 @@
         <w:pStyle w:val="Heading2"/>
       </w:pPr>
       <w:r>
-        <w:t xml:space="preserve">Week 7 outlook</w:t>
-      </w:r>
-    </w:p>
-    <w:p>
-      <w:pPr>
-        <w:pStyle w:val="Normal"/>
-      </w:pPr>
-      <w:r>
-        <w:t xml:space="preserve">Weekly overall model rank Not published (GAME_STARTED_NO_ORIGINAL_WEEKLY_RANK). ROS overall rank 143 (RB43). Availability: NO_ADVERSE_STATUS_REPORTED. Weekly ranks are preliminary when playing status is unconfirmed; they are separate from season ranks.</w:t>
+        <w:t xml:space="preserve">Week 8 outlook</w:t>
+      </w:r>
+    </w:p>
+    <w:p>
+      <w:pPr>
+        <w:pStyle w:val="Normal"/>
+      </w:pPr>
+      <w:r>
+        <w:t xml:space="preserve">Weekly overall model rank 122 (RB33). ROS overall rank 143 (RB43). Availability: NO_ADVERSE_STATUS_REPORTED. Weekly ranks are preliminary when playing status is unconfirmed; they are separate from season ranks.</w:t>
       </w:r>
     </w:p>
     <w:p>
@@ -16935,15 +16935,15 @@
         <w:pStyle w:val="Heading2"/>
       </w:pPr>
       <w:r>
-        <w:t xml:space="preserve">Week 7 outlook</w:t>
-      </w:r>
-    </w:p>
-    <w:p>
-      <w:pPr>
-        <w:pStyle w:val="Normal"/>
-      </w:pPr>
-      <w:r>
-        <w:t xml:space="preserve">Weekly overall model rank Not published (NO_CURRENT_WEEK_GAME). ROS overall rank 144 (TE23). Availability: UNKNOWN. Weekly ranks are preliminary when playing status is unconfirmed; they are separate from season ranks.</w:t>
+        <w:t xml:space="preserve">Week 8 outlook</w:t>
+      </w:r>
+    </w:p>
+    <w:p>
+      <w:pPr>
+        <w:pStyle w:val="Normal"/>
+      </w:pPr>
+      <w:r>
+        <w:t xml:space="preserve">Weekly overall model rank 106 (TE16). ROS overall rank 144 (TE23). Availability: QUESTIONABLE. Weekly ranks are preliminary when playing status is unconfirmed; they are separate from season ranks.</w:t>
       </w:r>
     </w:p>
     <w:p>
@@ -17055,15 +17055,15 @@
         <w:pStyle w:val="Heading2"/>
       </w:pPr>
       <w:r>
-        <w:t xml:space="preserve">Week 7 outlook</w:t>
-      </w:r>
-    </w:p>
-    <w:p>
-      <w:pPr>
-        <w:pStyle w:val="Normal"/>
-      </w:pPr>
-      <w:r>
-        <w:t xml:space="preserve">Weekly overall model rank Not published (GAME_STARTED_NO_ORIGINAL_WEEKLY_RANK). ROS overall rank 145 (WR63). Availability: QUESTIONABLE. Weekly ranks are preliminary when playing status is unconfirmed; they are separate from season ranks.</w:t>
+        <w:t xml:space="preserve">Week 8 outlook</w:t>
+      </w:r>
+    </w:p>
+    <w:p>
+      <w:pPr>
+        <w:pStyle w:val="Normal"/>
+      </w:pPr>
+      <w:r>
+        <w:t xml:space="preserve">Weekly overall model rank 117 (WR48). ROS overall rank 145 (WR63). Availability: QUESTIONABLE. Weekly ranks are preliminary when playing status is unconfirmed; they are separate from season ranks.</w:t>
       </w:r>
     </w:p>
     <w:p>
@@ -17175,15 +17175,15 @@
         <w:pStyle w:val="Heading2"/>
       </w:pPr>
       <w:r>
-        <w:t xml:space="preserve">Week 7 outlook</w:t>
-      </w:r>
-    </w:p>
-    <w:p>
-      <w:pPr>
-        <w:pStyle w:val="Normal"/>
-      </w:pPr>
-      <w:r>
-        <w:t xml:space="preserve">Weekly overall model rank Not published (GAME_STARTED_NO_ORIGINAL_WEEKLY_RANK). ROS overall rank 146 (RB44). Availability: UNKNOWN. Weekly ranks are preliminary when playing status is unconfirmed; they are separate from season ranks.</w:t>
+        <w:t xml:space="preserve">Week 8 outlook</w:t>
+      </w:r>
+    </w:p>
+    <w:p>
+      <w:pPr>
+        <w:pStyle w:val="Normal"/>
+      </w:pPr>
+      <w:r>
+        <w:t xml:space="preserve">Weekly overall model rank 124 (RB35). ROS overall rank 146 (RB44). Availability: UNKNOWN. Weekly ranks are preliminary when playing status is unconfirmed; they are separate from season ranks.</w:t>
       </w:r>
     </w:p>
     <w:p>
@@ -17295,7 +17295,7 @@
         <w:pStyle w:val="Heading2"/>
       </w:pPr>
       <w:r>
-        <w:t xml:space="preserve">Week 7 outlook</w:t>
+        <w:t xml:space="preserve">Week 8 outlook</w:t>
       </w:r>
     </w:p>
     <w:p>
@@ -17415,15 +17415,15 @@
         <w:pStyle w:val="Heading2"/>
       </w:pPr>
       <w:r>
-        <w:t xml:space="preserve">Week 7 outlook</w:t>
-      </w:r>
-    </w:p>
-    <w:p>
-      <w:pPr>
-        <w:pStyle w:val="Normal"/>
-      </w:pPr>
-      <w:r>
-        <w:t xml:space="preserve">Weekly overall model rank Not published (NOT_EXPECTED_TO_PLAY). ROS overall rank 148 (QB17). Availability: INJURED_RESERVE. Weekly ranks are preliminary when playing status is unconfirmed; they are separate from season ranks.</w:t>
+        <w:t xml:space="preserve">Week 8 outlook</w:t>
+      </w:r>
+    </w:p>
+    <w:p>
+      <w:pPr>
+        <w:pStyle w:val="Normal"/>
+      </w:pPr>
+      <w:r>
+        <w:t xml:space="preserve">Weekly overall model rank Not published (NO_CURRENT_WEEK_GAME). ROS overall rank 148 (QB17). Availability: INJURED_RESERVE. Weekly ranks are preliminary when playing status is unconfirmed; they are separate from season ranks.</w:t>
       </w:r>
     </w:p>
     <w:p>
@@ -17535,15 +17535,15 @@
         <w:pStyle w:val="Heading2"/>
       </w:pPr>
       <w:r>
-        <w:t xml:space="preserve">Week 7 outlook</w:t>
-      </w:r>
-    </w:p>
-    <w:p>
-      <w:pPr>
-        <w:pStyle w:val="Normal"/>
-      </w:pPr>
-      <w:r>
-        <w:t xml:space="preserve">Weekly overall model rank Not published (NO_CURRENT_WEEK_GAME). ROS overall rank 149 (WR64). Availability: UNKNOWN. Weekly ranks are preliminary when playing status is unconfirmed; they are separate from season ranks.</w:t>
+        <w:t xml:space="preserve">Week 8 outlook</w:t>
+      </w:r>
+    </w:p>
+    <w:p>
+      <w:pPr>
+        <w:pStyle w:val="Normal"/>
+      </w:pPr>
+      <w:r>
+        <w:t xml:space="preserve">Weekly overall model rank 129 (WR51). ROS overall rank 149 (WR64). Availability: NO_ADVERSE_STATUS_REPORTED. Weekly ranks are preliminary when playing status is unconfirmed; they are separate from season ranks.</w:t>
       </w:r>
     </w:p>
     <w:p>
@@ -17655,15 +17655,15 @@
         <w:pStyle w:val="Heading2"/>
       </w:pPr>
       <w:r>
-        <w:t xml:space="preserve">Week 7 outlook</w:t>
-      </w:r>
-    </w:p>
-    <w:p>
-      <w:pPr>
-        <w:pStyle w:val="Normal"/>
-      </w:pPr>
-      <w:r>
-        <w:t xml:space="preserve">Weekly overall model rank Not published (GAME_STARTED_NO_ORIGINAL_WEEKLY_RANK). ROS overall rank 150 (RB46). Availability: QUESTIONABLE. Weekly ranks are preliminary when playing status is unconfirmed; they are separate from season ranks.</w:t>
+        <w:t xml:space="preserve">Week 8 outlook</w:t>
+      </w:r>
+    </w:p>
+    <w:p>
+      <w:pPr>
+        <w:pStyle w:val="Normal"/>
+      </w:pPr>
+      <w:r>
+        <w:t xml:space="preserve">Weekly overall model rank 73 (RB17). ROS overall rank 150 (RB46). Availability: NO_ADVERSE_STATUS_REPORTED. Weekly ranks are preliminary when playing status is unconfirmed; they are separate from season ranks.</w:t>
       </w:r>
     </w:p>
     <w:p>
@@ -17775,15 +17775,15 @@
         <w:pStyle w:val="Heading2"/>
       </w:pPr>
       <w:r>
-        <w:t xml:space="preserve">Week 7 outlook</w:t>
-      </w:r>
-    </w:p>
-    <w:p>
-      <w:pPr>
-        <w:pStyle w:val="Normal"/>
-      </w:pPr>
-      <w:r>
-        <w:t xml:space="preserve">Weekly overall model rank Not published (GAME_STARTED_NO_ORIGINAL_WEEKLY_RANK). ROS overall rank 151 (WR65). Availability: NO_ADVERSE_STATUS_REPORTED. Weekly ranks are preliminary when playing status is unconfirmed; they are separate from season ranks.</w:t>
+        <w:t xml:space="preserve">Week 8 outlook</w:t>
+      </w:r>
+    </w:p>
+    <w:p>
+      <w:pPr>
+        <w:pStyle w:val="Normal"/>
+      </w:pPr>
+      <w:r>
+        <w:t xml:space="preserve">Weekly overall model rank 101 (WR43). ROS overall rank 151 (WR65). Availability: NO_ADVERSE_STATUS_REPORTED. Weekly ranks are preliminary when playing status is unconfirmed; they are separate from season ranks.</w:t>
       </w:r>
     </w:p>
     <w:p>
@@ -17895,7 +17895,7 @@
         <w:pStyle w:val="Heading2"/>
       </w:pPr>
       <w:r>
-        <w:t xml:space="preserve">Week 7 outlook</w:t>
+        <w:t xml:space="preserve">Week 8 outlook</w:t>
       </w:r>
     </w:p>
     <w:p>
@@ -18015,15 +18015,15 @@
         <w:pStyle w:val="Heading2"/>
       </w:pPr>
       <w:r>
-        <w:t xml:space="preserve">Week 7 outlook</w:t>
-      </w:r>
-    </w:p>
-    <w:p>
-      <w:pPr>
-        <w:pStyle w:val="Normal"/>
-      </w:pPr>
-      <w:r>
-        <w:t xml:space="preserve">Weekly overall model rank Not published (GAME_STARTED_NO_ORIGINAL_WEEKLY_RANK). ROS overall rank 153 (RB47). Availability: QUESTIONABLE. Weekly ranks are preliminary when playing status is unconfirmed; they are separate from season ranks.</w:t>
+        <w:t xml:space="preserve">Week 8 outlook</w:t>
+      </w:r>
+    </w:p>
+    <w:p>
+      <w:pPr>
+        <w:pStyle w:val="Normal"/>
+      </w:pPr>
+      <w:r>
+        <w:t xml:space="preserve">Weekly overall model rank 118 (RB30). ROS overall rank 153 (RB47). Availability: NO_ADVERSE_STATUS_REPORTED. Weekly ranks are preliminary when playing status is unconfirmed; they are separate from season ranks.</w:t>
       </w:r>
     </w:p>
     <w:p>
@@ -18135,15 +18135,15 @@
         <w:pStyle w:val="Heading2"/>
       </w:pPr>
       <w:r>
-        <w:t xml:space="preserve">Week 7 outlook</w:t>
-      </w:r>
-    </w:p>
-    <w:p>
-      <w:pPr>
-        <w:pStyle w:val="Normal"/>
-      </w:pPr>
-      <w:r>
-        <w:t xml:space="preserve">Weekly overall model rank Not published (GAME_STARTED_NO_ORIGINAL_WEEKLY_RANK). ROS overall rank 154 (RB48). Availability: QUESTIONABLE. Weekly ranks are preliminary when playing status is unconfirmed; they are separate from season ranks.</w:t>
+        <w:t xml:space="preserve">Week 8 outlook</w:t>
+      </w:r>
+    </w:p>
+    <w:p>
+      <w:pPr>
+        <w:pStyle w:val="Normal"/>
+      </w:pPr>
+      <w:r>
+        <w:t xml:space="preserve">Weekly overall model rank 132 (RB41). ROS overall rank 154 (RB48). Availability: NO_ADVERSE_STATUS_REPORTED. Weekly ranks are preliminary when playing status is unconfirmed; they are separate from season ranks.</w:t>
       </w:r>
     </w:p>
     <w:p>
@@ -18255,15 +18255,15 @@
         <w:pStyle w:val="Heading2"/>
       </w:pPr>
       <w:r>
-        <w:t xml:space="preserve">Week 7 outlook</w:t>
-      </w:r>
-    </w:p>
-    <w:p>
-      <w:pPr>
-        <w:pStyle w:val="Normal"/>
-      </w:pPr>
-      <w:r>
-        <w:t xml:space="preserve">Weekly overall model rank Not published (GAME_STARTED_NO_ORIGINAL_WEEKLY_RANK). ROS overall rank 155 (RB49). Availability: QUESTIONABLE. Weekly ranks are preliminary when playing status is unconfirmed; they are separate from season ranks.</w:t>
+        <w:t xml:space="preserve">Week 8 outlook</w:t>
+      </w:r>
+    </w:p>
+    <w:p>
+      <w:pPr>
+        <w:pStyle w:val="Normal"/>
+      </w:pPr>
+      <w:r>
+        <w:t xml:space="preserve">Weekly overall model rank 131 (RB40). ROS overall rank 155 (RB49). Availability: NO_ADVERSE_STATUS_REPORTED. Weekly ranks are preliminary when playing status is unconfirmed; they are separate from season ranks.</w:t>
       </w:r>
     </w:p>
     <w:p>
@@ -18375,15 +18375,15 @@
         <w:pStyle w:val="Heading2"/>
       </w:pPr>
       <w:r>
-        <w:t xml:space="preserve">Week 7 outlook</w:t>
-      </w:r>
-    </w:p>
-    <w:p>
-      <w:pPr>
-        <w:pStyle w:val="Normal"/>
-      </w:pPr>
-      <w:r>
-        <w:t xml:space="preserve">Weekly overall model rank Not published (GAME_STARTED_NO_ORIGINAL_WEEKLY_RANK). ROS overall rank 156 (RB50). Availability: QUESTIONABLE. Weekly ranks are preliminary when playing status is unconfirmed; they are separate from season ranks.</w:t>
+        <w:t xml:space="preserve">Week 8 outlook</w:t>
+      </w:r>
+    </w:p>
+    <w:p>
+      <w:pPr>
+        <w:pStyle w:val="Normal"/>
+      </w:pPr>
+      <w:r>
+        <w:t xml:space="preserve">Weekly overall model rank 138 (RB46). ROS overall rank 156 (RB50). Availability: QUESTIONABLE. Weekly ranks are preliminary when playing status is unconfirmed; they are separate from season ranks.</w:t>
       </w:r>
     </w:p>
     <w:p>
@@ -18495,15 +18495,15 @@
         <w:pStyle w:val="Heading2"/>
       </w:pPr>
       <w:r>
-        <w:t xml:space="preserve">Week 7 outlook</w:t>
-      </w:r>
-    </w:p>
-    <w:p>
-      <w:pPr>
-        <w:pStyle w:val="Normal"/>
-      </w:pPr>
-      <w:r>
-        <w:t xml:space="preserve">Weekly overall model rank Not published (GAME_STARTED_NO_ORIGINAL_WEEKLY_RANK). ROS overall rank 157 (RB51). Availability: NO_ADVERSE_STATUS_REPORTED. Weekly ranks are preliminary when playing status is unconfirmed; they are separate from season ranks.</w:t>
+        <w:t xml:space="preserve">Week 8 outlook</w:t>
+      </w:r>
+    </w:p>
+    <w:p>
+      <w:pPr>
+        <w:pStyle w:val="Normal"/>
+      </w:pPr>
+      <w:r>
+        <w:t xml:space="preserve">Weekly overall model rank 98 (RB23). ROS overall rank 157 (RB51). Availability: QUESTIONABLE. Weekly ranks are preliminary when playing status is unconfirmed; they are separate from season ranks.</w:t>
       </w:r>
     </w:p>
     <w:p>
@@ -18615,15 +18615,15 @@
         <w:pStyle w:val="Heading2"/>
       </w:pPr>
       <w:r>
-        <w:t xml:space="preserve">Week 7 outlook</w:t>
-      </w:r>
-    </w:p>
-    <w:p>
-      <w:pPr>
-        <w:pStyle w:val="Normal"/>
-      </w:pPr>
-      <w:r>
-        <w:t xml:space="preserve">Weekly overall model rank Not published (NOT_EXPECTED_TO_PLAY). ROS overall rank 158 (WR66). Availability: OUT. Weekly ranks are preliminary when playing status is unconfirmed; they are separate from season ranks.</w:t>
+        <w:t xml:space="preserve">Week 8 outlook</w:t>
+      </w:r>
+    </w:p>
+    <w:p>
+      <w:pPr>
+        <w:pStyle w:val="Normal"/>
+      </w:pPr>
+      <w:r>
+        <w:t xml:space="preserve">Weekly overall model rank Not published (NO_CURRENT_WEEK_GAME). ROS overall rank 158 (WR66). Availability: QUESTIONABLE. Weekly ranks are preliminary when playing status is unconfirmed; they are separate from season ranks.</w:t>
       </w:r>
     </w:p>
     <w:p>
@@ -18735,15 +18735,15 @@
         <w:pStyle w:val="Heading2"/>
       </w:pPr>
       <w:r>
-        <w:t xml:space="preserve">Week 7 outlook</w:t>
-      </w:r>
-    </w:p>
-    <w:p>
-      <w:pPr>
-        <w:pStyle w:val="Normal"/>
-      </w:pPr>
-      <w:r>
-        <w:t xml:space="preserve">Weekly overall model rank Not published (GAME_STARTED_NO_ORIGINAL_WEEKLY_RANK). ROS overall rank 159 (WR67). Availability: NO_ADVERSE_STATUS_REPORTED. Weekly ranks are preliminary when playing status is unconfirmed; they are separate from season ranks.</w:t>
+        <w:t xml:space="preserve">Week 8 outlook</w:t>
+      </w:r>
+    </w:p>
+    <w:p>
+      <w:pPr>
+        <w:pStyle w:val="Normal"/>
+      </w:pPr>
+      <w:r>
+        <w:t xml:space="preserve">Weekly overall model rank 133 (WR52). ROS overall rank 159 (WR67). Availability: QUESTIONABLE. Weekly ranks are preliminary when playing status is unconfirmed; they are separate from season ranks.</w:t>
       </w:r>
     </w:p>
     <w:p>
@@ -18855,15 +18855,15 @@
         <w:pStyle w:val="Heading2"/>
       </w:pPr>
       <w:r>
-        <w:t xml:space="preserve">Week 7 outlook</w:t>
-      </w:r>
-    </w:p>
-    <w:p>
-      <w:pPr>
-        <w:pStyle w:val="Normal"/>
-      </w:pPr>
-      <w:r>
-        <w:t xml:space="preserve">Weekly overall model rank Not published (GAME_STARTED_NO_ORIGINAL_WEEKLY_RANK). ROS overall rank 160 (RB52). Availability: NO_ADVERSE_STATUS_REPORTED. Weekly ranks are preliminary when playing status is unconfirmed; they are separate from season ranks.</w:t>
+        <w:t xml:space="preserve">Week 8 outlook</w:t>
+      </w:r>
+    </w:p>
+    <w:p>
+      <w:pPr>
+        <w:pStyle w:val="Normal"/>
+      </w:pPr>
+      <w:r>
+        <w:t xml:space="preserve">Weekly overall model rank 127 (RB37). ROS overall rank 160 (RB52). Availability: NO_ADVERSE_STATUS_REPORTED. Weekly ranks are preliminary when playing status is unconfirmed; they are separate from season ranks.</w:t>
       </w:r>
     </w:p>
     <w:p>
@@ -18975,7 +18975,7 @@
         <w:pStyle w:val="Heading2"/>
       </w:pPr>
       <w:r>
-        <w:t xml:space="preserve">Week 7 outlook</w:t>
+        <w:t xml:space="preserve">Week 8 outlook</w:t>
       </w:r>
     </w:p>
     <w:p>
@@ -19095,15 +19095,15 @@
         <w:pStyle w:val="Heading2"/>
       </w:pPr>
       <w:r>
-        <w:t xml:space="preserve">Week 7 outlook</w:t>
-      </w:r>
-    </w:p>
-    <w:p>
-      <w:pPr>
-        <w:pStyle w:val="Normal"/>
-      </w:pPr>
-      <w:r>
-        <w:t xml:space="preserve">Weekly overall model rank Not published (NO_CURRENT_WEEK_GAME). ROS overall rank 162 (RB54). Availability: UNKNOWN. Weekly ranks are preliminary when playing status is unconfirmed; they are separate from season ranks.</w:t>
+        <w:t xml:space="preserve">Week 8 outlook</w:t>
+      </w:r>
+    </w:p>
+    <w:p>
+      <w:pPr>
+        <w:pStyle w:val="Normal"/>
+      </w:pPr>
+      <w:r>
+        <w:t xml:space="preserve">Weekly overall model rank 128 (RB38). ROS overall rank 162 (RB54). Availability: NO_ADVERSE_STATUS_REPORTED. Weekly ranks are preliminary when playing status is unconfirmed; they are separate from season ranks.</w:t>
       </w:r>
     </w:p>
     <w:p>
@@ -19215,15 +19215,15 @@
         <w:pStyle w:val="Heading2"/>
       </w:pPr>
       <w:r>
-        <w:t xml:space="preserve">Week 7 outlook</w:t>
-      </w:r>
-    </w:p>
-    <w:p>
-      <w:pPr>
-        <w:pStyle w:val="Normal"/>
-      </w:pPr>
-      <w:r>
-        <w:t xml:space="preserve">Weekly overall model rank Not published (GAME_STARTED_NO_ORIGINAL_WEEKLY_RANK). ROS overall rank 163 (WR68). Availability: NO_ADVERSE_STATUS_REPORTED. Weekly ranks are preliminary when playing status is unconfirmed; they are separate from season ranks.</w:t>
+        <w:t xml:space="preserve">Week 8 outlook</w:t>
+      </w:r>
+    </w:p>
+    <w:p>
+      <w:pPr>
+        <w:pStyle w:val="Normal"/>
+      </w:pPr>
+      <w:r>
+        <w:t xml:space="preserve">Weekly overall model rank 105 (WR44). ROS overall rank 163 (WR68). Availability: NO_ADVERSE_STATUS_REPORTED. Weekly ranks are preliminary when playing status is unconfirmed; they are separate from season ranks.</w:t>
       </w:r>
     </w:p>
     <w:p>
@@ -19303,15 +19303,15 @@
         <w:pStyle w:val="Heading2"/>
       </w:pPr>
       <w:r>
-        <w:t xml:space="preserve">Week 7 outlook</w:t>
-      </w:r>
-    </w:p>
-    <w:p>
-      <w:pPr>
-        <w:pStyle w:val="Normal"/>
-      </w:pPr>
-      <w:r>
-        <w:t xml:space="preserve">Weekly overall model rank Not published (GAME_STARTED_NO_ORIGINAL_WEEKLY_RANK). ROS overall rank 164 (QB18). Availability: NO_ADVERSE_STATUS_REPORTED. Weekly ranks are preliminary when playing status is unconfirmed; they are separate from season ranks.</w:t>
+        <w:t xml:space="preserve">Week 8 outlook</w:t>
+      </w:r>
+    </w:p>
+    <w:p>
+      <w:pPr>
+        <w:pStyle w:val="Normal"/>
+      </w:pPr>
+      <w:r>
+        <w:t xml:space="preserve">Weekly overall model rank 63 (QB21). ROS overall rank 164 (QB18). Availability: NO_ADVERSE_STATUS_REPORTED. Weekly ranks are preliminary when playing status is unconfirmed; they are separate from season ranks.</w:t>
       </w:r>
     </w:p>
     <w:p>
@@ -19423,15 +19423,15 @@
         <w:pStyle w:val="Heading2"/>
       </w:pPr>
       <w:r>
-        <w:t xml:space="preserve">Week 7 outlook</w:t>
-      </w:r>
-    </w:p>
-    <w:p>
-      <w:pPr>
-        <w:pStyle w:val="Normal"/>
-      </w:pPr>
-      <w:r>
-        <w:t xml:space="preserve">Weekly overall model rank Not published (GAME_STARTED_NO_ORIGINAL_WEEKLY_RANK). ROS overall rank 165 (QB19). Availability: NO_ADVERSE_STATUS_REPORTED. Weekly ranks are preliminary when playing status is unconfirmed; they are separate from season ranks.</w:t>
+        <w:t xml:space="preserve">Week 8 outlook</w:t>
+      </w:r>
+    </w:p>
+    <w:p>
+      <w:pPr>
+        <w:pStyle w:val="Normal"/>
+      </w:pPr>
+      <w:r>
+        <w:t xml:space="preserve">Weekly overall model rank 25 (QB9). ROS overall rank 165 (QB19). Availability: NO_ADVERSE_STATUS_REPORTED. Weekly ranks are preliminary when playing status is unconfirmed; they are separate from season ranks.</w:t>
       </w:r>
     </w:p>
     <w:p>
@@ -19543,15 +19543,15 @@
         <w:pStyle w:val="Heading2"/>
       </w:pPr>
       <w:r>
-        <w:t xml:space="preserve">Week 7 outlook</w:t>
-      </w:r>
-    </w:p>
-    <w:p>
-      <w:pPr>
-        <w:pStyle w:val="Normal"/>
-      </w:pPr>
-      <w:r>
-        <w:t xml:space="preserve">Weekly overall model rank Not published (NOT_EXPECTED_TO_PLAY). ROS overall rank 166 (RB55). Availability: OUT. Weekly ranks are preliminary when playing status is unconfirmed; they are separate from season ranks.</w:t>
+        <w:t xml:space="preserve">Week 8 outlook</w:t>
+      </w:r>
+    </w:p>
+    <w:p>
+      <w:pPr>
+        <w:pStyle w:val="Normal"/>
+      </w:pPr>
+      <w:r>
+        <w:t xml:space="preserve">Weekly overall model rank 120 (RB31). ROS overall rank 166 (RB55). Availability: QUESTIONABLE. Weekly ranks are preliminary when playing status is unconfirmed; they are separate from season ranks.</w:t>
       </w:r>
     </w:p>
     <w:p>
@@ -19647,15 +19647,15 @@
         <w:pStyle w:val="Heading2"/>
       </w:pPr>
       <w:r>
-        <w:t xml:space="preserve">Week 7 outlook</w:t>
-      </w:r>
-    </w:p>
-    <w:p>
-      <w:pPr>
-        <w:pStyle w:val="Normal"/>
-      </w:pPr>
-      <w:r>
-        <w:t xml:space="preserve">Weekly overall model rank Not published (GAME_STARTED_NO_ORIGINAL_WEEKLY_RANK). ROS overall rank 167 (RB56). Availability: QUESTIONABLE. Weekly ranks are preliminary when playing status is unconfirmed; they are separate from season ranks.</w:t>
+        <w:t xml:space="preserve">Week 8 outlook</w:t>
+      </w:r>
+    </w:p>
+    <w:p>
+      <w:pPr>
+        <w:pStyle w:val="Normal"/>
+      </w:pPr>
+      <w:r>
+        <w:t xml:space="preserve">Weekly overall model rank Not published (NO_CURRENT_WEEK_GAME). ROS overall rank 167 (RB56). Availability: INJURED_RESERVE. Weekly ranks are preliminary when playing status is unconfirmed; they are separate from season ranks.</w:t>
       </w:r>
     </w:p>
     <w:p>
@@ -19767,15 +19767,15 @@
         <w:pStyle w:val="Heading2"/>
       </w:pPr>
       <w:r>
-        <w:t xml:space="preserve">Week 7 outlook</w:t>
-      </w:r>
-    </w:p>
-    <w:p>
-      <w:pPr>
-        <w:pStyle w:val="Normal"/>
-      </w:pPr>
-      <w:r>
-        <w:t xml:space="preserve">Weekly overall model rank Not published (GAME_STARTED_NO_ORIGINAL_WEEKLY_RANK). ROS overall rank 168 (QB20). Availability: NO_ADVERSE_STATUS_REPORTED. Weekly ranks are preliminary when playing status is unconfirmed; they are separate from season ranks.</w:t>
+        <w:t xml:space="preserve">Week 8 outlook</w:t>
+      </w:r>
+    </w:p>
+    <w:p>
+      <w:pPr>
+        <w:pStyle w:val="Normal"/>
+      </w:pPr>
+      <w:r>
+        <w:t xml:space="preserve">Weekly overall model rank Not published (NO_CURRENT_WEEK_GAME). ROS overall rank 168 (QB20). Availability: NO_ADVERSE_STATUS_REPORTED. Weekly ranks are preliminary when playing status is unconfirmed; they are separate from season ranks.</w:t>
       </w:r>
     </w:p>
     <w:p>
@@ -19887,15 +19887,15 @@
         <w:pStyle w:val="Heading2"/>
       </w:pPr>
       <w:r>
-        <w:t xml:space="preserve">Week 7 outlook</w:t>
-      </w:r>
-    </w:p>
-    <w:p>
-      <w:pPr>
-        <w:pStyle w:val="Normal"/>
-      </w:pPr>
-      <w:r>
-        <w:t xml:space="preserve">Weekly overall model rank Not published (NO_CURRENT_WEEK_GAME). ROS overall rank 169 (RB57). Availability: UNKNOWN. Weekly ranks are preliminary when playing status is unconfirmed; they are separate from season ranks.</w:t>
+        <w:t xml:space="preserve">Week 8 outlook</w:t>
+      </w:r>
+    </w:p>
+    <w:p>
+      <w:pPr>
+        <w:pStyle w:val="Normal"/>
+      </w:pPr>
+      <w:r>
+        <w:t xml:space="preserve">Weekly overall model rank 136 (RB44). ROS overall rank 169 (RB57). Availability: NO_ADVERSE_STATUS_REPORTED. Weekly ranks are preliminary when playing status is unconfirmed; they are separate from season ranks.</w:t>
       </w:r>
     </w:p>
     <w:p>
@@ -19975,15 +19975,15 @@
         <w:pStyle w:val="Heading2"/>
       </w:pPr>
       <w:r>
-        <w:t xml:space="preserve">Week 7 outlook</w:t>
-      </w:r>
-    </w:p>
-    <w:p>
-      <w:pPr>
-        <w:pStyle w:val="Normal"/>
-      </w:pPr>
-      <w:r>
-        <w:t xml:space="preserve">Weekly overall model rank Not published (GAME_STARTED_NO_ORIGINAL_WEEKLY_RANK). ROS overall rank 170 (QB21). Availability: NO_ADVERSE_STATUS_REPORTED. Weekly ranks are preliminary when playing status is unconfirmed; they are separate from season ranks.</w:t>
+        <w:t xml:space="preserve">Week 8 outlook</w:t>
+      </w:r>
+    </w:p>
+    <w:p>
+      <w:pPr>
+        <w:pStyle w:val="Normal"/>
+      </w:pPr>
+      <w:r>
+        <w:t xml:space="preserve">Weekly overall model rank 26 (QB10). ROS overall rank 170 (QB21). Availability: NO_ADVERSE_STATUS_REPORTED. Weekly ranks are preliminary when playing status is unconfirmed; they are separate from season ranks.</w:t>
       </w:r>
     </w:p>
     <w:p>
@@ -20095,15 +20095,15 @@
         <w:pStyle w:val="Heading2"/>
       </w:pPr>
       <w:r>
-        <w:t xml:space="preserve">Week 7 outlook</w:t>
-      </w:r>
-    </w:p>
-    <w:p>
-      <w:pPr>
-        <w:pStyle w:val="Normal"/>
-      </w:pPr>
-      <w:r>
-        <w:t xml:space="preserve">Weekly overall model rank Not published (NOT_EXPECTED_TO_PLAY). ROS overall rank 171 (RB58). Availability: OUT. Weekly ranks are preliminary when playing status is unconfirmed; they are separate from season ranks.</w:t>
+        <w:t xml:space="preserve">Week 8 outlook</w:t>
+      </w:r>
+    </w:p>
+    <w:p>
+      <w:pPr>
+        <w:pStyle w:val="Normal"/>
+      </w:pPr>
+      <w:r>
+        <w:t xml:space="preserve">Weekly overall model rank 137 (RB45). ROS overall rank 171 (RB58). Availability: QUESTIONABLE. Weekly ranks are preliminary when playing status is unconfirmed; they are separate from season ranks.</w:t>
       </w:r>
     </w:p>
     <w:p>
@@ -20183,15 +20183,15 @@
         <w:pStyle w:val="Heading2"/>
       </w:pPr>
       <w:r>
-        <w:t xml:space="preserve">Week 7 outlook</w:t>
-      </w:r>
-    </w:p>
-    <w:p>
-      <w:pPr>
-        <w:pStyle w:val="Normal"/>
-      </w:pPr>
-      <w:r>
-        <w:t xml:space="preserve">Weekly overall model rank Not published (NO_CURRENT_WEEK_GAME). ROS overall rank 172 (RB59). Availability: UNKNOWN. Weekly ranks are preliminary when playing status is unconfirmed; they are separate from season ranks.</w:t>
+        <w:t xml:space="preserve">Week 8 outlook</w:t>
+      </w:r>
+    </w:p>
+    <w:p>
+      <w:pPr>
+        <w:pStyle w:val="Normal"/>
+      </w:pPr>
+      <w:r>
+        <w:t xml:space="preserve">Weekly overall model rank 135 (RB43). ROS overall rank 172 (RB59). Availability: NO_ADVERSE_STATUS_REPORTED. Weekly ranks are preliminary when playing status is unconfirmed; they are separate from season ranks.</w:t>
       </w:r>
     </w:p>
     <w:p>
@@ -20303,15 +20303,15 @@
         <w:pStyle w:val="Heading2"/>
       </w:pPr>
       <w:r>
-        <w:t xml:space="preserve">Week 7 outlook</w:t>
-      </w:r>
-    </w:p>
-    <w:p>
-      <w:pPr>
-        <w:pStyle w:val="Normal"/>
-      </w:pPr>
-      <w:r>
-        <w:t xml:space="preserve">Weekly overall model rank Not published (NO_CURRENT_WEEK_GAME). ROS overall rank 173 (RB60). Availability: UNKNOWN. Weekly ranks are preliminary when playing status is unconfirmed; they are separate from season ranks.</w:t>
+        <w:t xml:space="preserve">Week 8 outlook</w:t>
+      </w:r>
+    </w:p>
+    <w:p>
+      <w:pPr>
+        <w:pStyle w:val="Normal"/>
+      </w:pPr>
+      <w:r>
+        <w:t xml:space="preserve">Weekly overall model rank 130 (RB39). ROS overall rank 173 (RB60). Availability: UNKNOWN. Weekly ranks are preliminary when playing status is unconfirmed; they are separate from season ranks.</w:t>
       </w:r>
     </w:p>
     <w:p>
@@ -20423,15 +20423,15 @@
         <w:pStyle w:val="Heading2"/>
       </w:pPr>
       <w:r>
-        <w:t xml:space="preserve">Week 7 outlook</w:t>
-      </w:r>
-    </w:p>
-    <w:p>
-      <w:pPr>
-        <w:pStyle w:val="Normal"/>
-      </w:pPr>
-      <w:r>
-        <w:t xml:space="preserve">Weekly overall model rank Not published (GAME_STARTED_NO_ORIGINAL_WEEKLY_RANK). ROS overall rank 174 (WR69). Availability: NO_ADVERSE_STATUS_REPORTED. Weekly ranks are preliminary when playing status is unconfirmed; they are separate from season ranks.</w:t>
+        <w:t xml:space="preserve">Week 8 outlook</w:t>
+      </w:r>
+    </w:p>
+    <w:p>
+      <w:pPr>
+        <w:pStyle w:val="Normal"/>
+      </w:pPr>
+      <w:r>
+        <w:t xml:space="preserve">Weekly overall model rank 141 (WR54). ROS overall rank 174 (WR69). Availability: NO_ADVERSE_STATUS_REPORTED. Weekly ranks are preliminary when playing status is unconfirmed; they are separate from season ranks.</w:t>
       </w:r>
     </w:p>
     <w:p>
@@ -20543,15 +20543,15 @@
         <w:pStyle w:val="Heading2"/>
       </w:pPr>
       <w:r>
-        <w:t xml:space="preserve">Week 7 outlook</w:t>
-      </w:r>
-    </w:p>
-    <w:p>
-      <w:pPr>
-        <w:pStyle w:val="Normal"/>
-      </w:pPr>
-      <w:r>
-        <w:t xml:space="preserve">Weekly overall model rank Not published (GAME_STARTED_NO_ORIGINAL_WEEKLY_RANK). ROS overall rank 175 (QB22). Availability: NO_ADVERSE_STATUS_REPORTED. Weekly ranks are preliminary when playing status is unconfirmed; they are separate from season ranks.</w:t>
+        <w:t xml:space="preserve">Week 8 outlook</w:t>
+      </w:r>
+    </w:p>
+    <w:p>
+      <w:pPr>
+        <w:pStyle w:val="Normal"/>
+      </w:pPr>
+      <w:r>
+        <w:t xml:space="preserve">Weekly overall model rank 40 (QB17). ROS overall rank 175 (QB22). Availability: NO_ADVERSE_STATUS_REPORTED. Weekly ranks are preliminary when playing status is unconfirmed; they are separate from season ranks.</w:t>
       </w:r>
     </w:p>
     <w:p>
@@ -20663,15 +20663,15 @@
         <w:pStyle w:val="Heading2"/>
       </w:pPr>
       <w:r>
-        <w:t xml:space="preserve">Week 7 outlook</w:t>
-      </w:r>
-    </w:p>
-    <w:p>
-      <w:pPr>
-        <w:pStyle w:val="Normal"/>
-      </w:pPr>
-      <w:r>
-        <w:t xml:space="preserve">Weekly overall model rank Not published (NO_CURRENT_WEEK_GAME). ROS overall rank 176 (WR70). Availability: QUESTIONABLE. Weekly ranks are preliminary when playing status is unconfirmed; they are separate from season ranks.</w:t>
+        <w:t xml:space="preserve">Week 8 outlook</w:t>
+      </w:r>
+    </w:p>
+    <w:p>
+      <w:pPr>
+        <w:pStyle w:val="Normal"/>
+      </w:pPr>
+      <w:r>
+        <w:t xml:space="preserve">Weekly overall model rank 126 (WR50). ROS overall rank 176 (WR70). Availability: QUESTIONABLE. Weekly ranks are preliminary when playing status is unconfirmed; they are separate from season ranks.</w:t>
       </w:r>
     </w:p>
     <w:p>
@@ -20751,15 +20751,15 @@
         <w:pStyle w:val="Heading2"/>
       </w:pPr>
       <w:r>
-        <w:t xml:space="preserve">Week 7 outlook</w:t>
-      </w:r>
-    </w:p>
-    <w:p>
-      <w:pPr>
-        <w:pStyle w:val="Normal"/>
-      </w:pPr>
-      <w:r>
-        <w:t xml:space="preserve">Weekly overall model rank Not published (GAME_STARTED_NO_ORIGINAL_WEEKLY_RANK). ROS overall rank 177 (WR71). Availability: NO_ADVERSE_STATUS_REPORTED. Weekly ranks are preliminary when playing status is unconfirmed; they are separate from season ranks.</w:t>
+        <w:t xml:space="preserve">Week 8 outlook</w:t>
+      </w:r>
+    </w:p>
+    <w:p>
+      <w:pPr>
+        <w:pStyle w:val="Normal"/>
+      </w:pPr>
+      <w:r>
+        <w:t xml:space="preserve">Weekly overall model rank Not published (NO_CURRENT_WEEK_GAME). ROS overall rank 177 (WR71). Availability: NO_ADVERSE_STATUS_REPORTED. Weekly ranks are preliminary when playing status is unconfirmed; they are separate from season ranks.</w:t>
       </w:r>
     </w:p>
     <w:p>
@@ -20871,15 +20871,15 @@
         <w:pStyle w:val="Heading2"/>
       </w:pPr>
       <w:r>
-        <w:t xml:space="preserve">Week 7 outlook</w:t>
-      </w:r>
-    </w:p>
-    <w:p>
-      <w:pPr>
-        <w:pStyle w:val="Normal"/>
-      </w:pPr>
-      <w:r>
-        <w:t xml:space="preserve">Weekly overall model rank Not published (GAME_STARTED_NO_ORIGINAL_WEEKLY_RANK). ROS overall rank 178 (WR72). Availability: NO_ADVERSE_STATUS_REPORTED. Weekly ranks are preliminary when playing status is unconfirmed; they are separate from season ranks.</w:t>
+        <w:t xml:space="preserve">Week 8 outlook</w:t>
+      </w:r>
+    </w:p>
+    <w:p>
+      <w:pPr>
+        <w:pStyle w:val="Normal"/>
+      </w:pPr>
+      <w:r>
+        <w:t xml:space="preserve">Weekly overall model rank 140 (WR53). ROS overall rank 178 (WR72). Availability: NO_ADVERSE_STATUS_REPORTED. Weekly ranks are preliminary when playing status is unconfirmed; they are separate from season ranks.</w:t>
       </w:r>
     </w:p>
     <w:p>
@@ -20959,15 +20959,15 @@
         <w:pStyle w:val="Heading2"/>
       </w:pPr>
       <w:r>
-        <w:t xml:space="preserve">Week 7 outlook</w:t>
-      </w:r>
-    </w:p>
-    <w:p>
-      <w:pPr>
-        <w:pStyle w:val="Normal"/>
-      </w:pPr>
-      <w:r>
-        <w:t xml:space="preserve">Weekly overall model rank Not published (GAME_STARTED_NO_ORIGINAL_WEEKLY_RANK). ROS overall rank 179 (TE25). Availability: NO_ADVERSE_STATUS_REPORTED. Weekly ranks are preliminary when playing status is unconfirmed; they are separate from season ranks.</w:t>
+        <w:t xml:space="preserve">Week 8 outlook</w:t>
+      </w:r>
+    </w:p>
+    <w:p>
+      <w:pPr>
+        <w:pStyle w:val="Normal"/>
+      </w:pPr>
+      <w:r>
+        <w:t xml:space="preserve">Weekly overall model rank 142 (TE19). ROS overall rank 179 (TE25). Availability: NO_ADVERSE_STATUS_REPORTED. Weekly ranks are preliminary when playing status is unconfirmed; they are separate from season ranks.</w:t>
       </w:r>
     </w:p>
     <w:p>
@@ -21079,15 +21079,15 @@
         <w:pStyle w:val="Heading2"/>
       </w:pPr>
       <w:r>
-        <w:t xml:space="preserve">Week 7 outlook</w:t>
-      </w:r>
-    </w:p>
-    <w:p>
-      <w:pPr>
-        <w:pStyle w:val="Normal"/>
-      </w:pPr>
-      <w:r>
-        <w:t xml:space="preserve">Weekly overall model rank Not published (GAME_STARTED_NO_ORIGINAL_WEEKLY_RANK). ROS overall rank 180 (RB61). Availability: NO_ADVERSE_STATUS_REPORTED. Weekly ranks are preliminary when playing status is unconfirmed; they are separate from season ranks.</w:t>
+        <w:t xml:space="preserve">Week 8 outlook</w:t>
+      </w:r>
+    </w:p>
+    <w:p>
+      <w:pPr>
+        <w:pStyle w:val="Normal"/>
+      </w:pPr>
+      <w:r>
+        <w:t xml:space="preserve">Weekly overall model rank 134 (RB42). ROS overall rank 180 (RB61). Availability: NO_ADVERSE_STATUS_REPORTED. Weekly ranks are preliminary when playing status is unconfirmed; they are separate from season ranks.</w:t>
       </w:r>
     </w:p>
     <w:p>
@@ -21167,7 +21167,7 @@
         <w:pStyle w:val="Heading2"/>
       </w:pPr>
       <w:r>
-        <w:t xml:space="preserve">Week 7 outlook</w:t>
+        <w:t xml:space="preserve">Week 8 outlook</w:t>
       </w:r>
     </w:p>
     <w:p>
@@ -21287,15 +21287,15 @@
         <w:pStyle w:val="Heading2"/>
       </w:pPr>
       <w:r>
-        <w:t xml:space="preserve">Week 7 outlook</w:t>
-      </w:r>
-    </w:p>
-    <w:p>
-      <w:pPr>
-        <w:pStyle w:val="Normal"/>
-      </w:pPr>
-      <w:r>
-        <w:t xml:space="preserve">Weekly overall model rank Not published (GAME_STARTED_NO_ORIGINAL_WEEKLY_RANK). ROS overall rank 182 (QB23). Availability: NO_ADVERSE_STATUS_REPORTED. Weekly ranks are preliminary when playing status is unconfirmed; they are separate from season ranks.</w:t>
+        <w:t xml:space="preserve">Week 8 outlook</w:t>
+      </w:r>
+    </w:p>
+    <w:p>
+      <w:pPr>
+        <w:pStyle w:val="Normal"/>
+      </w:pPr>
+      <w:r>
+        <w:t xml:space="preserve">Weekly overall model rank 44 (QB19). ROS overall rank 182 (QB23). Availability: NO_ADVERSE_STATUS_REPORTED. Weekly ranks are preliminary when playing status is unconfirmed; they are separate from season ranks.</w:t>
       </w:r>
     </w:p>
     <w:p>
@@ -21407,15 +21407,15 @@
         <w:pStyle w:val="Heading2"/>
       </w:pPr>
       <w:r>
-        <w:t xml:space="preserve">Week 7 outlook</w:t>
-      </w:r>
-    </w:p>
-    <w:p>
-      <w:pPr>
-        <w:pStyle w:val="Normal"/>
-      </w:pPr>
-      <w:r>
-        <w:t xml:space="preserve">Weekly overall model rank Not published (GAME_STARTED_NO_ORIGINAL_WEEKLY_RANK). ROS overall rank 183 (RB63). Availability: UNKNOWN. Weekly ranks are preliminary when playing status is unconfirmed; they are separate from season ranks.</w:t>
+        <w:t xml:space="preserve">Week 8 outlook</w:t>
+      </w:r>
+    </w:p>
+    <w:p>
+      <w:pPr>
+        <w:pStyle w:val="Normal"/>
+      </w:pPr>
+      <w:r>
+        <w:t xml:space="preserve">Weekly overall model rank 139 (RB47). ROS overall rank 183 (RB63). Availability: NO_ADVERSE_STATUS_REPORTED. Weekly ranks are preliminary when playing status is unconfirmed; they are separate from season ranks.</w:t>
       </w:r>
     </w:p>
     <w:p>
@@ -21527,15 +21527,15 @@
         <w:pStyle w:val="Heading2"/>
       </w:pPr>
       <w:r>
-        <w:t xml:space="preserve">Week 7 outlook</w:t>
-      </w:r>
-    </w:p>
-    <w:p>
-      <w:pPr>
-        <w:pStyle w:val="Normal"/>
-      </w:pPr>
-      <w:r>
-        <w:t xml:space="preserve">Weekly overall model rank Not published (GAME_STARTED_NO_ORIGINAL_WEEKLY_RANK). ROS overall rank 184 (RB64). Availability: NO_ADVERSE_STATUS_REPORTED. Weekly ranks are preliminary when playing status is unconfirmed; they are separate from season ranks.</w:t>
+        <w:t xml:space="preserve">Week 8 outlook</w:t>
+      </w:r>
+    </w:p>
+    <w:p>
+      <w:pPr>
+        <w:pStyle w:val="Normal"/>
+      </w:pPr>
+      <w:r>
+        <w:t xml:space="preserve">Weekly overall model rank Not published (NO_CURRENT_WEEK_GAME). ROS overall rank 184 (RB64). Availability: NO_ADVERSE_STATUS_REPORTED. Weekly ranks are preliminary when playing status is unconfirmed; they are separate from season ranks.</w:t>
       </w:r>
     </w:p>
     <w:p>
@@ -21647,15 +21647,15 @@
         <w:pStyle w:val="Heading2"/>
       </w:pPr>
       <w:r>
-        <w:t xml:space="preserve">Week 7 outlook</w:t>
-      </w:r>
-    </w:p>
-    <w:p>
-      <w:pPr>
-        <w:pStyle w:val="Normal"/>
-      </w:pPr>
-      <w:r>
-        <w:t xml:space="preserve">Weekly overall model rank Not published (GAME_STARTED_NO_ORIGINAL_WEEKLY_RANK). ROS overall rank 185 (QB24). Availability: NO_ADVERSE_STATUS_REPORTED. Weekly ranks are preliminary when playing status is unconfirmed; they are separate from season ranks.</w:t>
+        <w:t xml:space="preserve">Week 8 outlook</w:t>
+      </w:r>
+    </w:p>
+    <w:p>
+      <w:pPr>
+        <w:pStyle w:val="Normal"/>
+      </w:pPr>
+      <w:r>
+        <w:t xml:space="preserve">Weekly overall model rank Not published (NO_CURRENT_WEEK_GAME). ROS overall rank 185 (QB24). Availability: NO_ADVERSE_STATUS_REPORTED. Weekly ranks are preliminary when playing status is unconfirmed; they are separate from season ranks.</w:t>
       </w:r>
     </w:p>
     <w:p>
@@ -21767,15 +21767,15 @@
         <w:pStyle w:val="Heading2"/>
       </w:pPr>
       <w:r>
-        <w:t xml:space="preserve">Week 7 outlook</w:t>
-      </w:r>
-    </w:p>
-    <w:p>
-      <w:pPr>
-        <w:pStyle w:val="Normal"/>
-      </w:pPr>
-      <w:r>
-        <w:t xml:space="preserve">Weekly overall model rank Not published (GAME_STARTED_NO_ORIGINAL_WEEKLY_RANK). ROS overall rank 186 (QB25). Availability: QUESTIONABLE. Weekly ranks are preliminary when playing status is unconfirmed; they are separate from season ranks.</w:t>
+        <w:t xml:space="preserve">Week 8 outlook</w:t>
+      </w:r>
+    </w:p>
+    <w:p>
+      <w:pPr>
+        <w:pStyle w:val="Normal"/>
+      </w:pPr>
+      <w:r>
+        <w:t xml:space="preserve">Weekly overall model rank 39 (QB16). ROS overall rank 186 (QB25). Availability: NO_ADVERSE_STATUS_REPORTED. Weekly ranks are preliminary when playing status is unconfirmed; they are separate from season ranks.</w:t>
       </w:r>
     </w:p>
     <w:p>
@@ -21887,15 +21887,15 @@
         <w:pStyle w:val="Heading2"/>
       </w:pPr>
       <w:r>
-        <w:t xml:space="preserve">Week 7 outlook</w:t>
-      </w:r>
-    </w:p>
-    <w:p>
-      <w:pPr>
-        <w:pStyle w:val="Normal"/>
-      </w:pPr>
-      <w:r>
-        <w:t xml:space="preserve">Weekly overall model rank Not published (GAME_STARTED_NO_ORIGINAL_WEEKLY_RANK). ROS overall rank 187 (TE26). Availability: UNKNOWN. Weekly ranks are preliminary when playing status is unconfirmed; they are separate from season ranks.</w:t>
+        <w:t xml:space="preserve">Week 8 outlook</w:t>
+      </w:r>
+    </w:p>
+    <w:p>
+      <w:pPr>
+        <w:pStyle w:val="Normal"/>
+      </w:pPr>
+      <w:r>
+        <w:t xml:space="preserve">Weekly overall model rank Not published (NOT_EXPECTED_TO_PLAY). ROS overall rank 187 (TE26). Availability: OUT. Weekly ranks are preliminary when playing status is unconfirmed; they are separate from season ranks.</w:t>
       </w:r>
     </w:p>
     <w:p>
@@ -22007,15 +22007,15 @@
         <w:pStyle w:val="Heading2"/>
       </w:pPr>
       <w:r>
-        <w:t xml:space="preserve">Week 7 outlook</w:t>
-      </w:r>
-    </w:p>
-    <w:p>
-      <w:pPr>
-        <w:pStyle w:val="Normal"/>
-      </w:pPr>
-      <w:r>
-        <w:t xml:space="preserve">Weekly overall model rank Not published (GAME_STARTED_NO_ORIGINAL_WEEKLY_RANK). ROS overall rank 188 (QB26). Availability: UNKNOWN. Weekly ranks are preliminary when playing status is unconfirmed; they are separate from season ranks.</w:t>
+        <w:t xml:space="preserve">Week 8 outlook</w:t>
+      </w:r>
+    </w:p>
+    <w:p>
+      <w:pPr>
+        <w:pStyle w:val="Normal"/>
+      </w:pPr>
+      <w:r>
+        <w:t xml:space="preserve">Weekly overall model rank Not published (GAME_STARTED_NO_ORIGINAL_WEEKLY_RANK). ROS overall rank 188 (QB26). Availability: NO_ADVERSE_STATUS_REPORTED. Weekly ranks are preliminary when playing status is unconfirmed; they are separate from season ranks.</w:t>
       </w:r>
     </w:p>
     <w:p>
@@ -22127,7 +22127,7 @@
         <w:pStyle w:val="Heading2"/>
       </w:pPr>
       <w:r>
-        <w:t xml:space="preserve">Week 7 outlook</w:t>
+        <w:t xml:space="preserve">Week 8 outlook</w:t>
       </w:r>
     </w:p>
     <w:p>
@@ -22247,15 +22247,15 @@
         <w:pStyle w:val="Heading2"/>
       </w:pPr>
       <w:r>
-        <w:t xml:space="preserve">Week 7 outlook</w:t>
-      </w:r>
-    </w:p>
-    <w:p>
-      <w:pPr>
-        <w:pStyle w:val="Normal"/>
-      </w:pPr>
-      <w:r>
-        <w:t xml:space="preserve">Weekly overall model rank Not published (GAME_STARTED_NO_ORIGINAL_WEEKLY_RANK). ROS overall rank 190 (QB27). Availability: NO_ADVERSE_STATUS_REPORTED. Weekly ranks are preliminary when playing status is unconfirmed; they are separate from season ranks.</w:t>
+        <w:t xml:space="preserve">Week 8 outlook</w:t>
+      </w:r>
+    </w:p>
+    <w:p>
+      <w:pPr>
+        <w:pStyle w:val="Normal"/>
+      </w:pPr>
+      <w:r>
+        <w:t xml:space="preserve">Weekly overall model rank 103 (QB22). ROS overall rank 190 (QB27). Availability: NO_ADVERSE_STATUS_REPORTED. Weekly ranks are preliminary when playing status is unconfirmed; they are separate from season ranks.</w:t>
       </w:r>
     </w:p>
     <w:p>
@@ -22335,15 +22335,15 @@
         <w:pStyle w:val="Heading2"/>
       </w:pPr>
       <w:r>
-        <w:t xml:space="preserve">Week 7 outlook</w:t>
-      </w:r>
-    </w:p>
-    <w:p>
-      <w:pPr>
-        <w:pStyle w:val="Normal"/>
-      </w:pPr>
-      <w:r>
-        <w:t xml:space="preserve">Weekly overall model rank Not published (NOT_EXPECTED_TO_PLAY). ROS overall rank 191 (RB66). Availability: OUT. Weekly ranks are preliminary when playing status is unconfirmed; they are separate from season ranks.</w:t>
+        <w:t xml:space="preserve">Week 8 outlook</w:t>
+      </w:r>
+    </w:p>
+    <w:p>
+      <w:pPr>
+        <w:pStyle w:val="Normal"/>
+      </w:pPr>
+      <w:r>
+        <w:t xml:space="preserve">Weekly overall model rank 143 (RB48). ROS overall rank 191 (RB66). Availability: QUESTIONABLE. Weekly ranks are preliminary when playing status is unconfirmed; they are separate from season ranks.</w:t>
       </w:r>
     </w:p>
     <w:p>
@@ -22455,15 +22455,15 @@
         <w:pStyle w:val="Heading2"/>
       </w:pPr>
       <w:r>
-        <w:t xml:space="preserve">Week 7 outlook</w:t>
-      </w:r>
-    </w:p>
-    <w:p>
-      <w:pPr>
-        <w:pStyle w:val="Normal"/>
-      </w:pPr>
-      <w:r>
-        <w:t xml:space="preserve">Weekly overall model rank Not published (GAME_STARTED_NO_ORIGINAL_WEEKLY_RANK). ROS overall rank 192 (QB28). Availability: NO_ADVERSE_STATUS_REPORTED. Weekly ranks are preliminary when playing status is unconfirmed; they are separate from season ranks.</w:t>
+        <w:t xml:space="preserve">Week 8 outlook</w:t>
+      </w:r>
+    </w:p>
+    <w:p>
+      <w:pPr>
+        <w:pStyle w:val="Normal"/>
+      </w:pPr>
+      <w:r>
+        <w:t xml:space="preserve">Weekly overall model rank 56 (QB20). ROS overall rank 192 (QB28). Availability: NO_ADVERSE_STATUS_REPORTED. Weekly ranks are preliminary when playing status is unconfirmed; they are separate from season ranks.</w:t>
       </w:r>
     </w:p>
     <w:p>
@@ -22575,15 +22575,15 @@
         <w:pStyle w:val="Heading2"/>
       </w:pPr>
       <w:r>
-        <w:t xml:space="preserve">Week 7 outlook</w:t>
-      </w:r>
-    </w:p>
-    <w:p>
-      <w:pPr>
-        <w:pStyle w:val="Normal"/>
-      </w:pPr>
-      <w:r>
-        <w:t xml:space="preserve">Weekly overall model rank Not published (NOT_EXPECTED_TO_PLAY). ROS overall rank 193 (WR73). Availability: INJURED_RESERVE. Weekly ranks are preliminary when playing status is unconfirmed; they are separate from season ranks.</w:t>
+        <w:t xml:space="preserve">Week 8 outlook</w:t>
+      </w:r>
+    </w:p>
+    <w:p>
+      <w:pPr>
+        <w:pStyle w:val="Normal"/>
+      </w:pPr>
+      <w:r>
+        <w:t xml:space="preserve">Weekly overall model rank Not published (NO_CURRENT_WEEK_GAME). ROS overall rank 193 (WR73). Availability: NO_ADVERSE_STATUS_REPORTED. Weekly ranks are preliminary when playing status is unconfirmed; they are separate from season ranks.</w:t>
       </w:r>
     </w:p>
     <w:p>
@@ -22695,15 +22695,15 @@
         <w:pStyle w:val="Heading2"/>
       </w:pPr>
       <w:r>
-        <w:t xml:space="preserve">Week 7 outlook</w:t>
-      </w:r>
-    </w:p>
-    <w:p>
-      <w:pPr>
-        <w:pStyle w:val="Normal"/>
-      </w:pPr>
-      <w:r>
-        <w:t xml:space="preserve">Weekly overall model rank Not published (GAME_STARTED_NO_ORIGINAL_WEEKLY_RANK). ROS overall rank 194 (QB29). Availability: NO_ADVERSE_STATUS_REPORTED. Weekly ranks are preliminary when playing status is unconfirmed; they are separate from season ranks.</w:t>
+        <w:t xml:space="preserve">Week 8 outlook</w:t>
+      </w:r>
+    </w:p>
+    <w:p>
+      <w:pPr>
+        <w:pStyle w:val="Normal"/>
+      </w:pPr>
+      <w:r>
+        <w:t xml:space="preserve">Weekly overall model rank Not published (NO_CURRENT_WEEK_GAME). ROS overall rank 194 (QB29). Availability: NO_ADVERSE_STATUS_REPORTED. Weekly ranks are preliminary when playing status is unconfirmed; they are separate from season ranks.</w:t>
       </w:r>
     </w:p>
     <w:p>
@@ -22815,15 +22815,15 @@
         <w:pStyle w:val="Heading2"/>
       </w:pPr>
       <w:r>
-        <w:t xml:space="preserve">Week 7 outlook</w:t>
-      </w:r>
-    </w:p>
-    <w:p>
-      <w:pPr>
-        <w:pStyle w:val="Normal"/>
-      </w:pPr>
-      <w:r>
-        <w:t xml:space="preserve">Weekly overall model rank Not published (GAME_STARTED_NO_ORIGINAL_WEEKLY_RANK). ROS overall rank 195 (WR74). Availability: QUESTIONABLE. Weekly ranks are preliminary when playing status is unconfirmed; they are separate from season ranks.</w:t>
+        <w:t xml:space="preserve">Week 8 outlook</w:t>
+      </w:r>
+    </w:p>
+    <w:p>
+      <w:pPr>
+        <w:pStyle w:val="Normal"/>
+      </w:pPr>
+      <w:r>
+        <w:t xml:space="preserve">Weekly overall model rank Not published (NO_CURRENT_WEEK_GAME). ROS overall rank 195 (WR74). Availability: NO_ADVERSE_STATUS_REPORTED. Weekly ranks are preliminary when playing status is unconfirmed; they are separate from season ranks.</w:t>
       </w:r>
     </w:p>
     <w:p>
@@ -22935,15 +22935,15 @@
         <w:pStyle w:val="Heading2"/>
       </w:pPr>
       <w:r>
-        <w:t xml:space="preserve">Week 7 outlook</w:t>
-      </w:r>
-    </w:p>
-    <w:p>
-      <w:pPr>
-        <w:pStyle w:val="Normal"/>
-      </w:pPr>
-      <w:r>
-        <w:t xml:space="preserve">Weekly overall model rank Not published (NOT_EXPECTED_TO_PLAY). ROS overall rank 196 (WR75). Availability: INJURED_RESERVE. Weekly ranks are preliminary when playing status is unconfirmed; they are separate from season ranks.</w:t>
+        <w:t xml:space="preserve">Week 8 outlook</w:t>
+      </w:r>
+    </w:p>
+    <w:p>
+      <w:pPr>
+        <w:pStyle w:val="Normal"/>
+      </w:pPr>
+      <w:r>
+        <w:t xml:space="preserve">Weekly overall model rank Not published (NO_CURRENT_WEEK_GAME). ROS overall rank 196 (WR75). Availability: INJURED_RESERVE. Weekly ranks are preliminary when playing status is unconfirmed; they are separate from season ranks.</w:t>
       </w:r>
     </w:p>
     <w:p>
@@ -23055,15 +23055,15 @@
         <w:pStyle w:val="Heading2"/>
       </w:pPr>
       <w:r>
-        <w:t xml:space="preserve">Week 7 outlook</w:t>
-      </w:r>
-    </w:p>
-    <w:p>
-      <w:pPr>
-        <w:pStyle w:val="Normal"/>
-      </w:pPr>
-      <w:r>
-        <w:t xml:space="preserve">Weekly overall model rank Not published (GAME_STARTED_NO_ORIGINAL_WEEKLY_RANK). ROS overall rank 197 (RB67). Availability: NO_ADVERSE_STATUS_REPORTED. Weekly ranks are preliminary when playing status is unconfirmed; they are separate from season ranks.</w:t>
+        <w:t xml:space="preserve">Week 8 outlook</w:t>
+      </w:r>
+    </w:p>
+    <w:p>
+      <w:pPr>
+        <w:pStyle w:val="Normal"/>
+      </w:pPr>
+      <w:r>
+        <w:t xml:space="preserve">Weekly overall model rank Not published (NO_CURRENT_WEEK_GAME). ROS overall rank 197 (RB67). Availability: NO_ADVERSE_STATUS_REPORTED. Weekly ranks are preliminary when playing status is unconfirmed; they are separate from season ranks.</w:t>
       </w:r>
     </w:p>
     <w:p>

</xml_diff>

<commit_message>
Refresh in-season rankings: exports/fantasy-2026-current.docx
</commit_message>
<xml_diff>
--- a/exports/fantasy-2026-current.docx
+++ b/exports/fantasy-2026-current.docx
@@ -2119,7 +2119,7 @@
         <w:pStyle w:val="Normal"/>
       </w:pPr>
       <w:r>
-        <w:t xml:space="preserve">Weekly overall model rank 4 (RB1). ROS overall rank 19 (RB10). Availability: NO_ADVERSE_STATUS_REPORTED. Weekly ranks are preliminary when playing status is unconfirmed; they are separate from season ranks.</w:t>
+        <w:t xml:space="preserve">Weekly overall model rank Not published (GAME_STARTED_NO_ORIGINAL_WEEKLY_RANK). ROS overall rank 19 (RB10). Availability: NO_ADVERSE_STATUS_REPORTED. Weekly ranks are preliminary when playing status is unconfirmed; they are separate from season ranks.</w:t>
       </w:r>
     </w:p>
     <w:p>
@@ -4399,7 +4399,7 @@
         <w:pStyle w:val="Normal"/>
       </w:pPr>
       <w:r>
-        <w:t xml:space="preserve">Weekly overall model rank 9 (WR2). ROS overall rank 38 (WR21). Availability: UNKNOWN. Weekly ranks are preliminary when playing status is unconfirmed; they are separate from season ranks.</w:t>
+        <w:t xml:space="preserve">Weekly overall model rank 6 (WR2). ROS overall rank 38 (WR21). Availability: UNKNOWN. Weekly ranks are preliminary when playing status is unconfirmed; they are separate from season ranks.</w:t>
       </w:r>
     </w:p>
     <w:p>
@@ -4759,7 +4759,7 @@
         <w:pStyle w:val="Normal"/>
       </w:pPr>
       <w:r>
-        <w:t xml:space="preserve">Weekly overall model rank 6 (TE1). ROS overall rank 41 (TE3). Availability: NO_ADVERSE_STATUS_REPORTED. Weekly ranks are preliminary when playing status is unconfirmed; they are separate from season ranks.</w:t>
+        <w:t xml:space="preserve">Weekly overall model rank 3 (TE1). ROS overall rank 41 (TE3). Availability: NO_ADVERSE_STATUS_REPORTED. Weekly ranks are preliminary when playing status is unconfirmed; they are separate from season ranks.</w:t>
       </w:r>
     </w:p>
     <w:p>
@@ -5239,7 +5239,7 @@
         <w:pStyle w:val="Normal"/>
       </w:pPr>
       <w:r>
-        <w:t xml:space="preserve">Weekly overall model rank 11 (WR4). ROS overall rank 45 (WR25). Availability: UNKNOWN. Weekly ranks are preliminary when playing status is unconfirmed; they are separate from season ranks.</w:t>
+        <w:t xml:space="preserve">Weekly overall model rank 8 (WR4). ROS overall rank 45 (WR25). Availability: UNKNOWN. Weekly ranks are preliminary when playing status is unconfirmed; they are separate from season ranks.</w:t>
       </w:r>
     </w:p>
     <w:p>
@@ -7159,7 +7159,7 @@
         <w:pStyle w:val="Normal"/>
       </w:pPr>
       <w:r>
-        <w:t xml:space="preserve">Weekly overall model rank 8 (RB2). ROS overall rank 61 (RB20). Availability: UNKNOWN. Weekly ranks are preliminary when playing status is unconfirmed; they are separate from season ranks.</w:t>
+        <w:t xml:space="preserve">Weekly overall model rank 5 (RB1). ROS overall rank 61 (RB20). Availability: UNKNOWN. Weekly ranks are preliminary when playing status is unconfirmed; they are separate from season ranks.</w:t>
       </w:r>
     </w:p>
     <w:p>
@@ -7607,7 +7607,7 @@
         <w:pStyle w:val="Normal"/>
       </w:pPr>
       <w:r>
-        <w:t xml:space="preserve">Weekly overall model rank 5 (QB3). ROS overall rank 65 (QB9). Availability: UNKNOWN. Weekly ranks are preliminary when playing status is unconfirmed; they are separate from season ranks.</w:t>
+        <w:t xml:space="preserve">Weekly overall model rank Not published (GAME_STARTED_NO_ORIGINAL_WEEKLY_RANK). ROS overall rank 65 (QB9). Availability: UNKNOWN. Weekly ranks are preliminary when playing status is unconfirmed; they are separate from season ranks.</w:t>
       </w:r>
     </w:p>
     <w:p>
@@ -8207,7 +8207,7 @@
         <w:pStyle w:val="Normal"/>
       </w:pPr>
       <w:r>
-        <w:t xml:space="preserve">Weekly overall model rank 3 (QB2). ROS overall rank 70 (QB11). Availability: UNKNOWN. Weekly ranks are preliminary when playing status is unconfirmed; they are separate from season ranks.</w:t>
+        <w:t xml:space="preserve">Weekly overall model rank 2 (QB1). ROS overall rank 70 (QB11). Availability: UNKNOWN. Weekly ranks are preliminary when playing status is unconfirmed; they are separate from season ranks.</w:t>
       </w:r>
     </w:p>
     <w:p>
@@ -8327,7 +8327,7 @@
         <w:pStyle w:val="Normal"/>
       </w:pPr>
       <w:r>
-        <w:t xml:space="preserve">Weekly overall model rank 2 (QB1). ROS overall rank 71 (QB12). Availability: NO_ADVERSE_STATUS_REPORTED. Weekly ranks are preliminary when playing status is unconfirmed; they are separate from season ranks.</w:t>
+        <w:t xml:space="preserve">Weekly overall model rank Not published (GAME_STARTED_NO_ORIGINAL_WEEKLY_RANK). ROS overall rank 71 (QB12). Availability: NO_ADVERSE_STATUS_REPORTED. Weekly ranks are preliminary when playing status is unconfirmed; they are separate from season ranks.</w:t>
       </w:r>
     </w:p>
     <w:p>
@@ -8567,7 +8567,7 @@
         <w:pStyle w:val="Normal"/>
       </w:pPr>
       <w:r>
-        <w:t xml:space="preserve">Weekly overall model rank 10 (WR3). ROS overall rank 73 (WR33). Availability: UNKNOWN. Weekly ranks are preliminary when playing status is unconfirmed; they are separate from season ranks.</w:t>
+        <w:t xml:space="preserve">Weekly overall model rank 7 (WR3). ROS overall rank 73 (WR33). Availability: UNKNOWN. Weekly ranks are preliminary when playing status is unconfirmed; they are separate from season ranks.</w:t>
       </w:r>
     </w:p>
     <w:p>
@@ -11655,7 +11655,7 @@
         <w:pStyle w:val="Normal"/>
       </w:pPr>
       <w:r>
-        <w:t xml:space="preserve">Weekly overall model rank 14 (WR5). ROS overall rank 99 (WR46). Availability: NO_ADVERSE_STATUS_REPORTED. Weekly ranks are preliminary when playing status is unconfirmed; they are separate from season ranks.</w:t>
+        <w:t xml:space="preserve">Weekly overall model rank Not published (GAME_STARTED_NO_ORIGINAL_WEEKLY_RANK). ROS overall rank 99 (WR46). Availability: NO_ADVERSE_STATUS_REPORTED. Weekly ranks are preliminary when playing status is unconfirmed; they are separate from season ranks.</w:t>
       </w:r>
     </w:p>
     <w:p>
@@ -13575,7 +13575,7 @@
         <w:pStyle w:val="Normal"/>
       </w:pPr>
       <w:r>
-        <w:t xml:space="preserve">Weekly overall model rank 13 (RB3). ROS overall rank 115 (RB31). Availability: NO_ADVERSE_STATUS_REPORTED. Weekly ranks are preliminary when playing status is unconfirmed; they are separate from season ranks.</w:t>
+        <w:t xml:space="preserve">Weekly overall model rank 9 (RB2). ROS overall rank 115 (RB31). Availability: NO_ADVERSE_STATUS_REPORTED. Weekly ranks are preliminary when playing status is unconfirmed; they are separate from season ranks.</w:t>
       </w:r>
     </w:p>
     <w:p>
@@ -14663,7 +14663,7 @@
         <w:pStyle w:val="Normal"/>
       </w:pPr>
       <w:r>
-        <w:t xml:space="preserve">Weekly overall model rank 12 (TE2). ROS overall rank 125 (TE20). Availability: NO_ADVERSE_STATUS_REPORTED. Weekly ranks are preliminary when playing status is unconfirmed; they are separate from season ranks.</w:t>
+        <w:t xml:space="preserve">Weekly overall model rank Not published (GAME_STARTED_NO_ORIGINAL_WEEKLY_RANK). ROS overall rank 125 (TE20). Availability: NO_ADVERSE_STATUS_REPORTED. Weekly ranks are preliminary when playing status is unconfirmed; they are separate from season ranks.</w:t>
       </w:r>
     </w:p>
     <w:p>
@@ -15023,7 +15023,7 @@
         <w:pStyle w:val="Normal"/>
       </w:pPr>
       <w:r>
-        <w:t xml:space="preserve">Weekly overall model rank 16 (RB4). ROS overall rank 128 (RB36). Availability: NO_ADVERSE_STATUS_REPORTED. Weekly ranks are preliminary when playing status is unconfirmed; they are separate from season ranks.</w:t>
+        <w:t xml:space="preserve">Weekly overall model rank Not published (GAME_STARTED_NO_ORIGINAL_WEEKLY_RANK). ROS overall rank 128 (RB36). Availability: NO_ADVERSE_STATUS_REPORTED. Weekly ranks are preliminary when playing status is unconfirmed; they are separate from season ranks.</w:t>
       </w:r>
     </w:p>
     <w:p>
@@ -16343,7 +16343,7 @@
         <w:pStyle w:val="Normal"/>
       </w:pPr>
       <w:r>
-        <w:t xml:space="preserve">Weekly overall model rank 15 (TE3). ROS overall rank 139 (TE22). Availability: UNKNOWN. Weekly ranks are preliminary when playing status is unconfirmed; they are separate from season ranks.</w:t>
+        <w:t xml:space="preserve">Weekly overall model rank Not published (GAME_STARTED_NO_ORIGINAL_WEEKLY_RANK). ROS overall rank 139 (TE22). Availability: UNKNOWN. Weekly ranks are preliminary when playing status is unconfirmed; they are separate from season ranks.</w:t>
       </w:r>
     </w:p>
     <w:p>
@@ -17183,7 +17183,7 @@
         <w:pStyle w:val="Normal"/>
       </w:pPr>
       <w:r>
-        <w:t xml:space="preserve">Weekly overall model rank 17 (RB5). ROS overall rank 146 (RB44). Availability: UNKNOWN. Weekly ranks are preliminary when playing status is unconfirmed; they are separate from season ranks.</w:t>
+        <w:t xml:space="preserve">Weekly overall model rank 10 (RB3). ROS overall rank 146 (RB44). Availability: UNKNOWN. Weekly ranks are preliminary when playing status is unconfirmed; they are separate from season ranks.</w:t>
       </w:r>
     </w:p>
     <w:p>
@@ -17543,7 +17543,7 @@
         <w:pStyle w:val="Normal"/>
       </w:pPr>
       <w:r>
-        <w:t xml:space="preserve">Weekly overall model rank 19 (WR6). ROS overall rank 149 (WR64). Availability: NO_ADVERSE_STATUS_REPORTED. Weekly ranks are preliminary when playing status is unconfirmed; they are separate from season ranks.</w:t>
+        <w:t xml:space="preserve">Weekly overall model rank Not published (GAME_STARTED_NO_ORIGINAL_WEEKLY_RANK). ROS overall rank 149 (WR64). Availability: NO_ADVERSE_STATUS_REPORTED. Weekly ranks are preliminary when playing status is unconfirmed; they are separate from season ranks.</w:t>
       </w:r>
     </w:p>
     <w:p>
@@ -19103,7 +19103,7 @@
         <w:pStyle w:val="Normal"/>
       </w:pPr>
       <w:r>
-        <w:t xml:space="preserve">Weekly overall model rank 18 (RB6). ROS overall rank 162 (RB54). Availability: UNKNOWN. Weekly ranks are preliminary when playing status is unconfirmed; they are separate from season ranks.</w:t>
+        <w:t xml:space="preserve">Weekly overall model rank Not published (GAME_STARTED_NO_ORIGINAL_WEEKLY_RANK). ROS overall rank 162 (RB54). Availability: UNKNOWN. Weekly ranks are preliminary when playing status is unconfirmed; they are separate from season ranks.</w:t>
       </w:r>
     </w:p>
     <w:p>
@@ -20311,7 +20311,7 @@
         <w:pStyle w:val="Normal"/>
       </w:pPr>
       <w:r>
-        <w:t xml:space="preserve">Weekly overall model rank 20 (RB7). ROS overall rank 173 (RB60). Availability: UNKNOWN. Weekly ranks are preliminary when playing status is unconfirmed; they are separate from season ranks.</w:t>
+        <w:t xml:space="preserve">Weekly overall model rank Not published (GAME_STARTED_NO_ORIGINAL_WEEKLY_RANK). ROS overall rank 173 (RB60). Availability: UNKNOWN. Weekly ranks are preliminary when playing status is unconfirmed; they are separate from season ranks.</w:t>
       </w:r>
     </w:p>
     <w:p>
@@ -22343,7 +22343,7 @@
         <w:pStyle w:val="Normal"/>
       </w:pPr>
       <w:r>
-        <w:t xml:space="preserve">Weekly overall model rank 21 (RB8). ROS overall rank 191 (RB66). Availability: NO_ADVERSE_STATUS_REPORTED. Weekly ranks are preliminary when playing status is unconfirmed; they are separate from season ranks.</w:t>
+        <w:t xml:space="preserve">Weekly overall model rank 11 (RB4). ROS overall rank 191 (RB66). Availability: NO_ADVERSE_STATUS_REPORTED. Weekly ranks are preliminary when playing status is unconfirmed; they are separate from season ranks.</w:t>
       </w:r>
     </w:p>
     <w:p>
@@ -22463,7 +22463,7 @@
         <w:pStyle w:val="Normal"/>
       </w:pPr>
       <w:r>
-        <w:t xml:space="preserve">Weekly overall model rank 7 (QB4). ROS overall rank 192 (QB28). Availability: UNKNOWN. Weekly ranks are preliminary when playing status is unconfirmed; they are separate from season ranks.</w:t>
+        <w:t xml:space="preserve">Weekly overall model rank 4 (QB2). ROS overall rank 192 (QB28). Availability: UNKNOWN. Weekly ranks are preliminary when playing status is unconfirmed; they are separate from season ranks.</w:t>
       </w:r>
     </w:p>
     <w:p>

</xml_diff>